<commit_message>
update paper results and discussion and limitations
</commit_message>
<xml_diff>
--- a/Paper/Patterns_Clinical_Trials_Tumor_Name_Standardization_using Embedding_Analysis.docx
+++ b/Paper/Patterns_Clinical_Trials_Tumor_Name_Standardization_using Embedding_Analysis.docx
@@ -1487,7 +1487,7 @@
           <w:highlight w:val="white"/>
           <w:rtl w:val="0"/>
         </w:rPr>
-        <w:t xml:space="preserve">In this paper, we describe the CANTOS pipeline, which extracts and standardizes tumor names from the CTR according to the WHO system and NCIt resources. CANTOS extracted 13,230 tumor records from the CTR, with 6,324 identified as pediatric, and then implemented 12 methods based on text-matching (edit-distances) and text-embedding to standardize the tumor names from the CTR.  To evaluate these methods, we needed ground truth (i.e., standardized terms) for all the 13,230 tumor names. In order to provide a ground-truth set for testing, we randomly sampled 1,600 tumor names from the 13,230 and manually annotated those tumor names to assess our methods' performance.</w:t>
+        <w:t xml:space="preserve">In this paper, we describe the CANTOS pipeline, which extracts and standardizes tumor names from the CTR according to the WHO system and NCIt resources. CANTOS extracted 13,230 tumor records from the CTR, with 6,324 identified as pediatric, and then implemented 34 methods based on text-matching (edit-distances) and text-embedding to standardize the tumor names from the CTR.  To evaluate these methods, we needed ground truth (i.e., standardized terms) for all the 13,230 tumor names. In order to provide a ground-truth set for testing, we randomly sampled 1,600 tumor names from the 13,230 and manually annotated those tumor names to assess our methods' performance.</w:t>
       </w:r>
     </w:p>
     <w:p>
@@ -2505,7 +2505,7 @@
           <w:highlight w:val="yellow"/>
           <w:rtl w:val="0"/>
         </w:rPr>
-        <w:t xml:space="preserve">). Thus there is a need for high quality text-embeddings which produce a larger separation between the distribution of Euclidean distances between correctly and incorrectly standardized tumor names. Such embeddings will also reduce the number of CTR tumor names that are incorrectly standardized and consequently increase the standardization accuracy. LLMs that trained on and fine tuned on tumor nomenclature and standardized tumor nomenclature like the WHO system and database will likely be the first avenue to obtain such high quality text-embeddings. </w:t>
+        <w:t xml:space="preserve">). Thus there is a need for high quality text-embeddings which produce a larger separation between the distribution of Euclidean distances between correctly and incorrectly standardized tumor names. Such embeddings will also reduce the number of CTR tumor names that are incorrectly standardized and consequently increase the standardization accuracy. LLMs that trained and fine tuned on tumor nomenclature, including standardized tumor nomenclature found in the WHO system and  NCIt database will likely be a potential tool for generating high quality text-embeddings. </w:t>
       </w:r>
     </w:p>
     <w:p>
@@ -2786,7 +2786,7 @@
           <w:color w:val="2a2a2a"/>
           <w:sz w:val="24"/>
           <w:szCs w:val="24"/>
-          <w:highlight w:val="white"/>
+          <w:highlight w:val="yellow"/>
         </w:rPr>
       </w:pPr>
       <w:r>
@@ -2821,25 +2821,18 @@
           <w:highlight w:val="white"/>
           <w:rtl w:val="0"/>
         </w:rPr>
-        <w:t xml:space="preserve">). CANTOS identified 13,230 unique tumors, of which 6,324 were pediatric tumors. It standardized these names according to the WHO system and NCIt database using 12 methods based on text-matching (edit distances) or text embedding. We evaluated these methods only against the WHO system, which is considered the gold standard for clinical tumor nomenclature. To assess accuracy, we randomly selected 1,600 tumor names from the 13,230 standardized by CANTOS and manually annotated their ground truths using the WHO system 5th edition and WHO system all editions. We found more tumors could be annotated using WHO system all editions, as the WHO system 5th edition has fewer terms. Overall, text-embedding methods proved more accurate than text-matching methods because text embeddings capture the semantic and contextual meaning between texts and map similar texts accordingly, while text-matching techniques focus only on syntactical differences between texts.</w:t>
-      </w:r>
-    </w:p>
-    <w:p>
-      <w:pPr>
-        <w:spacing w:line="276.0005454545455" w:lineRule="auto"/>
-        <w:ind w:left="-540" w:firstLine="0"/>
+        <w:t xml:space="preserve">). CANTOS identified 13,230 unique tumors, of which 6,324 were pediatric tumors. It standardized these names according to the WHO system and NCIt database using 34 methods based on text-matching (edit distances) or text embedding. We evaluated these methods only against the WHO system, which is considered the gold standard for clinical tumor nomenclature. </w:t>
+      </w:r>
+      <w:r>
         <w:rPr>
           <w:rFonts w:ascii="Times New Roman" w:cs="Times New Roman" w:eastAsia="Times New Roman" w:hAnsi="Times New Roman"/>
           <w:color w:val="2a2a2a"/>
           <w:sz w:val="24"/>
           <w:szCs w:val="24"/>
-          <w:highlight w:val="white"/>
-        </w:rPr>
-      </w:pPr>
-      <w:r>
-        <w:rPr>
-          <w:rtl w:val="0"/>
-        </w:rPr>
+          <w:highlight w:val="yellow"/>
+          <w:rtl w:val="0"/>
+        </w:rPr>
+        <w:t xml:space="preserve">To assess accuracy, we randomly selected 1,600 tumor names from the 13,230 standardized by CANTOS and manually annotated their ground truths using the WHO system 5th edition and WHO system all editions. We found more tumors could be annotated using WHO system all editions, as the WHO system 5th edition has fewer terms.  </w:t>
       </w:r>
     </w:p>
     <w:p>
@@ -2852,19 +2845,13 @@
           <w:color w:val="2a2a2a"/>
           <w:sz w:val="24"/>
           <w:szCs w:val="24"/>
-          <w:highlight w:val="white"/>
-        </w:rPr>
-      </w:pPr>
-      <w:r>
-        <w:rPr>
-          <w:rFonts w:ascii="Times New Roman" w:cs="Times New Roman" w:eastAsia="Times New Roman" w:hAnsi="Times New Roman"/>
-          <w:color w:val="2a2a2a"/>
-          <w:sz w:val="24"/>
-          <w:szCs w:val="24"/>
-          <w:highlight w:val="white"/>
-          <w:rtl w:val="0"/>
-        </w:rPr>
-        <w:t xml:space="preserve">We generated text embeddings using OpenAI's LLM: text-embedding-ada-002 (ADA-002) and text-embedding-3-large (LTE-3). LTE-3 methods generally outperformed ADA-002, except for LTE-3+K-means, which slightly underperformed compared to ADA-002+Euclidean Dist and ADA-002+AP when standardized against WHO system all editions. Regardless of the edition of the WHO system, LTE-3+Euclidean Dist achieved the highest accuracy, followed by LTE-3+AP. The LTE-3+Euclidean Dist method standardizes clinical trial tumors by identifying the closest WHO term based on Euclidean distance in the LTE-3 embedding space. This method is simpler and faster than LTE-3+AP, as it does not require additional steps like clustering, cluster size analysis, or outlier detection.</w:t>
+          <w:highlight w:val="yellow"/>
+        </w:rPr>
+      </w:pPr>
+      <w:r>
+        <w:rPr>
+          <w:rtl w:val="0"/>
+        </w:rPr>
       </w:r>
     </w:p>
     <w:p>
@@ -2877,6 +2864,31 @@
           <w:color w:val="2a2a2a"/>
           <w:sz w:val="24"/>
           <w:szCs w:val="24"/>
+          <w:highlight w:val="yellow"/>
+        </w:rPr>
+      </w:pPr>
+      <w:r>
+        <w:rPr>
+          <w:rFonts w:ascii="Times New Roman" w:cs="Times New Roman" w:eastAsia="Times New Roman" w:hAnsi="Times New Roman"/>
+          <w:color w:val="2a2a2a"/>
+          <w:sz w:val="24"/>
+          <w:szCs w:val="24"/>
+          <w:highlight w:val="yellow"/>
+          <w:rtl w:val="0"/>
+        </w:rPr>
+        <w:t xml:space="preserve">Among the methods, the text-matching based methods produced standardization accuracy ranging between 21.78% - 30.59% when standardizing against the 5th edition of the WHO system and between 22.82% - 32.70 % when standardizing against all editions of the WHO system. In contrast, text-embedding based methods produced a wider range of standardization accuracy ranging between 13.64% - 66.79%  and 15.36% - 69.27% when standardized against 5th and all editions of the WHO system, respectively.  While the range of accuracy for the methods based on text-embeddings is wide, their performance however is consistent across both the 5th and all editions of the WHO system, which allows us to classify the text-embedding based methods as high, intermediate, and low accuracy methods. When standardizing against either the 5th or all editions of the WHO system methods based on text-embeddings generated from the models LTE-3, ADA-002, MiniLM_L12_v2, MiniLM_L6_v2, E5_Large, MPNet, achieve a standardization accuracy of at least 60.79%. Methods implementing text-embeddings from these are classified as high accuracy methods and the highest standardizing accuracy is obtained by the methods LTE-3+Euclidean Dist when standardizing against all editions of the WHO system and by the methods   MiniLM_L12_v2+Euclidean Dist and E5_Large+Euclidean Dist when standardizing against the 5th edition of the WHO system. Methods based on text-embeddings generated from Roberta, GTR_T5_Large, cohere, sapBERT, clinicalBERT, LaBSE, and BioGPT are classified as intermediate accuracy methods and their standardization accuracy ranges between ~35%-58% when standardized against 5th or all editions of the WHO system. The low accuracy methods included models such as Llama, MedLlama, DeepSeek, PubMedBERT, BioBERT, sciBERT, Phi4, and their standardization accuracies ranged between 13.64%- 31.55% for the 5th or all editions of the WHO system. For all the text-embedding based methods, we standardized the CTR tumor terms by identifying the nearest standardized term from the WHO system or NCIt database in the respective embedding space using Euclidean distance. We also implemented a standardization method that combined embeddings obtained from OpenAI’s models (LTE-3 and ADA-002) with Affinity Propagation clustering (LTE-3+AP, ADA-002+AP) and K-Means (LTE-3+K-Means, ADA-002+K-Means) clustering. These methods utilizing text-embeddings and clustering had comparable but lower standardizing accuracy as compared to their counterpart methods (LTE-3+ Euclidean Dist , ADA–002+ Euclidean Dist ) that only utilized Euclidean Dist. In general, the LTE-3 based methods generally outperformed ADA-002, except for LTE-3+K-means, which slightly underperformed compared to ADA-002+Euclidean Dist and ADA-002+AP when standardized against WHO system all editions. However, LTE-3+K-means performed better than its counterpart method ADA–002+K-means against either edition of the WHO system. Compared to the methods utilizing text-embedding and clustering, the text-embedding method that simply compute the Euclidean distance to assign the nearest term from the WHO system or NCIt database as the standardized term achieves higher standardization accuracy and is much simpler and faster as as it does not require additional steps like clustering, cluster size analysis, or outlier detection.</w:t>
+      </w:r>
+    </w:p>
+    <w:p>
+      <w:pPr>
+        <w:spacing w:line="276.0005454545455" w:lineRule="auto"/>
+        <w:ind w:left="-540" w:firstLine="0"/>
+        <w:jc w:val="both"/>
+        <w:rPr>
+          <w:rFonts w:ascii="Times New Roman" w:cs="Times New Roman" w:eastAsia="Times New Roman" w:hAnsi="Times New Roman"/>
+          <w:color w:val="2a2a2a"/>
+          <w:sz w:val="24"/>
+          <w:szCs w:val="24"/>
           <w:highlight w:val="white"/>
         </w:rPr>
       </w:pPr>
@@ -2888,6 +2900,51 @@
     </w:p>
     <w:p>
       <w:pPr>
+        <w:spacing w:line="276.0005454545455" w:lineRule="auto"/>
+        <w:ind w:left="-540" w:firstLine="0"/>
+        <w:jc w:val="both"/>
+        <w:rPr>
+          <w:rFonts w:ascii="Times New Roman" w:cs="Times New Roman" w:eastAsia="Times New Roman" w:hAnsi="Times New Roman"/>
+          <w:color w:val="2a2a2a"/>
+          <w:sz w:val="24"/>
+          <w:szCs w:val="24"/>
+          <w:highlight w:val="yellow"/>
+        </w:rPr>
+      </w:pPr>
+      <w:r>
+        <w:rPr>
+          <w:rFonts w:ascii="Times New Roman" w:cs="Times New Roman" w:eastAsia="Times New Roman" w:hAnsi="Times New Roman"/>
+          <w:color w:val="2a2a2a"/>
+          <w:sz w:val="24"/>
+          <w:szCs w:val="24"/>
+          <w:highlight w:val="yellow"/>
+          <w:rtl w:val="0"/>
+        </w:rPr>
+        <w:t xml:space="preserve">Text-matching based methods had consistent performance across the 5th and all editions of the WHO system achieving a standardization accuracy ranging between 21.78% - 32.70%. The text-matching are only able to capture the syntactical difference between the unstandardized tumor name in CTR and the standardized term in the WHO system or NCIt database. Unlike text-embedding, text-matching methods are unable to quantify and capture semantic similarity between the standardized and unstandardized terms and focus only on syntactical differences between texts, which is likely why their standardization accuracy remains low compared to some of the text-embedding methods that are classified as high and intermediate accuracy methods. </w:t>
+      </w:r>
+    </w:p>
+    <w:p>
+      <w:pPr>
+        <w:spacing w:line="276.0005454545455" w:lineRule="auto"/>
+        <w:ind w:left="-540" w:firstLine="0"/>
+        <w:jc w:val="both"/>
+        <w:rPr>
+          <w:rFonts w:ascii="Times New Roman" w:cs="Times New Roman" w:eastAsia="Times New Roman" w:hAnsi="Times New Roman"/>
+          <w:color w:val="2a2a2a"/>
+          <w:sz w:val="24"/>
+          <w:szCs w:val="24"/>
+          <w:highlight w:val="white"/>
+        </w:rPr>
+      </w:pPr>
+      <w:r>
+        <w:rPr>
+          <w:rtl w:val="0"/>
+        </w:rPr>
+      </w:r>
+    </w:p>
+    <w:p>
+      <w:pPr>
+        <w:spacing w:line="276.0005454545455" w:lineRule="auto"/>
         <w:ind w:left="-540" w:firstLine="0"/>
         <w:jc w:val="both"/>
         <w:rPr>
@@ -3091,29 +3148,26 @@
           <w:rFonts w:ascii="Times New Roman" w:cs="Times New Roman" w:eastAsia="Times New Roman" w:hAnsi="Times New Roman"/>
           <w:sz w:val="24"/>
           <w:szCs w:val="24"/>
-          <w:highlight w:val="white"/>
-        </w:rPr>
-      </w:pPr>
-      <w:r>
-        <w:rPr>
-          <w:rFonts w:ascii="Times New Roman" w:cs="Times New Roman" w:eastAsia="Times New Roman" w:hAnsi="Times New Roman"/>
-          <w:sz w:val="24"/>
-          <w:szCs w:val="24"/>
-          <w:highlight w:val="white"/>
-          <w:rtl w:val="0"/>
-        </w:rPr>
-        <w:t xml:space="preserve">As more CTR samples are annotated with ground truth, the performance accuracies of each method will approach their true values. While we expect accuracy changes, our annotation of 1,600 CTR tumor names suggests that text-embedding methods will likely outperform text-matching methods. Expert annotation of CTR tumor names is crucial for accurately evaluating these methods and is a limitation of our study. Additionally, as the CTR updates, new tumor names must be identified and standardized, necessitating rerunning CANTOS and manually validating the findings, which is time-consuming. Beyond expert annotation, there are computational costs associated with running the CANTOS pipeline, generating embeddings, and storing data, which can become expensive over time. Another limitation is that the embeddings generated by OpenAI may require switching to other LLMs if the models are updated or discontinued. Furthermore, OpenAI’s models are not specifically trained on a medical corpus, so an LLM trained on such data would likely perform better and differentiate tumor names more precisely </w:t>
+          <w:highlight w:val="yellow"/>
+        </w:rPr>
+      </w:pPr>
+      <w:r>
+        <w:rPr>
+          <w:rFonts w:ascii="Times New Roman" w:cs="Times New Roman" w:eastAsia="Times New Roman" w:hAnsi="Times New Roman"/>
+          <w:sz w:val="24"/>
+          <w:szCs w:val="24"/>
+          <w:highlight w:val="yellow"/>
+          <w:rtl w:val="0"/>
+        </w:rPr>
+        <w:t xml:space="preserve">As more CTR samples are annotated with ground truth, the performance accuracies of each method will approach their true values. While we expect accuracy changes, our annotation of 1,600 CTR tumor names suggests that text-embedding methods will likely outperform text-matching methods. Expert annotation of CTR tumor names is crucial for accurately evaluating these methods and is a limitation of our study. Additionally, as the CTR updates, new tumor names must be identified and standardized, necessitating rerunning CANTOS and manually validating the findings, which is time-consuming. Beyond expert annotation, there are computational costs associated with running the CANTOS pipeline, generating embeddings, and storing data, which can become expensive over time. Another limitation is that embeddings generated using the current versions of the LLM need to be updated as newer and more powerful models become available. While we tested methods that employed text-embeddings from models that were trained on biomedical and scientific literature such as MedLlama, PubMedBERT, SciBERT, BioGPT, and ClinicalBERT , these models did not achieve high standardization accuracy. Therefore, it is not necessary that a domain specific LLM such as these will produce high quality text embeddings. Even though these LLMs are trained on biomedical literature, their poor performance can possibly be attributed to low generalization power, which can happen when the training dataset is not rich and diverse enough. Furthermore, having a very focused and narrow training dataset can cause embeddings from failing to capture a deeper contextual understanding of words. Contextual understanding can potentially help embeddings to disambiguate terms and detect nuanced relationships between words. Various other factors such as model architecture and embedding dimensions also play a role in the quality of text-embeddings produced. Any  LLM that is trained and fine tuned on a large diverse dataset that include tumor nomenclature will be a potential candidate for future integration in the CANTOS pipeline as text-embeddings generated from these models could likely differentiate tumor names more precisely </w:t>
       </w:r>
       <w:hyperlink r:id="rId29">
         <w:r>
           <w:rPr>
             <w:rFonts w:ascii="Times New Roman" w:cs="Times New Roman" w:eastAsia="Times New Roman" w:hAnsi="Times New Roman"/>
-            <w:b w:val="0"/>
-            <w:color w:val="000000"/>
             <w:sz w:val="24"/>
             <w:szCs w:val="24"/>
-            <w:highlight w:val="white"/>
-            <w:u w:val="none"/>
+            <w:highlight w:val="yellow"/>
             <w:vertAlign w:val="superscript"/>
             <w:rtl w:val="0"/>
           </w:rPr>
@@ -3125,15 +3179,17 @@
           <w:rFonts w:ascii="Times New Roman" w:cs="Times New Roman" w:eastAsia="Times New Roman" w:hAnsi="Times New Roman"/>
           <w:sz w:val="24"/>
           <w:szCs w:val="24"/>
-          <w:highlight w:val="white"/>
-          <w:rtl w:val="0"/>
-        </w:rPr>
-        <w:t xml:space="preserve">. Future work will include developing CANTOS to test across specific biomedical LLMs to improve its performance.</w:t>
-      </w:r>
-    </w:p>
-    <w:p>
-      <w:pPr>
+          <w:highlight w:val="yellow"/>
+          <w:rtl w:val="0"/>
+        </w:rPr>
+        <w:t xml:space="preserve">.  </w:t>
+      </w:r>
+    </w:p>
+    <w:p>
+      <w:pPr>
+        <w:spacing w:line="276.0005454545455" w:lineRule="auto"/>
         <w:ind w:left="-540" w:firstLine="0"/>
+        <w:jc w:val="both"/>
         <w:rPr>
           <w:rFonts w:ascii="Times New Roman" w:cs="Times New Roman" w:eastAsia="Times New Roman" w:hAnsi="Times New Roman"/>
           <w:sz w:val="24"/>
@@ -3280,6 +3336,45 @@
         <w:ind w:left="-540" w:firstLine="0"/>
         <w:rPr>
           <w:rFonts w:ascii="Times New Roman" w:cs="Times New Roman" w:eastAsia="Times New Roman" w:hAnsi="Times New Roman"/>
+        </w:rPr>
+      </w:pPr>
+      <w:r>
+        <w:rPr>
+          <w:rtl w:val="0"/>
+        </w:rPr>
+      </w:r>
+    </w:p>
+    <w:p>
+      <w:pPr>
+        <w:ind w:left="-540" w:firstLine="0"/>
+        <w:rPr>
+          <w:rFonts w:ascii="Times New Roman" w:cs="Times New Roman" w:eastAsia="Times New Roman" w:hAnsi="Times New Roman"/>
+        </w:rPr>
+      </w:pPr>
+      <w:r>
+        <w:rPr>
+          <w:rtl w:val="0"/>
+        </w:rPr>
+      </w:r>
+    </w:p>
+    <w:p>
+      <w:pPr>
+        <w:ind w:left="-540" w:firstLine="0"/>
+        <w:rPr>
+          <w:rFonts w:ascii="Times New Roman" w:cs="Times New Roman" w:eastAsia="Times New Roman" w:hAnsi="Times New Roman"/>
+        </w:rPr>
+      </w:pPr>
+      <w:r>
+        <w:rPr>
+          <w:rtl w:val="0"/>
+        </w:rPr>
+      </w:r>
+    </w:p>
+    <w:p>
+      <w:pPr>
+        <w:ind w:left="-540" w:firstLine="0"/>
+        <w:rPr>
+          <w:rFonts w:ascii="Times New Roman" w:cs="Times New Roman" w:eastAsia="Times New Roman" w:hAnsi="Times New Roman"/>
           <w:b w:val="1"/>
           <w:sz w:val="28"/>
           <w:szCs w:val="28"/>
@@ -3319,7 +3414,7 @@
           <w:szCs w:val="24"/>
           <w:rtl w:val="0"/>
         </w:rPr>
-        <w:t xml:space="preserve">This section outlines the design and methods of the CANTOS computational pipeline, which performs two main tasks: (i) identifying tumor names from the CTR and (ii) standardizing CTR tumor names. CANTOS takes condition names from CTR and standardized tumor names from the WHO system and NCIt database as inputs. After identifying tumor names, CANTOS iterates through the standardization step twice to account for different editions of the WHO system. The WHO system is considered the gold standard for tumor nomenclature and has multiple versions due to updates over the years. We used the 3rd, 4th, and 5th editions of the WHO system, which are all publicly available online. In the first iteration, CANTOS used only the latest 5th edition of the WHO system, while the second iteration incorporated all editions of the WHO system. In other words, this approach first aims to standardize the tumor names from the CTR based on only the latest edition of the WHO system, i.e., 5th edition and then follows  standardizing with the combined editions of the WHO system, i.e., WHO system all editions (includes 3rd, 4th, and 5th referred to in this text as the “WHO all edition”). Throughout these two iterations, tumor names from the CTR were also standardized against the NCIt database.</w:t>
+        <w:t xml:space="preserve">This section outlines the design and methods of the CANTOS computational pipeline, which performs two main tasks: (i) identifying tumor names from the CTR and (ii) standardizing CTR tumor names. CANTOS takes condition names from CTR and standardized tumor names from the WHO system and NCIt database as inputs. After identifying tumor names, CANTOS iterates through the standardization step twice to account for different editions of the WHO system. The WHO system is considered the gold standard for tumor nomenclature and has multiple versions due to updates over the years. We used the 3rd, 4th, and 5th editions of the WHO system, which are all publicly available online. In the first iteration, CANTOS used only the latest 5th edition of the WHO system, while the second iteration incorporated all editions of the WHO system. In other words, this approach first aims to standardize the tumor names from the CTR based on only the latest edition of the WHO system, i.e., 5th edition and then follows by standardizing the tumor names in CTR with the combined editions of the WHO system, i.e., WHO system all editions (includes 3rd, 4th, and 5th referred to in this text as the “WHO all edition”). Throughout these two iterations, tumor names from the CTR were also standardized against the NCIt database.</w:t>
       </w:r>
     </w:p>
     <w:p>
@@ -4392,7 +4487,26 @@
           <w:szCs w:val="24"/>
           <w:rtl w:val="0"/>
         </w:rPr>
-        <w:t xml:space="preserve">We implemented various methods in CANTOS to standardize the tumor names in the CTR. These methods are based either on text-matching (edit-distances) or text-embedding. It also combines unsupervised clustering with these approaches for improved standardization. In total, CANTOS implemented 12 standardization methods, and their performance accuracies are discussed in the results section. The following subsections will detail the text-matching methods first, followed by the text-embedding techniques.</w:t>
+        <w:t xml:space="preserve">We implemented various methods in CANTOS to standardize the tumor names in the CTR. These methods are based either on text-matching (edit-distances) or text-embedding. I</w:t>
+      </w:r>
+      <w:r>
+        <w:rPr>
+          <w:rFonts w:ascii="Times New Roman" w:cs="Times New Roman" w:eastAsia="Times New Roman" w:hAnsi="Times New Roman"/>
+          <w:sz w:val="24"/>
+          <w:szCs w:val="24"/>
+          <w:highlight w:val="yellow"/>
+          <w:rtl w:val="0"/>
+        </w:rPr>
+        <w:t xml:space="preserve">t also combines unsupervised clustering with text-embeddings generated from Open AI’s models LTE-3 and ADA-002 to evaluate if there is improvement in performance. </w:t>
+      </w:r>
+      <w:r>
+        <w:rPr>
+          <w:rFonts w:ascii="Times New Roman" w:cs="Times New Roman" w:eastAsia="Times New Roman" w:hAnsi="Times New Roman"/>
+          <w:sz w:val="24"/>
+          <w:szCs w:val="24"/>
+          <w:rtl w:val="0"/>
+        </w:rPr>
+        <w:t xml:space="preserve">In total, CANTOS implemented 34 standardization methods, and their performance accuracies are discussed in the results section. The following subsections will detail the text-matching methods first, followed by the text-embedding techniques.</w:t>
       </w:r>
     </w:p>
     <w:p>
@@ -8241,7 +8355,7 @@
           <w:highlight w:val="white"/>
           <w:rtl w:val="0"/>
         </w:rPr>
-        <w:t xml:space="preserve"> and NCIt database using 12 standardization methods based on text-matching and text-embedding. Our findings show that embedding-based methods outperform text-matching methods, with the LTE-3+Euclidean Distance method achieving the highest accuracy. We standardized all 13,230 tumors in the CTR against the WHO </w:t>
+        <w:t xml:space="preserve"> and NCIt database using 34 standardization methods based on text-matching and text-embedding. Our findings show that embedding-based methods outperform text-matching methods, with the LTE-3+Euclidean Distance method achieving the highest accuracy. We standardized all 13,230 tumors in the CTR against the WHO </w:t>
       </w:r>
       <w:r>
         <w:rPr>
@@ -19593,7 +19707,7 @@
                 <w:szCs w:val="20"/>
                 <w:rtl w:val="0"/>
               </w:rPr>
-              <w:t xml:space="preserve">LTE-3+KMeans</w:t>
+              <w:t xml:space="preserve">LTE-3+K-Means</w:t>
             </w:r>
             <w:r>
               <w:rPr>
@@ -19766,7 +19880,7 @@
                 <w:szCs w:val="20"/>
                 <w:rtl w:val="0"/>
               </w:rPr>
-              <w:t xml:space="preserve">ADA-002+KMeans</w:t>
+              <w:t xml:space="preserve">ADA-002+K-Means</w:t>
             </w:r>
             <w:r>
               <w:rPr>
@@ -19993,7 +20107,7 @@
       <w:tr>
         <w:trPr>
           <w:cantSplit w:val="0"/>
-          <w:trHeight w:val="315" w:hRule="atLeast"/>
+          <w:trHeight w:val="369.4775390625" w:hRule="atLeast"/>
           <w:tblHeader w:val="0"/>
         </w:trPr>
         <w:tc>
@@ -25393,7 +25507,7 @@
                 <w:szCs w:val="20"/>
                 <w:rtl w:val="0"/>
               </w:rPr>
-              <w:t xml:space="preserve">LTE-3+KMeans</w:t>
+              <w:t xml:space="preserve">LTE-3+K-Means</w:t>
             </w:r>
             <w:r>
               <w:rPr>
@@ -25909,7 +26023,7 @@
                 <w:szCs w:val="20"/>
                 <w:rtl w:val="0"/>
               </w:rPr>
-              <w:t xml:space="preserve">ADA-002+KMeans</w:t>
+              <w:t xml:space="preserve">ADA-002+K-Means</w:t>
             </w:r>
             <w:r>
               <w:rPr>
@@ -30037,7 +30151,7 @@
                 <w:szCs w:val="20"/>
                 <w:rtl w:val="0"/>
               </w:rPr>
-              <w:t xml:space="preserve">Medllama_7B+Euclidean Dist</w:t>
+              <w:t xml:space="preserve">MedLlama_7B+Euclidean Dist</w:t>
             </w:r>
             <w:r>
               <w:rPr>
@@ -40061,12 +40175,12 @@
           <wp:inline distB="114300" distT="114300" distL="114300" distR="114300">
             <wp:extent cx="6655689" cy="2973054"/>
             <wp:effectExtent b="0" l="0" r="0" t="0"/>
-            <wp:docPr id="4" name="image3.png"/>
+            <wp:docPr id="4" name="image2.png"/>
             <a:graphic>
               <a:graphicData uri="http://schemas.openxmlformats.org/drawingml/2006/picture">
                 <pic:pic>
                   <pic:nvPicPr>
-                    <pic:cNvPr id="0" name="image3.png"/>
+                    <pic:cNvPr id="0" name="image2.png"/>
                     <pic:cNvPicPr preferRelativeResize="0"/>
                   </pic:nvPicPr>
                   <pic:blipFill>
@@ -40169,12 +40283,12 @@
           <wp:inline distB="114300" distT="114300" distL="114300" distR="114300">
             <wp:extent cx="7217045" cy="4254901"/>
             <wp:effectExtent b="0" l="0" r="0" t="0"/>
-            <wp:docPr id="2" name="image2.png"/>
+            <wp:docPr id="2" name="image4.png"/>
             <a:graphic>
               <a:graphicData uri="http://schemas.openxmlformats.org/drawingml/2006/picture">
                 <pic:pic>
                   <pic:nvPicPr>
-                    <pic:cNvPr id="0" name="image2.png"/>
+                    <pic:cNvPr id="0" name="image4.png"/>
                     <pic:cNvPicPr preferRelativeResize="0"/>
                   </pic:nvPicPr>
                   <pic:blipFill>
@@ -40305,12 +40419,12 @@
           <wp:inline distB="114300" distT="114300" distL="114300" distR="114300">
             <wp:extent cx="6057900" cy="6832600"/>
             <wp:effectExtent b="0" l="0" r="0" t="0"/>
-            <wp:docPr id="3" name="image4.png"/>
+            <wp:docPr id="3" name="image3.png"/>
             <a:graphic>
               <a:graphicData uri="http://schemas.openxmlformats.org/drawingml/2006/picture">
                 <pic:pic>
                   <pic:nvPicPr>
-                    <pic:cNvPr id="0" name="image4.png"/>
+                    <pic:cNvPr id="0" name="image3.png"/>
                     <pic:cNvPicPr preferRelativeResize="0"/>
                   </pic:nvPicPr>
                   <pic:blipFill>
@@ -40922,7 +41036,7 @@
           <w:szCs w:val="24"/>
           <w:rtl w:val="0"/>
         </w:rPr>
-        <w:t xml:space="preserve">ST4_tumor_sample_df_gt_annotated_all.csv.  This file contains the ground truth annotation with respect to all editions (3rd, 4th, and 5th) of WHO Tumor Classification System for the 1600 tumor names randomly sampled from the CTR. Furthermore, this file also contains the standardization results obtained from the 12 standardization methods implemented by CANTOS.  </w:t>
+        <w:t xml:space="preserve">ST4_tumor_sample_df_gt_annotated_all.csv.  This file contains the ground truth annotation with respect to all editions (3rd, 4th, and 5th) of WHO Tumor Classification System for the 1600 tumor names randomly sampled from the CTR. Furthermore, this file also contains the standardization results obtained from the 34 standardization methods implemented by CANTOS.  </w:t>
       </w:r>
       <w:r>
         <w:rPr>
@@ -40980,7 +41094,7 @@
           <w:szCs w:val="24"/>
           <w:rtl w:val="0"/>
         </w:rPr>
-        <w:t xml:space="preserve">ST5_tumor_sample_df_gt_annotated_5th.csv. This file contains the ground truth annotation with respect to the 5th edition of WHO Tumor Classification System for the 1600 tumor names randomly sampled from the CTR. Furthermore, this file also contains the standardization results obtained from the 12 standardization methods implemented by CANTOS.  </w:t>
+        <w:t xml:space="preserve">ST5_tumor_sample_df_gt_annotated_5th.csv. This file contains the ground truth annotation with respect to the 5th edition of WHO Tumor Classification System for the 1600 tumor names randomly sampled from the CTR. Furthermore, this file also contains the standardization results obtained from the 34 standardization methods implemented by CANTOS.  </w:t>
       </w:r>
       <w:r>
         <w:rPr>

</xml_diff>

<commit_message>
update paper with table 7
</commit_message>
<xml_diff>
--- a/Paper/Patterns_Clinical_Trials_Tumor_Name_Standardization_using Embedding_Analysis.docx
+++ b/Paper/Patterns_Clinical_Trials_Tumor_Name_Standardization_using Embedding_Analysis.docx
@@ -40627,7 +40627,7 @@
       <w:tblPr>
         <w:tblStyle w:val="Table8"/>
         <w:tblpPr w:leftFromText="180" w:rightFromText="180" w:topFromText="180" w:bottomFromText="180" w:vertAnchor="text" w:horzAnchor="text" w:tblpX="-540" w:tblpY="0"/>
-        <w:tblW w:w="12600.0" w:type="dxa"/>
+        <w:tblW w:w="13155.0" w:type="dxa"/>
         <w:jc w:val="left"/>
         <w:tblBorders>
           <w:top w:color="000000" w:space="0" w:sz="0" w:val="nil"/>
@@ -40641,17 +40641,19 @@
         <w:tblLook w:val="0600"/>
       </w:tblPr>
       <w:tblGrid>
-        <w:gridCol w:w="2115"/>
-        <w:gridCol w:w="1305"/>
-        <w:gridCol w:w="4665"/>
-        <w:gridCol w:w="2055"/>
+        <w:gridCol w:w="420"/>
+        <w:gridCol w:w="3015"/>
+        <w:gridCol w:w="1335"/>
+        <w:gridCol w:w="4695"/>
+        <w:gridCol w:w="1230"/>
         <w:gridCol w:w="2460"/>
         <w:tblGridChange w:id="0">
           <w:tblGrid>
-            <w:gridCol w:w="2115"/>
-            <w:gridCol w:w="1305"/>
-            <w:gridCol w:w="4665"/>
-            <w:gridCol w:w="2055"/>
+            <w:gridCol w:w="420"/>
+            <w:gridCol w:w="3015"/>
+            <w:gridCol w:w="1335"/>
+            <w:gridCol w:w="4695"/>
+            <w:gridCol w:w="1230"/>
             <w:gridCol w:w="2460"/>
           </w:tblGrid>
         </w:tblGridChange>
@@ -40659,9 +40661,35 @@
       <w:tr>
         <w:trPr>
           <w:cantSplit w:val="0"/>
-          <w:trHeight w:val="540" w:hRule="atLeast"/>
+          <w:trHeight w:val="648.955078125" w:hRule="atLeast"/>
           <w:tblHeader w:val="0"/>
         </w:trPr>
+        <w:tc>
+          <w:tcPr>
+            <w:tcBorders>
+              <w:top w:color="000000" w:space="0" w:sz="5" w:val="single"/>
+              <w:left w:color="000000" w:space="0" w:sz="5" w:val="single"/>
+              <w:bottom w:color="000000" w:space="0" w:sz="5" w:val="single"/>
+              <w:right w:color="000000" w:space="0" w:sz="5" w:val="single"/>
+            </w:tcBorders>
+          </w:tcPr>
+          <w:p>
+            <w:pPr>
+              <w:rPr>
+                <w:rFonts w:ascii="Times New Roman" w:cs="Times New Roman" w:eastAsia="Times New Roman" w:hAnsi="Times New Roman"/>
+                <w:b w:val="1"/>
+                <w:sz w:val="20"/>
+                <w:szCs w:val="20"/>
+                <w:highlight w:val="white"/>
+              </w:rPr>
+            </w:pPr>
+            <w:r>
+              <w:rPr>
+                <w:rtl w:val="0"/>
+              </w:rPr>
+            </w:r>
+          </w:p>
+        </w:tc>
         <w:tc>
           <w:tcPr>
             <w:tcBorders>
@@ -40855,7 +40883,37 @@
                 <w:highlight w:val="white"/>
                 <w:rtl w:val="0"/>
               </w:rPr>
-              <w:t xml:space="preserve">LTE-3 </w:t>
+              <w:t xml:space="preserve">1</w:t>
+            </w:r>
+          </w:p>
+        </w:tc>
+        <w:tc>
+          <w:tcPr>
+            <w:tcBorders>
+              <w:top w:color="000000" w:space="0" w:sz="5" w:val="single"/>
+              <w:left w:color="000000" w:space="0" w:sz="5" w:val="single"/>
+              <w:bottom w:color="000000" w:space="0" w:sz="5" w:val="single"/>
+              <w:right w:color="000000" w:space="0" w:sz="5" w:val="single"/>
+            </w:tcBorders>
+          </w:tcPr>
+          <w:p>
+            <w:pPr>
+              <w:rPr>
+                <w:rFonts w:ascii="Times New Roman" w:cs="Times New Roman" w:eastAsia="Times New Roman" w:hAnsi="Times New Roman"/>
+                <w:sz w:val="20"/>
+                <w:szCs w:val="20"/>
+                <w:highlight w:val="white"/>
+              </w:rPr>
+            </w:pPr>
+            <w:r>
+              <w:rPr>
+                <w:rFonts w:ascii="Times New Roman" w:cs="Times New Roman" w:eastAsia="Times New Roman" w:hAnsi="Times New Roman"/>
+                <w:sz w:val="20"/>
+                <w:szCs w:val="20"/>
+                <w:highlight w:val="white"/>
+                <w:rtl w:val="0"/>
+              </w:rPr>
+              <w:t xml:space="preserve">Open AI: text-embedding-3-large (LTE-3) </w:t>
             </w:r>
           </w:p>
         </w:tc>
@@ -41012,7 +41070,37 @@
                 <w:highlight w:val="white"/>
                 <w:rtl w:val="0"/>
               </w:rPr>
-              <w:t xml:space="preserve">ADA-002</w:t>
+              <w:t xml:space="preserve">2</w:t>
+            </w:r>
+          </w:p>
+        </w:tc>
+        <w:tc>
+          <w:tcPr>
+            <w:tcBorders>
+              <w:top w:color="000000" w:space="0" w:sz="5" w:val="single"/>
+              <w:left w:color="000000" w:space="0" w:sz="5" w:val="single"/>
+              <w:bottom w:color="000000" w:space="0" w:sz="5" w:val="single"/>
+              <w:right w:color="000000" w:space="0" w:sz="5" w:val="single"/>
+            </w:tcBorders>
+          </w:tcPr>
+          <w:p>
+            <w:pPr>
+              <w:rPr>
+                <w:rFonts w:ascii="Times New Roman" w:cs="Times New Roman" w:eastAsia="Times New Roman" w:hAnsi="Times New Roman"/>
+                <w:sz w:val="20"/>
+                <w:szCs w:val="20"/>
+                <w:highlight w:val="white"/>
+              </w:rPr>
+            </w:pPr>
+            <w:r>
+              <w:rPr>
+                <w:rFonts w:ascii="Times New Roman" w:cs="Times New Roman" w:eastAsia="Times New Roman" w:hAnsi="Times New Roman"/>
+                <w:sz w:val="20"/>
+                <w:szCs w:val="20"/>
+                <w:highlight w:val="white"/>
+                <w:rtl w:val="0"/>
+              </w:rPr>
+              <w:t xml:space="preserve">Open AI: text-embedding-ada-002 (ADA-002)</w:t>
             </w:r>
           </w:p>
         </w:tc>
@@ -41169,7 +41257,7 @@
                 <w:highlight w:val="white"/>
                 <w:rtl w:val="0"/>
               </w:rPr>
-              <w:t xml:space="preserve">LLama 3.3</w:t>
+              <w:t xml:space="preserve">3</w:t>
             </w:r>
           </w:p>
         </w:tc>
@@ -41199,7 +41287,7 @@
                 <w:highlight w:val="white"/>
                 <w:rtl w:val="0"/>
               </w:rPr>
-              <w:t xml:space="preserve">Open Source</w:t>
+              <w:t xml:space="preserve">Cohere: embed-english-v2.0 </w:t>
             </w:r>
           </w:p>
         </w:tc>
@@ -41229,7 +41317,7 @@
                 <w:highlight w:val="white"/>
                 <w:rtl w:val="0"/>
               </w:rPr>
-              <w:t xml:space="preserve">https://ollama.com/library/llama3.3</w:t>
+              <w:t xml:space="preserve">Proprietary</w:t>
             </w:r>
           </w:p>
         </w:tc>
@@ -41259,7 +41347,7 @@
                 <w:highlight w:val="white"/>
                 <w:rtl w:val="0"/>
               </w:rPr>
-              <w:t xml:space="preserve">8192</w:t>
+              <w:t xml:space="preserve">https://docs.cohere.com/v2/docs/cohere-embed</w:t>
             </w:r>
           </w:p>
         </w:tc>
@@ -41289,7 +41377,32 @@
                 <w:highlight w:val="white"/>
                 <w:rtl w:val="0"/>
               </w:rPr>
-              <w:t xml:space="preserve">70 Billion</w:t>
+              <w:t xml:space="preserve">4096</w:t>
+            </w:r>
+          </w:p>
+        </w:tc>
+        <w:tc>
+          <w:tcPr>
+            <w:tcBorders>
+              <w:top w:color="000000" w:space="0" w:sz="5" w:val="single"/>
+              <w:left w:color="000000" w:space="0" w:sz="5" w:val="single"/>
+              <w:bottom w:color="000000" w:space="0" w:sz="5" w:val="single"/>
+              <w:right w:color="000000" w:space="0" w:sz="5" w:val="single"/>
+            </w:tcBorders>
+          </w:tcPr>
+          <w:p>
+            <w:pPr>
+              <w:rPr>
+                <w:rFonts w:ascii="Times New Roman" w:cs="Times New Roman" w:eastAsia="Times New Roman" w:hAnsi="Times New Roman"/>
+                <w:sz w:val="20"/>
+                <w:szCs w:val="20"/>
+                <w:highlight w:val="white"/>
+              </w:rPr>
+            </w:pPr>
+            <w:r>
+              <w:rPr>
+                <w:rtl w:val="0"/>
+              </w:rPr>
             </w:r>
           </w:p>
         </w:tc>
@@ -41326,7 +41439,7 @@
                 <w:highlight w:val="white"/>
                 <w:rtl w:val="0"/>
               </w:rPr>
-              <w:t xml:space="preserve">Llama 3.2</w:t>
+              <w:t xml:space="preserve">4</w:t>
             </w:r>
           </w:p>
         </w:tc>
@@ -41356,7 +41469,7 @@
                 <w:highlight w:val="white"/>
                 <w:rtl w:val="0"/>
               </w:rPr>
-              <w:t xml:space="preserve">Open Source</w:t>
+              <w:t xml:space="preserve">LLama 3.3</w:t>
             </w:r>
           </w:p>
         </w:tc>
@@ -41386,7 +41499,7 @@
                 <w:highlight w:val="white"/>
                 <w:rtl w:val="0"/>
               </w:rPr>
-              <w:t xml:space="preserve">https://ollama.com/library/llama3.2</w:t>
+              <w:t xml:space="preserve">Open Source</w:t>
             </w:r>
           </w:p>
         </w:tc>
@@ -41416,7 +41529,7 @@
                 <w:highlight w:val="white"/>
                 <w:rtl w:val="0"/>
               </w:rPr>
-              <w:t xml:space="preserve">3072</w:t>
+              <w:t xml:space="preserve">https://ollama.com/library/llama3.3</w:t>
             </w:r>
           </w:p>
         </w:tc>
@@ -41446,7 +41559,37 @@
                 <w:highlight w:val="white"/>
                 <w:rtl w:val="0"/>
               </w:rPr>
-              <w:t xml:space="preserve">3 Billion</w:t>
+              <w:t xml:space="preserve">8192</w:t>
+            </w:r>
+          </w:p>
+        </w:tc>
+        <w:tc>
+          <w:tcPr>
+            <w:tcBorders>
+              <w:top w:color="000000" w:space="0" w:sz="5" w:val="single"/>
+              <w:left w:color="000000" w:space="0" w:sz="5" w:val="single"/>
+              <w:bottom w:color="000000" w:space="0" w:sz="5" w:val="single"/>
+              <w:right w:color="000000" w:space="0" w:sz="5" w:val="single"/>
+            </w:tcBorders>
+          </w:tcPr>
+          <w:p>
+            <w:pPr>
+              <w:rPr>
+                <w:rFonts w:ascii="Times New Roman" w:cs="Times New Roman" w:eastAsia="Times New Roman" w:hAnsi="Times New Roman"/>
+                <w:sz w:val="20"/>
+                <w:szCs w:val="20"/>
+                <w:highlight w:val="white"/>
+              </w:rPr>
+            </w:pPr>
+            <w:r>
+              <w:rPr>
+                <w:rFonts w:ascii="Times New Roman" w:cs="Times New Roman" w:eastAsia="Times New Roman" w:hAnsi="Times New Roman"/>
+                <w:sz w:val="20"/>
+                <w:szCs w:val="20"/>
+                <w:highlight w:val="white"/>
+                <w:rtl w:val="0"/>
+              </w:rPr>
+              <w:t xml:space="preserve">70 Billion</w:t>
             </w:r>
           </w:p>
         </w:tc>
@@ -41483,7 +41626,7 @@
                 <w:highlight w:val="white"/>
                 <w:rtl w:val="0"/>
               </w:rPr>
-              <w:t xml:space="preserve">LLama 3  </w:t>
+              <w:t xml:space="preserve">5</w:t>
             </w:r>
           </w:p>
         </w:tc>
@@ -41513,7 +41656,7 @@
                 <w:highlight w:val="white"/>
                 <w:rtl w:val="0"/>
               </w:rPr>
-              <w:t xml:space="preserve">Open Source</w:t>
+              <w:t xml:space="preserve">Llama 3.2</w:t>
             </w:r>
           </w:p>
         </w:tc>
@@ -41543,7 +41686,7 @@
                 <w:highlight w:val="white"/>
                 <w:rtl w:val="0"/>
               </w:rPr>
-              <w:t xml:space="preserve">https://ollama.com/library/llama3</w:t>
+              <w:t xml:space="preserve">Open Source</w:t>
             </w:r>
           </w:p>
         </w:tc>
@@ -41573,7 +41716,7 @@
                 <w:highlight w:val="white"/>
                 <w:rtl w:val="0"/>
               </w:rPr>
-              <w:t xml:space="preserve">4096</w:t>
+              <w:t xml:space="preserve">https://ollama.com/library/llama3.2</w:t>
             </w:r>
           </w:p>
         </w:tc>
@@ -41603,7 +41746,37 @@
                 <w:highlight w:val="white"/>
                 <w:rtl w:val="0"/>
               </w:rPr>
-              <w:t xml:space="preserve">8 Billion</w:t>
+              <w:t xml:space="preserve">3072</w:t>
+            </w:r>
+          </w:p>
+        </w:tc>
+        <w:tc>
+          <w:tcPr>
+            <w:tcBorders>
+              <w:top w:color="000000" w:space="0" w:sz="5" w:val="single"/>
+              <w:left w:color="000000" w:space="0" w:sz="5" w:val="single"/>
+              <w:bottom w:color="000000" w:space="0" w:sz="5" w:val="single"/>
+              <w:right w:color="000000" w:space="0" w:sz="5" w:val="single"/>
+            </w:tcBorders>
+          </w:tcPr>
+          <w:p>
+            <w:pPr>
+              <w:rPr>
+                <w:rFonts w:ascii="Times New Roman" w:cs="Times New Roman" w:eastAsia="Times New Roman" w:hAnsi="Times New Roman"/>
+                <w:sz w:val="20"/>
+                <w:szCs w:val="20"/>
+                <w:highlight w:val="white"/>
+              </w:rPr>
+            </w:pPr>
+            <w:r>
+              <w:rPr>
+                <w:rFonts w:ascii="Times New Roman" w:cs="Times New Roman" w:eastAsia="Times New Roman" w:hAnsi="Times New Roman"/>
+                <w:sz w:val="20"/>
+                <w:szCs w:val="20"/>
+                <w:highlight w:val="white"/>
+                <w:rtl w:val="0"/>
+              </w:rPr>
+              <w:t xml:space="preserve">3 Billion</w:t>
             </w:r>
           </w:p>
         </w:tc>
@@ -41640,7 +41813,7 @@
                 <w:highlight w:val="white"/>
                 <w:rtl w:val="0"/>
               </w:rPr>
-              <w:t xml:space="preserve">MedLLama2</w:t>
+              <w:t xml:space="preserve">6</w:t>
             </w:r>
           </w:p>
         </w:tc>
@@ -41670,7 +41843,7 @@
                 <w:highlight w:val="white"/>
                 <w:rtl w:val="0"/>
               </w:rPr>
-              <w:t xml:space="preserve">Open Source</w:t>
+              <w:t xml:space="preserve">LLama 3  </w:t>
             </w:r>
           </w:p>
         </w:tc>
@@ -41700,7 +41873,7 @@
                 <w:highlight w:val="white"/>
                 <w:rtl w:val="0"/>
               </w:rPr>
-              <w:t xml:space="preserve">https://ollama.com/library/medllama2</w:t>
+              <w:t xml:space="preserve">Open Source</w:t>
             </w:r>
           </w:p>
         </w:tc>
@@ -41730,7 +41903,7 @@
                 <w:highlight w:val="white"/>
                 <w:rtl w:val="0"/>
               </w:rPr>
-              <w:t xml:space="preserve">4096</w:t>
+              <w:t xml:space="preserve">https://ollama.com/library/llama3</w:t>
             </w:r>
           </w:p>
         </w:tc>
@@ -41760,7 +41933,37 @@
                 <w:highlight w:val="white"/>
                 <w:rtl w:val="0"/>
               </w:rPr>
-              <w:t xml:space="preserve">7 Billion</w:t>
+              <w:t xml:space="preserve">4096</w:t>
+            </w:r>
+          </w:p>
+        </w:tc>
+        <w:tc>
+          <w:tcPr>
+            <w:tcBorders>
+              <w:top w:color="000000" w:space="0" w:sz="5" w:val="single"/>
+              <w:left w:color="000000" w:space="0" w:sz="5" w:val="single"/>
+              <w:bottom w:color="000000" w:space="0" w:sz="5" w:val="single"/>
+              <w:right w:color="000000" w:space="0" w:sz="5" w:val="single"/>
+            </w:tcBorders>
+          </w:tcPr>
+          <w:p>
+            <w:pPr>
+              <w:rPr>
+                <w:rFonts w:ascii="Times New Roman" w:cs="Times New Roman" w:eastAsia="Times New Roman" w:hAnsi="Times New Roman"/>
+                <w:sz w:val="20"/>
+                <w:szCs w:val="20"/>
+                <w:highlight w:val="white"/>
+              </w:rPr>
+            </w:pPr>
+            <w:r>
+              <w:rPr>
+                <w:rFonts w:ascii="Times New Roman" w:cs="Times New Roman" w:eastAsia="Times New Roman" w:hAnsi="Times New Roman"/>
+                <w:sz w:val="20"/>
+                <w:szCs w:val="20"/>
+                <w:highlight w:val="white"/>
+                <w:rtl w:val="0"/>
+              </w:rPr>
+              <w:t xml:space="preserve">8 Billion</w:t>
             </w:r>
           </w:p>
         </w:tc>
@@ -41797,7 +42000,7 @@
                 <w:highlight w:val="white"/>
                 <w:rtl w:val="0"/>
               </w:rPr>
-              <w:t xml:space="preserve">MedLLama13B</w:t>
+              <w:t xml:space="preserve">7</w:t>
             </w:r>
           </w:p>
         </w:tc>
@@ -41827,7 +42030,7 @@
                 <w:highlight w:val="white"/>
                 <w:rtl w:val="0"/>
               </w:rPr>
-              <w:t xml:space="preserve">Open Source</w:t>
+              <w:t xml:space="preserve">MedLLama2</w:t>
             </w:r>
           </w:p>
         </w:tc>
@@ -41857,7 +42060,7 @@
                 <w:highlight w:val="white"/>
                 <w:rtl w:val="0"/>
               </w:rPr>
-              <w:t xml:space="preserve">https://huggingface.co/chaoyi-wu/MedLLaMA_13B</w:t>
+              <w:t xml:space="preserve">Open Source</w:t>
             </w:r>
           </w:p>
         </w:tc>
@@ -41887,7 +42090,7 @@
                 <w:highlight w:val="white"/>
                 <w:rtl w:val="0"/>
               </w:rPr>
-              <w:t xml:space="preserve">5120</w:t>
+              <w:t xml:space="preserve">https://ollama.com/library/medllama2</w:t>
             </w:r>
           </w:p>
         </w:tc>
@@ -41917,7 +42120,37 @@
                 <w:highlight w:val="white"/>
                 <w:rtl w:val="0"/>
               </w:rPr>
-              <w:t xml:space="preserve">13 Billion</w:t>
+              <w:t xml:space="preserve">4096</w:t>
+            </w:r>
+          </w:p>
+        </w:tc>
+        <w:tc>
+          <w:tcPr>
+            <w:tcBorders>
+              <w:top w:color="000000" w:space="0" w:sz="5" w:val="single"/>
+              <w:left w:color="000000" w:space="0" w:sz="5" w:val="single"/>
+              <w:bottom w:color="000000" w:space="0" w:sz="5" w:val="single"/>
+              <w:right w:color="000000" w:space="0" w:sz="5" w:val="single"/>
+            </w:tcBorders>
+          </w:tcPr>
+          <w:p>
+            <w:pPr>
+              <w:rPr>
+                <w:rFonts w:ascii="Times New Roman" w:cs="Times New Roman" w:eastAsia="Times New Roman" w:hAnsi="Times New Roman"/>
+                <w:sz w:val="20"/>
+                <w:szCs w:val="20"/>
+                <w:highlight w:val="white"/>
+              </w:rPr>
+            </w:pPr>
+            <w:r>
+              <w:rPr>
+                <w:rFonts w:ascii="Times New Roman" w:cs="Times New Roman" w:eastAsia="Times New Roman" w:hAnsi="Times New Roman"/>
+                <w:sz w:val="20"/>
+                <w:szCs w:val="20"/>
+                <w:highlight w:val="white"/>
+                <w:rtl w:val="0"/>
+              </w:rPr>
+              <w:t xml:space="preserve">7 Billion</w:t>
             </w:r>
           </w:p>
         </w:tc>
@@ -41954,7 +42187,7 @@
                 <w:highlight w:val="white"/>
                 <w:rtl w:val="0"/>
               </w:rPr>
-              <w:t xml:space="preserve">BioBERT</w:t>
+              <w:t xml:space="preserve">8</w:t>
             </w:r>
           </w:p>
         </w:tc>
@@ -41984,7 +42217,7 @@
                 <w:highlight w:val="white"/>
                 <w:rtl w:val="0"/>
               </w:rPr>
-              <w:t xml:space="preserve">Open Source</w:t>
+              <w:t xml:space="preserve">MedLLama13B</w:t>
             </w:r>
           </w:p>
         </w:tc>
@@ -42014,7 +42247,7 @@
                 <w:highlight w:val="white"/>
                 <w:rtl w:val="0"/>
               </w:rPr>
-              <w:t xml:space="preserve">https://github.com/dmis-lab/biobert-pytorch/blob/master/README.md</w:t>
+              <w:t xml:space="preserve">Open Source</w:t>
             </w:r>
           </w:p>
         </w:tc>
@@ -42044,7 +42277,7 @@
                 <w:highlight w:val="white"/>
                 <w:rtl w:val="0"/>
               </w:rPr>
-              <w:t xml:space="preserve">768</w:t>
+              <w:t xml:space="preserve">https://huggingface.co/chaoyi-wu/MedLLaMA_13B</w:t>
             </w:r>
           </w:p>
         </w:tc>
@@ -42074,7 +42307,37 @@
                 <w:highlight w:val="white"/>
                 <w:rtl w:val="0"/>
               </w:rPr>
-              <w:t xml:space="preserve">110 Million</w:t>
+              <w:t xml:space="preserve">5120</w:t>
+            </w:r>
+          </w:p>
+        </w:tc>
+        <w:tc>
+          <w:tcPr>
+            <w:tcBorders>
+              <w:top w:color="000000" w:space="0" w:sz="5" w:val="single"/>
+              <w:left w:color="000000" w:space="0" w:sz="5" w:val="single"/>
+              <w:bottom w:color="000000" w:space="0" w:sz="5" w:val="single"/>
+              <w:right w:color="000000" w:space="0" w:sz="5" w:val="single"/>
+            </w:tcBorders>
+          </w:tcPr>
+          <w:p>
+            <w:pPr>
+              <w:rPr>
+                <w:rFonts w:ascii="Times New Roman" w:cs="Times New Roman" w:eastAsia="Times New Roman" w:hAnsi="Times New Roman"/>
+                <w:sz w:val="20"/>
+                <w:szCs w:val="20"/>
+                <w:highlight w:val="white"/>
+              </w:rPr>
+            </w:pPr>
+            <w:r>
+              <w:rPr>
+                <w:rFonts w:ascii="Times New Roman" w:cs="Times New Roman" w:eastAsia="Times New Roman" w:hAnsi="Times New Roman"/>
+                <w:sz w:val="20"/>
+                <w:szCs w:val="20"/>
+                <w:highlight w:val="white"/>
+                <w:rtl w:val="0"/>
+              </w:rPr>
+              <w:t xml:space="preserve">13 Billion</w:t>
             </w:r>
           </w:p>
         </w:tc>
@@ -42111,7 +42374,7 @@
                 <w:highlight w:val="white"/>
                 <w:rtl w:val="0"/>
               </w:rPr>
-              <w:t xml:space="preserve">PubMedBERT-Abstract</w:t>
+              <w:t xml:space="preserve">9</w:t>
             </w:r>
           </w:p>
         </w:tc>
@@ -42141,7 +42404,7 @@
                 <w:highlight w:val="white"/>
                 <w:rtl w:val="0"/>
               </w:rPr>
-              <w:t xml:space="preserve">Open Source</w:t>
+              <w:t xml:space="preserve">BioBERT</w:t>
             </w:r>
           </w:p>
         </w:tc>
@@ -42171,7 +42434,37 @@
                 <w:highlight w:val="white"/>
                 <w:rtl w:val="0"/>
               </w:rPr>
-              <w:t xml:space="preserve">https://huggingface.co/microsoft/BiomedNLP-BiomedBERT-base-uncased-abstract</w:t>
+              <w:t xml:space="preserve">Open Source</w:t>
+            </w:r>
+          </w:p>
+        </w:tc>
+        <w:tc>
+          <w:tcPr>
+            <w:tcBorders>
+              <w:top w:color="000000" w:space="0" w:sz="5" w:val="single"/>
+              <w:left w:color="000000" w:space="0" w:sz="5" w:val="single"/>
+              <w:bottom w:color="000000" w:space="0" w:sz="5" w:val="single"/>
+              <w:right w:color="000000" w:space="0" w:sz="5" w:val="single"/>
+            </w:tcBorders>
+          </w:tcPr>
+          <w:p>
+            <w:pPr>
+              <w:rPr>
+                <w:rFonts w:ascii="Times New Roman" w:cs="Times New Roman" w:eastAsia="Times New Roman" w:hAnsi="Times New Roman"/>
+                <w:sz w:val="20"/>
+                <w:szCs w:val="20"/>
+                <w:highlight w:val="white"/>
+              </w:rPr>
+            </w:pPr>
+            <w:r>
+              <w:rPr>
+                <w:rFonts w:ascii="Times New Roman" w:cs="Times New Roman" w:eastAsia="Times New Roman" w:hAnsi="Times New Roman"/>
+                <w:sz w:val="20"/>
+                <w:szCs w:val="20"/>
+                <w:highlight w:val="white"/>
+                <w:rtl w:val="0"/>
+              </w:rPr>
+              <w:t xml:space="preserve">https://github.com/dmis-lab/biobert-pytorch/blob/master/README.md</w:t>
             </w:r>
           </w:p>
         </w:tc>
@@ -42268,7 +42561,7 @@
                 <w:highlight w:val="white"/>
                 <w:rtl w:val="0"/>
               </w:rPr>
-              <w:t xml:space="preserve">ModernBERT-Large</w:t>
+              <w:t xml:space="preserve">10</w:t>
             </w:r>
           </w:p>
         </w:tc>
@@ -42298,7 +42591,7 @@
                 <w:highlight w:val="white"/>
                 <w:rtl w:val="0"/>
               </w:rPr>
-              <w:t xml:space="preserve">Open Source</w:t>
+              <w:t xml:space="preserve">PubMedBERT-Abstract</w:t>
             </w:r>
           </w:p>
         </w:tc>
@@ -42328,7 +42621,7 @@
                 <w:highlight w:val="white"/>
                 <w:rtl w:val="0"/>
               </w:rPr>
-              <w:t xml:space="preserve">https://huggingface.co/answerdotai/ModernBERT-large</w:t>
+              <w:t xml:space="preserve">Open Source</w:t>
             </w:r>
           </w:p>
         </w:tc>
@@ -42358,7 +42651,7 @@
                 <w:highlight w:val="white"/>
                 <w:rtl w:val="0"/>
               </w:rPr>
-              <w:t xml:space="preserve">1024</w:t>
+              <w:t xml:space="preserve">https://huggingface.co/microsoft/BiomedNLP-BiomedBERT-base-uncased-abstract</w:t>
             </w:r>
           </w:p>
         </w:tc>
@@ -42388,7 +42681,37 @@
                 <w:highlight w:val="white"/>
                 <w:rtl w:val="0"/>
               </w:rPr>
-              <w:t xml:space="preserve">395 Million</w:t>
+              <w:t xml:space="preserve">768</w:t>
+            </w:r>
+          </w:p>
+        </w:tc>
+        <w:tc>
+          <w:tcPr>
+            <w:tcBorders>
+              <w:top w:color="000000" w:space="0" w:sz="5" w:val="single"/>
+              <w:left w:color="000000" w:space="0" w:sz="5" w:val="single"/>
+              <w:bottom w:color="000000" w:space="0" w:sz="5" w:val="single"/>
+              <w:right w:color="000000" w:space="0" w:sz="5" w:val="single"/>
+            </w:tcBorders>
+          </w:tcPr>
+          <w:p>
+            <w:pPr>
+              <w:rPr>
+                <w:rFonts w:ascii="Times New Roman" w:cs="Times New Roman" w:eastAsia="Times New Roman" w:hAnsi="Times New Roman"/>
+                <w:sz w:val="20"/>
+                <w:szCs w:val="20"/>
+                <w:highlight w:val="white"/>
+              </w:rPr>
+            </w:pPr>
+            <w:r>
+              <w:rPr>
+                <w:rFonts w:ascii="Times New Roman" w:cs="Times New Roman" w:eastAsia="Times New Roman" w:hAnsi="Times New Roman"/>
+                <w:sz w:val="20"/>
+                <w:szCs w:val="20"/>
+                <w:highlight w:val="white"/>
+                <w:rtl w:val="0"/>
+              </w:rPr>
+              <w:t xml:space="preserve">110 Million</w:t>
             </w:r>
           </w:p>
         </w:tc>
@@ -42425,7 +42748,7 @@
                 <w:highlight w:val="white"/>
                 <w:rtl w:val="0"/>
               </w:rPr>
-              <w:t xml:space="preserve">Phi-4</w:t>
+              <w:t xml:space="preserve">11</w:t>
             </w:r>
           </w:p>
         </w:tc>
@@ -42455,7 +42778,7 @@
                 <w:highlight w:val="white"/>
                 <w:rtl w:val="0"/>
               </w:rPr>
-              <w:t xml:space="preserve">Open Source</w:t>
+              <w:t xml:space="preserve">ModernBERT-Large</w:t>
             </w:r>
           </w:p>
         </w:tc>
@@ -42485,7 +42808,7 @@
                 <w:highlight w:val="white"/>
                 <w:rtl w:val="0"/>
               </w:rPr>
-              <w:t xml:space="preserve">https://ollama.com/library/phi4</w:t>
+              <w:t xml:space="preserve">Open Source</w:t>
             </w:r>
           </w:p>
         </w:tc>
@@ -42515,7 +42838,7 @@
                 <w:highlight w:val="white"/>
                 <w:rtl w:val="0"/>
               </w:rPr>
-              <w:t xml:space="preserve">5120</w:t>
+              <w:t xml:space="preserve">https://huggingface.co/answerdotai/ModernBERT-large</w:t>
             </w:r>
           </w:p>
         </w:tc>
@@ -42545,7 +42868,2702 @@
                 <w:highlight w:val="white"/>
                 <w:rtl w:val="0"/>
               </w:rPr>
+              <w:t xml:space="preserve">1024</w:t>
+            </w:r>
+          </w:p>
+        </w:tc>
+        <w:tc>
+          <w:tcPr>
+            <w:tcBorders>
+              <w:top w:color="000000" w:space="0" w:sz="5" w:val="single"/>
+              <w:left w:color="000000" w:space="0" w:sz="5" w:val="single"/>
+              <w:bottom w:color="000000" w:space="0" w:sz="5" w:val="single"/>
+              <w:right w:color="000000" w:space="0" w:sz="5" w:val="single"/>
+            </w:tcBorders>
+          </w:tcPr>
+          <w:p>
+            <w:pPr>
+              <w:rPr>
+                <w:rFonts w:ascii="Times New Roman" w:cs="Times New Roman" w:eastAsia="Times New Roman" w:hAnsi="Times New Roman"/>
+                <w:sz w:val="20"/>
+                <w:szCs w:val="20"/>
+                <w:highlight w:val="white"/>
+              </w:rPr>
+            </w:pPr>
+            <w:r>
+              <w:rPr>
+                <w:rFonts w:ascii="Times New Roman" w:cs="Times New Roman" w:eastAsia="Times New Roman" w:hAnsi="Times New Roman"/>
+                <w:sz w:val="20"/>
+                <w:szCs w:val="20"/>
+                <w:highlight w:val="white"/>
+                <w:rtl w:val="0"/>
+              </w:rPr>
+              <w:t xml:space="preserve">395 Million</w:t>
+            </w:r>
+          </w:p>
+        </w:tc>
+      </w:tr>
+      <w:tr>
+        <w:trPr>
+          <w:cantSplit w:val="0"/>
+          <w:trHeight w:val="450" w:hRule="atLeast"/>
+          <w:tblHeader w:val="0"/>
+        </w:trPr>
+        <w:tc>
+          <w:tcPr>
+            <w:tcBorders>
+              <w:top w:color="000000" w:space="0" w:sz="5" w:val="single"/>
+              <w:left w:color="000000" w:space="0" w:sz="5" w:val="single"/>
+              <w:bottom w:color="000000" w:space="0" w:sz="5" w:val="single"/>
+              <w:right w:color="000000" w:space="0" w:sz="5" w:val="single"/>
+            </w:tcBorders>
+          </w:tcPr>
+          <w:p>
+            <w:pPr>
+              <w:rPr>
+                <w:rFonts w:ascii="Times New Roman" w:cs="Times New Roman" w:eastAsia="Times New Roman" w:hAnsi="Times New Roman"/>
+                <w:sz w:val="20"/>
+                <w:szCs w:val="20"/>
+                <w:highlight w:val="white"/>
+              </w:rPr>
+            </w:pPr>
+            <w:r>
+              <w:rPr>
+                <w:rFonts w:ascii="Times New Roman" w:cs="Times New Roman" w:eastAsia="Times New Roman" w:hAnsi="Times New Roman"/>
+                <w:sz w:val="20"/>
+                <w:szCs w:val="20"/>
+                <w:highlight w:val="white"/>
+                <w:rtl w:val="0"/>
+              </w:rPr>
+              <w:t xml:space="preserve">12</w:t>
+            </w:r>
+          </w:p>
+        </w:tc>
+        <w:tc>
+          <w:tcPr>
+            <w:tcBorders>
+              <w:top w:color="000000" w:space="0" w:sz="5" w:val="single"/>
+              <w:left w:color="000000" w:space="0" w:sz="5" w:val="single"/>
+              <w:bottom w:color="000000" w:space="0" w:sz="5" w:val="single"/>
+              <w:right w:color="000000" w:space="0" w:sz="5" w:val="single"/>
+            </w:tcBorders>
+          </w:tcPr>
+          <w:p>
+            <w:pPr>
+              <w:rPr>
+                <w:rFonts w:ascii="Times New Roman" w:cs="Times New Roman" w:eastAsia="Times New Roman" w:hAnsi="Times New Roman"/>
+                <w:sz w:val="20"/>
+                <w:szCs w:val="20"/>
+                <w:highlight w:val="white"/>
+              </w:rPr>
+            </w:pPr>
+            <w:r>
+              <w:rPr>
+                <w:rFonts w:ascii="Times New Roman" w:cs="Times New Roman" w:eastAsia="Times New Roman" w:hAnsi="Times New Roman"/>
+                <w:sz w:val="20"/>
+                <w:szCs w:val="20"/>
+                <w:highlight w:val="white"/>
+                <w:rtl w:val="0"/>
+              </w:rPr>
+              <w:t xml:space="preserve">Phi-4</w:t>
+            </w:r>
+          </w:p>
+        </w:tc>
+        <w:tc>
+          <w:tcPr>
+            <w:tcBorders>
+              <w:top w:color="000000" w:space="0" w:sz="5" w:val="single"/>
+              <w:left w:color="000000" w:space="0" w:sz="5" w:val="single"/>
+              <w:bottom w:color="000000" w:space="0" w:sz="5" w:val="single"/>
+              <w:right w:color="000000" w:space="0" w:sz="5" w:val="single"/>
+            </w:tcBorders>
+          </w:tcPr>
+          <w:p>
+            <w:pPr>
+              <w:rPr>
+                <w:rFonts w:ascii="Times New Roman" w:cs="Times New Roman" w:eastAsia="Times New Roman" w:hAnsi="Times New Roman"/>
+                <w:sz w:val="20"/>
+                <w:szCs w:val="20"/>
+                <w:highlight w:val="white"/>
+              </w:rPr>
+            </w:pPr>
+            <w:r>
+              <w:rPr>
+                <w:rFonts w:ascii="Times New Roman" w:cs="Times New Roman" w:eastAsia="Times New Roman" w:hAnsi="Times New Roman"/>
+                <w:sz w:val="20"/>
+                <w:szCs w:val="20"/>
+                <w:highlight w:val="white"/>
+                <w:rtl w:val="0"/>
+              </w:rPr>
+              <w:t xml:space="preserve">Open Source</w:t>
+            </w:r>
+          </w:p>
+        </w:tc>
+        <w:tc>
+          <w:tcPr>
+            <w:tcBorders>
+              <w:top w:color="000000" w:space="0" w:sz="5" w:val="single"/>
+              <w:left w:color="000000" w:space="0" w:sz="5" w:val="single"/>
+              <w:bottom w:color="000000" w:space="0" w:sz="5" w:val="single"/>
+              <w:right w:color="000000" w:space="0" w:sz="5" w:val="single"/>
+            </w:tcBorders>
+          </w:tcPr>
+          <w:p>
+            <w:pPr>
+              <w:rPr>
+                <w:rFonts w:ascii="Times New Roman" w:cs="Times New Roman" w:eastAsia="Times New Roman" w:hAnsi="Times New Roman"/>
+                <w:sz w:val="20"/>
+                <w:szCs w:val="20"/>
+                <w:highlight w:val="white"/>
+              </w:rPr>
+            </w:pPr>
+            <w:r>
+              <w:rPr>
+                <w:rFonts w:ascii="Times New Roman" w:cs="Times New Roman" w:eastAsia="Times New Roman" w:hAnsi="Times New Roman"/>
+                <w:sz w:val="20"/>
+                <w:szCs w:val="20"/>
+                <w:highlight w:val="white"/>
+                <w:rtl w:val="0"/>
+              </w:rPr>
+              <w:t xml:space="preserve">https://ollama.com/library/phi4</w:t>
+            </w:r>
+          </w:p>
+        </w:tc>
+        <w:tc>
+          <w:tcPr>
+            <w:tcBorders>
+              <w:top w:color="000000" w:space="0" w:sz="5" w:val="single"/>
+              <w:left w:color="000000" w:space="0" w:sz="5" w:val="single"/>
+              <w:bottom w:color="000000" w:space="0" w:sz="5" w:val="single"/>
+              <w:right w:color="000000" w:space="0" w:sz="5" w:val="single"/>
+            </w:tcBorders>
+          </w:tcPr>
+          <w:p>
+            <w:pPr>
+              <w:rPr>
+                <w:rFonts w:ascii="Times New Roman" w:cs="Times New Roman" w:eastAsia="Times New Roman" w:hAnsi="Times New Roman"/>
+                <w:sz w:val="20"/>
+                <w:szCs w:val="20"/>
+                <w:highlight w:val="white"/>
+              </w:rPr>
+            </w:pPr>
+            <w:r>
+              <w:rPr>
+                <w:rFonts w:ascii="Times New Roman" w:cs="Times New Roman" w:eastAsia="Times New Roman" w:hAnsi="Times New Roman"/>
+                <w:sz w:val="20"/>
+                <w:szCs w:val="20"/>
+                <w:highlight w:val="white"/>
+                <w:rtl w:val="0"/>
+              </w:rPr>
+              <w:t xml:space="preserve">5120</w:t>
+            </w:r>
+          </w:p>
+        </w:tc>
+        <w:tc>
+          <w:tcPr>
+            <w:tcBorders>
+              <w:top w:color="000000" w:space="0" w:sz="5" w:val="single"/>
+              <w:left w:color="000000" w:space="0" w:sz="5" w:val="single"/>
+              <w:bottom w:color="000000" w:space="0" w:sz="5" w:val="single"/>
+              <w:right w:color="000000" w:space="0" w:sz="5" w:val="single"/>
+            </w:tcBorders>
+          </w:tcPr>
+          <w:p>
+            <w:pPr>
+              <w:rPr>
+                <w:rFonts w:ascii="Times New Roman" w:cs="Times New Roman" w:eastAsia="Times New Roman" w:hAnsi="Times New Roman"/>
+                <w:sz w:val="20"/>
+                <w:szCs w:val="20"/>
+                <w:highlight w:val="white"/>
+              </w:rPr>
+            </w:pPr>
+            <w:r>
+              <w:rPr>
+                <w:rFonts w:ascii="Times New Roman" w:cs="Times New Roman" w:eastAsia="Times New Roman" w:hAnsi="Times New Roman"/>
+                <w:sz w:val="20"/>
+                <w:szCs w:val="20"/>
+                <w:highlight w:val="white"/>
+                <w:rtl w:val="0"/>
+              </w:rPr>
               <w:t xml:space="preserve">14 Billion</w:t>
+            </w:r>
+          </w:p>
+        </w:tc>
+      </w:tr>
+      <w:tr>
+        <w:trPr>
+          <w:cantSplit w:val="0"/>
+          <w:trHeight w:val="450" w:hRule="atLeast"/>
+          <w:tblHeader w:val="0"/>
+        </w:trPr>
+        <w:tc>
+          <w:tcPr>
+            <w:tcBorders>
+              <w:top w:color="000000" w:space="0" w:sz="5" w:val="single"/>
+              <w:left w:color="000000" w:space="0" w:sz="5" w:val="single"/>
+              <w:bottom w:color="000000" w:space="0" w:sz="5" w:val="single"/>
+              <w:right w:color="000000" w:space="0" w:sz="5" w:val="single"/>
+            </w:tcBorders>
+          </w:tcPr>
+          <w:p>
+            <w:pPr>
+              <w:rPr>
+                <w:rFonts w:ascii="Times New Roman" w:cs="Times New Roman" w:eastAsia="Times New Roman" w:hAnsi="Times New Roman"/>
+                <w:sz w:val="20"/>
+                <w:szCs w:val="20"/>
+                <w:highlight w:val="white"/>
+              </w:rPr>
+            </w:pPr>
+            <w:r>
+              <w:rPr>
+                <w:rFonts w:ascii="Times New Roman" w:cs="Times New Roman" w:eastAsia="Times New Roman" w:hAnsi="Times New Roman"/>
+                <w:sz w:val="20"/>
+                <w:szCs w:val="20"/>
+                <w:highlight w:val="white"/>
+                <w:rtl w:val="0"/>
+              </w:rPr>
+              <w:t xml:space="preserve">13</w:t>
+            </w:r>
+          </w:p>
+        </w:tc>
+        <w:tc>
+          <w:tcPr>
+            <w:tcBorders>
+              <w:top w:color="000000" w:space="0" w:sz="5" w:val="single"/>
+              <w:left w:color="000000" w:space="0" w:sz="5" w:val="single"/>
+              <w:bottom w:color="000000" w:space="0" w:sz="5" w:val="single"/>
+              <w:right w:color="000000" w:space="0" w:sz="5" w:val="single"/>
+            </w:tcBorders>
+          </w:tcPr>
+          <w:p>
+            <w:pPr>
+              <w:rPr>
+                <w:rFonts w:ascii="Times New Roman" w:cs="Times New Roman" w:eastAsia="Times New Roman" w:hAnsi="Times New Roman"/>
+                <w:sz w:val="20"/>
+                <w:szCs w:val="20"/>
+                <w:highlight w:val="white"/>
+              </w:rPr>
+            </w:pPr>
+            <w:r>
+              <w:rPr>
+                <w:rFonts w:ascii="Times New Roman" w:cs="Times New Roman" w:eastAsia="Times New Roman" w:hAnsi="Times New Roman"/>
+                <w:sz w:val="20"/>
+                <w:szCs w:val="20"/>
+                <w:highlight w:val="white"/>
+                <w:rtl w:val="0"/>
+              </w:rPr>
+              <w:t xml:space="preserve">e5-large</w:t>
+            </w:r>
+          </w:p>
+        </w:tc>
+        <w:tc>
+          <w:tcPr>
+            <w:tcBorders>
+              <w:top w:color="000000" w:space="0" w:sz="5" w:val="single"/>
+              <w:left w:color="000000" w:space="0" w:sz="5" w:val="single"/>
+              <w:bottom w:color="000000" w:space="0" w:sz="5" w:val="single"/>
+              <w:right w:color="000000" w:space="0" w:sz="5" w:val="single"/>
+            </w:tcBorders>
+          </w:tcPr>
+          <w:p>
+            <w:pPr>
+              <w:rPr>
+                <w:rFonts w:ascii="Times New Roman" w:cs="Times New Roman" w:eastAsia="Times New Roman" w:hAnsi="Times New Roman"/>
+                <w:sz w:val="20"/>
+                <w:szCs w:val="20"/>
+                <w:highlight w:val="white"/>
+              </w:rPr>
+            </w:pPr>
+            <w:r>
+              <w:rPr>
+                <w:rFonts w:ascii="Times New Roman" w:cs="Times New Roman" w:eastAsia="Times New Roman" w:hAnsi="Times New Roman"/>
+                <w:sz w:val="20"/>
+                <w:szCs w:val="20"/>
+                <w:highlight w:val="white"/>
+                <w:rtl w:val="0"/>
+              </w:rPr>
+              <w:t xml:space="preserve">Open Source</w:t>
+            </w:r>
+          </w:p>
+        </w:tc>
+        <w:tc>
+          <w:tcPr>
+            <w:tcBorders>
+              <w:top w:color="000000" w:space="0" w:sz="5" w:val="single"/>
+              <w:left w:color="000000" w:space="0" w:sz="5" w:val="single"/>
+              <w:bottom w:color="000000" w:space="0" w:sz="5" w:val="single"/>
+              <w:right w:color="000000" w:space="0" w:sz="5" w:val="single"/>
+            </w:tcBorders>
+          </w:tcPr>
+          <w:p>
+            <w:pPr>
+              <w:rPr>
+                <w:rFonts w:ascii="Times New Roman" w:cs="Times New Roman" w:eastAsia="Times New Roman" w:hAnsi="Times New Roman"/>
+                <w:sz w:val="20"/>
+                <w:szCs w:val="20"/>
+                <w:highlight w:val="white"/>
+              </w:rPr>
+            </w:pPr>
+            <w:r>
+              <w:rPr>
+                <w:rtl w:val="0"/>
+              </w:rPr>
+            </w:r>
+          </w:p>
+        </w:tc>
+        <w:tc>
+          <w:tcPr>
+            <w:tcBorders>
+              <w:top w:color="000000" w:space="0" w:sz="5" w:val="single"/>
+              <w:left w:color="000000" w:space="0" w:sz="5" w:val="single"/>
+              <w:bottom w:color="000000" w:space="0" w:sz="5" w:val="single"/>
+              <w:right w:color="000000" w:space="0" w:sz="5" w:val="single"/>
+            </w:tcBorders>
+          </w:tcPr>
+          <w:p>
+            <w:pPr>
+              <w:rPr>
+                <w:rFonts w:ascii="Times New Roman" w:cs="Times New Roman" w:eastAsia="Times New Roman" w:hAnsi="Times New Roman"/>
+                <w:sz w:val="20"/>
+                <w:szCs w:val="20"/>
+                <w:highlight w:val="white"/>
+              </w:rPr>
+            </w:pPr>
+            <w:r>
+              <w:rPr>
+                <w:rFonts w:ascii="Times New Roman" w:cs="Times New Roman" w:eastAsia="Times New Roman" w:hAnsi="Times New Roman"/>
+                <w:sz w:val="20"/>
+                <w:szCs w:val="20"/>
+                <w:highlight w:val="white"/>
+                <w:rtl w:val="0"/>
+              </w:rPr>
+              <w:t xml:space="preserve">1024</w:t>
+            </w:r>
+          </w:p>
+        </w:tc>
+        <w:tc>
+          <w:tcPr>
+            <w:tcBorders>
+              <w:top w:color="000000" w:space="0" w:sz="5" w:val="single"/>
+              <w:left w:color="000000" w:space="0" w:sz="5" w:val="single"/>
+              <w:bottom w:color="000000" w:space="0" w:sz="5" w:val="single"/>
+              <w:right w:color="000000" w:space="0" w:sz="5" w:val="single"/>
+            </w:tcBorders>
+          </w:tcPr>
+          <w:p>
+            <w:pPr>
+              <w:rPr>
+                <w:rFonts w:ascii="Times New Roman" w:cs="Times New Roman" w:eastAsia="Times New Roman" w:hAnsi="Times New Roman"/>
+                <w:sz w:val="20"/>
+                <w:szCs w:val="20"/>
+                <w:highlight w:val="white"/>
+              </w:rPr>
+            </w:pPr>
+            <w:r>
+              <w:rPr>
+                <w:rtl w:val="0"/>
+              </w:rPr>
+            </w:r>
+          </w:p>
+        </w:tc>
+      </w:tr>
+      <w:tr>
+        <w:trPr>
+          <w:cantSplit w:val="0"/>
+          <w:trHeight w:val="450" w:hRule="atLeast"/>
+          <w:tblHeader w:val="0"/>
+        </w:trPr>
+        <w:tc>
+          <w:tcPr>
+            <w:tcBorders>
+              <w:top w:color="000000" w:space="0" w:sz="5" w:val="single"/>
+              <w:left w:color="000000" w:space="0" w:sz="5" w:val="single"/>
+              <w:bottom w:color="000000" w:space="0" w:sz="5" w:val="single"/>
+              <w:right w:color="000000" w:space="0" w:sz="5" w:val="single"/>
+            </w:tcBorders>
+          </w:tcPr>
+          <w:p>
+            <w:pPr>
+              <w:rPr>
+                <w:rFonts w:ascii="Times New Roman" w:cs="Times New Roman" w:eastAsia="Times New Roman" w:hAnsi="Times New Roman"/>
+                <w:sz w:val="20"/>
+                <w:szCs w:val="20"/>
+                <w:highlight w:val="white"/>
+              </w:rPr>
+            </w:pPr>
+            <w:r>
+              <w:rPr>
+                <w:rFonts w:ascii="Times New Roman" w:cs="Times New Roman" w:eastAsia="Times New Roman" w:hAnsi="Times New Roman"/>
+                <w:sz w:val="20"/>
+                <w:szCs w:val="20"/>
+                <w:highlight w:val="white"/>
+                <w:rtl w:val="0"/>
+              </w:rPr>
+              <w:t xml:space="preserve">14</w:t>
+            </w:r>
+          </w:p>
+        </w:tc>
+        <w:tc>
+          <w:tcPr>
+            <w:tcBorders>
+              <w:top w:color="000000" w:space="0" w:sz="5" w:val="single"/>
+              <w:left w:color="000000" w:space="0" w:sz="5" w:val="single"/>
+              <w:bottom w:color="000000" w:space="0" w:sz="5" w:val="single"/>
+              <w:right w:color="000000" w:space="0" w:sz="5" w:val="single"/>
+            </w:tcBorders>
+          </w:tcPr>
+          <w:p>
+            <w:pPr>
+              <w:rPr>
+                <w:rFonts w:ascii="Times New Roman" w:cs="Times New Roman" w:eastAsia="Times New Roman" w:hAnsi="Times New Roman"/>
+                <w:sz w:val="20"/>
+                <w:szCs w:val="20"/>
+                <w:highlight w:val="white"/>
+              </w:rPr>
+            </w:pPr>
+            <w:r>
+              <w:rPr>
+                <w:rFonts w:ascii="Times New Roman" w:cs="Times New Roman" w:eastAsia="Times New Roman" w:hAnsi="Times New Roman"/>
+                <w:sz w:val="20"/>
+                <w:szCs w:val="20"/>
+                <w:highlight w:val="white"/>
+                <w:rtl w:val="0"/>
+              </w:rPr>
+              <w:t xml:space="preserve">e5-large-v2</w:t>
+            </w:r>
+          </w:p>
+        </w:tc>
+        <w:tc>
+          <w:tcPr>
+            <w:tcBorders>
+              <w:top w:color="000000" w:space="0" w:sz="5" w:val="single"/>
+              <w:left w:color="000000" w:space="0" w:sz="5" w:val="single"/>
+              <w:bottom w:color="000000" w:space="0" w:sz="5" w:val="single"/>
+              <w:right w:color="000000" w:space="0" w:sz="5" w:val="single"/>
+            </w:tcBorders>
+          </w:tcPr>
+          <w:p>
+            <w:pPr>
+              <w:rPr>
+                <w:rFonts w:ascii="Times New Roman" w:cs="Times New Roman" w:eastAsia="Times New Roman" w:hAnsi="Times New Roman"/>
+                <w:sz w:val="20"/>
+                <w:szCs w:val="20"/>
+                <w:highlight w:val="white"/>
+              </w:rPr>
+            </w:pPr>
+            <w:r>
+              <w:rPr>
+                <w:rFonts w:ascii="Times New Roman" w:cs="Times New Roman" w:eastAsia="Times New Roman" w:hAnsi="Times New Roman"/>
+                <w:sz w:val="20"/>
+                <w:szCs w:val="20"/>
+                <w:highlight w:val="white"/>
+                <w:rtl w:val="0"/>
+              </w:rPr>
+              <w:t xml:space="preserve">Open Source</w:t>
+            </w:r>
+          </w:p>
+        </w:tc>
+        <w:tc>
+          <w:tcPr>
+            <w:tcBorders>
+              <w:top w:color="000000" w:space="0" w:sz="5" w:val="single"/>
+              <w:left w:color="000000" w:space="0" w:sz="5" w:val="single"/>
+              <w:bottom w:color="000000" w:space="0" w:sz="5" w:val="single"/>
+              <w:right w:color="000000" w:space="0" w:sz="5" w:val="single"/>
+            </w:tcBorders>
+          </w:tcPr>
+          <w:p>
+            <w:pPr>
+              <w:rPr>
+                <w:rFonts w:ascii="Times New Roman" w:cs="Times New Roman" w:eastAsia="Times New Roman" w:hAnsi="Times New Roman"/>
+                <w:sz w:val="20"/>
+                <w:szCs w:val="20"/>
+                <w:highlight w:val="white"/>
+              </w:rPr>
+            </w:pPr>
+            <w:r>
+              <w:rPr>
+                <w:rtl w:val="0"/>
+              </w:rPr>
+            </w:r>
+          </w:p>
+        </w:tc>
+        <w:tc>
+          <w:tcPr>
+            <w:tcBorders>
+              <w:top w:color="000000" w:space="0" w:sz="5" w:val="single"/>
+              <w:left w:color="000000" w:space="0" w:sz="5" w:val="single"/>
+              <w:bottom w:color="000000" w:space="0" w:sz="5" w:val="single"/>
+              <w:right w:color="000000" w:space="0" w:sz="5" w:val="single"/>
+            </w:tcBorders>
+          </w:tcPr>
+          <w:p>
+            <w:pPr>
+              <w:rPr>
+                <w:rFonts w:ascii="Times New Roman" w:cs="Times New Roman" w:eastAsia="Times New Roman" w:hAnsi="Times New Roman"/>
+                <w:sz w:val="20"/>
+                <w:szCs w:val="20"/>
+                <w:highlight w:val="white"/>
+              </w:rPr>
+            </w:pPr>
+            <w:r>
+              <w:rPr>
+                <w:rFonts w:ascii="Times New Roman" w:cs="Times New Roman" w:eastAsia="Times New Roman" w:hAnsi="Times New Roman"/>
+                <w:sz w:val="20"/>
+                <w:szCs w:val="20"/>
+                <w:highlight w:val="white"/>
+                <w:rtl w:val="0"/>
+              </w:rPr>
+              <w:t xml:space="preserve">1024</w:t>
+            </w:r>
+          </w:p>
+        </w:tc>
+        <w:tc>
+          <w:tcPr>
+            <w:tcBorders>
+              <w:top w:color="000000" w:space="0" w:sz="5" w:val="single"/>
+              <w:left w:color="000000" w:space="0" w:sz="5" w:val="single"/>
+              <w:bottom w:color="000000" w:space="0" w:sz="5" w:val="single"/>
+              <w:right w:color="000000" w:space="0" w:sz="5" w:val="single"/>
+            </w:tcBorders>
+          </w:tcPr>
+          <w:p>
+            <w:pPr>
+              <w:rPr>
+                <w:rFonts w:ascii="Times New Roman" w:cs="Times New Roman" w:eastAsia="Times New Roman" w:hAnsi="Times New Roman"/>
+                <w:sz w:val="20"/>
+                <w:szCs w:val="20"/>
+                <w:highlight w:val="white"/>
+              </w:rPr>
+            </w:pPr>
+            <w:r>
+              <w:rPr>
+                <w:rtl w:val="0"/>
+              </w:rPr>
+            </w:r>
+          </w:p>
+        </w:tc>
+      </w:tr>
+      <w:tr>
+        <w:trPr>
+          <w:cantSplit w:val="0"/>
+          <w:trHeight w:val="450" w:hRule="atLeast"/>
+          <w:tblHeader w:val="0"/>
+        </w:trPr>
+        <w:tc>
+          <w:tcPr>
+            <w:tcBorders>
+              <w:top w:color="000000" w:space="0" w:sz="5" w:val="single"/>
+              <w:left w:color="000000" w:space="0" w:sz="5" w:val="single"/>
+              <w:bottom w:color="000000" w:space="0" w:sz="5" w:val="single"/>
+              <w:right w:color="000000" w:space="0" w:sz="5" w:val="single"/>
+            </w:tcBorders>
+          </w:tcPr>
+          <w:p>
+            <w:pPr>
+              <w:rPr>
+                <w:rFonts w:ascii="Times New Roman" w:cs="Times New Roman" w:eastAsia="Times New Roman" w:hAnsi="Times New Roman"/>
+                <w:sz w:val="20"/>
+                <w:szCs w:val="20"/>
+                <w:highlight w:val="white"/>
+              </w:rPr>
+            </w:pPr>
+            <w:r>
+              <w:rPr>
+                <w:rFonts w:ascii="Times New Roman" w:cs="Times New Roman" w:eastAsia="Times New Roman" w:hAnsi="Times New Roman"/>
+                <w:sz w:val="20"/>
+                <w:szCs w:val="20"/>
+                <w:highlight w:val="white"/>
+                <w:rtl w:val="0"/>
+              </w:rPr>
+              <w:t xml:space="preserve">15</w:t>
+            </w:r>
+          </w:p>
+        </w:tc>
+        <w:tc>
+          <w:tcPr>
+            <w:tcBorders>
+              <w:top w:color="000000" w:space="0" w:sz="5" w:val="single"/>
+              <w:left w:color="000000" w:space="0" w:sz="5" w:val="single"/>
+              <w:bottom w:color="000000" w:space="0" w:sz="5" w:val="single"/>
+              <w:right w:color="000000" w:space="0" w:sz="5" w:val="single"/>
+            </w:tcBorders>
+          </w:tcPr>
+          <w:p>
+            <w:pPr>
+              <w:rPr>
+                <w:rFonts w:ascii="Times New Roman" w:cs="Times New Roman" w:eastAsia="Times New Roman" w:hAnsi="Times New Roman"/>
+                <w:sz w:val="20"/>
+                <w:szCs w:val="20"/>
+                <w:highlight w:val="white"/>
+              </w:rPr>
+            </w:pPr>
+            <w:r>
+              <w:rPr>
+                <w:rFonts w:ascii="Times New Roman" w:cs="Times New Roman" w:eastAsia="Times New Roman" w:hAnsi="Times New Roman"/>
+                <w:sz w:val="20"/>
+                <w:szCs w:val="20"/>
+                <w:highlight w:val="white"/>
+                <w:rtl w:val="0"/>
+              </w:rPr>
+              <w:t xml:space="preserve">all-mpnet-base-v2</w:t>
+            </w:r>
+          </w:p>
+        </w:tc>
+        <w:tc>
+          <w:tcPr>
+            <w:tcBorders>
+              <w:top w:color="000000" w:space="0" w:sz="5" w:val="single"/>
+              <w:left w:color="000000" w:space="0" w:sz="5" w:val="single"/>
+              <w:bottom w:color="000000" w:space="0" w:sz="5" w:val="single"/>
+              <w:right w:color="000000" w:space="0" w:sz="5" w:val="single"/>
+            </w:tcBorders>
+          </w:tcPr>
+          <w:p>
+            <w:pPr>
+              <w:rPr>
+                <w:rFonts w:ascii="Times New Roman" w:cs="Times New Roman" w:eastAsia="Times New Roman" w:hAnsi="Times New Roman"/>
+                <w:sz w:val="20"/>
+                <w:szCs w:val="20"/>
+                <w:highlight w:val="white"/>
+              </w:rPr>
+            </w:pPr>
+            <w:r>
+              <w:rPr>
+                <w:rFonts w:ascii="Times New Roman" w:cs="Times New Roman" w:eastAsia="Times New Roman" w:hAnsi="Times New Roman"/>
+                <w:sz w:val="20"/>
+                <w:szCs w:val="20"/>
+                <w:highlight w:val="white"/>
+                <w:rtl w:val="0"/>
+              </w:rPr>
+              <w:t xml:space="preserve">Open Source</w:t>
+            </w:r>
+          </w:p>
+        </w:tc>
+        <w:tc>
+          <w:tcPr>
+            <w:tcBorders>
+              <w:top w:color="000000" w:space="0" w:sz="5" w:val="single"/>
+              <w:left w:color="000000" w:space="0" w:sz="5" w:val="single"/>
+              <w:bottom w:color="000000" w:space="0" w:sz="5" w:val="single"/>
+              <w:right w:color="000000" w:space="0" w:sz="5" w:val="single"/>
+            </w:tcBorders>
+          </w:tcPr>
+          <w:p>
+            <w:pPr>
+              <w:rPr>
+                <w:rFonts w:ascii="Times New Roman" w:cs="Times New Roman" w:eastAsia="Times New Roman" w:hAnsi="Times New Roman"/>
+                <w:sz w:val="20"/>
+                <w:szCs w:val="20"/>
+                <w:highlight w:val="white"/>
+              </w:rPr>
+            </w:pPr>
+            <w:r>
+              <w:rPr>
+                <w:rtl w:val="0"/>
+              </w:rPr>
+            </w:r>
+          </w:p>
+        </w:tc>
+        <w:tc>
+          <w:tcPr>
+            <w:tcBorders>
+              <w:top w:color="000000" w:space="0" w:sz="5" w:val="single"/>
+              <w:left w:color="000000" w:space="0" w:sz="5" w:val="single"/>
+              <w:bottom w:color="000000" w:space="0" w:sz="5" w:val="single"/>
+              <w:right w:color="000000" w:space="0" w:sz="5" w:val="single"/>
+            </w:tcBorders>
+          </w:tcPr>
+          <w:p>
+            <w:pPr>
+              <w:rPr>
+                <w:rFonts w:ascii="Times New Roman" w:cs="Times New Roman" w:eastAsia="Times New Roman" w:hAnsi="Times New Roman"/>
+                <w:sz w:val="20"/>
+                <w:szCs w:val="20"/>
+                <w:highlight w:val="white"/>
+              </w:rPr>
+            </w:pPr>
+            <w:r>
+              <w:rPr>
+                <w:rFonts w:ascii="Times New Roman" w:cs="Times New Roman" w:eastAsia="Times New Roman" w:hAnsi="Times New Roman"/>
+                <w:sz w:val="20"/>
+                <w:szCs w:val="20"/>
+                <w:highlight w:val="white"/>
+                <w:rtl w:val="0"/>
+              </w:rPr>
+              <w:t xml:space="preserve">768</w:t>
+            </w:r>
+          </w:p>
+        </w:tc>
+        <w:tc>
+          <w:tcPr>
+            <w:tcBorders>
+              <w:top w:color="000000" w:space="0" w:sz="5" w:val="single"/>
+              <w:left w:color="000000" w:space="0" w:sz="5" w:val="single"/>
+              <w:bottom w:color="000000" w:space="0" w:sz="5" w:val="single"/>
+              <w:right w:color="000000" w:space="0" w:sz="5" w:val="single"/>
+            </w:tcBorders>
+          </w:tcPr>
+          <w:p>
+            <w:pPr>
+              <w:rPr>
+                <w:rFonts w:ascii="Times New Roman" w:cs="Times New Roman" w:eastAsia="Times New Roman" w:hAnsi="Times New Roman"/>
+                <w:sz w:val="20"/>
+                <w:szCs w:val="20"/>
+                <w:highlight w:val="white"/>
+              </w:rPr>
+            </w:pPr>
+            <w:r>
+              <w:rPr>
+                <w:rtl w:val="0"/>
+              </w:rPr>
+            </w:r>
+          </w:p>
+        </w:tc>
+      </w:tr>
+      <w:tr>
+        <w:trPr>
+          <w:cantSplit w:val="0"/>
+          <w:trHeight w:val="450" w:hRule="atLeast"/>
+          <w:tblHeader w:val="0"/>
+        </w:trPr>
+        <w:tc>
+          <w:tcPr>
+            <w:tcBorders>
+              <w:top w:color="000000" w:space="0" w:sz="5" w:val="single"/>
+              <w:left w:color="000000" w:space="0" w:sz="5" w:val="single"/>
+              <w:bottom w:color="000000" w:space="0" w:sz="5" w:val="single"/>
+              <w:right w:color="000000" w:space="0" w:sz="5" w:val="single"/>
+            </w:tcBorders>
+          </w:tcPr>
+          <w:p>
+            <w:pPr>
+              <w:rPr>
+                <w:rFonts w:ascii="Times New Roman" w:cs="Times New Roman" w:eastAsia="Times New Roman" w:hAnsi="Times New Roman"/>
+                <w:sz w:val="20"/>
+                <w:szCs w:val="20"/>
+                <w:highlight w:val="white"/>
+              </w:rPr>
+            </w:pPr>
+            <w:r>
+              <w:rPr>
+                <w:rFonts w:ascii="Times New Roman" w:cs="Times New Roman" w:eastAsia="Times New Roman" w:hAnsi="Times New Roman"/>
+                <w:sz w:val="20"/>
+                <w:szCs w:val="20"/>
+                <w:highlight w:val="white"/>
+                <w:rtl w:val="0"/>
+              </w:rPr>
+              <w:t xml:space="preserve">16</w:t>
+            </w:r>
+          </w:p>
+        </w:tc>
+        <w:tc>
+          <w:tcPr>
+            <w:tcBorders>
+              <w:top w:color="000000" w:space="0" w:sz="5" w:val="single"/>
+              <w:left w:color="000000" w:space="0" w:sz="5" w:val="single"/>
+              <w:bottom w:color="000000" w:space="0" w:sz="5" w:val="single"/>
+              <w:right w:color="000000" w:space="0" w:sz="5" w:val="single"/>
+            </w:tcBorders>
+          </w:tcPr>
+          <w:p>
+            <w:pPr>
+              <w:rPr>
+                <w:rFonts w:ascii="Times New Roman" w:cs="Times New Roman" w:eastAsia="Times New Roman" w:hAnsi="Times New Roman"/>
+                <w:sz w:val="20"/>
+                <w:szCs w:val="20"/>
+                <w:highlight w:val="white"/>
+              </w:rPr>
+            </w:pPr>
+            <w:r>
+              <w:rPr>
+                <w:rFonts w:ascii="Times New Roman" w:cs="Times New Roman" w:eastAsia="Times New Roman" w:hAnsi="Times New Roman"/>
+                <w:sz w:val="20"/>
+                <w:szCs w:val="20"/>
+                <w:highlight w:val="white"/>
+                <w:rtl w:val="0"/>
+              </w:rPr>
+              <w:t xml:space="preserve">gtr-t5-large</w:t>
+            </w:r>
+          </w:p>
+        </w:tc>
+        <w:tc>
+          <w:tcPr>
+            <w:tcBorders>
+              <w:top w:color="000000" w:space="0" w:sz="5" w:val="single"/>
+              <w:left w:color="000000" w:space="0" w:sz="5" w:val="single"/>
+              <w:bottom w:color="000000" w:space="0" w:sz="5" w:val="single"/>
+              <w:right w:color="000000" w:space="0" w:sz="5" w:val="single"/>
+            </w:tcBorders>
+          </w:tcPr>
+          <w:p>
+            <w:pPr>
+              <w:rPr>
+                <w:rFonts w:ascii="Times New Roman" w:cs="Times New Roman" w:eastAsia="Times New Roman" w:hAnsi="Times New Roman"/>
+                <w:sz w:val="20"/>
+                <w:szCs w:val="20"/>
+                <w:highlight w:val="white"/>
+              </w:rPr>
+            </w:pPr>
+            <w:r>
+              <w:rPr>
+                <w:rFonts w:ascii="Times New Roman" w:cs="Times New Roman" w:eastAsia="Times New Roman" w:hAnsi="Times New Roman"/>
+                <w:sz w:val="20"/>
+                <w:szCs w:val="20"/>
+                <w:highlight w:val="white"/>
+                <w:rtl w:val="0"/>
+              </w:rPr>
+              <w:t xml:space="preserve">Open Source</w:t>
+            </w:r>
+          </w:p>
+        </w:tc>
+        <w:tc>
+          <w:tcPr>
+            <w:tcBorders>
+              <w:top w:color="000000" w:space="0" w:sz="5" w:val="single"/>
+              <w:left w:color="000000" w:space="0" w:sz="5" w:val="single"/>
+              <w:bottom w:color="000000" w:space="0" w:sz="5" w:val="single"/>
+              <w:right w:color="000000" w:space="0" w:sz="5" w:val="single"/>
+            </w:tcBorders>
+          </w:tcPr>
+          <w:p>
+            <w:pPr>
+              <w:rPr>
+                <w:rFonts w:ascii="Times New Roman" w:cs="Times New Roman" w:eastAsia="Times New Roman" w:hAnsi="Times New Roman"/>
+                <w:sz w:val="20"/>
+                <w:szCs w:val="20"/>
+                <w:highlight w:val="white"/>
+              </w:rPr>
+            </w:pPr>
+            <w:r>
+              <w:rPr>
+                <w:rtl w:val="0"/>
+              </w:rPr>
+            </w:r>
+          </w:p>
+        </w:tc>
+        <w:tc>
+          <w:tcPr>
+            <w:tcBorders>
+              <w:top w:color="000000" w:space="0" w:sz="5" w:val="single"/>
+              <w:left w:color="000000" w:space="0" w:sz="5" w:val="single"/>
+              <w:bottom w:color="000000" w:space="0" w:sz="5" w:val="single"/>
+              <w:right w:color="000000" w:space="0" w:sz="5" w:val="single"/>
+            </w:tcBorders>
+          </w:tcPr>
+          <w:p>
+            <w:pPr>
+              <w:rPr>
+                <w:rFonts w:ascii="Times New Roman" w:cs="Times New Roman" w:eastAsia="Times New Roman" w:hAnsi="Times New Roman"/>
+                <w:sz w:val="20"/>
+                <w:szCs w:val="20"/>
+                <w:highlight w:val="white"/>
+              </w:rPr>
+            </w:pPr>
+            <w:r>
+              <w:rPr>
+                <w:rFonts w:ascii="Times New Roman" w:cs="Times New Roman" w:eastAsia="Times New Roman" w:hAnsi="Times New Roman"/>
+                <w:sz w:val="20"/>
+                <w:szCs w:val="20"/>
+                <w:highlight w:val="white"/>
+                <w:rtl w:val="0"/>
+              </w:rPr>
+              <w:t xml:space="preserve">768</w:t>
+            </w:r>
+          </w:p>
+        </w:tc>
+        <w:tc>
+          <w:tcPr>
+            <w:tcBorders>
+              <w:top w:color="000000" w:space="0" w:sz="5" w:val="single"/>
+              <w:left w:color="000000" w:space="0" w:sz="5" w:val="single"/>
+              <w:bottom w:color="000000" w:space="0" w:sz="5" w:val="single"/>
+              <w:right w:color="000000" w:space="0" w:sz="5" w:val="single"/>
+            </w:tcBorders>
+          </w:tcPr>
+          <w:p>
+            <w:pPr>
+              <w:rPr>
+                <w:rFonts w:ascii="Times New Roman" w:cs="Times New Roman" w:eastAsia="Times New Roman" w:hAnsi="Times New Roman"/>
+                <w:sz w:val="20"/>
+                <w:szCs w:val="20"/>
+                <w:highlight w:val="white"/>
+              </w:rPr>
+            </w:pPr>
+            <w:r>
+              <w:rPr>
+                <w:rtl w:val="0"/>
+              </w:rPr>
+            </w:r>
+          </w:p>
+        </w:tc>
+      </w:tr>
+      <w:tr>
+        <w:trPr>
+          <w:cantSplit w:val="0"/>
+          <w:trHeight w:val="450" w:hRule="atLeast"/>
+          <w:tblHeader w:val="0"/>
+        </w:trPr>
+        <w:tc>
+          <w:tcPr>
+            <w:tcBorders>
+              <w:top w:color="000000" w:space="0" w:sz="5" w:val="single"/>
+              <w:left w:color="000000" w:space="0" w:sz="5" w:val="single"/>
+              <w:bottom w:color="000000" w:space="0" w:sz="5" w:val="single"/>
+              <w:right w:color="000000" w:space="0" w:sz="5" w:val="single"/>
+            </w:tcBorders>
+          </w:tcPr>
+          <w:p>
+            <w:pPr>
+              <w:rPr>
+                <w:rFonts w:ascii="Times New Roman" w:cs="Times New Roman" w:eastAsia="Times New Roman" w:hAnsi="Times New Roman"/>
+                <w:sz w:val="20"/>
+                <w:szCs w:val="20"/>
+                <w:highlight w:val="white"/>
+              </w:rPr>
+            </w:pPr>
+            <w:r>
+              <w:rPr>
+                <w:rFonts w:ascii="Times New Roman" w:cs="Times New Roman" w:eastAsia="Times New Roman" w:hAnsi="Times New Roman"/>
+                <w:sz w:val="20"/>
+                <w:szCs w:val="20"/>
+                <w:highlight w:val="white"/>
+                <w:rtl w:val="0"/>
+              </w:rPr>
+              <w:t xml:space="preserve">17</w:t>
+            </w:r>
+          </w:p>
+        </w:tc>
+        <w:tc>
+          <w:tcPr>
+            <w:tcBorders>
+              <w:top w:color="000000" w:space="0" w:sz="5" w:val="single"/>
+              <w:left w:color="000000" w:space="0" w:sz="5" w:val="single"/>
+              <w:bottom w:color="000000" w:space="0" w:sz="5" w:val="single"/>
+              <w:right w:color="000000" w:space="0" w:sz="5" w:val="single"/>
+            </w:tcBorders>
+          </w:tcPr>
+          <w:p>
+            <w:pPr>
+              <w:rPr>
+                <w:rFonts w:ascii="Times New Roman" w:cs="Times New Roman" w:eastAsia="Times New Roman" w:hAnsi="Times New Roman"/>
+                <w:sz w:val="20"/>
+                <w:szCs w:val="20"/>
+                <w:highlight w:val="white"/>
+              </w:rPr>
+            </w:pPr>
+            <w:r>
+              <w:rPr>
+                <w:rFonts w:ascii="Times New Roman" w:cs="Times New Roman" w:eastAsia="Times New Roman" w:hAnsi="Times New Roman"/>
+                <w:sz w:val="20"/>
+                <w:szCs w:val="20"/>
+                <w:highlight w:val="white"/>
+                <w:rtl w:val="0"/>
+              </w:rPr>
+              <w:t xml:space="preserve">all-MiniLM-L12-v2</w:t>
+            </w:r>
+          </w:p>
+        </w:tc>
+        <w:tc>
+          <w:tcPr>
+            <w:tcBorders>
+              <w:top w:color="000000" w:space="0" w:sz="5" w:val="single"/>
+              <w:left w:color="000000" w:space="0" w:sz="5" w:val="single"/>
+              <w:bottom w:color="000000" w:space="0" w:sz="5" w:val="single"/>
+              <w:right w:color="000000" w:space="0" w:sz="5" w:val="single"/>
+            </w:tcBorders>
+          </w:tcPr>
+          <w:p>
+            <w:pPr>
+              <w:rPr>
+                <w:rFonts w:ascii="Times New Roman" w:cs="Times New Roman" w:eastAsia="Times New Roman" w:hAnsi="Times New Roman"/>
+                <w:sz w:val="20"/>
+                <w:szCs w:val="20"/>
+                <w:highlight w:val="white"/>
+              </w:rPr>
+            </w:pPr>
+            <w:r>
+              <w:rPr>
+                <w:rFonts w:ascii="Times New Roman" w:cs="Times New Roman" w:eastAsia="Times New Roman" w:hAnsi="Times New Roman"/>
+                <w:sz w:val="20"/>
+                <w:szCs w:val="20"/>
+                <w:highlight w:val="white"/>
+                <w:rtl w:val="0"/>
+              </w:rPr>
+              <w:t xml:space="preserve">Open Source</w:t>
+            </w:r>
+          </w:p>
+        </w:tc>
+        <w:tc>
+          <w:tcPr>
+            <w:tcBorders>
+              <w:top w:color="000000" w:space="0" w:sz="5" w:val="single"/>
+              <w:left w:color="000000" w:space="0" w:sz="5" w:val="single"/>
+              <w:bottom w:color="000000" w:space="0" w:sz="5" w:val="single"/>
+              <w:right w:color="000000" w:space="0" w:sz="5" w:val="single"/>
+            </w:tcBorders>
+          </w:tcPr>
+          <w:p>
+            <w:pPr>
+              <w:rPr>
+                <w:rFonts w:ascii="Times New Roman" w:cs="Times New Roman" w:eastAsia="Times New Roman" w:hAnsi="Times New Roman"/>
+                <w:sz w:val="20"/>
+                <w:szCs w:val="20"/>
+                <w:highlight w:val="white"/>
+              </w:rPr>
+            </w:pPr>
+            <w:r>
+              <w:rPr>
+                <w:rtl w:val="0"/>
+              </w:rPr>
+            </w:r>
+          </w:p>
+        </w:tc>
+        <w:tc>
+          <w:tcPr>
+            <w:tcBorders>
+              <w:top w:color="000000" w:space="0" w:sz="5" w:val="single"/>
+              <w:left w:color="000000" w:space="0" w:sz="5" w:val="single"/>
+              <w:bottom w:color="000000" w:space="0" w:sz="5" w:val="single"/>
+              <w:right w:color="000000" w:space="0" w:sz="5" w:val="single"/>
+            </w:tcBorders>
+          </w:tcPr>
+          <w:p>
+            <w:pPr>
+              <w:rPr>
+                <w:rFonts w:ascii="Times New Roman" w:cs="Times New Roman" w:eastAsia="Times New Roman" w:hAnsi="Times New Roman"/>
+                <w:sz w:val="20"/>
+                <w:szCs w:val="20"/>
+                <w:highlight w:val="white"/>
+              </w:rPr>
+            </w:pPr>
+            <w:r>
+              <w:rPr>
+                <w:rFonts w:ascii="Times New Roman" w:cs="Times New Roman" w:eastAsia="Times New Roman" w:hAnsi="Times New Roman"/>
+                <w:sz w:val="20"/>
+                <w:szCs w:val="20"/>
+                <w:highlight w:val="white"/>
+                <w:rtl w:val="0"/>
+              </w:rPr>
+              <w:t xml:space="preserve">384</w:t>
+            </w:r>
+          </w:p>
+        </w:tc>
+        <w:tc>
+          <w:tcPr>
+            <w:tcBorders>
+              <w:top w:color="000000" w:space="0" w:sz="5" w:val="single"/>
+              <w:left w:color="000000" w:space="0" w:sz="5" w:val="single"/>
+              <w:bottom w:color="000000" w:space="0" w:sz="5" w:val="single"/>
+              <w:right w:color="000000" w:space="0" w:sz="5" w:val="single"/>
+            </w:tcBorders>
+          </w:tcPr>
+          <w:p>
+            <w:pPr>
+              <w:rPr>
+                <w:rFonts w:ascii="Times New Roman" w:cs="Times New Roman" w:eastAsia="Times New Roman" w:hAnsi="Times New Roman"/>
+                <w:sz w:val="20"/>
+                <w:szCs w:val="20"/>
+                <w:highlight w:val="white"/>
+              </w:rPr>
+            </w:pPr>
+            <w:r>
+              <w:rPr>
+                <w:rtl w:val="0"/>
+              </w:rPr>
+            </w:r>
+          </w:p>
+        </w:tc>
+      </w:tr>
+      <w:tr>
+        <w:trPr>
+          <w:cantSplit w:val="0"/>
+          <w:trHeight w:val="450" w:hRule="atLeast"/>
+          <w:tblHeader w:val="0"/>
+        </w:trPr>
+        <w:tc>
+          <w:tcPr>
+            <w:tcBorders>
+              <w:top w:color="000000" w:space="0" w:sz="5" w:val="single"/>
+              <w:left w:color="000000" w:space="0" w:sz="5" w:val="single"/>
+              <w:bottom w:color="000000" w:space="0" w:sz="5" w:val="single"/>
+              <w:right w:color="000000" w:space="0" w:sz="5" w:val="single"/>
+            </w:tcBorders>
+          </w:tcPr>
+          <w:p>
+            <w:pPr>
+              <w:rPr>
+                <w:rFonts w:ascii="Times New Roman" w:cs="Times New Roman" w:eastAsia="Times New Roman" w:hAnsi="Times New Roman"/>
+                <w:sz w:val="20"/>
+                <w:szCs w:val="20"/>
+                <w:highlight w:val="white"/>
+              </w:rPr>
+            </w:pPr>
+            <w:r>
+              <w:rPr>
+                <w:rFonts w:ascii="Times New Roman" w:cs="Times New Roman" w:eastAsia="Times New Roman" w:hAnsi="Times New Roman"/>
+                <w:sz w:val="20"/>
+                <w:szCs w:val="20"/>
+                <w:highlight w:val="white"/>
+                <w:rtl w:val="0"/>
+              </w:rPr>
+              <w:t xml:space="preserve">18</w:t>
+            </w:r>
+          </w:p>
+        </w:tc>
+        <w:tc>
+          <w:tcPr>
+            <w:tcBorders>
+              <w:top w:color="000000" w:space="0" w:sz="5" w:val="single"/>
+              <w:left w:color="000000" w:space="0" w:sz="5" w:val="single"/>
+              <w:bottom w:color="000000" w:space="0" w:sz="5" w:val="single"/>
+              <w:right w:color="000000" w:space="0" w:sz="5" w:val="single"/>
+            </w:tcBorders>
+          </w:tcPr>
+          <w:p>
+            <w:pPr>
+              <w:rPr>
+                <w:rFonts w:ascii="Times New Roman" w:cs="Times New Roman" w:eastAsia="Times New Roman" w:hAnsi="Times New Roman"/>
+                <w:sz w:val="20"/>
+                <w:szCs w:val="20"/>
+                <w:highlight w:val="white"/>
+              </w:rPr>
+            </w:pPr>
+            <w:r>
+              <w:rPr>
+                <w:rFonts w:ascii="Times New Roman" w:cs="Times New Roman" w:eastAsia="Times New Roman" w:hAnsi="Times New Roman"/>
+                <w:sz w:val="20"/>
+                <w:szCs w:val="20"/>
+                <w:highlight w:val="white"/>
+                <w:rtl w:val="0"/>
+              </w:rPr>
+              <w:t xml:space="preserve">all-MiniLM-L6-v2</w:t>
+            </w:r>
+          </w:p>
+        </w:tc>
+        <w:tc>
+          <w:tcPr>
+            <w:tcBorders>
+              <w:top w:color="000000" w:space="0" w:sz="5" w:val="single"/>
+              <w:left w:color="000000" w:space="0" w:sz="5" w:val="single"/>
+              <w:bottom w:color="000000" w:space="0" w:sz="5" w:val="single"/>
+              <w:right w:color="000000" w:space="0" w:sz="5" w:val="single"/>
+            </w:tcBorders>
+          </w:tcPr>
+          <w:p>
+            <w:pPr>
+              <w:rPr>
+                <w:rFonts w:ascii="Times New Roman" w:cs="Times New Roman" w:eastAsia="Times New Roman" w:hAnsi="Times New Roman"/>
+                <w:sz w:val="20"/>
+                <w:szCs w:val="20"/>
+                <w:highlight w:val="white"/>
+              </w:rPr>
+            </w:pPr>
+            <w:r>
+              <w:rPr>
+                <w:rFonts w:ascii="Times New Roman" w:cs="Times New Roman" w:eastAsia="Times New Roman" w:hAnsi="Times New Roman"/>
+                <w:sz w:val="20"/>
+                <w:szCs w:val="20"/>
+                <w:highlight w:val="white"/>
+                <w:rtl w:val="0"/>
+              </w:rPr>
+              <w:t xml:space="preserve">Open Source</w:t>
+            </w:r>
+          </w:p>
+        </w:tc>
+        <w:tc>
+          <w:tcPr>
+            <w:tcBorders>
+              <w:top w:color="000000" w:space="0" w:sz="5" w:val="single"/>
+              <w:left w:color="000000" w:space="0" w:sz="5" w:val="single"/>
+              <w:bottom w:color="000000" w:space="0" w:sz="5" w:val="single"/>
+              <w:right w:color="000000" w:space="0" w:sz="5" w:val="single"/>
+            </w:tcBorders>
+          </w:tcPr>
+          <w:p>
+            <w:pPr>
+              <w:rPr>
+                <w:rFonts w:ascii="Times New Roman" w:cs="Times New Roman" w:eastAsia="Times New Roman" w:hAnsi="Times New Roman"/>
+                <w:sz w:val="20"/>
+                <w:szCs w:val="20"/>
+                <w:highlight w:val="white"/>
+              </w:rPr>
+            </w:pPr>
+            <w:r>
+              <w:rPr>
+                <w:rtl w:val="0"/>
+              </w:rPr>
+            </w:r>
+          </w:p>
+        </w:tc>
+        <w:tc>
+          <w:tcPr>
+            <w:tcBorders>
+              <w:top w:color="000000" w:space="0" w:sz="5" w:val="single"/>
+              <w:left w:color="000000" w:space="0" w:sz="5" w:val="single"/>
+              <w:bottom w:color="000000" w:space="0" w:sz="5" w:val="single"/>
+              <w:right w:color="000000" w:space="0" w:sz="5" w:val="single"/>
+            </w:tcBorders>
+          </w:tcPr>
+          <w:p>
+            <w:pPr>
+              <w:rPr>
+                <w:rFonts w:ascii="Times New Roman" w:cs="Times New Roman" w:eastAsia="Times New Roman" w:hAnsi="Times New Roman"/>
+                <w:sz w:val="20"/>
+                <w:szCs w:val="20"/>
+                <w:highlight w:val="white"/>
+              </w:rPr>
+            </w:pPr>
+            <w:r>
+              <w:rPr>
+                <w:rFonts w:ascii="Times New Roman" w:cs="Times New Roman" w:eastAsia="Times New Roman" w:hAnsi="Times New Roman"/>
+                <w:sz w:val="20"/>
+                <w:szCs w:val="20"/>
+                <w:highlight w:val="white"/>
+                <w:rtl w:val="0"/>
+              </w:rPr>
+              <w:t xml:space="preserve">384</w:t>
+            </w:r>
+          </w:p>
+        </w:tc>
+        <w:tc>
+          <w:tcPr>
+            <w:tcBorders>
+              <w:top w:color="000000" w:space="0" w:sz="5" w:val="single"/>
+              <w:left w:color="000000" w:space="0" w:sz="5" w:val="single"/>
+              <w:bottom w:color="000000" w:space="0" w:sz="5" w:val="single"/>
+              <w:right w:color="000000" w:space="0" w:sz="5" w:val="single"/>
+            </w:tcBorders>
+          </w:tcPr>
+          <w:p>
+            <w:pPr>
+              <w:rPr>
+                <w:rFonts w:ascii="Times New Roman" w:cs="Times New Roman" w:eastAsia="Times New Roman" w:hAnsi="Times New Roman"/>
+                <w:sz w:val="20"/>
+                <w:szCs w:val="20"/>
+                <w:highlight w:val="white"/>
+              </w:rPr>
+            </w:pPr>
+            <w:r>
+              <w:rPr>
+                <w:rtl w:val="0"/>
+              </w:rPr>
+            </w:r>
+          </w:p>
+        </w:tc>
+      </w:tr>
+      <w:tr>
+        <w:trPr>
+          <w:cantSplit w:val="0"/>
+          <w:trHeight w:val="450" w:hRule="atLeast"/>
+          <w:tblHeader w:val="0"/>
+        </w:trPr>
+        <w:tc>
+          <w:tcPr>
+            <w:tcBorders>
+              <w:top w:color="000000" w:space="0" w:sz="5" w:val="single"/>
+              <w:left w:color="000000" w:space="0" w:sz="5" w:val="single"/>
+              <w:bottom w:color="000000" w:space="0" w:sz="5" w:val="single"/>
+              <w:right w:color="000000" w:space="0" w:sz="5" w:val="single"/>
+            </w:tcBorders>
+          </w:tcPr>
+          <w:p>
+            <w:pPr>
+              <w:rPr>
+                <w:rFonts w:ascii="Times New Roman" w:cs="Times New Roman" w:eastAsia="Times New Roman" w:hAnsi="Times New Roman"/>
+                <w:sz w:val="20"/>
+                <w:szCs w:val="20"/>
+                <w:highlight w:val="white"/>
+              </w:rPr>
+            </w:pPr>
+            <w:r>
+              <w:rPr>
+                <w:rFonts w:ascii="Times New Roman" w:cs="Times New Roman" w:eastAsia="Times New Roman" w:hAnsi="Times New Roman"/>
+                <w:sz w:val="20"/>
+                <w:szCs w:val="20"/>
+                <w:highlight w:val="white"/>
+                <w:rtl w:val="0"/>
+              </w:rPr>
+              <w:t xml:space="preserve">19</w:t>
+            </w:r>
+          </w:p>
+        </w:tc>
+        <w:tc>
+          <w:tcPr>
+            <w:tcBorders>
+              <w:top w:color="000000" w:space="0" w:sz="5" w:val="single"/>
+              <w:left w:color="000000" w:space="0" w:sz="5" w:val="single"/>
+              <w:bottom w:color="000000" w:space="0" w:sz="5" w:val="single"/>
+              <w:right w:color="000000" w:space="0" w:sz="5" w:val="single"/>
+            </w:tcBorders>
+          </w:tcPr>
+          <w:p>
+            <w:pPr>
+              <w:rPr>
+                <w:rFonts w:ascii="Times New Roman" w:cs="Times New Roman" w:eastAsia="Times New Roman" w:hAnsi="Times New Roman"/>
+                <w:sz w:val="20"/>
+                <w:szCs w:val="20"/>
+                <w:highlight w:val="white"/>
+              </w:rPr>
+            </w:pPr>
+            <w:r>
+              <w:rPr>
+                <w:rFonts w:ascii="Times New Roman" w:cs="Times New Roman" w:eastAsia="Times New Roman" w:hAnsi="Times New Roman"/>
+                <w:sz w:val="20"/>
+                <w:szCs w:val="20"/>
+                <w:highlight w:val="white"/>
+                <w:rtl w:val="0"/>
+              </w:rPr>
+              <w:t xml:space="preserve">all-roberta-large-v1</w:t>
+            </w:r>
+          </w:p>
+        </w:tc>
+        <w:tc>
+          <w:tcPr>
+            <w:tcBorders>
+              <w:top w:color="000000" w:space="0" w:sz="5" w:val="single"/>
+              <w:left w:color="000000" w:space="0" w:sz="5" w:val="single"/>
+              <w:bottom w:color="000000" w:space="0" w:sz="5" w:val="single"/>
+              <w:right w:color="000000" w:space="0" w:sz="5" w:val="single"/>
+            </w:tcBorders>
+          </w:tcPr>
+          <w:p>
+            <w:pPr>
+              <w:rPr>
+                <w:rFonts w:ascii="Times New Roman" w:cs="Times New Roman" w:eastAsia="Times New Roman" w:hAnsi="Times New Roman"/>
+                <w:sz w:val="20"/>
+                <w:szCs w:val="20"/>
+                <w:highlight w:val="white"/>
+              </w:rPr>
+            </w:pPr>
+            <w:r>
+              <w:rPr>
+                <w:rFonts w:ascii="Times New Roman" w:cs="Times New Roman" w:eastAsia="Times New Roman" w:hAnsi="Times New Roman"/>
+                <w:sz w:val="20"/>
+                <w:szCs w:val="20"/>
+                <w:highlight w:val="white"/>
+                <w:rtl w:val="0"/>
+              </w:rPr>
+              <w:t xml:space="preserve">Open Source</w:t>
+            </w:r>
+          </w:p>
+        </w:tc>
+        <w:tc>
+          <w:tcPr>
+            <w:tcBorders>
+              <w:top w:color="000000" w:space="0" w:sz="5" w:val="single"/>
+              <w:left w:color="000000" w:space="0" w:sz="5" w:val="single"/>
+              <w:bottom w:color="000000" w:space="0" w:sz="5" w:val="single"/>
+              <w:right w:color="000000" w:space="0" w:sz="5" w:val="single"/>
+            </w:tcBorders>
+          </w:tcPr>
+          <w:p>
+            <w:pPr>
+              <w:rPr>
+                <w:rFonts w:ascii="Times New Roman" w:cs="Times New Roman" w:eastAsia="Times New Roman" w:hAnsi="Times New Roman"/>
+                <w:sz w:val="20"/>
+                <w:szCs w:val="20"/>
+                <w:highlight w:val="white"/>
+              </w:rPr>
+            </w:pPr>
+            <w:r>
+              <w:rPr>
+                <w:rtl w:val="0"/>
+              </w:rPr>
+            </w:r>
+          </w:p>
+        </w:tc>
+        <w:tc>
+          <w:tcPr>
+            <w:tcBorders>
+              <w:top w:color="000000" w:space="0" w:sz="5" w:val="single"/>
+              <w:left w:color="000000" w:space="0" w:sz="5" w:val="single"/>
+              <w:bottom w:color="000000" w:space="0" w:sz="5" w:val="single"/>
+              <w:right w:color="000000" w:space="0" w:sz="5" w:val="single"/>
+            </w:tcBorders>
+          </w:tcPr>
+          <w:p>
+            <w:pPr>
+              <w:rPr>
+                <w:rFonts w:ascii="Times New Roman" w:cs="Times New Roman" w:eastAsia="Times New Roman" w:hAnsi="Times New Roman"/>
+                <w:sz w:val="20"/>
+                <w:szCs w:val="20"/>
+                <w:highlight w:val="white"/>
+              </w:rPr>
+            </w:pPr>
+            <w:r>
+              <w:rPr>
+                <w:rFonts w:ascii="Times New Roman" w:cs="Times New Roman" w:eastAsia="Times New Roman" w:hAnsi="Times New Roman"/>
+                <w:sz w:val="20"/>
+                <w:szCs w:val="20"/>
+                <w:highlight w:val="white"/>
+                <w:rtl w:val="0"/>
+              </w:rPr>
+              <w:t xml:space="preserve">1024</w:t>
+            </w:r>
+          </w:p>
+        </w:tc>
+        <w:tc>
+          <w:tcPr>
+            <w:tcBorders>
+              <w:top w:color="000000" w:space="0" w:sz="5" w:val="single"/>
+              <w:left w:color="000000" w:space="0" w:sz="5" w:val="single"/>
+              <w:bottom w:color="000000" w:space="0" w:sz="5" w:val="single"/>
+              <w:right w:color="000000" w:space="0" w:sz="5" w:val="single"/>
+            </w:tcBorders>
+          </w:tcPr>
+          <w:p>
+            <w:pPr>
+              <w:rPr>
+                <w:rFonts w:ascii="Times New Roman" w:cs="Times New Roman" w:eastAsia="Times New Roman" w:hAnsi="Times New Roman"/>
+                <w:sz w:val="20"/>
+                <w:szCs w:val="20"/>
+                <w:highlight w:val="white"/>
+              </w:rPr>
+            </w:pPr>
+            <w:r>
+              <w:rPr>
+                <w:rtl w:val="0"/>
+              </w:rPr>
+            </w:r>
+          </w:p>
+        </w:tc>
+      </w:tr>
+      <w:tr>
+        <w:trPr>
+          <w:cantSplit w:val="0"/>
+          <w:trHeight w:val="450" w:hRule="atLeast"/>
+          <w:tblHeader w:val="0"/>
+        </w:trPr>
+        <w:tc>
+          <w:tcPr>
+            <w:tcBorders>
+              <w:top w:color="000000" w:space="0" w:sz="5" w:val="single"/>
+              <w:left w:color="000000" w:space="0" w:sz="5" w:val="single"/>
+              <w:bottom w:color="000000" w:space="0" w:sz="5" w:val="single"/>
+              <w:right w:color="000000" w:space="0" w:sz="5" w:val="single"/>
+            </w:tcBorders>
+          </w:tcPr>
+          <w:p>
+            <w:pPr>
+              <w:rPr>
+                <w:rFonts w:ascii="Times New Roman" w:cs="Times New Roman" w:eastAsia="Times New Roman" w:hAnsi="Times New Roman"/>
+                <w:sz w:val="20"/>
+                <w:szCs w:val="20"/>
+                <w:highlight w:val="white"/>
+              </w:rPr>
+            </w:pPr>
+            <w:r>
+              <w:rPr>
+                <w:rFonts w:ascii="Times New Roman" w:cs="Times New Roman" w:eastAsia="Times New Roman" w:hAnsi="Times New Roman"/>
+                <w:sz w:val="20"/>
+                <w:szCs w:val="20"/>
+                <w:highlight w:val="white"/>
+                <w:rtl w:val="0"/>
+              </w:rPr>
+              <w:t xml:space="preserve">20</w:t>
+            </w:r>
+          </w:p>
+        </w:tc>
+        <w:tc>
+          <w:tcPr>
+            <w:tcBorders>
+              <w:top w:color="000000" w:space="0" w:sz="5" w:val="single"/>
+              <w:left w:color="000000" w:space="0" w:sz="5" w:val="single"/>
+              <w:bottom w:color="000000" w:space="0" w:sz="5" w:val="single"/>
+              <w:right w:color="000000" w:space="0" w:sz="5" w:val="single"/>
+            </w:tcBorders>
+          </w:tcPr>
+          <w:p>
+            <w:pPr>
+              <w:rPr>
+                <w:rFonts w:ascii="Times New Roman" w:cs="Times New Roman" w:eastAsia="Times New Roman" w:hAnsi="Times New Roman"/>
+                <w:sz w:val="20"/>
+                <w:szCs w:val="20"/>
+                <w:highlight w:val="white"/>
+              </w:rPr>
+            </w:pPr>
+            <w:r>
+              <w:rPr>
+                <w:rFonts w:ascii="Times New Roman" w:cs="Times New Roman" w:eastAsia="Times New Roman" w:hAnsi="Times New Roman"/>
+                <w:sz w:val="20"/>
+                <w:szCs w:val="20"/>
+                <w:highlight w:val="white"/>
+                <w:rtl w:val="0"/>
+              </w:rPr>
+              <w:t xml:space="preserve">SapBERT</w:t>
+            </w:r>
+          </w:p>
+        </w:tc>
+        <w:tc>
+          <w:tcPr>
+            <w:tcBorders>
+              <w:top w:color="000000" w:space="0" w:sz="5" w:val="single"/>
+              <w:left w:color="000000" w:space="0" w:sz="5" w:val="single"/>
+              <w:bottom w:color="000000" w:space="0" w:sz="5" w:val="single"/>
+              <w:right w:color="000000" w:space="0" w:sz="5" w:val="single"/>
+            </w:tcBorders>
+          </w:tcPr>
+          <w:p>
+            <w:pPr>
+              <w:rPr>
+                <w:rFonts w:ascii="Times New Roman" w:cs="Times New Roman" w:eastAsia="Times New Roman" w:hAnsi="Times New Roman"/>
+                <w:sz w:val="20"/>
+                <w:szCs w:val="20"/>
+                <w:highlight w:val="white"/>
+              </w:rPr>
+            </w:pPr>
+            <w:r>
+              <w:rPr>
+                <w:rFonts w:ascii="Times New Roman" w:cs="Times New Roman" w:eastAsia="Times New Roman" w:hAnsi="Times New Roman"/>
+                <w:sz w:val="20"/>
+                <w:szCs w:val="20"/>
+                <w:highlight w:val="white"/>
+                <w:rtl w:val="0"/>
+              </w:rPr>
+              <w:t xml:space="preserve">Open Source</w:t>
+            </w:r>
+          </w:p>
+        </w:tc>
+        <w:tc>
+          <w:tcPr>
+            <w:tcBorders>
+              <w:top w:color="000000" w:space="0" w:sz="5" w:val="single"/>
+              <w:left w:color="000000" w:space="0" w:sz="5" w:val="single"/>
+              <w:bottom w:color="000000" w:space="0" w:sz="5" w:val="single"/>
+              <w:right w:color="000000" w:space="0" w:sz="5" w:val="single"/>
+            </w:tcBorders>
+          </w:tcPr>
+          <w:p>
+            <w:pPr>
+              <w:rPr>
+                <w:rFonts w:ascii="Times New Roman" w:cs="Times New Roman" w:eastAsia="Times New Roman" w:hAnsi="Times New Roman"/>
+                <w:sz w:val="20"/>
+                <w:szCs w:val="20"/>
+                <w:highlight w:val="white"/>
+              </w:rPr>
+            </w:pPr>
+            <w:r>
+              <w:rPr>
+                <w:rtl w:val="0"/>
+              </w:rPr>
+            </w:r>
+          </w:p>
+        </w:tc>
+        <w:tc>
+          <w:tcPr>
+            <w:tcBorders>
+              <w:top w:color="000000" w:space="0" w:sz="5" w:val="single"/>
+              <w:left w:color="000000" w:space="0" w:sz="5" w:val="single"/>
+              <w:bottom w:color="000000" w:space="0" w:sz="5" w:val="single"/>
+              <w:right w:color="000000" w:space="0" w:sz="5" w:val="single"/>
+            </w:tcBorders>
+          </w:tcPr>
+          <w:p>
+            <w:pPr>
+              <w:rPr>
+                <w:rFonts w:ascii="Times New Roman" w:cs="Times New Roman" w:eastAsia="Times New Roman" w:hAnsi="Times New Roman"/>
+                <w:sz w:val="20"/>
+                <w:szCs w:val="20"/>
+                <w:highlight w:val="white"/>
+              </w:rPr>
+            </w:pPr>
+            <w:r>
+              <w:rPr>
+                <w:rFonts w:ascii="Times New Roman" w:cs="Times New Roman" w:eastAsia="Times New Roman" w:hAnsi="Times New Roman"/>
+                <w:sz w:val="20"/>
+                <w:szCs w:val="20"/>
+                <w:highlight w:val="white"/>
+                <w:rtl w:val="0"/>
+              </w:rPr>
+              <w:t xml:space="preserve">768</w:t>
+            </w:r>
+          </w:p>
+        </w:tc>
+        <w:tc>
+          <w:tcPr>
+            <w:tcBorders>
+              <w:top w:color="000000" w:space="0" w:sz="5" w:val="single"/>
+              <w:left w:color="000000" w:space="0" w:sz="5" w:val="single"/>
+              <w:bottom w:color="000000" w:space="0" w:sz="5" w:val="single"/>
+              <w:right w:color="000000" w:space="0" w:sz="5" w:val="single"/>
+            </w:tcBorders>
+          </w:tcPr>
+          <w:p>
+            <w:pPr>
+              <w:rPr>
+                <w:rFonts w:ascii="Times New Roman" w:cs="Times New Roman" w:eastAsia="Times New Roman" w:hAnsi="Times New Roman"/>
+                <w:sz w:val="20"/>
+                <w:szCs w:val="20"/>
+                <w:highlight w:val="white"/>
+              </w:rPr>
+            </w:pPr>
+            <w:r>
+              <w:rPr>
+                <w:rtl w:val="0"/>
+              </w:rPr>
+            </w:r>
+          </w:p>
+        </w:tc>
+      </w:tr>
+      <w:tr>
+        <w:trPr>
+          <w:cantSplit w:val="0"/>
+          <w:trHeight w:val="450" w:hRule="atLeast"/>
+          <w:tblHeader w:val="0"/>
+        </w:trPr>
+        <w:tc>
+          <w:tcPr>
+            <w:tcBorders>
+              <w:top w:color="000000" w:space="0" w:sz="5" w:val="single"/>
+              <w:left w:color="000000" w:space="0" w:sz="5" w:val="single"/>
+              <w:bottom w:color="000000" w:space="0" w:sz="5" w:val="single"/>
+              <w:right w:color="000000" w:space="0" w:sz="5" w:val="single"/>
+            </w:tcBorders>
+          </w:tcPr>
+          <w:p>
+            <w:pPr>
+              <w:rPr>
+                <w:rFonts w:ascii="Times New Roman" w:cs="Times New Roman" w:eastAsia="Times New Roman" w:hAnsi="Times New Roman"/>
+                <w:sz w:val="20"/>
+                <w:szCs w:val="20"/>
+                <w:highlight w:val="white"/>
+              </w:rPr>
+            </w:pPr>
+            <w:r>
+              <w:rPr>
+                <w:rFonts w:ascii="Times New Roman" w:cs="Times New Roman" w:eastAsia="Times New Roman" w:hAnsi="Times New Roman"/>
+                <w:sz w:val="20"/>
+                <w:szCs w:val="20"/>
+                <w:highlight w:val="white"/>
+                <w:rtl w:val="0"/>
+              </w:rPr>
+              <w:t xml:space="preserve">21</w:t>
+            </w:r>
+          </w:p>
+        </w:tc>
+        <w:tc>
+          <w:tcPr>
+            <w:tcBorders>
+              <w:top w:color="000000" w:space="0" w:sz="5" w:val="single"/>
+              <w:left w:color="000000" w:space="0" w:sz="5" w:val="single"/>
+              <w:bottom w:color="000000" w:space="0" w:sz="5" w:val="single"/>
+              <w:right w:color="000000" w:space="0" w:sz="5" w:val="single"/>
+            </w:tcBorders>
+          </w:tcPr>
+          <w:p>
+            <w:pPr>
+              <w:rPr>
+                <w:rFonts w:ascii="Times New Roman" w:cs="Times New Roman" w:eastAsia="Times New Roman" w:hAnsi="Times New Roman"/>
+                <w:sz w:val="20"/>
+                <w:szCs w:val="20"/>
+                <w:highlight w:val="white"/>
+              </w:rPr>
+            </w:pPr>
+            <w:r>
+              <w:rPr>
+                <w:rFonts w:ascii="Times New Roman" w:cs="Times New Roman" w:eastAsia="Times New Roman" w:hAnsi="Times New Roman"/>
+                <w:sz w:val="20"/>
+                <w:szCs w:val="20"/>
+                <w:highlight w:val="white"/>
+                <w:rtl w:val="0"/>
+              </w:rPr>
+              <w:t xml:space="preserve">clinicalBERT</w:t>
+            </w:r>
+          </w:p>
+        </w:tc>
+        <w:tc>
+          <w:tcPr>
+            <w:tcBorders>
+              <w:top w:color="000000" w:space="0" w:sz="5" w:val="single"/>
+              <w:left w:color="000000" w:space="0" w:sz="5" w:val="single"/>
+              <w:bottom w:color="000000" w:space="0" w:sz="5" w:val="single"/>
+              <w:right w:color="000000" w:space="0" w:sz="5" w:val="single"/>
+            </w:tcBorders>
+          </w:tcPr>
+          <w:p>
+            <w:pPr>
+              <w:rPr>
+                <w:rFonts w:ascii="Times New Roman" w:cs="Times New Roman" w:eastAsia="Times New Roman" w:hAnsi="Times New Roman"/>
+                <w:sz w:val="20"/>
+                <w:szCs w:val="20"/>
+                <w:highlight w:val="white"/>
+              </w:rPr>
+            </w:pPr>
+            <w:r>
+              <w:rPr>
+                <w:rFonts w:ascii="Times New Roman" w:cs="Times New Roman" w:eastAsia="Times New Roman" w:hAnsi="Times New Roman"/>
+                <w:sz w:val="20"/>
+                <w:szCs w:val="20"/>
+                <w:highlight w:val="white"/>
+                <w:rtl w:val="0"/>
+              </w:rPr>
+              <w:t xml:space="preserve">Open Source</w:t>
+            </w:r>
+          </w:p>
+        </w:tc>
+        <w:tc>
+          <w:tcPr>
+            <w:tcBorders>
+              <w:top w:color="000000" w:space="0" w:sz="5" w:val="single"/>
+              <w:left w:color="000000" w:space="0" w:sz="5" w:val="single"/>
+              <w:bottom w:color="000000" w:space="0" w:sz="5" w:val="single"/>
+              <w:right w:color="000000" w:space="0" w:sz="5" w:val="single"/>
+            </w:tcBorders>
+          </w:tcPr>
+          <w:p>
+            <w:pPr>
+              <w:rPr>
+                <w:rFonts w:ascii="Times New Roman" w:cs="Times New Roman" w:eastAsia="Times New Roman" w:hAnsi="Times New Roman"/>
+                <w:sz w:val="20"/>
+                <w:szCs w:val="20"/>
+                <w:highlight w:val="white"/>
+              </w:rPr>
+            </w:pPr>
+            <w:r>
+              <w:rPr>
+                <w:rtl w:val="0"/>
+              </w:rPr>
+            </w:r>
+          </w:p>
+        </w:tc>
+        <w:tc>
+          <w:tcPr>
+            <w:tcBorders>
+              <w:top w:color="000000" w:space="0" w:sz="5" w:val="single"/>
+              <w:left w:color="000000" w:space="0" w:sz="5" w:val="single"/>
+              <w:bottom w:color="000000" w:space="0" w:sz="5" w:val="single"/>
+              <w:right w:color="000000" w:space="0" w:sz="5" w:val="single"/>
+            </w:tcBorders>
+          </w:tcPr>
+          <w:p>
+            <w:pPr>
+              <w:rPr>
+                <w:rFonts w:ascii="Times New Roman" w:cs="Times New Roman" w:eastAsia="Times New Roman" w:hAnsi="Times New Roman"/>
+                <w:sz w:val="20"/>
+                <w:szCs w:val="20"/>
+                <w:highlight w:val="white"/>
+              </w:rPr>
+            </w:pPr>
+            <w:r>
+              <w:rPr>
+                <w:rFonts w:ascii="Times New Roman" w:cs="Times New Roman" w:eastAsia="Times New Roman" w:hAnsi="Times New Roman"/>
+                <w:sz w:val="20"/>
+                <w:szCs w:val="20"/>
+                <w:highlight w:val="white"/>
+                <w:rtl w:val="0"/>
+              </w:rPr>
+              <w:t xml:space="preserve">768</w:t>
+            </w:r>
+          </w:p>
+        </w:tc>
+        <w:tc>
+          <w:tcPr>
+            <w:tcBorders>
+              <w:top w:color="000000" w:space="0" w:sz="5" w:val="single"/>
+              <w:left w:color="000000" w:space="0" w:sz="5" w:val="single"/>
+              <w:bottom w:color="000000" w:space="0" w:sz="5" w:val="single"/>
+              <w:right w:color="000000" w:space="0" w:sz="5" w:val="single"/>
+            </w:tcBorders>
+          </w:tcPr>
+          <w:p>
+            <w:pPr>
+              <w:rPr>
+                <w:rFonts w:ascii="Times New Roman" w:cs="Times New Roman" w:eastAsia="Times New Roman" w:hAnsi="Times New Roman"/>
+                <w:sz w:val="20"/>
+                <w:szCs w:val="20"/>
+                <w:highlight w:val="white"/>
+              </w:rPr>
+            </w:pPr>
+            <w:r>
+              <w:rPr>
+                <w:rtl w:val="0"/>
+              </w:rPr>
+            </w:r>
+          </w:p>
+        </w:tc>
+      </w:tr>
+      <w:tr>
+        <w:trPr>
+          <w:cantSplit w:val="0"/>
+          <w:trHeight w:val="450" w:hRule="atLeast"/>
+          <w:tblHeader w:val="0"/>
+        </w:trPr>
+        <w:tc>
+          <w:tcPr>
+            <w:tcBorders>
+              <w:top w:color="000000" w:space="0" w:sz="5" w:val="single"/>
+              <w:left w:color="000000" w:space="0" w:sz="5" w:val="single"/>
+              <w:bottom w:color="000000" w:space="0" w:sz="5" w:val="single"/>
+              <w:right w:color="000000" w:space="0" w:sz="5" w:val="single"/>
+            </w:tcBorders>
+          </w:tcPr>
+          <w:p>
+            <w:pPr>
+              <w:rPr>
+                <w:rFonts w:ascii="Times New Roman" w:cs="Times New Roman" w:eastAsia="Times New Roman" w:hAnsi="Times New Roman"/>
+                <w:sz w:val="20"/>
+                <w:szCs w:val="20"/>
+                <w:highlight w:val="white"/>
+              </w:rPr>
+            </w:pPr>
+            <w:r>
+              <w:rPr>
+                <w:rFonts w:ascii="Times New Roman" w:cs="Times New Roman" w:eastAsia="Times New Roman" w:hAnsi="Times New Roman"/>
+                <w:sz w:val="20"/>
+                <w:szCs w:val="20"/>
+                <w:highlight w:val="white"/>
+                <w:rtl w:val="0"/>
+              </w:rPr>
+              <w:t xml:space="preserve">22</w:t>
+            </w:r>
+          </w:p>
+        </w:tc>
+        <w:tc>
+          <w:tcPr>
+            <w:tcBorders>
+              <w:top w:color="000000" w:space="0" w:sz="5" w:val="single"/>
+              <w:left w:color="000000" w:space="0" w:sz="5" w:val="single"/>
+              <w:bottom w:color="000000" w:space="0" w:sz="5" w:val="single"/>
+              <w:right w:color="000000" w:space="0" w:sz="5" w:val="single"/>
+            </w:tcBorders>
+          </w:tcPr>
+          <w:p>
+            <w:pPr>
+              <w:rPr>
+                <w:rFonts w:ascii="Times New Roman" w:cs="Times New Roman" w:eastAsia="Times New Roman" w:hAnsi="Times New Roman"/>
+                <w:sz w:val="20"/>
+                <w:szCs w:val="20"/>
+                <w:highlight w:val="white"/>
+              </w:rPr>
+            </w:pPr>
+            <w:r>
+              <w:rPr>
+                <w:rFonts w:ascii="Times New Roman" w:cs="Times New Roman" w:eastAsia="Times New Roman" w:hAnsi="Times New Roman"/>
+                <w:sz w:val="20"/>
+                <w:szCs w:val="20"/>
+                <w:highlight w:val="white"/>
+                <w:rtl w:val="0"/>
+              </w:rPr>
+              <w:t xml:space="preserve">LaBSE</w:t>
+            </w:r>
+          </w:p>
+        </w:tc>
+        <w:tc>
+          <w:tcPr>
+            <w:tcBorders>
+              <w:top w:color="000000" w:space="0" w:sz="5" w:val="single"/>
+              <w:left w:color="000000" w:space="0" w:sz="5" w:val="single"/>
+              <w:bottom w:color="000000" w:space="0" w:sz="5" w:val="single"/>
+              <w:right w:color="000000" w:space="0" w:sz="5" w:val="single"/>
+            </w:tcBorders>
+          </w:tcPr>
+          <w:p>
+            <w:pPr>
+              <w:rPr>
+                <w:rFonts w:ascii="Times New Roman" w:cs="Times New Roman" w:eastAsia="Times New Roman" w:hAnsi="Times New Roman"/>
+                <w:sz w:val="20"/>
+                <w:szCs w:val="20"/>
+                <w:highlight w:val="white"/>
+              </w:rPr>
+            </w:pPr>
+            <w:r>
+              <w:rPr>
+                <w:rFonts w:ascii="Times New Roman" w:cs="Times New Roman" w:eastAsia="Times New Roman" w:hAnsi="Times New Roman"/>
+                <w:sz w:val="20"/>
+                <w:szCs w:val="20"/>
+                <w:highlight w:val="white"/>
+                <w:rtl w:val="0"/>
+              </w:rPr>
+              <w:t xml:space="preserve">Open Source</w:t>
+            </w:r>
+          </w:p>
+        </w:tc>
+        <w:tc>
+          <w:tcPr>
+            <w:tcBorders>
+              <w:top w:color="000000" w:space="0" w:sz="5" w:val="single"/>
+              <w:left w:color="000000" w:space="0" w:sz="5" w:val="single"/>
+              <w:bottom w:color="000000" w:space="0" w:sz="5" w:val="single"/>
+              <w:right w:color="000000" w:space="0" w:sz="5" w:val="single"/>
+            </w:tcBorders>
+          </w:tcPr>
+          <w:p>
+            <w:pPr>
+              <w:rPr>
+                <w:rFonts w:ascii="Times New Roman" w:cs="Times New Roman" w:eastAsia="Times New Roman" w:hAnsi="Times New Roman"/>
+                <w:sz w:val="20"/>
+                <w:szCs w:val="20"/>
+                <w:highlight w:val="white"/>
+              </w:rPr>
+            </w:pPr>
+            <w:r>
+              <w:rPr>
+                <w:rtl w:val="0"/>
+              </w:rPr>
+            </w:r>
+          </w:p>
+        </w:tc>
+        <w:tc>
+          <w:tcPr>
+            <w:tcBorders>
+              <w:top w:color="000000" w:space="0" w:sz="5" w:val="single"/>
+              <w:left w:color="000000" w:space="0" w:sz="5" w:val="single"/>
+              <w:bottom w:color="000000" w:space="0" w:sz="5" w:val="single"/>
+              <w:right w:color="000000" w:space="0" w:sz="5" w:val="single"/>
+            </w:tcBorders>
+          </w:tcPr>
+          <w:p>
+            <w:pPr>
+              <w:rPr>
+                <w:rFonts w:ascii="Times New Roman" w:cs="Times New Roman" w:eastAsia="Times New Roman" w:hAnsi="Times New Roman"/>
+                <w:sz w:val="20"/>
+                <w:szCs w:val="20"/>
+                <w:highlight w:val="white"/>
+              </w:rPr>
+            </w:pPr>
+            <w:r>
+              <w:rPr>
+                <w:rFonts w:ascii="Times New Roman" w:cs="Times New Roman" w:eastAsia="Times New Roman" w:hAnsi="Times New Roman"/>
+                <w:sz w:val="20"/>
+                <w:szCs w:val="20"/>
+                <w:highlight w:val="white"/>
+                <w:rtl w:val="0"/>
+              </w:rPr>
+              <w:t xml:space="preserve">768</w:t>
+            </w:r>
+          </w:p>
+        </w:tc>
+        <w:tc>
+          <w:tcPr>
+            <w:tcBorders>
+              <w:top w:color="000000" w:space="0" w:sz="5" w:val="single"/>
+              <w:left w:color="000000" w:space="0" w:sz="5" w:val="single"/>
+              <w:bottom w:color="000000" w:space="0" w:sz="5" w:val="single"/>
+              <w:right w:color="000000" w:space="0" w:sz="5" w:val="single"/>
+            </w:tcBorders>
+          </w:tcPr>
+          <w:p>
+            <w:pPr>
+              <w:rPr>
+                <w:rFonts w:ascii="Times New Roman" w:cs="Times New Roman" w:eastAsia="Times New Roman" w:hAnsi="Times New Roman"/>
+                <w:sz w:val="20"/>
+                <w:szCs w:val="20"/>
+                <w:highlight w:val="white"/>
+              </w:rPr>
+            </w:pPr>
+            <w:r>
+              <w:rPr>
+                <w:rtl w:val="0"/>
+              </w:rPr>
+            </w:r>
+          </w:p>
+        </w:tc>
+      </w:tr>
+      <w:tr>
+        <w:trPr>
+          <w:cantSplit w:val="0"/>
+          <w:trHeight w:val="450" w:hRule="atLeast"/>
+          <w:tblHeader w:val="0"/>
+        </w:trPr>
+        <w:tc>
+          <w:tcPr>
+            <w:tcBorders>
+              <w:top w:color="000000" w:space="0" w:sz="5" w:val="single"/>
+              <w:left w:color="000000" w:space="0" w:sz="5" w:val="single"/>
+              <w:bottom w:color="000000" w:space="0" w:sz="5" w:val="single"/>
+              <w:right w:color="000000" w:space="0" w:sz="5" w:val="single"/>
+            </w:tcBorders>
+          </w:tcPr>
+          <w:p>
+            <w:pPr>
+              <w:rPr>
+                <w:rFonts w:ascii="Times New Roman" w:cs="Times New Roman" w:eastAsia="Times New Roman" w:hAnsi="Times New Roman"/>
+                <w:sz w:val="20"/>
+                <w:szCs w:val="20"/>
+                <w:highlight w:val="white"/>
+              </w:rPr>
+            </w:pPr>
+            <w:r>
+              <w:rPr>
+                <w:rFonts w:ascii="Times New Roman" w:cs="Times New Roman" w:eastAsia="Times New Roman" w:hAnsi="Times New Roman"/>
+                <w:sz w:val="20"/>
+                <w:szCs w:val="20"/>
+                <w:highlight w:val="white"/>
+                <w:rtl w:val="0"/>
+              </w:rPr>
+              <w:t xml:space="preserve">23</w:t>
+            </w:r>
+          </w:p>
+        </w:tc>
+        <w:tc>
+          <w:tcPr>
+            <w:tcBorders>
+              <w:top w:color="000000" w:space="0" w:sz="5" w:val="single"/>
+              <w:left w:color="000000" w:space="0" w:sz="5" w:val="single"/>
+              <w:bottom w:color="000000" w:space="0" w:sz="5" w:val="single"/>
+              <w:right w:color="000000" w:space="0" w:sz="5" w:val="single"/>
+            </w:tcBorders>
+          </w:tcPr>
+          <w:p>
+            <w:pPr>
+              <w:rPr>
+                <w:rFonts w:ascii="Times New Roman" w:cs="Times New Roman" w:eastAsia="Times New Roman" w:hAnsi="Times New Roman"/>
+                <w:sz w:val="20"/>
+                <w:szCs w:val="20"/>
+                <w:highlight w:val="white"/>
+              </w:rPr>
+            </w:pPr>
+            <w:r>
+              <w:rPr>
+                <w:rFonts w:ascii="Times New Roman" w:cs="Times New Roman" w:eastAsia="Times New Roman" w:hAnsi="Times New Roman"/>
+                <w:sz w:val="20"/>
+                <w:szCs w:val="20"/>
+                <w:highlight w:val="white"/>
+                <w:rtl w:val="0"/>
+              </w:rPr>
+              <w:t xml:space="preserve">BioGPT</w:t>
+            </w:r>
+          </w:p>
+        </w:tc>
+        <w:tc>
+          <w:tcPr>
+            <w:tcBorders>
+              <w:top w:color="000000" w:space="0" w:sz="5" w:val="single"/>
+              <w:left w:color="000000" w:space="0" w:sz="5" w:val="single"/>
+              <w:bottom w:color="000000" w:space="0" w:sz="5" w:val="single"/>
+              <w:right w:color="000000" w:space="0" w:sz="5" w:val="single"/>
+            </w:tcBorders>
+          </w:tcPr>
+          <w:p>
+            <w:pPr>
+              <w:rPr>
+                <w:rFonts w:ascii="Times New Roman" w:cs="Times New Roman" w:eastAsia="Times New Roman" w:hAnsi="Times New Roman"/>
+                <w:sz w:val="20"/>
+                <w:szCs w:val="20"/>
+                <w:highlight w:val="white"/>
+              </w:rPr>
+            </w:pPr>
+            <w:r>
+              <w:rPr>
+                <w:rFonts w:ascii="Times New Roman" w:cs="Times New Roman" w:eastAsia="Times New Roman" w:hAnsi="Times New Roman"/>
+                <w:sz w:val="20"/>
+                <w:szCs w:val="20"/>
+                <w:highlight w:val="white"/>
+                <w:rtl w:val="0"/>
+              </w:rPr>
+              <w:t xml:space="preserve">Open Source</w:t>
+            </w:r>
+          </w:p>
+        </w:tc>
+        <w:tc>
+          <w:tcPr>
+            <w:tcBorders>
+              <w:top w:color="000000" w:space="0" w:sz="5" w:val="single"/>
+              <w:left w:color="000000" w:space="0" w:sz="5" w:val="single"/>
+              <w:bottom w:color="000000" w:space="0" w:sz="5" w:val="single"/>
+              <w:right w:color="000000" w:space="0" w:sz="5" w:val="single"/>
+            </w:tcBorders>
+          </w:tcPr>
+          <w:p>
+            <w:pPr>
+              <w:rPr>
+                <w:rFonts w:ascii="Times New Roman" w:cs="Times New Roman" w:eastAsia="Times New Roman" w:hAnsi="Times New Roman"/>
+                <w:sz w:val="20"/>
+                <w:szCs w:val="20"/>
+                <w:highlight w:val="white"/>
+              </w:rPr>
+            </w:pPr>
+            <w:r>
+              <w:rPr>
+                <w:rtl w:val="0"/>
+              </w:rPr>
+            </w:r>
+          </w:p>
+        </w:tc>
+        <w:tc>
+          <w:tcPr>
+            <w:tcBorders>
+              <w:top w:color="000000" w:space="0" w:sz="5" w:val="single"/>
+              <w:left w:color="000000" w:space="0" w:sz="5" w:val="single"/>
+              <w:bottom w:color="000000" w:space="0" w:sz="5" w:val="single"/>
+              <w:right w:color="000000" w:space="0" w:sz="5" w:val="single"/>
+            </w:tcBorders>
+          </w:tcPr>
+          <w:p>
+            <w:pPr>
+              <w:rPr>
+                <w:rFonts w:ascii="Times New Roman" w:cs="Times New Roman" w:eastAsia="Times New Roman" w:hAnsi="Times New Roman"/>
+                <w:sz w:val="20"/>
+                <w:szCs w:val="20"/>
+                <w:highlight w:val="white"/>
+              </w:rPr>
+            </w:pPr>
+            <w:r>
+              <w:rPr>
+                <w:rFonts w:ascii="Times New Roman" w:cs="Times New Roman" w:eastAsia="Times New Roman" w:hAnsi="Times New Roman"/>
+                <w:sz w:val="20"/>
+                <w:szCs w:val="20"/>
+                <w:highlight w:val="white"/>
+                <w:rtl w:val="0"/>
+              </w:rPr>
+              <w:t xml:space="preserve">1024</w:t>
+            </w:r>
+          </w:p>
+        </w:tc>
+        <w:tc>
+          <w:tcPr>
+            <w:tcBorders>
+              <w:top w:color="000000" w:space="0" w:sz="5" w:val="single"/>
+              <w:left w:color="000000" w:space="0" w:sz="5" w:val="single"/>
+              <w:bottom w:color="000000" w:space="0" w:sz="5" w:val="single"/>
+              <w:right w:color="000000" w:space="0" w:sz="5" w:val="single"/>
+            </w:tcBorders>
+          </w:tcPr>
+          <w:p>
+            <w:pPr>
+              <w:rPr>
+                <w:rFonts w:ascii="Times New Roman" w:cs="Times New Roman" w:eastAsia="Times New Roman" w:hAnsi="Times New Roman"/>
+                <w:sz w:val="20"/>
+                <w:szCs w:val="20"/>
+                <w:highlight w:val="white"/>
+              </w:rPr>
+            </w:pPr>
+            <w:r>
+              <w:rPr>
+                <w:rtl w:val="0"/>
+              </w:rPr>
+            </w:r>
+          </w:p>
+        </w:tc>
+      </w:tr>
+      <w:tr>
+        <w:trPr>
+          <w:cantSplit w:val="0"/>
+          <w:trHeight w:val="450" w:hRule="atLeast"/>
+          <w:tblHeader w:val="0"/>
+        </w:trPr>
+        <w:tc>
+          <w:tcPr>
+            <w:tcBorders>
+              <w:top w:color="000000" w:space="0" w:sz="5" w:val="single"/>
+              <w:left w:color="000000" w:space="0" w:sz="5" w:val="single"/>
+              <w:bottom w:color="000000" w:space="0" w:sz="5" w:val="single"/>
+              <w:right w:color="000000" w:space="0" w:sz="5" w:val="single"/>
+            </w:tcBorders>
+          </w:tcPr>
+          <w:p>
+            <w:pPr>
+              <w:rPr>
+                <w:rFonts w:ascii="Times New Roman" w:cs="Times New Roman" w:eastAsia="Times New Roman" w:hAnsi="Times New Roman"/>
+                <w:sz w:val="20"/>
+                <w:szCs w:val="20"/>
+                <w:highlight w:val="white"/>
+              </w:rPr>
+            </w:pPr>
+            <w:r>
+              <w:rPr>
+                <w:rFonts w:ascii="Times New Roman" w:cs="Times New Roman" w:eastAsia="Times New Roman" w:hAnsi="Times New Roman"/>
+                <w:sz w:val="20"/>
+                <w:szCs w:val="20"/>
+                <w:highlight w:val="white"/>
+                <w:rtl w:val="0"/>
+              </w:rPr>
+              <w:t xml:space="preserve">24</w:t>
+            </w:r>
+          </w:p>
+        </w:tc>
+        <w:tc>
+          <w:tcPr>
+            <w:tcBorders>
+              <w:top w:color="000000" w:space="0" w:sz="5" w:val="single"/>
+              <w:left w:color="000000" w:space="0" w:sz="5" w:val="single"/>
+              <w:bottom w:color="000000" w:space="0" w:sz="5" w:val="single"/>
+              <w:right w:color="000000" w:space="0" w:sz="5" w:val="single"/>
+            </w:tcBorders>
+          </w:tcPr>
+          <w:p>
+            <w:pPr>
+              <w:rPr>
+                <w:rFonts w:ascii="Times New Roman" w:cs="Times New Roman" w:eastAsia="Times New Roman" w:hAnsi="Times New Roman"/>
+                <w:sz w:val="20"/>
+                <w:szCs w:val="20"/>
+                <w:highlight w:val="white"/>
+              </w:rPr>
+            </w:pPr>
+            <w:r>
+              <w:rPr>
+                <w:rFonts w:ascii="Times New Roman" w:cs="Times New Roman" w:eastAsia="Times New Roman" w:hAnsi="Times New Roman"/>
+                <w:sz w:val="20"/>
+                <w:szCs w:val="20"/>
+                <w:highlight w:val="white"/>
+                <w:rtl w:val="0"/>
+              </w:rPr>
+              <w:t xml:space="preserve">DeepSeek_8B</w:t>
+            </w:r>
+          </w:p>
+        </w:tc>
+        <w:tc>
+          <w:tcPr>
+            <w:tcBorders>
+              <w:top w:color="000000" w:space="0" w:sz="5" w:val="single"/>
+              <w:left w:color="000000" w:space="0" w:sz="5" w:val="single"/>
+              <w:bottom w:color="000000" w:space="0" w:sz="5" w:val="single"/>
+              <w:right w:color="000000" w:space="0" w:sz="5" w:val="single"/>
+            </w:tcBorders>
+          </w:tcPr>
+          <w:p>
+            <w:pPr>
+              <w:rPr>
+                <w:rFonts w:ascii="Times New Roman" w:cs="Times New Roman" w:eastAsia="Times New Roman" w:hAnsi="Times New Roman"/>
+                <w:sz w:val="20"/>
+                <w:szCs w:val="20"/>
+                <w:highlight w:val="white"/>
+              </w:rPr>
+            </w:pPr>
+            <w:r>
+              <w:rPr>
+                <w:rFonts w:ascii="Times New Roman" w:cs="Times New Roman" w:eastAsia="Times New Roman" w:hAnsi="Times New Roman"/>
+                <w:sz w:val="20"/>
+                <w:szCs w:val="20"/>
+                <w:highlight w:val="white"/>
+                <w:rtl w:val="0"/>
+              </w:rPr>
+              <w:t xml:space="preserve">Open Source</w:t>
+            </w:r>
+          </w:p>
+        </w:tc>
+        <w:tc>
+          <w:tcPr>
+            <w:tcBorders>
+              <w:top w:color="000000" w:space="0" w:sz="5" w:val="single"/>
+              <w:left w:color="000000" w:space="0" w:sz="5" w:val="single"/>
+              <w:bottom w:color="000000" w:space="0" w:sz="5" w:val="single"/>
+              <w:right w:color="000000" w:space="0" w:sz="5" w:val="single"/>
+            </w:tcBorders>
+          </w:tcPr>
+          <w:p>
+            <w:pPr>
+              <w:rPr>
+                <w:rFonts w:ascii="Times New Roman" w:cs="Times New Roman" w:eastAsia="Times New Roman" w:hAnsi="Times New Roman"/>
+                <w:sz w:val="20"/>
+                <w:szCs w:val="20"/>
+                <w:highlight w:val="white"/>
+              </w:rPr>
+            </w:pPr>
+            <w:r>
+              <w:rPr>
+                <w:rtl w:val="0"/>
+              </w:rPr>
+            </w:r>
+          </w:p>
+        </w:tc>
+        <w:tc>
+          <w:tcPr>
+            <w:tcBorders>
+              <w:top w:color="000000" w:space="0" w:sz="5" w:val="single"/>
+              <w:left w:color="000000" w:space="0" w:sz="5" w:val="single"/>
+              <w:bottom w:color="000000" w:space="0" w:sz="5" w:val="single"/>
+              <w:right w:color="000000" w:space="0" w:sz="5" w:val="single"/>
+            </w:tcBorders>
+          </w:tcPr>
+          <w:p>
+            <w:pPr>
+              <w:rPr>
+                <w:rFonts w:ascii="Times New Roman" w:cs="Times New Roman" w:eastAsia="Times New Roman" w:hAnsi="Times New Roman"/>
+                <w:sz w:val="20"/>
+                <w:szCs w:val="20"/>
+                <w:highlight w:val="white"/>
+              </w:rPr>
+            </w:pPr>
+            <w:r>
+              <w:rPr>
+                <w:rFonts w:ascii="Times New Roman" w:cs="Times New Roman" w:eastAsia="Times New Roman" w:hAnsi="Times New Roman"/>
+                <w:sz w:val="20"/>
+                <w:szCs w:val="20"/>
+                <w:highlight w:val="white"/>
+                <w:rtl w:val="0"/>
+              </w:rPr>
+              <w:t xml:space="preserve">4096</w:t>
+            </w:r>
+          </w:p>
+        </w:tc>
+        <w:tc>
+          <w:tcPr>
+            <w:tcBorders>
+              <w:top w:color="000000" w:space="0" w:sz="5" w:val="single"/>
+              <w:left w:color="000000" w:space="0" w:sz="5" w:val="single"/>
+              <w:bottom w:color="000000" w:space="0" w:sz="5" w:val="single"/>
+              <w:right w:color="000000" w:space="0" w:sz="5" w:val="single"/>
+            </w:tcBorders>
+          </w:tcPr>
+          <w:p>
+            <w:pPr>
+              <w:rPr>
+                <w:rFonts w:ascii="Times New Roman" w:cs="Times New Roman" w:eastAsia="Times New Roman" w:hAnsi="Times New Roman"/>
+                <w:sz w:val="20"/>
+                <w:szCs w:val="20"/>
+                <w:highlight w:val="white"/>
+              </w:rPr>
+            </w:pPr>
+            <w:r>
+              <w:rPr>
+                <w:rtl w:val="0"/>
+              </w:rPr>
+            </w:r>
+          </w:p>
+        </w:tc>
+      </w:tr>
+      <w:tr>
+        <w:trPr>
+          <w:cantSplit w:val="0"/>
+          <w:trHeight w:val="450" w:hRule="atLeast"/>
+          <w:tblHeader w:val="0"/>
+        </w:trPr>
+        <w:tc>
+          <w:tcPr>
+            <w:tcBorders>
+              <w:top w:color="000000" w:space="0" w:sz="5" w:val="single"/>
+              <w:left w:color="000000" w:space="0" w:sz="5" w:val="single"/>
+              <w:bottom w:color="000000" w:space="0" w:sz="5" w:val="single"/>
+              <w:right w:color="000000" w:space="0" w:sz="5" w:val="single"/>
+            </w:tcBorders>
+          </w:tcPr>
+          <w:p>
+            <w:pPr>
+              <w:rPr>
+                <w:rFonts w:ascii="Times New Roman" w:cs="Times New Roman" w:eastAsia="Times New Roman" w:hAnsi="Times New Roman"/>
+                <w:sz w:val="20"/>
+                <w:szCs w:val="20"/>
+                <w:highlight w:val="white"/>
+              </w:rPr>
+            </w:pPr>
+            <w:r>
+              <w:rPr>
+                <w:rFonts w:ascii="Times New Roman" w:cs="Times New Roman" w:eastAsia="Times New Roman" w:hAnsi="Times New Roman"/>
+                <w:sz w:val="20"/>
+                <w:szCs w:val="20"/>
+                <w:highlight w:val="white"/>
+                <w:rtl w:val="0"/>
+              </w:rPr>
+              <w:t xml:space="preserve">25</w:t>
+            </w:r>
+          </w:p>
+        </w:tc>
+        <w:tc>
+          <w:tcPr>
+            <w:tcBorders>
+              <w:top w:color="000000" w:space="0" w:sz="5" w:val="single"/>
+              <w:left w:color="000000" w:space="0" w:sz="5" w:val="single"/>
+              <w:bottom w:color="000000" w:space="0" w:sz="5" w:val="single"/>
+              <w:right w:color="000000" w:space="0" w:sz="5" w:val="single"/>
+            </w:tcBorders>
+          </w:tcPr>
+          <w:p>
+            <w:pPr>
+              <w:rPr>
+                <w:rFonts w:ascii="Times New Roman" w:cs="Times New Roman" w:eastAsia="Times New Roman" w:hAnsi="Times New Roman"/>
+                <w:sz w:val="20"/>
+                <w:szCs w:val="20"/>
+                <w:highlight w:val="white"/>
+              </w:rPr>
+            </w:pPr>
+            <w:r>
+              <w:rPr>
+                <w:rFonts w:ascii="Times New Roman" w:cs="Times New Roman" w:eastAsia="Times New Roman" w:hAnsi="Times New Roman"/>
+                <w:sz w:val="20"/>
+                <w:szCs w:val="20"/>
+                <w:highlight w:val="white"/>
+                <w:rtl w:val="0"/>
+              </w:rPr>
+              <w:t xml:space="preserve">sciBERT</w:t>
+            </w:r>
+          </w:p>
+        </w:tc>
+        <w:tc>
+          <w:tcPr>
+            <w:tcBorders>
+              <w:top w:color="000000" w:space="0" w:sz="5" w:val="single"/>
+              <w:left w:color="000000" w:space="0" w:sz="5" w:val="single"/>
+              <w:bottom w:color="000000" w:space="0" w:sz="5" w:val="single"/>
+              <w:right w:color="000000" w:space="0" w:sz="5" w:val="single"/>
+            </w:tcBorders>
+          </w:tcPr>
+          <w:p>
+            <w:pPr>
+              <w:rPr>
+                <w:rFonts w:ascii="Times New Roman" w:cs="Times New Roman" w:eastAsia="Times New Roman" w:hAnsi="Times New Roman"/>
+                <w:sz w:val="20"/>
+                <w:szCs w:val="20"/>
+                <w:highlight w:val="white"/>
+              </w:rPr>
+            </w:pPr>
+            <w:r>
+              <w:rPr>
+                <w:rFonts w:ascii="Times New Roman" w:cs="Times New Roman" w:eastAsia="Times New Roman" w:hAnsi="Times New Roman"/>
+                <w:sz w:val="20"/>
+                <w:szCs w:val="20"/>
+                <w:highlight w:val="white"/>
+                <w:rtl w:val="0"/>
+              </w:rPr>
+              <w:t xml:space="preserve">Open Source</w:t>
+            </w:r>
+          </w:p>
+        </w:tc>
+        <w:tc>
+          <w:tcPr>
+            <w:tcBorders>
+              <w:top w:color="000000" w:space="0" w:sz="5" w:val="single"/>
+              <w:left w:color="000000" w:space="0" w:sz="5" w:val="single"/>
+              <w:bottom w:color="000000" w:space="0" w:sz="5" w:val="single"/>
+              <w:right w:color="000000" w:space="0" w:sz="5" w:val="single"/>
+            </w:tcBorders>
+          </w:tcPr>
+          <w:p>
+            <w:pPr>
+              <w:rPr>
+                <w:rFonts w:ascii="Times New Roman" w:cs="Times New Roman" w:eastAsia="Times New Roman" w:hAnsi="Times New Roman"/>
+                <w:sz w:val="20"/>
+                <w:szCs w:val="20"/>
+                <w:highlight w:val="white"/>
+              </w:rPr>
+            </w:pPr>
+            <w:r>
+              <w:rPr>
+                <w:rtl w:val="0"/>
+              </w:rPr>
+            </w:r>
+          </w:p>
+        </w:tc>
+        <w:tc>
+          <w:tcPr>
+            <w:tcBorders>
+              <w:top w:color="000000" w:space="0" w:sz="5" w:val="single"/>
+              <w:left w:color="000000" w:space="0" w:sz="5" w:val="single"/>
+              <w:bottom w:color="000000" w:space="0" w:sz="5" w:val="single"/>
+              <w:right w:color="000000" w:space="0" w:sz="5" w:val="single"/>
+            </w:tcBorders>
+          </w:tcPr>
+          <w:p>
+            <w:pPr>
+              <w:rPr>
+                <w:rFonts w:ascii="Times New Roman" w:cs="Times New Roman" w:eastAsia="Times New Roman" w:hAnsi="Times New Roman"/>
+                <w:sz w:val="20"/>
+                <w:szCs w:val="20"/>
+                <w:highlight w:val="white"/>
+              </w:rPr>
+            </w:pPr>
+            <w:r>
+              <w:rPr>
+                <w:rFonts w:ascii="Times New Roman" w:cs="Times New Roman" w:eastAsia="Times New Roman" w:hAnsi="Times New Roman"/>
+                <w:sz w:val="20"/>
+                <w:szCs w:val="20"/>
+                <w:highlight w:val="white"/>
+                <w:rtl w:val="0"/>
+              </w:rPr>
+              <w:t xml:space="preserve">768</w:t>
+            </w:r>
+          </w:p>
+        </w:tc>
+        <w:tc>
+          <w:tcPr>
+            <w:tcBorders>
+              <w:top w:color="000000" w:space="0" w:sz="5" w:val="single"/>
+              <w:left w:color="000000" w:space="0" w:sz="5" w:val="single"/>
+              <w:bottom w:color="000000" w:space="0" w:sz="5" w:val="single"/>
+              <w:right w:color="000000" w:space="0" w:sz="5" w:val="single"/>
+            </w:tcBorders>
+          </w:tcPr>
+          <w:p>
+            <w:pPr>
+              <w:rPr>
+                <w:rFonts w:ascii="Times New Roman" w:cs="Times New Roman" w:eastAsia="Times New Roman" w:hAnsi="Times New Roman"/>
+                <w:sz w:val="20"/>
+                <w:szCs w:val="20"/>
+                <w:highlight w:val="white"/>
+              </w:rPr>
+            </w:pPr>
+            <w:r>
+              <w:rPr>
+                <w:rtl w:val="0"/>
+              </w:rPr>
+            </w:r>
+          </w:p>
+        </w:tc>
+      </w:tr>
+      <w:tr>
+        <w:trPr>
+          <w:cantSplit w:val="0"/>
+          <w:trHeight w:val="450" w:hRule="atLeast"/>
+          <w:tblHeader w:val="0"/>
+        </w:trPr>
+        <w:tc>
+          <w:tcPr>
+            <w:tcBorders>
+              <w:top w:color="000000" w:space="0" w:sz="5" w:val="single"/>
+              <w:left w:color="000000" w:space="0" w:sz="5" w:val="single"/>
+              <w:bottom w:color="000000" w:space="0" w:sz="5" w:val="single"/>
+              <w:right w:color="000000" w:space="0" w:sz="5" w:val="single"/>
+            </w:tcBorders>
+          </w:tcPr>
+          <w:p>
+            <w:pPr>
+              <w:rPr>
+                <w:rFonts w:ascii="Times New Roman" w:cs="Times New Roman" w:eastAsia="Times New Roman" w:hAnsi="Times New Roman"/>
+                <w:sz w:val="20"/>
+                <w:szCs w:val="20"/>
+                <w:highlight w:val="white"/>
+              </w:rPr>
+            </w:pPr>
+            <w:r>
+              <w:rPr>
+                <w:rFonts w:ascii="Times New Roman" w:cs="Times New Roman" w:eastAsia="Times New Roman" w:hAnsi="Times New Roman"/>
+                <w:sz w:val="20"/>
+                <w:szCs w:val="20"/>
+                <w:highlight w:val="white"/>
+                <w:rtl w:val="0"/>
+              </w:rPr>
+              <w:t xml:space="preserve">26</w:t>
+            </w:r>
+          </w:p>
+        </w:tc>
+        <w:tc>
+          <w:tcPr>
+            <w:tcBorders>
+              <w:top w:color="000000" w:space="0" w:sz="5" w:val="single"/>
+              <w:left w:color="000000" w:space="0" w:sz="5" w:val="single"/>
+              <w:bottom w:color="000000" w:space="0" w:sz="5" w:val="single"/>
+              <w:right w:color="000000" w:space="0" w:sz="5" w:val="single"/>
+            </w:tcBorders>
+          </w:tcPr>
+          <w:p>
+            <w:pPr>
+              <w:rPr>
+                <w:rFonts w:ascii="Times New Roman" w:cs="Times New Roman" w:eastAsia="Times New Roman" w:hAnsi="Times New Roman"/>
+                <w:sz w:val="20"/>
+                <w:szCs w:val="20"/>
+                <w:highlight w:val="white"/>
+              </w:rPr>
+            </w:pPr>
+            <w:r>
+              <w:rPr>
+                <w:rFonts w:ascii="Times New Roman" w:cs="Times New Roman" w:eastAsia="Times New Roman" w:hAnsi="Times New Roman"/>
+                <w:sz w:val="20"/>
+                <w:szCs w:val="20"/>
+                <w:highlight w:val="white"/>
+                <w:rtl w:val="0"/>
+              </w:rPr>
+              <w:t xml:space="preserve">nomic-embed-text</w:t>
+            </w:r>
+          </w:p>
+        </w:tc>
+        <w:tc>
+          <w:tcPr>
+            <w:tcBorders>
+              <w:top w:color="000000" w:space="0" w:sz="5" w:val="single"/>
+              <w:left w:color="000000" w:space="0" w:sz="5" w:val="single"/>
+              <w:bottom w:color="000000" w:space="0" w:sz="5" w:val="single"/>
+              <w:right w:color="000000" w:space="0" w:sz="5" w:val="single"/>
+            </w:tcBorders>
+          </w:tcPr>
+          <w:p>
+            <w:pPr>
+              <w:rPr>
+                <w:rFonts w:ascii="Times New Roman" w:cs="Times New Roman" w:eastAsia="Times New Roman" w:hAnsi="Times New Roman"/>
+                <w:sz w:val="20"/>
+                <w:szCs w:val="20"/>
+                <w:highlight w:val="white"/>
+              </w:rPr>
+            </w:pPr>
+            <w:r>
+              <w:rPr>
+                <w:rFonts w:ascii="Times New Roman" w:cs="Times New Roman" w:eastAsia="Times New Roman" w:hAnsi="Times New Roman"/>
+                <w:sz w:val="20"/>
+                <w:szCs w:val="20"/>
+                <w:highlight w:val="white"/>
+                <w:rtl w:val="0"/>
+              </w:rPr>
+              <w:t xml:space="preserve">Open Source</w:t>
+            </w:r>
+          </w:p>
+        </w:tc>
+        <w:tc>
+          <w:tcPr>
+            <w:tcBorders>
+              <w:top w:color="000000" w:space="0" w:sz="5" w:val="single"/>
+              <w:left w:color="000000" w:space="0" w:sz="5" w:val="single"/>
+              <w:bottom w:color="000000" w:space="0" w:sz="5" w:val="single"/>
+              <w:right w:color="000000" w:space="0" w:sz="5" w:val="single"/>
+            </w:tcBorders>
+          </w:tcPr>
+          <w:p>
+            <w:pPr>
+              <w:rPr>
+                <w:rFonts w:ascii="Times New Roman" w:cs="Times New Roman" w:eastAsia="Times New Roman" w:hAnsi="Times New Roman"/>
+                <w:sz w:val="20"/>
+                <w:szCs w:val="20"/>
+                <w:highlight w:val="white"/>
+              </w:rPr>
+            </w:pPr>
+            <w:r>
+              <w:rPr>
+                <w:rtl w:val="0"/>
+              </w:rPr>
+            </w:r>
+          </w:p>
+        </w:tc>
+        <w:tc>
+          <w:tcPr>
+            <w:tcBorders>
+              <w:top w:color="000000" w:space="0" w:sz="5" w:val="single"/>
+              <w:left w:color="000000" w:space="0" w:sz="5" w:val="single"/>
+              <w:bottom w:color="000000" w:space="0" w:sz="5" w:val="single"/>
+              <w:right w:color="000000" w:space="0" w:sz="5" w:val="single"/>
+            </w:tcBorders>
+          </w:tcPr>
+          <w:p>
+            <w:pPr>
+              <w:rPr>
+                <w:rFonts w:ascii="Times New Roman" w:cs="Times New Roman" w:eastAsia="Times New Roman" w:hAnsi="Times New Roman"/>
+                <w:sz w:val="20"/>
+                <w:szCs w:val="20"/>
+                <w:highlight w:val="white"/>
+              </w:rPr>
+            </w:pPr>
+            <w:r>
+              <w:rPr>
+                <w:rFonts w:ascii="Times New Roman" w:cs="Times New Roman" w:eastAsia="Times New Roman" w:hAnsi="Times New Roman"/>
+                <w:sz w:val="20"/>
+                <w:szCs w:val="20"/>
+                <w:highlight w:val="white"/>
+                <w:rtl w:val="0"/>
+              </w:rPr>
+              <w:t xml:space="preserve">768</w:t>
+            </w:r>
+          </w:p>
+        </w:tc>
+        <w:tc>
+          <w:tcPr>
+            <w:tcBorders>
+              <w:top w:color="000000" w:space="0" w:sz="5" w:val="single"/>
+              <w:left w:color="000000" w:space="0" w:sz="5" w:val="single"/>
+              <w:bottom w:color="000000" w:space="0" w:sz="5" w:val="single"/>
+              <w:right w:color="000000" w:space="0" w:sz="5" w:val="single"/>
+            </w:tcBorders>
+          </w:tcPr>
+          <w:p>
+            <w:pPr>
+              <w:rPr>
+                <w:rFonts w:ascii="Times New Roman" w:cs="Times New Roman" w:eastAsia="Times New Roman" w:hAnsi="Times New Roman"/>
+                <w:sz w:val="20"/>
+                <w:szCs w:val="20"/>
+                <w:highlight w:val="white"/>
+              </w:rPr>
+            </w:pPr>
+            <w:r>
+              <w:rPr>
+                <w:rtl w:val="0"/>
+              </w:rPr>
             </w:r>
           </w:p>
         </w:tc>
@@ -42923,12 +45941,12 @@
           <wp:inline distB="114300" distT="114300" distL="114300" distR="114300">
             <wp:extent cx="6655689" cy="2973054"/>
             <wp:effectExtent b="0" l="0" r="0" t="0"/>
-            <wp:docPr id="4" name="image1.png"/>
+            <wp:docPr id="4" name="image3.png"/>
             <a:graphic>
               <a:graphicData uri="http://schemas.openxmlformats.org/drawingml/2006/picture">
                 <pic:pic>
                   <pic:nvPicPr>
-                    <pic:cNvPr id="0" name="image1.png"/>
+                    <pic:cNvPr id="0" name="image3.png"/>
                     <pic:cNvPicPr preferRelativeResize="0"/>
                   </pic:nvPicPr>
                   <pic:blipFill>
@@ -43167,12 +46185,12 @@
           <wp:inline distB="114300" distT="114300" distL="114300" distR="114300">
             <wp:extent cx="6057900" cy="6832600"/>
             <wp:effectExtent b="0" l="0" r="0" t="0"/>
-            <wp:docPr id="3" name="image3.png"/>
+            <wp:docPr id="3" name="image4.png"/>
             <a:graphic>
               <a:graphicData uri="http://schemas.openxmlformats.org/drawingml/2006/picture">
                 <pic:pic>
                   <pic:nvPicPr>
-                    <pic:cNvPr id="0" name="image3.png"/>
+                    <pic:cNvPr id="0" name="image4.png"/>
                     <pic:cNvPicPr preferRelativeResize="0"/>
                   </pic:nvPicPr>
                   <pic:blipFill>
@@ -43358,12 +46376,12 @@
           <wp:inline distB="114300" distT="114300" distL="114300" distR="114300">
             <wp:extent cx="6612679" cy="2750958"/>
             <wp:effectExtent b="0" l="0" r="0" t="0"/>
-            <wp:docPr id="1" name="image4.png"/>
+            <wp:docPr id="1" name="image1.png"/>
             <a:graphic>
               <a:graphicData uri="http://schemas.openxmlformats.org/drawingml/2006/picture">
                 <pic:pic>
                   <pic:nvPicPr>
-                    <pic:cNvPr id="0" name="image4.png"/>
+                    <pic:cNvPr id="0" name="image1.png"/>
                     <pic:cNvPicPr preferRelativeResize="0"/>
                   </pic:nvPicPr>
                   <pic:blipFill>

</xml_diff>

<commit_message>
update consensus analysis writing in methods and results section
</commit_message>
<xml_diff>
--- a/Paper/Patterns_Clinical_Trials_Tumor_Name_Standardization_using Embedding_Analysis.docx
+++ b/Paper/Patterns_Clinical_Trials_Tumor_Name_Standardization_using Embedding_Analysis.docx
@@ -1638,13 +1638,13 @@
       </w:r>
       <w:r>
         <w:rPr>
-          <w:rFonts w:ascii="Times New Roman" w:cs="Times New Roman" w:eastAsia="Times New Roman" w:hAnsi="Times New Roman"/>
+          <w:rFonts w:ascii="Gungsuh" w:cs="Gungsuh" w:eastAsia="Gungsuh" w:hAnsi="Gungsuh"/>
           <w:sz w:val="24"/>
           <w:szCs w:val="24"/>
           <w:highlight w:val="yellow"/>
           <w:rtl w:val="0"/>
         </w:rPr>
-        <w:t xml:space="preserve">. </w:t>
+        <w:t xml:space="preserve">. For clarity in discussion, we categorized the standardization methods based on their standardization accuracy as follows: high-accuracy methods (≥ 60%), intermediate-accuracy methods (50% to &lt; 60%), and low-accuracy methods (&lt; 50%).</w:t>
       </w:r>
     </w:p>
     <w:p>
@@ -2411,7 +2411,7 @@
           <w:highlight w:val="yellow"/>
           <w:rtl w:val="0"/>
         </w:rPr>
-        <w:t xml:space="preserve">.</w:t>
+        <w:t xml:space="preserve">. </w:t>
       </w:r>
     </w:p>
     <w:p>
@@ -2877,15 +2877,94 @@
         <w:jc w:val="both"/>
         <w:rPr>
           <w:rFonts w:ascii="Times New Roman" w:cs="Times New Roman" w:eastAsia="Times New Roman" w:hAnsi="Times New Roman"/>
+          <w:sz w:val="24"/>
+          <w:szCs w:val="24"/>
           <w:highlight w:val="yellow"/>
         </w:rPr>
       </w:pPr>
       <w:r>
         <w:rPr>
+          <w:rtl w:val="0"/>
+        </w:rPr>
+      </w:r>
+    </w:p>
+    <w:p>
+      <w:pPr>
+        <w:spacing w:line="276.0005454545455" w:lineRule="auto"/>
+        <w:ind w:left="-540" w:firstLine="0"/>
+        <w:jc w:val="both"/>
+        <w:rPr>
           <w:rFonts w:ascii="Times New Roman" w:cs="Times New Roman" w:eastAsia="Times New Roman" w:hAnsi="Times New Roman"/>
           <w:sz w:val="24"/>
           <w:szCs w:val="24"/>
           <w:highlight w:val="yellow"/>
+        </w:rPr>
+      </w:pPr>
+      <w:r>
+        <w:rPr>
+          <w:rtl w:val="0"/>
+        </w:rPr>
+      </w:r>
+    </w:p>
+    <w:p>
+      <w:pPr>
+        <w:spacing w:line="276.0005454545455" w:lineRule="auto"/>
+        <w:ind w:left="-540" w:firstLine="0"/>
+        <w:jc w:val="both"/>
+        <w:rPr>
+          <w:rFonts w:ascii="Times New Roman" w:cs="Times New Roman" w:eastAsia="Times New Roman" w:hAnsi="Times New Roman"/>
+          <w:sz w:val="24"/>
+          <w:szCs w:val="24"/>
+          <w:highlight w:val="yellow"/>
+        </w:rPr>
+      </w:pPr>
+      <w:r>
+        <w:rPr>
+          <w:rFonts w:ascii="Times New Roman" w:cs="Times New Roman" w:eastAsia="Times New Roman" w:hAnsi="Times New Roman"/>
+          <w:sz w:val="24"/>
+          <w:szCs w:val="24"/>
+          <w:highlight w:val="yellow"/>
+          <w:rtl w:val="0"/>
+        </w:rPr>
+        <w:t xml:space="preserve">We also extended our analysis to combine three high-accuracy standardization methods and selected the combination of methods that had the lowest average pairwise mutual information score to maximize the diversity in their prediction and thereby increase standardization accuracy.  The combined methods predicted the standardization for a giver CTR tumor name by performing a majority vote operation.  This strategy led to the combination of the methods:ADA-002+AP, LTE-3+K-means, and all-MiniLM-L12-v2 +Euclidean Dist,for the WHO 5th edition and this method achieved a standardization accuracy of 72.126%. Whereas for WHO all editions, the methods that were combined included:ADA-002+K-means, LTE-3+K-means, and all-MiniLM-L12-v2+Euclidean Dist, which achieved an accuracy of 71.377%. We implemented these methods in CANTOS, and the standardization results for all CTR tumor names using this consensus voting method.</w:t>
+      </w:r>
+    </w:p>
+    <w:p>
+      <w:pPr>
+        <w:spacing w:line="276.0005454545455" w:lineRule="auto"/>
+        <w:ind w:left="-540" w:firstLine="0"/>
+        <w:jc w:val="both"/>
+        <w:rPr>
+          <w:rFonts w:ascii="Times New Roman" w:cs="Times New Roman" w:eastAsia="Times New Roman" w:hAnsi="Times New Roman"/>
+          <w:sz w:val="24"/>
+          <w:szCs w:val="24"/>
+          <w:highlight w:val="yellow"/>
+        </w:rPr>
+      </w:pPr>
+      <w:r>
+        <w:rPr>
+          <w:rtl w:val="0"/>
+        </w:rPr>
+      </w:r>
+    </w:p>
+    <w:p>
+      <w:pPr>
+        <w:spacing w:line="276.0005454545455" w:lineRule="auto"/>
+        <w:ind w:left="-540" w:firstLine="0"/>
+        <w:jc w:val="both"/>
+        <w:rPr>
+          <w:rFonts w:ascii="Times New Roman" w:cs="Times New Roman" w:eastAsia="Times New Roman" w:hAnsi="Times New Roman"/>
+          <w:sz w:val="24"/>
+          <w:szCs w:val="24"/>
+          <w:highlight w:val="yellow"/>
+        </w:rPr>
+      </w:pPr>
+      <w:r>
+        <w:rPr>
+          <w:rFonts w:ascii="Times New Roman" w:cs="Times New Roman" w:eastAsia="Times New Roman" w:hAnsi="Times New Roman"/>
+          <w:sz w:val="24"/>
+          <w:szCs w:val="24"/>
+          <w:highlight w:val="yellow"/>
           <w:rtl w:val="0"/>
         </w:rPr>
         <w:t xml:space="preserve">Ground truth annotations for the 1,600 CTR tumor names and their standardization results are available in</w:t>
@@ -2973,11 +3052,6 @@
           <w:rtl w:val="0"/>
         </w:rPr>
         <w:t xml:space="preserve">.</w:t>
-      </w:r>
-      <w:r>
-        <w:rPr>
-          <w:rtl w:val="0"/>
-        </w:rPr>
       </w:r>
     </w:p>
     <w:p>
@@ -3235,14 +3309,14 @@
       </w:pPr>
       <w:r>
         <w:rPr>
-          <w:rFonts w:ascii="Gungsuh" w:cs="Gungsuh" w:eastAsia="Gungsuh" w:hAnsi="Gungsuh"/>
+          <w:rFonts w:ascii="Times New Roman" w:cs="Times New Roman" w:eastAsia="Times New Roman" w:hAnsi="Times New Roman"/>
           <w:color w:val="2a2a2a"/>
           <w:sz w:val="24"/>
           <w:szCs w:val="24"/>
           <w:highlight w:val="yellow"/>
           <w:rtl w:val="0"/>
         </w:rPr>
-        <w:t xml:space="preserve">In contrast, text-embedding-based methods exhibited a wider accuracy range, from 13.69% to 67.81% for the WHO 5th edition and from 15.38% to 69.05% for WHO all editions. Unlike the text-matching based methods, some of the text-embedding based methods are able to quantify and capture the semantic difference between unstandardized tumor name in CTR and the standardized term in the WHO system which is likely why some text-embedding based methods achieved high standardization accuracy. Although the accuracy range for text-embedding based methods is broader, their performance remained consistent across both the WHO 5th and all editions. For clarity in discussion, we categorized the standardization methods based on their standardization accuracy as follows: high-accuracy methods (≥ 60%), intermediate-accuracy methods (50% to &lt; 60%), and low-accuracy methods (&lt; 50%).</w:t>
+        <w:t xml:space="preserve">In contrast, text-embedding-based methods exhibited a wider accuracy range, from 13.69% to 67.81% for the WHO 5th edition and from 15.38% to 69.05% for WHO all editions. Unlike the text-matching based methods, some of the text-embedding based methods are able to quantify and capture the semantic difference between unstandardized tumor name in CTR and the standardized term in the WHO system which is likely why some text-embedding based methods achieved high standardization accuracy. Although the accuracy range for text-embedding based methods is broader, their performance remained consistent across both the WHO 5th and all editions. </w:t>
       </w:r>
     </w:p>
     <w:p>
@@ -3604,6 +3678,119 @@
           <w:rtl w:val="0"/>
         </w:rPr>
         <w:t xml:space="preserve">text-embeddings and clustering had comparable but lower standardizing accuracy as compared to their counterpart closest match methods (LTE-3+ Euclidean Dist , ADA–002+ Euclidean Dist ). In general, the LTE-3 based methods generally outperformed ADA-002, except for LTE-3+K-means, which slightly underperformed compared to ADA-002+Euclidean Dist and ADA-002+AP when standardized against WHO all editions. However, LTE-3+K-means performed better than its counterpart method ADA–002+K-means against either edition of the WHO system. Compared to these methods utilizing text-embedding and clustering, the text-embedding based methods using closet match approach, achieves higher standardization accuracy and is much simpler and faster as it does not require additional steps like clustering, cluster size analysis, or outlier detection.</w:t>
+      </w:r>
+    </w:p>
+    <w:p>
+      <w:pPr>
+        <w:spacing w:line="276.0005454545455" w:lineRule="auto"/>
+        <w:ind w:left="-540" w:firstLine="0"/>
+        <w:jc w:val="both"/>
+        <w:rPr>
+          <w:rFonts w:ascii="Times New Roman" w:cs="Times New Roman" w:eastAsia="Times New Roman" w:hAnsi="Times New Roman"/>
+          <w:color w:val="2a2a2a"/>
+          <w:sz w:val="24"/>
+          <w:szCs w:val="24"/>
+          <w:highlight w:val="yellow"/>
+        </w:rPr>
+      </w:pPr>
+      <w:r>
+        <w:rPr>
+          <w:rtl w:val="0"/>
+        </w:rPr>
+      </w:r>
+    </w:p>
+    <w:p>
+      <w:pPr>
+        <w:spacing w:line="276.0005454545455" w:lineRule="auto"/>
+        <w:ind w:left="-540" w:firstLine="0"/>
+        <w:jc w:val="both"/>
+        <w:rPr>
+          <w:rFonts w:ascii="Times New Roman" w:cs="Times New Roman" w:eastAsia="Times New Roman" w:hAnsi="Times New Roman"/>
+          <w:color w:val="2a2a2a"/>
+          <w:sz w:val="24"/>
+          <w:szCs w:val="24"/>
+          <w:highlight w:val="yellow"/>
+        </w:rPr>
+      </w:pPr>
+      <w:r>
+        <w:rPr>
+          <w:rFonts w:ascii="Times New Roman" w:cs="Times New Roman" w:eastAsia="Times New Roman" w:hAnsi="Times New Roman"/>
+          <w:color w:val="2a2a2a"/>
+          <w:sz w:val="24"/>
+          <w:szCs w:val="24"/>
+          <w:highlight w:val="yellow"/>
+          <w:rtl w:val="0"/>
+        </w:rPr>
+        <w:t xml:space="preserve">In our effort to improve the standardization accuracy, we combined high-accuracy methods to perform a consensus vote based on their standardization prediction for a given CTR tumor name.  We considered combinations of three methods as an odd number of methods as it reduces chances of a tie occurring. We limited the consensus vote to only the high-accuracy methods identified in </w:t>
+      </w:r>
+      <w:r>
+        <w:rPr>
+          <w:rFonts w:ascii="Times New Roman" w:cs="Times New Roman" w:eastAsia="Times New Roman" w:hAnsi="Times New Roman"/>
+          <w:b w:val="1"/>
+          <w:color w:val="2a2a2a"/>
+          <w:sz w:val="24"/>
+          <w:szCs w:val="24"/>
+          <w:highlight w:val="yellow"/>
+          <w:rtl w:val="0"/>
+        </w:rPr>
+        <w:t xml:space="preserve">Tables</w:t>
+      </w:r>
+      <w:r>
+        <w:rPr>
+          <w:rFonts w:ascii="Times New Roman" w:cs="Times New Roman" w:eastAsia="Times New Roman" w:hAnsi="Times New Roman"/>
+          <w:color w:val="2a2a2a"/>
+          <w:sz w:val="24"/>
+          <w:szCs w:val="24"/>
+          <w:highlight w:val="yellow"/>
+          <w:rtl w:val="0"/>
+        </w:rPr>
+        <w:t xml:space="preserve"> </w:t>
+      </w:r>
+      <w:r>
+        <w:rPr>
+          <w:rFonts w:ascii="Times New Roman" w:cs="Times New Roman" w:eastAsia="Times New Roman" w:hAnsi="Times New Roman"/>
+          <w:b w:val="1"/>
+          <w:color w:val="2a2a2a"/>
+          <w:sz w:val="24"/>
+          <w:szCs w:val="24"/>
+          <w:highlight w:val="yellow"/>
+          <w:rtl w:val="0"/>
+        </w:rPr>
+        <w:t xml:space="preserve">1</w:t>
+      </w:r>
+      <w:r>
+        <w:rPr>
+          <w:rFonts w:ascii="Times New Roman" w:cs="Times New Roman" w:eastAsia="Times New Roman" w:hAnsi="Times New Roman"/>
+          <w:color w:val="2a2a2a"/>
+          <w:sz w:val="24"/>
+          <w:szCs w:val="24"/>
+          <w:highlight w:val="yellow"/>
+          <w:rtl w:val="0"/>
+        </w:rPr>
+        <w:t xml:space="preserve"> and </w:t>
+      </w:r>
+      <w:r>
+        <w:rPr>
+          <w:rFonts w:ascii="Times New Roman" w:cs="Times New Roman" w:eastAsia="Times New Roman" w:hAnsi="Times New Roman"/>
+          <w:b w:val="1"/>
+          <w:color w:val="2a2a2a"/>
+          <w:sz w:val="24"/>
+          <w:szCs w:val="24"/>
+          <w:highlight w:val="yellow"/>
+          <w:rtl w:val="0"/>
+        </w:rPr>
+        <w:t xml:space="preserve">2</w:t>
+      </w:r>
+      <w:r>
+        <w:rPr>
+          <w:rFonts w:ascii="Times New Roman" w:cs="Times New Roman" w:eastAsia="Times New Roman" w:hAnsi="Times New Roman"/>
+          <w:color w:val="2a2a2a"/>
+          <w:sz w:val="24"/>
+          <w:szCs w:val="24"/>
+          <w:highlight w:val="yellow"/>
+          <w:rtl w:val="0"/>
+        </w:rPr>
+        <w:t xml:space="preserve">. Since there were a  total of eleven high-accuracy methods for m</w:t>
       </w:r>
     </w:p>
     <w:p>
@@ -9064,11 +9251,268 @@
     </w:p>
     <w:p>
       <w:pPr>
+        <w:spacing w:line="276.0005454545455" w:lineRule="auto"/>
         <w:ind w:left="-540" w:firstLine="0"/>
-        <w:rPr>
-          <w:rFonts w:ascii="Times New Roman" w:cs="Times New Roman" w:eastAsia="Times New Roman" w:hAnsi="Times New Roman"/>
-          <w:sz w:val="24"/>
-          <w:szCs w:val="24"/>
+        <w:jc w:val="both"/>
+        <w:rPr>
+          <w:rFonts w:ascii="Times New Roman" w:cs="Times New Roman" w:eastAsia="Times New Roman" w:hAnsi="Times New Roman"/>
+          <w:sz w:val="24"/>
+          <w:szCs w:val="24"/>
+          <w:highlight w:val="white"/>
+        </w:rPr>
+      </w:pPr>
+      <w:r>
+        <w:rPr>
+          <w:rtl w:val="0"/>
+        </w:rPr>
+      </w:r>
+    </w:p>
+    <w:p>
+      <w:pPr>
+        <w:ind w:left="-540" w:firstLine="0"/>
+        <w:rPr>
+          <w:rFonts w:ascii="Times New Roman" w:cs="Times New Roman" w:eastAsia="Times New Roman" w:hAnsi="Times New Roman"/>
+          <w:b w:val="1"/>
+          <w:sz w:val="24"/>
+          <w:szCs w:val="24"/>
+        </w:rPr>
+      </w:pPr>
+      <w:r>
+        <w:rPr>
+          <w:rFonts w:ascii="Times New Roman" w:cs="Times New Roman" w:eastAsia="Times New Roman" w:hAnsi="Times New Roman"/>
+          <w:b w:val="1"/>
+          <w:sz w:val="24"/>
+          <w:szCs w:val="24"/>
+          <w:rtl w:val="0"/>
+        </w:rPr>
+        <w:t xml:space="preserve">Standardization using consensus of embedding methods:</w:t>
+      </w:r>
+    </w:p>
+    <w:p>
+      <w:pPr>
+        <w:ind w:left="-540" w:firstLine="0"/>
+        <w:jc w:val="both"/>
+        <w:rPr>
+          <w:rFonts w:ascii="Times New Roman" w:cs="Times New Roman" w:eastAsia="Times New Roman" w:hAnsi="Times New Roman"/>
+          <w:sz w:val="24"/>
+          <w:szCs w:val="24"/>
+          <w:highlight w:val="yellow"/>
+        </w:rPr>
+      </w:pPr>
+      <w:r>
+        <w:rPr>
+          <w:rFonts w:ascii="Times New Roman" w:cs="Times New Roman" w:eastAsia="Times New Roman" w:hAnsi="Times New Roman"/>
+          <w:sz w:val="24"/>
+          <w:szCs w:val="24"/>
+          <w:highlight w:val="yellow"/>
+          <w:rtl w:val="0"/>
+        </w:rPr>
+        <w:t xml:space="preserve">Based on the performance of the aforementioned standardization methods, we developed an approach that combines three high-accuracy standardization techniques to improve overall standardization accuracy. This approach standardizes a given CTR tumor name by assigning it to the term most frequently predicted among the three methods (majority vote). Since eleven methods qualified as high-accuracy standardization techniques for both the WHO 5th edition and all editions combined, we can theoretically test for 165 (</w:t>
+      </w:r>
+      <w:r>
+        <w:rPr>
+          <w:rFonts w:ascii="Times New Roman" w:cs="Times New Roman" w:eastAsia="Times New Roman" w:hAnsi="Times New Roman"/>
+          <w:sz w:val="24"/>
+          <w:szCs w:val="24"/>
+          <w:highlight w:val="yellow"/>
+          <w:vertAlign w:val="superscript"/>
+          <w:rtl w:val="0"/>
+        </w:rPr>
+        <w:t xml:space="preserve">11</w:t>
+      </w:r>
+      <w:r>
+        <w:rPr>
+          <w:rFonts w:ascii="Times New Roman" w:cs="Times New Roman" w:eastAsia="Times New Roman" w:hAnsi="Times New Roman"/>
+          <w:sz w:val="24"/>
+          <w:szCs w:val="24"/>
+          <w:highlight w:val="yellow"/>
+          <w:rtl w:val="0"/>
+        </w:rPr>
+        <w:t xml:space="preserve">C</w:t>
+      </w:r>
+      <w:r>
+        <w:rPr>
+          <w:rFonts w:ascii="Times New Roman" w:cs="Times New Roman" w:eastAsia="Times New Roman" w:hAnsi="Times New Roman"/>
+          <w:sz w:val="24"/>
+          <w:szCs w:val="24"/>
+          <w:highlight w:val="yellow"/>
+          <w:vertAlign w:val="subscript"/>
+          <w:rtl w:val="0"/>
+        </w:rPr>
+        <w:t xml:space="preserve">3</w:t>
+      </w:r>
+      <w:r>
+        <w:rPr>
+          <w:rFonts w:ascii="Times New Roman" w:cs="Times New Roman" w:eastAsia="Times New Roman" w:hAnsi="Times New Roman"/>
+          <w:sz w:val="24"/>
+          <w:szCs w:val="24"/>
+          <w:highlight w:val="yellow"/>
+          <w:rtl w:val="0"/>
+        </w:rPr>
+        <w:t xml:space="preserve">)</w:t>
+      </w:r>
+      <w:r>
+        <w:rPr>
+          <w:rFonts w:ascii="Times New Roman" w:cs="Times New Roman" w:eastAsia="Times New Roman" w:hAnsi="Times New Roman"/>
+          <w:sz w:val="24"/>
+          <w:szCs w:val="24"/>
+          <w:highlight w:val="yellow"/>
+          <w:rtl w:val="0"/>
+        </w:rPr>
+        <w:t xml:space="preserve"> possible three-method combinations for either edition of the WHO system (See Tables 1 and 2). However, rather than testing all possible combinations, we prioritized selecting three methods with high disagreement (i.e., high diversity in their predictions). This strategy aims to maximize the standardization accuracy  by focusing on selecting methods in a way such that when one method incorrectly standardizes at CTR tumor name, the other methods have a higher chance of correctly standardizing the same. To select the three methods, we first computed the pairwise mutual information among the eleven standardization methods. </w:t>
+      </w:r>
+    </w:p>
+    <w:p>
+      <w:pPr>
+        <w:ind w:left="-540" w:firstLine="0"/>
+        <w:jc w:val="both"/>
+        <w:rPr>
+          <w:rFonts w:ascii="Times New Roman" w:cs="Times New Roman" w:eastAsia="Times New Roman" w:hAnsi="Times New Roman"/>
+          <w:sz w:val="24"/>
+          <w:szCs w:val="24"/>
+          <w:highlight w:val="yellow"/>
+        </w:rPr>
+      </w:pPr>
+      <w:r>
+        <w:rPr>
+          <w:rtl w:val="0"/>
+        </w:rPr>
+      </w:r>
+    </w:p>
+    <w:p>
+      <w:pPr>
+        <w:ind w:left="-540" w:firstLine="0"/>
+        <w:jc w:val="both"/>
+        <w:rPr>
+          <w:rFonts w:ascii="Times New Roman" w:cs="Times New Roman" w:eastAsia="Times New Roman" w:hAnsi="Times New Roman"/>
+          <w:sz w:val="24"/>
+          <w:szCs w:val="24"/>
+          <w:highlight w:val="yellow"/>
+        </w:rPr>
+      </w:pPr>
+      <w:r>
+        <w:rPr>
+          <w:rFonts w:ascii="Times New Roman" w:cs="Times New Roman" w:eastAsia="Times New Roman" w:hAnsi="Times New Roman"/>
+          <w:sz w:val="24"/>
+          <w:szCs w:val="24"/>
+          <w:highlight w:val="yellow"/>
+          <w:rtl w:val="0"/>
+        </w:rPr>
+        <w:t xml:space="preserve">To select the methods using this criteria, we create a matrix containing the pairwise mutual information of each high-accuracy method  using their standardization results generated against the 1600 randomly sampled tumor names from CTR under both the WHO 5th edition and all editions. Following the creation of the mutual information matrix, for each of the 165 combinations of standardization methods we calculated the mean pairwise mutual information. Since each combination contains three methods, the pairwise mutual information of each of these methods (</w:t>
+      </w:r>
+      <w:r>
+        <w:rPr>
+          <w:rFonts w:ascii="Times New Roman" w:cs="Times New Roman" w:eastAsia="Times New Roman" w:hAnsi="Times New Roman"/>
+          <w:sz w:val="24"/>
+          <w:szCs w:val="24"/>
+          <w:highlight w:val="yellow"/>
+          <w:vertAlign w:val="superscript"/>
+          <w:rtl w:val="0"/>
+        </w:rPr>
+        <w:t xml:space="preserve">3</w:t>
+      </w:r>
+      <w:r>
+        <w:rPr>
+          <w:rFonts w:ascii="Times New Roman" w:cs="Times New Roman" w:eastAsia="Times New Roman" w:hAnsi="Times New Roman"/>
+          <w:sz w:val="24"/>
+          <w:szCs w:val="24"/>
+          <w:highlight w:val="yellow"/>
+          <w:rtl w:val="0"/>
+        </w:rPr>
+        <w:t xml:space="preserve">C</w:t>
+      </w:r>
+      <w:r>
+        <w:rPr>
+          <w:rFonts w:ascii="Times New Roman" w:cs="Times New Roman" w:eastAsia="Times New Roman" w:hAnsi="Times New Roman"/>
+          <w:sz w:val="24"/>
+          <w:szCs w:val="24"/>
+          <w:highlight w:val="yellow"/>
+          <w:vertAlign w:val="subscript"/>
+          <w:rtl w:val="0"/>
+        </w:rPr>
+        <w:t xml:space="preserve">2</w:t>
+      </w:r>
+      <w:r>
+        <w:rPr>
+          <w:rFonts w:ascii="Times New Roman" w:cs="Times New Roman" w:eastAsia="Times New Roman" w:hAnsi="Times New Roman"/>
+          <w:sz w:val="24"/>
+          <w:szCs w:val="24"/>
+          <w:highlight w:val="yellow"/>
+          <w:rtl w:val="0"/>
+        </w:rPr>
+        <w:t xml:space="preserve">=3</w:t>
+      </w:r>
+      <w:r>
+        <w:rPr>
+          <w:rFonts w:ascii="Times New Roman" w:cs="Times New Roman" w:eastAsia="Times New Roman" w:hAnsi="Times New Roman"/>
+          <w:sz w:val="24"/>
+          <w:szCs w:val="24"/>
+          <w:highlight w:val="yellow"/>
+          <w:rtl w:val="0"/>
+        </w:rPr>
+        <w:t xml:space="preserve">) with respect are selected from the mutual information matrix and then averaged.   The combination of standardization methods with the lowest mutual information (i.e., they share the least amount of information and are therefore more diverse) are selected for standardization using the majority vote. In the event of tie, we select the method with the highest standardization accuracy (depending on the WHO system edition) among the three methods that were selected to perform the majority vote. </w:t>
+      </w:r>
+    </w:p>
+    <w:p>
+      <w:pPr>
+        <w:ind w:left="-540" w:firstLine="0"/>
+        <w:jc w:val="both"/>
+        <w:rPr>
+          <w:rFonts w:ascii="Times New Roman" w:cs="Times New Roman" w:eastAsia="Times New Roman" w:hAnsi="Times New Roman"/>
+          <w:sz w:val="24"/>
+          <w:szCs w:val="24"/>
+          <w:highlight w:val="yellow"/>
+        </w:rPr>
+      </w:pPr>
+      <w:r>
+        <w:rPr>
+          <w:rtl w:val="0"/>
+        </w:rPr>
+      </w:r>
+    </w:p>
+    <w:p>
+      <w:pPr>
+        <w:ind w:left="-540" w:firstLine="0"/>
+        <w:jc w:val="both"/>
+        <w:rPr>
+          <w:rFonts w:ascii="Times New Roman" w:cs="Times New Roman" w:eastAsia="Times New Roman" w:hAnsi="Times New Roman"/>
+          <w:sz w:val="24"/>
+          <w:szCs w:val="24"/>
+          <w:highlight w:val="yellow"/>
+        </w:rPr>
+      </w:pPr>
+      <w:r>
+        <w:rPr>
+          <w:rtl w:val="0"/>
+        </w:rPr>
+      </w:r>
+    </w:p>
+    <w:p>
+      <w:pPr>
+        <w:ind w:left="-540" w:firstLine="0"/>
+        <w:jc w:val="both"/>
+        <w:rPr>
+          <w:rFonts w:ascii="Times New Roman" w:cs="Times New Roman" w:eastAsia="Times New Roman" w:hAnsi="Times New Roman"/>
+          <w:sz w:val="24"/>
+          <w:szCs w:val="24"/>
+          <w:highlight w:val="yellow"/>
+        </w:rPr>
+      </w:pPr>
+      <w:r>
+        <w:rPr>
+          <w:rtl w:val="0"/>
+        </w:rPr>
+      </w:r>
+    </w:p>
+    <w:p>
+      <w:pPr>
+        <w:ind w:left="-540" w:firstLine="0"/>
+        <w:jc w:val="both"/>
+        <w:rPr>
+          <w:rFonts w:ascii="Times New Roman" w:cs="Times New Roman" w:eastAsia="Times New Roman" w:hAnsi="Times New Roman"/>
+          <w:sz w:val="24"/>
+          <w:szCs w:val="24"/>
+          <w:highlight w:val="yellow"/>
         </w:rPr>
       </w:pPr>
       <w:r>
@@ -47094,12 +47538,12 @@
           <wp:inline distB="114300" distT="114300" distL="114300" distR="114300">
             <wp:extent cx="7170039" cy="3133725"/>
             <wp:effectExtent b="0" l="0" r="0" t="0"/>
-            <wp:docPr id="1" name="image4.png"/>
+            <wp:docPr id="1" name="image2.png"/>
             <a:graphic>
               <a:graphicData uri="http://schemas.openxmlformats.org/drawingml/2006/picture">
                 <pic:pic>
                   <pic:nvPicPr>
-                    <pic:cNvPr id="0" name="image4.png"/>
+                    <pic:cNvPr id="0" name="image2.png"/>
                     <pic:cNvPicPr preferRelativeResize="0"/>
                   </pic:nvPicPr>
                   <pic:blipFill>
@@ -47202,12 +47646,12 @@
           <wp:inline distB="114300" distT="114300" distL="114300" distR="114300">
             <wp:extent cx="7217045" cy="4254901"/>
             <wp:effectExtent b="0" l="0" r="0" t="0"/>
-            <wp:docPr id="3" name="image3.png"/>
+            <wp:docPr id="3" name="image4.png"/>
             <a:graphic>
               <a:graphicData uri="http://schemas.openxmlformats.org/drawingml/2006/picture">
                 <pic:pic>
                   <pic:nvPicPr>
-                    <pic:cNvPr id="0" name="image3.png"/>
+                    <pic:cNvPr id="0" name="image4.png"/>
                     <pic:cNvPicPr preferRelativeResize="0"/>
                   </pic:nvPicPr>
                   <pic:blipFill>
@@ -47530,12 +47974,12 @@
           <wp:inline distB="114300" distT="114300" distL="114300" distR="114300">
             <wp:extent cx="6612679" cy="2750958"/>
             <wp:effectExtent b="0" l="0" r="0" t="0"/>
-            <wp:docPr id="2" name="image2.png"/>
+            <wp:docPr id="2" name="image3.png"/>
             <a:graphic>
               <a:graphicData uri="http://schemas.openxmlformats.org/drawingml/2006/picture">
                 <pic:pic>
                   <pic:nvPicPr>
-                    <pic:cNvPr id="0" name="image2.png"/>
+                    <pic:cNvPr id="0" name="image3.png"/>
                     <pic:cNvPicPr preferRelativeResize="0"/>
                   </pic:nvPicPr>
                   <pic:blipFill>

</xml_diff>

<commit_message>
adding paper edits to discussion
</commit_message>
<xml_diff>
--- a/Paper/Patterns_Clinical_Trials_Tumor_Name_Standardization_using Embedding_Analysis.docx
+++ b/Paper/Patterns_Clinical_Trials_Tumor_Name_Standardization_using Embedding_Analysis.docx
@@ -3047,6 +3047,7 @@
         <w:jc w:val="both"/>
         <w:rPr>
           <w:rFonts w:ascii="Times New Roman" w:cs="Times New Roman" w:eastAsia="Times New Roman" w:hAnsi="Times New Roman"/>
+          <w:color w:val="2a2a2a"/>
           <w:sz w:val="24"/>
           <w:szCs w:val="24"/>
           <w:highlight w:val="yellow"/>
@@ -3054,41 +3055,25 @@
       </w:pPr>
       <w:r>
         <w:rPr>
-          <w:rtl w:val="0"/>
-        </w:rPr>
-      </w:r>
-    </w:p>
-    <w:p>
-      <w:pPr>
-        <w:spacing w:line="276.0005454545455" w:lineRule="auto"/>
-        <w:ind w:left="-540" w:firstLine="0"/>
-        <w:jc w:val="both"/>
-        <w:rPr>
           <w:rFonts w:ascii="Times New Roman" w:cs="Times New Roman" w:eastAsia="Times New Roman" w:hAnsi="Times New Roman"/>
           <w:sz w:val="24"/>
           <w:szCs w:val="24"/>
           <w:highlight w:val="yellow"/>
-        </w:rPr>
-      </w:pPr>
-      <w:r>
-        <w:rPr>
-          <w:rtl w:val="0"/>
-        </w:rPr>
-      </w:r>
-    </w:p>
-    <w:p>
-      <w:pPr>
-        <w:spacing w:line="276.0005454545455" w:lineRule="auto"/>
-        <w:ind w:left="-540" w:firstLine="0"/>
-        <w:jc w:val="both"/>
-        <w:rPr>
-          <w:rFonts w:ascii="Times New Roman" w:cs="Times New Roman" w:eastAsia="Times New Roman" w:hAnsi="Times New Roman"/>
-          <w:color w:val="2a2a2a"/>
+          <w:rtl w:val="0"/>
+        </w:rPr>
+        <w:t xml:space="preserve">We also extended our analysis to combine three high-accuracy standardization methods (out of eleven high-accuracy methods, see </w:t>
+      </w:r>
+      <w:r>
+        <w:rPr>
+          <w:rFonts w:ascii="Times New Roman" w:cs="Times New Roman" w:eastAsia="Times New Roman" w:hAnsi="Times New Roman"/>
+          <w:b w:val="1"/>
           <w:sz w:val="24"/>
           <w:szCs w:val="24"/>
           <w:highlight w:val="yellow"/>
-        </w:rPr>
-      </w:pPr>
+          <w:rtl w:val="0"/>
+        </w:rPr>
+        <w:t xml:space="preserve">Tables</w:t>
+      </w:r>
       <w:r>
         <w:rPr>
           <w:rFonts w:ascii="Times New Roman" w:cs="Times New Roman" w:eastAsia="Times New Roman" w:hAnsi="Times New Roman"/>
@@ -3097,7 +3082,7 @@
           <w:highlight w:val="yellow"/>
           <w:rtl w:val="0"/>
         </w:rPr>
-        <w:t xml:space="preserve">We also extended our analysis to combine three high-accuracy standardization methods (out of 11 see </w:t>
+        <w:t xml:space="preserve"> </w:t>
       </w:r>
       <w:r>
         <w:rPr>
@@ -3108,7 +3093,7 @@
           <w:highlight w:val="yellow"/>
           <w:rtl w:val="0"/>
         </w:rPr>
-        <w:t xml:space="preserve">Tables</w:t>
+        <w:t xml:space="preserve">1</w:t>
       </w:r>
       <w:r>
         <w:rPr>
@@ -3118,7 +3103,7 @@
           <w:highlight w:val="yellow"/>
           <w:rtl w:val="0"/>
         </w:rPr>
-        <w:t xml:space="preserve"> </w:t>
+        <w:t xml:space="preserve"> and </w:t>
       </w:r>
       <w:r>
         <w:rPr>
@@ -3129,7 +3114,7 @@
           <w:highlight w:val="yellow"/>
           <w:rtl w:val="0"/>
         </w:rPr>
-        <w:t xml:space="preserve">1</w:t>
+        <w:t xml:space="preserve">2</w:t>
       </w:r>
       <w:r>
         <w:rPr>
@@ -3139,28 +3124,7 @@
           <w:highlight w:val="yellow"/>
           <w:rtl w:val="0"/>
         </w:rPr>
-        <w:t xml:space="preserve"> and </w:t>
-      </w:r>
-      <w:r>
-        <w:rPr>
-          <w:rFonts w:ascii="Times New Roman" w:cs="Times New Roman" w:eastAsia="Times New Roman" w:hAnsi="Times New Roman"/>
-          <w:b w:val="1"/>
-          <w:sz w:val="24"/>
-          <w:szCs w:val="24"/>
-          <w:highlight w:val="yellow"/>
-          <w:rtl w:val="0"/>
-        </w:rPr>
-        <w:t xml:space="preserve">2</w:t>
-      </w:r>
-      <w:r>
-        <w:rPr>
-          <w:rFonts w:ascii="Times New Roman" w:cs="Times New Roman" w:eastAsia="Times New Roman" w:hAnsi="Times New Roman"/>
-          <w:sz w:val="24"/>
-          <w:szCs w:val="24"/>
-          <w:highlight w:val="yellow"/>
-          <w:rtl w:val="0"/>
-        </w:rPr>
-        <w:t xml:space="preserve">) and selected the combination of methods that had the lowest average pairwise mutual information score to maximize the diversity in their prediction and thereby increase standardization accuracy. The combined methods predicted the standardization for a given CTR tumor name by performing a majority vote operation. This strategy led to the combination of the methods:ADA-002+AP, LTE-3+K-means, and all-MiniLM-L12-v2 +Euclidean Dist,for the WHO 5th edition and this method achieved a standardization accuracy of 72.126%. Whereas for WHO all editions, the methods that were combined included:ADA-002+K-means, LTE-3+K-means, and all-MiniLM-L12-v2+Euclidean Dist, which achieved an accuracy of 71.377%.  </w:t>
+        <w:t xml:space="preserve">) and selected the combination of methods that had the lowest average pairwise mutual information score to maximize the diversity in their prediction and thereby increase standardization accuracy. The combined methods predicted the standardization for a given CTR tumor name by performing a majority vote operation. This strategy led to the combination of the methods:ADA-002+AP, LTE-3+K-means, and all-MiniLM-L12-v2 +Euclidean Dist,for the WHO 5th edition which achieved a standardization accuracy of 72.126%. Whereas for WHO all editions, the methods that were combined included:ADA-002+K-means, LTE-3+K-means, and all-MiniLM-L12-v2+Euclidean Dist, which achieved an accuracy of 71.377%.  </w:t>
       </w:r>
       <w:r>
         <w:rPr>
@@ -3631,7 +3595,53 @@
           <w:highlight w:val="yellow"/>
           <w:rtl w:val="0"/>
         </w:rPr>
-        <w:t xml:space="preserve">In contrast, text-embedding-based methods exhibited a wider accuracy range, from 13.69% to 67.81% for the WHO 5th edition and from 15.38% to 69.05% for WHO all editions. Unlike the text-matching based methods, some of the text-embedding based methods are able to quantify and capture the semantic difference between unstandardized tumor name in CTR and the standardized term in the WHO system which is likely why some text-embedding based methods achieved high standardization accuracy. Although the accuracy range for text-embedding based methods is broader, their performance remained consistent across both the WHO 5th and all editions. </w:t>
+        <w:t xml:space="preserve">In contrast, text-embedding-based methods exhibited a wider accuracy range, from 13.69% to 67.81% for the WHO 5th edition and from 15.38% to 69.05% for WHO all editions. Unlike the text-matching based methods, some of the text-embedding based methods are able to quantify and capture the semantic difference between unstandardized tumor name in CTR and the standardized term in the WHO system which is likely why some text-embedding based methods achieved high standardization accuracy. Although the variance in standardization accuracy is broader for text-embedding methods, their performance (i.e. rankings, see </w:t>
+      </w:r>
+      <w:r>
+        <w:rPr>
+          <w:rFonts w:ascii="Times New Roman" w:cs="Times New Roman" w:eastAsia="Times New Roman" w:hAnsi="Times New Roman"/>
+          <w:b w:val="1"/>
+          <w:color w:val="2a2a2a"/>
+          <w:sz w:val="24"/>
+          <w:szCs w:val="24"/>
+          <w:highlight w:val="yellow"/>
+          <w:rtl w:val="0"/>
+        </w:rPr>
+        <w:t xml:space="preserve">Tables 1</w:t>
+      </w:r>
+      <w:r>
+        <w:rPr>
+          <w:rFonts w:ascii="Times New Roman" w:cs="Times New Roman" w:eastAsia="Times New Roman" w:hAnsi="Times New Roman"/>
+          <w:color w:val="2a2a2a"/>
+          <w:sz w:val="24"/>
+          <w:szCs w:val="24"/>
+          <w:highlight w:val="yellow"/>
+          <w:rtl w:val="0"/>
+        </w:rPr>
+        <w:t xml:space="preserve"> and </w:t>
+      </w:r>
+      <w:r>
+        <w:rPr>
+          <w:rFonts w:ascii="Times New Roman" w:cs="Times New Roman" w:eastAsia="Times New Roman" w:hAnsi="Times New Roman"/>
+          <w:b w:val="1"/>
+          <w:color w:val="2a2a2a"/>
+          <w:sz w:val="24"/>
+          <w:szCs w:val="24"/>
+          <w:highlight w:val="yellow"/>
+          <w:rtl w:val="0"/>
+        </w:rPr>
+        <w:t xml:space="preserve">2</w:t>
+      </w:r>
+      <w:r>
+        <w:rPr>
+          <w:rFonts w:ascii="Times New Roman" w:cs="Times New Roman" w:eastAsia="Times New Roman" w:hAnsi="Times New Roman"/>
+          <w:color w:val="2a2a2a"/>
+          <w:sz w:val="24"/>
+          <w:szCs w:val="24"/>
+          <w:highlight w:val="yellow"/>
+          <w:rtl w:val="0"/>
+        </w:rPr>
+        <w:t xml:space="preserve">) remained consistent across both the WHO 5th and all editions. </w:t>
       </w:r>
     </w:p>
     <w:p>
@@ -47924,12 +47934,12 @@
           <wp:inline distB="114300" distT="114300" distL="114300" distR="114300">
             <wp:extent cx="6303264" cy="3057525"/>
             <wp:effectExtent b="0" l="0" r="0" t="0"/>
-            <wp:docPr id="7" name="image1.png"/>
+            <wp:docPr id="7" name="image2.png"/>
             <a:graphic>
               <a:graphicData uri="http://schemas.openxmlformats.org/drawingml/2006/picture">
                 <pic:pic>
                   <pic:nvPicPr>
-                    <pic:cNvPr id="0" name="image1.png"/>
+                    <pic:cNvPr id="0" name="image2.png"/>
                     <pic:cNvPicPr preferRelativeResize="0"/>
                   </pic:nvPicPr>
                   <pic:blipFill>
@@ -48270,12 +48280,12 @@
           <wp:inline distB="114300" distT="114300" distL="114300" distR="114300">
             <wp:extent cx="7217045" cy="4254901"/>
             <wp:effectExtent b="0" l="0" r="0" t="0"/>
-            <wp:docPr id="5" name="image2.png"/>
+            <wp:docPr id="5" name="image4.png"/>
             <a:graphic>
               <a:graphicData uri="http://schemas.openxmlformats.org/drawingml/2006/picture">
                 <pic:pic>
                   <pic:nvPicPr>
-                    <pic:cNvPr id="0" name="image2.png"/>
+                    <pic:cNvPr id="0" name="image4.png"/>
                     <pic:cNvPicPr preferRelativeResize="0"/>
                   </pic:nvPicPr>
                   <pic:blipFill>
@@ -48557,12 +48567,12 @@
           <wp:inline distB="114300" distT="114300" distL="114300" distR="114300">
             <wp:extent cx="8339328" cy="3467100"/>
             <wp:effectExtent b="0" l="0" r="0" t="0"/>
-            <wp:docPr id="4" name="image3.png"/>
+            <wp:docPr id="4" name="image1.png"/>
             <a:graphic>
               <a:graphicData uri="http://schemas.openxmlformats.org/drawingml/2006/picture">
                 <pic:pic>
                   <pic:nvPicPr>
-                    <pic:cNvPr id="0" name="image3.png"/>
+                    <pic:cNvPr id="0" name="image1.png"/>
                     <pic:cNvPicPr preferRelativeResize="0"/>
                   </pic:nvPicPr>
                   <pic:blipFill>
@@ -48777,12 +48787,12 @@
           <wp:inline distB="114300" distT="114300" distL="114300" distR="114300">
             <wp:extent cx="6565011" cy="4943480"/>
             <wp:effectExtent b="0" l="0" r="0" t="0"/>
-            <wp:docPr id="2" name="image4.png"/>
+            <wp:docPr id="2" name="image3.png"/>
             <a:graphic>
               <a:graphicData uri="http://schemas.openxmlformats.org/drawingml/2006/picture">
                 <pic:pic>
                   <pic:nvPicPr>
-                    <pic:cNvPr id="0" name="image4.png"/>
+                    <pic:cNvPr id="0" name="image3.png"/>
                     <pic:cNvPicPr preferRelativeResize="0"/>
                   </pic:nvPicPr>
                   <pic:blipFill>

</xml_diff>

<commit_message>
update paper till limitations
</commit_message>
<xml_diff>
--- a/Paper/Patterns_Clinical_Trials_Tumor_Name_Standardization_using Embedding_Analysis.docx
+++ b/Paper/Patterns_Clinical_Trials_Tumor_Name_Standardization_using Embedding_Analysis.docx
@@ -3769,7 +3769,7 @@
           <w:highlight w:val="yellow"/>
           <w:rtl w:val="0"/>
         </w:rPr>
-        <w:t xml:space="preserve">, and nomic achieved a minimum standardization accuracy of at least 60.24% and were consequently classified as high-accuracy methods and the highest standardizing accuracy is obtained by the methods LTE-3+Euclidean Dist when standardizing against the WHO all editions and by </w:t>
+        <w:t xml:space="preserve">, and nomic achieved a minimum standardization accuracy of at least 60.24% and were consequently classified as high-accuracy methods. The highest standardization accuracy is obtained by the methods LTE-3+Euclidean Dist when standardizing against the WHO all editions and by </w:t>
       </w:r>
       <w:r>
         <w:rPr>
@@ -3874,7 +3874,7 @@
           <w:highlight w:val="yellow"/>
           <w:rtl w:val="0"/>
         </w:rPr>
-        <w:t xml:space="preserve"> are classified as intermediate-accuracy methods when either WHO 5th or all editions were used in CANTOS. SapBERT was classified as both an intermediate and low-accuracy method as its standardization accuracy was 51.72% against the WHO 5th editions and 47.94% against the WHO all editions. The low-accuracy methods included models such as </w:t>
+        <w:t xml:space="preserve"> are classified as intermediate-accuracy methods for both WHO 5th and all editions. SapBERT was classified as both an intermediate and low-accuracy method as its standardization accuracy was 51.72% against the WHO 5th editions and 47.94% against the WHO all editions. The low-accuracy text-embedding methods were based on models such as </w:t>
       </w:r>
       <w:r>
         <w:rPr>
@@ -3884,7 +3884,7 @@
           <w:highlight w:val="yellow"/>
           <w:rtl w:val="0"/>
         </w:rPr>
-        <w:t xml:space="preserve">Llama3.3_70B, Llama3.2_3B, Llama_3.0, MedLlama2, MedLlama_13B, BioBERT, SciBERT, PubMedBERT, ModernBERT, Phi-4 and  DeepSeek_8B </w:t>
+        <w:t xml:space="preserve">Llama3.3_70B, Llama3.2_3B, Llama_3.0, MedLlama2, MedLlama_13B, BioBERT, SciBERT, PubMedBERT, ModernBERT, Phi-4 and  DeepSeek_8B. </w:t>
       </w:r>
       <w:r>
         <w:rPr>
@@ -3895,7 +3895,7 @@
           <w:highlight w:val="yellow"/>
           <w:rtl w:val="0"/>
         </w:rPr>
-        <w:t xml:space="preserve">and their standardization accuracies were either comparable or poorer compared to the text-matching methods. All text-matching based  methods were classified as low-accuracy methods.</w:t>
+        <w:t xml:space="preserve">The standardization accuracies of the low-accuracy models were either comparable or poorer compared to the text-matching methods. All text-matching based  methods were classified as low-accuracy methods.</w:t>
       </w:r>
     </w:p>
     <w:p>
@@ -3981,7 +3981,7 @@
           <w:highlight w:val="yellow"/>
           <w:rtl w:val="0"/>
         </w:rPr>
-        <w:t xml:space="preserve"> obtained from OpenAI’s models (LTE-3 and ADA-002) with Affinity Propagation clustering (LTE-3+AP, ADA-002+AP) and K-Means (LTE-3+K-Means, ADA-002+K-Means) clustering. </w:t>
+        <w:t xml:space="preserve"> obtained from OpenAI’s models (LTE-3 and ADA-002) with Affinity Propagation clustering (LTE-3+AP, ADA-002+AP) and K-means (LTE-3+K-means, ADA-002+K-means) clustering. </w:t>
       </w:r>
       <w:r>
         <w:rPr>
@@ -4002,7 +4002,7 @@
           <w:highlight w:val="yellow"/>
           <w:rtl w:val="0"/>
         </w:rPr>
-        <w:t xml:space="preserve">text-embeddings and clustering had comparable but lower standardizing accuracy as compared to their counterpart closest match methods (LTE-3+ Euclidean Dist , ADA–002+ Euclidean Dist ). In general, the LTE-3 based methods generally outperformed ADA-002, except for LTE-3+K-means, which slightly underperformed compared to ADA-002+Euclidean Dist and ADA-002+AP when standardized against WHO all editions. However, LTE-3+K-means performed better than its counterpart method ADA–002+K-means against either edition of the WHO system. Compared to these methods utilizing text-embedding and clustering, the text-embedding based methods using closet match approach, achieves higher standardization accuracy and is much simpler and faster as it does not require additional steps like clustering, cluster size analysis, or outlier detection.</w:t>
+        <w:t xml:space="preserve">text-embeddings and clustering had comparable but lower standardizing accuracy as compared to their counterpart closest match methods (LTE-3+ Euclidean Dist , ADA–002+ Euclidean Dist ). In general, the LTE-3 based methods generally outperformed ADA-002, except for LTE-3+K-means, which marginally underperformed compared to ADA-002+Euclidean Dist and ADA-002+AP when standardized against WHO all editions. However, LTE-3+K-means performed better than its counterpart method ADA–002+K-means against either edition of the WHO system. Compared to these methods utilizing text-embedding and clustering, the text-embedding based methods using closest match approach, achieves higher standardization accuracy and is simpler and faster as it does not require additional steps like clustering, cluster size analysis, or outlier detection.</w:t>
       </w:r>
     </w:p>
     <w:p>
@@ -4012,7 +4012,6 @@
         <w:jc w:val="both"/>
         <w:rPr>
           <w:rFonts w:ascii="Times New Roman" w:cs="Times New Roman" w:eastAsia="Times New Roman" w:hAnsi="Times New Roman"/>
-          <w:color w:val="2a2a2a"/>
           <w:sz w:val="24"/>
           <w:szCs w:val="24"/>
           <w:highlight w:val="yellow"/>
@@ -4038,31 +4037,13 @@
       </w:pPr>
       <w:r>
         <w:rPr>
-          <w:rtl w:val="0"/>
-        </w:rPr>
-      </w:r>
-    </w:p>
-    <w:p>
-      <w:pPr>
-        <w:spacing w:line="276.0005454545455" w:lineRule="auto"/>
-        <w:ind w:left="-540" w:firstLine="0"/>
-        <w:jc w:val="both"/>
-        <w:rPr>
           <w:rFonts w:ascii="Times New Roman" w:cs="Times New Roman" w:eastAsia="Times New Roman" w:hAnsi="Times New Roman"/>
           <w:sz w:val="24"/>
           <w:szCs w:val="24"/>
           <w:highlight w:val="yellow"/>
-        </w:rPr>
-      </w:pPr>
-      <w:r>
-        <w:rPr>
-          <w:rFonts w:ascii="Times New Roman" w:cs="Times New Roman" w:eastAsia="Times New Roman" w:hAnsi="Times New Roman"/>
-          <w:sz w:val="24"/>
-          <w:szCs w:val="24"/>
-          <w:highlight w:val="yellow"/>
-          <w:rtl w:val="0"/>
-        </w:rPr>
-        <w:t xml:space="preserve">In our effort to improve the standardization accuracy, we devised a method that standardized a given CTR tumor name by performing a majority vote on the standardization predictions obtained from a combination of high-accuracy methods. We considered combinations of three methods as an odd number of methods as it reduces chances of a tie occurring. We limited the majority vote to only the high-accuracy methods identified in </w:t>
+          <w:rtl w:val="0"/>
+        </w:rPr>
+        <w:t xml:space="preserve">In our effort to improve the standardization accuracy, we devised a method that standardized a given CTR tumor name by performing a majority vote on the standardization predictions obtained from a combination of high-accuracy methods. We considered combinations of three methods as an odd number of methods reduces chances of a tie occurring. We limited the majority vote to only the high-accuracy methods identified in </w:t>
       </w:r>
       <w:r>
         <w:rPr>
@@ -24301,7 +24282,7 @@
                 <w:szCs w:val="20"/>
                 <w:rtl w:val="0"/>
               </w:rPr>
-              <w:t xml:space="preserve">LTE-3+KMeans</w:t>
+              <w:t xml:space="preserve">LTE-3+K-means</w:t>
             </w:r>
           </w:p>
         </w:tc>
@@ -24501,7 +24482,7 @@
                 <w:szCs w:val="20"/>
                 <w:rtl w:val="0"/>
               </w:rPr>
-              <w:t xml:space="preserve">ADA-002+KMeans</w:t>
+              <w:t xml:space="preserve">ADA-002+K-means</w:t>
             </w:r>
           </w:p>
         </w:tc>
@@ -31126,7 +31107,7 @@
                 <w:szCs w:val="20"/>
                 <w:rtl w:val="0"/>
               </w:rPr>
-              <w:t xml:space="preserve">LTE-3+KMeans</w:t>
+              <w:t xml:space="preserve">LTE-3+K-means</w:t>
             </w:r>
           </w:p>
         </w:tc>
@@ -31926,7 +31907,7 @@
                 <w:szCs w:val="20"/>
                 <w:rtl w:val="0"/>
               </w:rPr>
-              <w:t xml:space="preserve">ADA-002+KMeans</w:t>
+              <w:t xml:space="preserve">ADA-002+K-means</w:t>
             </w:r>
           </w:p>
         </w:tc>
@@ -48280,12 +48261,12 @@
           <wp:inline distB="114300" distT="114300" distL="114300" distR="114300">
             <wp:extent cx="7217045" cy="4254901"/>
             <wp:effectExtent b="0" l="0" r="0" t="0"/>
-            <wp:docPr id="5" name="image4.png"/>
+            <wp:docPr id="5" name="image3.png"/>
             <a:graphic>
               <a:graphicData uri="http://schemas.openxmlformats.org/drawingml/2006/picture">
                 <pic:pic>
                   <pic:nvPicPr>
-                    <pic:cNvPr id="0" name="image4.png"/>
+                    <pic:cNvPr id="0" name="image3.png"/>
                     <pic:cNvPicPr preferRelativeResize="0"/>
                   </pic:nvPicPr>
                   <pic:blipFill>
@@ -48787,12 +48768,12 @@
           <wp:inline distB="114300" distT="114300" distL="114300" distR="114300">
             <wp:extent cx="6565011" cy="4943480"/>
             <wp:effectExtent b="0" l="0" r="0" t="0"/>
-            <wp:docPr id="2" name="image3.png"/>
+            <wp:docPr id="2" name="image4.png"/>
             <a:graphic>
               <a:graphicData uri="http://schemas.openxmlformats.org/drawingml/2006/picture">
                 <pic:pic>
                   <pic:nvPicPr>
-                    <pic:cNvPr id="0" name="image3.png"/>
+                    <pic:cNvPr id="0" name="image4.png"/>
                     <pic:cNvPicPr preferRelativeResize="0"/>
                   </pic:nvPicPr>
                   <pic:blipFill>

</xml_diff>

<commit_message>
update paper and supplement files with ST12 and ST13
</commit_message>
<xml_diff>
--- a/Paper/Patterns_Clinical_Trials_Tumor_Name_Standardization_using Embedding_Analysis.docx
+++ b/Paper/Patterns_Clinical_Trials_Tumor_Name_Standardization_using Embedding_Analysis.docx
@@ -1348,7 +1348,7 @@
           <w:highlight w:val="yellow"/>
           <w:rtl w:val="0"/>
         </w:rPr>
-        <w:t xml:space="preserve">hat standardizes tumor names in the CTR’s “conditions” file using methods based on text-matching (based on edit distances) and text-embedding derived from open source and proprietary large language models (LLMs). </w:t>
+        <w:t xml:space="preserve">hat standardizes tumor names in the CTR’s “conditions” file using methods based on text-matching (based on edit distances) and text-embedding derived from open source and proprietary large language models (LLMs) or transformer based models. </w:t>
       </w:r>
       <w:r>
         <w:rPr>
@@ -3037,7 +3037,7 @@
           <w:highlight w:val="yellow"/>
           <w:rtl w:val="0"/>
         </w:rPr>
-        <w:t xml:space="preserve">, underscores the need for higher-quality text embeddings that would yield greater class distribution differences between correctly and incorrectly standardized tumor names. Such embeddings would also reduce the number of incorrect standardizations, thereby improving standardization accuracy. LLMs trained and fine-tuned on extensive, diverse datasets, including tumor nomenclature from the WHO system and the NCIt database are likely to be promising tools for generating such high-quality embeddings.</w:t>
+        <w:t xml:space="preserve">, underscores the need for higher-quality text embeddings that would yield greater class distribution differences between correctly and incorrectly standardized tumor names. Such embeddings would also reduce the number of incorrect standardizations, thereby improving standardization accuracy. LLMs or transformer based models trained and fine-tuned on extensive, diverse datasets, including tumor nomenclature from the WHO system and the NCIt database are likely to be promising tools for generating such high-quality embeddings.</w:t>
       </w:r>
     </w:p>
     <w:p>
@@ -4375,7 +4375,27 @@
           <w:highlight w:val="white"/>
           <w:rtl w:val="0"/>
         </w:rPr>
-        <w:t xml:space="preserve">. Future work includes generalizing CANTOS to incorporate additional embedding methods, including domain-specific biomedical LLMs, and expanding its functionality to standardize any collection of biomedical terms.</w:t>
+        <w:t xml:space="preserve">. Future work includes generalizing CANTOS to incorporate additional embedding methods, including domain-specific biomedical LLMs or </w:t>
+      </w:r>
+      <w:r>
+        <w:rPr>
+          <w:rFonts w:ascii="Times New Roman" w:cs="Times New Roman" w:eastAsia="Times New Roman" w:hAnsi="Times New Roman"/>
+          <w:sz w:val="24"/>
+          <w:szCs w:val="24"/>
+          <w:highlight w:val="yellow"/>
+          <w:rtl w:val="0"/>
+        </w:rPr>
+        <w:t xml:space="preserve">transformer based models</w:t>
+      </w:r>
+      <w:r>
+        <w:rPr>
+          <w:rFonts w:ascii="Times New Roman" w:cs="Times New Roman" w:eastAsia="Times New Roman" w:hAnsi="Times New Roman"/>
+          <w:sz w:val="24"/>
+          <w:szCs w:val="24"/>
+          <w:highlight w:val="white"/>
+          <w:rtl w:val="0"/>
+        </w:rPr>
+        <w:t xml:space="preserve">, and expanding its functionality to standardize any collection of biomedical terms.</w:t>
       </w:r>
       <w:r>
         <w:rPr>
@@ -4441,7 +4461,7 @@
           <w:highlight w:val="yellow"/>
           <w:rtl w:val="0"/>
         </w:rPr>
-        <w:t xml:space="preserve">As more CTR samples are annotated with ground truth, the standardization accuracies of each method will approach their true values. While we expect accuracy changes, our annotation of 1,600 CTR tumor names suggests that text-embedding methods will likely outperform text-matching methods. Expert annotation of CTR tumor names is crucial for accurately evaluating these methods and is a limitation of our study. Additionally, as the CTR updates, new tumor names must be identified and standardized, necessitating rerunning CANTOS and manually validating the findings, which is time-consuming. Beyond expert annotation, there are computational costs associated with running the CANTOS pipeline, generating text-embedding, and storing data, which can become expensive over time. Another limitation is that text-embedding generated using the current versions of the LLM need to be updated as newer and more powerful models become available. While we tested methods that employed text-embeddings from models that were trained on biomedical and scientific literature such as MedLlama, PubMedBERT, SciBERT, BioGPT, and ClinicalBERT , these models did not achieve high standardization accuracy. Therefore, it is not necessary that a domain specific model will produce high quality text-embeddings. Even though these models are trained on biomedical literature, their poor performance can possibly be attributed to low generalization power, which can happen when the training dataset is not rich or diverse enough. Furthermore, having a very focused and narrow training dataset can cause text-embedding from failing to capture a deeper contextual understanding of words. Contextual understanding can potentially help text-embedding to disambiguate terms and detect nuanced relationships between words. Various other factors such as model architecture and embedding dimensions also play a role in the quality of text-embeddings produced. Any  LLM that is trained and fine tuned on a large diverse dataset that include tumor nomenclature will be a potential candidate for future integration in the CANTOS pipeline as text-embeddings generated from these models could likely differentiate tumor names more precisely </w:t>
+        <w:t xml:space="preserve">As more CTR samples are annotated with ground truth, the standardization accuracies of each method will approach their true values. While we expect accuracy changes, our annotation of 1,600 CTR tumor names suggests that text-embedding methods will likely outperform text-matching methods. Expert annotation of CTR tumor names is crucial for accurately evaluating these methods and is a limitation of our study. Additionally, as the CTR updates, new tumor names must be identified and standardized, necessitating rerunning CANTOS and manually validating the findings, which is time-consuming. Beyond expert annotation, there are computational costs associated with running the CANTOS pipeline, generating text-embedding, and storing data, which can become expensive over time. Another limitation is that text-embedding generated using the current versions of the LLMs or transformer based models need to be updated as newer and more powerful models become available. While we tested methods that employed text-embeddings from models that were trained on biomedical and scientific literature such as MedLlama, PubMedBERT, SciBERT, BioGPT, and ClinicalBERT , these models did not achieve high standardization accuracy. Therefore, it is not necessary that a domain specific model will produce high quality text-embeddings. Even though these models are trained on biomedical literature, their poor performance can possibly be attributed to low generalization power, which can happen when the training dataset is not rich or diverse enough. Furthermore, having a very focused and narrow training dataset can cause text-embedding from failing to capture a deeper contextual understanding of words. Contextual understanding can potentially help text-embedding to disambiguate terms and detect nuanced relationships between words. Various other factors such as model architecture and embedding dimensions also play a role in the quality of text-embeddings produced. Any  LLM or transformer based model that is trained and fine tuned on a large diverse dataset that include tumor nomenclature will be a potential candidate for future integration in the CANTOS pipeline as text-embeddings generated from these models could likely differentiate tumor names more precisely </w:t>
       </w:r>
       <w:hyperlink r:id="rId48">
         <w:r>
@@ -4508,7 +4528,47 @@
           <w:highlight w:val="white"/>
           <w:rtl w:val="0"/>
         </w:rPr>
-        <w:t xml:space="preserve">The CANTOS pipeline uses embeddings from LLMs that may inadvertently produce outputs reflecting biases inherent in their training data. It is important to recognize that LLM outputs are not always neutral or free from error, and results should be interpreted with caution. Importantly, the CANTOS pipeline is designed solely for research analysis purposes and should not be applied in clinical or diagnostic settings. This tool is not intended for use in contexts where decisions may directly affect human health, treatment, or care. Any conclusions drawn from the use of CANTOS in research should be further reviewed and validated by clinical professionals and subjected to rigorous peer-reviewed testing before any potential medical or therapeutic applications.</w:t>
+        <w:t xml:space="preserve">The CANTOS pipeline uses text-embeddings from LLMs and </w:t>
+      </w:r>
+      <w:r>
+        <w:rPr>
+          <w:rFonts w:ascii="Times New Roman" w:cs="Times New Roman" w:eastAsia="Times New Roman" w:hAnsi="Times New Roman"/>
+          <w:sz w:val="24"/>
+          <w:szCs w:val="24"/>
+          <w:highlight w:val="yellow"/>
+          <w:rtl w:val="0"/>
+        </w:rPr>
+        <w:t xml:space="preserve">transformer based models</w:t>
+      </w:r>
+      <w:r>
+        <w:rPr>
+          <w:rFonts w:ascii="Times New Roman" w:cs="Times New Roman" w:eastAsia="Times New Roman" w:hAnsi="Times New Roman"/>
+          <w:sz w:val="24"/>
+          <w:szCs w:val="24"/>
+          <w:highlight w:val="white"/>
+          <w:rtl w:val="0"/>
+        </w:rPr>
+        <w:t xml:space="preserve"> that may inadvertently produce outputs reflecting biases inherent in their training data. It is important to recognize that LLMs and </w:t>
+      </w:r>
+      <w:r>
+        <w:rPr>
+          <w:rFonts w:ascii="Times New Roman" w:cs="Times New Roman" w:eastAsia="Times New Roman" w:hAnsi="Times New Roman"/>
+          <w:sz w:val="24"/>
+          <w:szCs w:val="24"/>
+          <w:highlight w:val="yellow"/>
+          <w:rtl w:val="0"/>
+        </w:rPr>
+        <w:t xml:space="preserve">transformer based models</w:t>
+      </w:r>
+      <w:r>
+        <w:rPr>
+          <w:rFonts w:ascii="Times New Roman" w:cs="Times New Roman" w:eastAsia="Times New Roman" w:hAnsi="Times New Roman"/>
+          <w:sz w:val="24"/>
+          <w:szCs w:val="24"/>
+          <w:highlight w:val="white"/>
+          <w:rtl w:val="0"/>
+        </w:rPr>
+        <w:t xml:space="preserve"> outputs are not always neutral or free from error, and results should be interpreted with caution. Importantly, the CANTOS pipeline is designed solely for research analysis purposes and should not be applied in clinical or diagnostic settings. This tool is not intended for use in contexts where decisions may directly affect human health, treatment, or care. Any conclusions drawn from the use of CANTOS in research should be further reviewed and validated by clinical professionals and subjected to rigorous peer-reviewed testing before any potential medical or therapeutic applications.</w:t>
       </w:r>
     </w:p>
     <w:p>
@@ -8306,7 +8366,76 @@
           <w:szCs w:val="24"/>
           <w:rtl w:val="0"/>
         </w:rPr>
-        <w:t xml:space="preserve">.</w:t>
+        <w:t xml:space="preserve"> or specialized transformer based models such as </w:t>
+      </w:r>
+      <w:r>
+        <w:rPr>
+          <w:rFonts w:ascii="Times New Roman" w:cs="Times New Roman" w:eastAsia="Times New Roman" w:hAnsi="Times New Roman"/>
+          <w:sz w:val="24"/>
+          <w:szCs w:val="24"/>
+          <w:highlight w:val="yellow"/>
+          <w:rtl w:val="0"/>
+        </w:rPr>
+        <w:t xml:space="preserve">text-embedding-3-large (LTE-3) </w:t>
+      </w:r>
+      <w:hyperlink r:id="rId74">
+        <w:r>
+          <w:rPr>
+            <w:rFonts w:ascii="Times New Roman" w:cs="Times New Roman" w:eastAsia="Times New Roman" w:hAnsi="Times New Roman"/>
+            <w:sz w:val="24"/>
+            <w:szCs w:val="24"/>
+            <w:highlight w:val="yellow"/>
+            <w:vertAlign w:val="superscript"/>
+            <w:rtl w:val="0"/>
+          </w:rPr>
+          <w:t xml:space="preserve">65</w:t>
+        </w:r>
+      </w:hyperlink>
+      <w:r>
+        <w:rPr>
+          <w:rFonts w:ascii="Times New Roman" w:cs="Times New Roman" w:eastAsia="Times New Roman" w:hAnsi="Times New Roman"/>
+          <w:sz w:val="24"/>
+          <w:szCs w:val="24"/>
+          <w:rtl w:val="0"/>
+        </w:rPr>
+        <w:t xml:space="preserve">, </w:t>
+      </w:r>
+      <w:r>
+        <w:rPr>
+          <w:rFonts w:ascii="Times New Roman" w:cs="Times New Roman" w:eastAsia="Times New Roman" w:hAnsi="Times New Roman"/>
+          <w:sz w:val="24"/>
+          <w:szCs w:val="24"/>
+          <w:highlight w:val="yellow"/>
+          <w:rtl w:val="0"/>
+        </w:rPr>
+        <w:t xml:space="preserve">text-embedding-ada-002 (ADA-002)</w:t>
+      </w:r>
+      <w:hyperlink r:id="rId75">
+        <w:r>
+          <w:rPr>
+            <w:rFonts w:ascii="Times New Roman" w:cs="Times New Roman" w:eastAsia="Times New Roman" w:hAnsi="Times New Roman"/>
+            <w:sz w:val="24"/>
+            <w:szCs w:val="24"/>
+            <w:highlight w:val="yellow"/>
+            <w:vertAlign w:val="superscript"/>
+            <w:rtl w:val="0"/>
+          </w:rPr>
+          <w:t xml:space="preserve">66</w:t>
+        </w:r>
+      </w:hyperlink>
+      <w:r>
+        <w:rPr>
+          <w:rFonts w:ascii="Times New Roman" w:cs="Times New Roman" w:eastAsia="Times New Roman" w:hAnsi="Times New Roman"/>
+          <w:sz w:val="24"/>
+          <w:szCs w:val="24"/>
+          <w:rtl w:val="0"/>
+        </w:rPr>
+        <w:t xml:space="preserve"> etc. </w:t>
+      </w:r>
+      <w:r>
+        <w:rPr>
+          <w:rtl w:val="0"/>
+        </w:rPr>
       </w:r>
     </w:p>
     <w:p>
@@ -8344,9 +8473,9 @@
           <w:highlight w:val="yellow"/>
           <w:rtl w:val="0"/>
         </w:rPr>
-        <w:t xml:space="preserve">For this study, we generated text-embeddings from 26 different LLMs, many of which were open source and a few of them were proprietary models. These models varied in their architectures, training data, domain specialization and text-embedding dimensions.  The open source models used for generating text-embeddings include e5-large</w:t>
-      </w:r>
-      <w:hyperlink r:id="rId74">
+        <w:t xml:space="preserve">For this study, we generated text-embeddings from 26 different transformer based models and LLMs, many of which were open source and a few of them were proprietary models. These models varied in their architectures, training data, domain specialization and text-embedding dimensions.  The open source models used for generating text-embeddings include e5-large</w:t>
+      </w:r>
+      <w:hyperlink r:id="rId76">
         <w:r>
           <w:rPr>
             <w:rFonts w:ascii="Times New Roman" w:cs="Times New Roman" w:eastAsia="Times New Roman" w:hAnsi="Times New Roman"/>
@@ -8372,7 +8501,7 @@
         </w:rPr>
         <w:t xml:space="preserve">, e5-large-v2 </w:t>
       </w:r>
-      <w:hyperlink r:id="rId75">
+      <w:hyperlink r:id="rId77">
         <w:r>
           <w:rPr>
             <w:rFonts w:ascii="Times New Roman" w:cs="Times New Roman" w:eastAsia="Times New Roman" w:hAnsi="Times New Roman"/>
@@ -8398,7 +8527,7 @@
         </w:rPr>
         <w:t xml:space="preserve">, all-mpnet-base-v2</w:t>
       </w:r>
-      <w:hyperlink r:id="rId76">
+      <w:hyperlink r:id="rId78">
         <w:r>
           <w:rPr>
             <w:rFonts w:ascii="Times New Roman" w:cs="Times New Roman" w:eastAsia="Times New Roman" w:hAnsi="Times New Roman"/>
@@ -8424,7 +8553,7 @@
         </w:rPr>
         <w:t xml:space="preserve">, all-MiniLM-L12-v2</w:t>
       </w:r>
-      <w:hyperlink r:id="rId77">
+      <w:hyperlink r:id="rId79">
         <w:r>
           <w:rPr>
             <w:rFonts w:ascii="Times New Roman" w:cs="Times New Roman" w:eastAsia="Times New Roman" w:hAnsi="Times New Roman"/>
@@ -8450,7 +8579,7 @@
         </w:rPr>
         <w:t xml:space="preserve">, gtr-t5-large</w:t>
       </w:r>
-      <w:hyperlink r:id="rId78">
+      <w:hyperlink r:id="rId80">
         <w:r>
           <w:rPr>
             <w:rFonts w:ascii="Times New Roman" w:cs="Times New Roman" w:eastAsia="Times New Roman" w:hAnsi="Times New Roman"/>
@@ -8476,7 +8605,7 @@
         </w:rPr>
         <w:t xml:space="preserve">, all-MiniLM-L6-v2</w:t>
       </w:r>
-      <w:hyperlink r:id="rId79">
+      <w:hyperlink r:id="rId81">
         <w:r>
           <w:rPr>
             <w:rFonts w:ascii="Times New Roman" w:cs="Times New Roman" w:eastAsia="Times New Roman" w:hAnsi="Times New Roman"/>
@@ -8502,7 +8631,7 @@
         </w:rPr>
         <w:t xml:space="preserve">, all-roberta-large-v1</w:t>
       </w:r>
-      <w:hyperlink r:id="rId80">
+      <w:hyperlink r:id="rId82">
         <w:r>
           <w:rPr>
             <w:rFonts w:ascii="Times New Roman" w:cs="Times New Roman" w:eastAsia="Times New Roman" w:hAnsi="Times New Roman"/>
@@ -8528,7 +8657,7 @@
         </w:rPr>
         <w:t xml:space="preserve">, sapBERT</w:t>
       </w:r>
-      <w:hyperlink r:id="rId81">
+      <w:hyperlink r:id="rId83">
         <w:r>
           <w:rPr>
             <w:rFonts w:ascii="Times New Roman" w:cs="Times New Roman" w:eastAsia="Times New Roman" w:hAnsi="Times New Roman"/>
@@ -8554,7 +8683,7 @@
         </w:rPr>
         <w:t xml:space="preserve">, clinicalBERT</w:t>
       </w:r>
-      <w:hyperlink r:id="rId82">
+      <w:hyperlink r:id="rId84">
         <w:r>
           <w:rPr>
             <w:rFonts w:ascii="Times New Roman" w:cs="Times New Roman" w:eastAsia="Times New Roman" w:hAnsi="Times New Roman"/>
@@ -8580,7 +8709,7 @@
         </w:rPr>
         <w:t xml:space="preserve">, PubMedBERT</w:t>
       </w:r>
-      <w:hyperlink r:id="rId83">
+      <w:hyperlink r:id="rId85">
         <w:r>
           <w:rPr>
             <w:rFonts w:ascii="Times New Roman" w:cs="Times New Roman" w:eastAsia="Times New Roman" w:hAnsi="Times New Roman"/>
@@ -8606,7 +8735,7 @@
         </w:rPr>
         <w:t xml:space="preserve">, BioBERT</w:t>
       </w:r>
-      <w:hyperlink r:id="rId84">
+      <w:hyperlink r:id="rId86">
         <w:r>
           <w:rPr>
             <w:rFonts w:ascii="Times New Roman" w:cs="Times New Roman" w:eastAsia="Times New Roman" w:hAnsi="Times New Roman"/>
@@ -8632,7 +8761,7 @@
         </w:rPr>
         <w:t xml:space="preserve">, SciBERT</w:t>
       </w:r>
-      <w:hyperlink r:id="rId85">
+      <w:hyperlink r:id="rId87">
         <w:r>
           <w:rPr>
             <w:rFonts w:ascii="Times New Roman" w:cs="Times New Roman" w:eastAsia="Times New Roman" w:hAnsi="Times New Roman"/>
@@ -8658,7 +8787,7 @@
         </w:rPr>
         <w:t xml:space="preserve">, ModernBERT</w:t>
       </w:r>
-      <w:hyperlink r:id="rId86">
+      <w:hyperlink r:id="rId88">
         <w:r>
           <w:rPr>
             <w:rFonts w:ascii="Times New Roman" w:cs="Times New Roman" w:eastAsia="Times New Roman" w:hAnsi="Times New Roman"/>
@@ -8684,7 +8813,7 @@
         </w:rPr>
         <w:t xml:space="preserve">, BioGPT</w:t>
       </w:r>
-      <w:hyperlink r:id="rId87">
+      <w:hyperlink r:id="rId89">
         <w:r>
           <w:rPr>
             <w:rFonts w:ascii="Times New Roman" w:cs="Times New Roman" w:eastAsia="Times New Roman" w:hAnsi="Times New Roman"/>
@@ -8710,7 +8839,7 @@
         </w:rPr>
         <w:t xml:space="preserve">, MedLlama2</w:t>
       </w:r>
-      <w:hyperlink r:id="rId88">
+      <w:hyperlink r:id="rId90">
         <w:r>
           <w:rPr>
             <w:rFonts w:ascii="Times New Roman" w:cs="Times New Roman" w:eastAsia="Times New Roman" w:hAnsi="Times New Roman"/>
@@ -8736,7 +8865,7 @@
         </w:rPr>
         <w:t xml:space="preserve">,  MedLlama_13B</w:t>
       </w:r>
-      <w:hyperlink r:id="rId89">
+      <w:hyperlink r:id="rId91">
         <w:r>
           <w:rPr>
             <w:rFonts w:ascii="Times New Roman" w:cs="Times New Roman" w:eastAsia="Times New Roman" w:hAnsi="Times New Roman"/>
@@ -8762,7 +8891,7 @@
         </w:rPr>
         <w:t xml:space="preserve">, LaBSE</w:t>
       </w:r>
-      <w:hyperlink r:id="rId90">
+      <w:hyperlink r:id="rId92">
         <w:r>
           <w:rPr>
             <w:rFonts w:ascii="Times New Roman" w:cs="Times New Roman" w:eastAsia="Times New Roman" w:hAnsi="Times New Roman"/>
@@ -8788,7 +8917,7 @@
         </w:rPr>
         <w:t xml:space="preserve">,  Llama3.3_70B</w:t>
       </w:r>
-      <w:hyperlink r:id="rId91">
+      <w:hyperlink r:id="rId93">
         <w:r>
           <w:rPr>
             <w:rFonts w:ascii="Times New Roman" w:cs="Times New Roman" w:eastAsia="Times New Roman" w:hAnsi="Times New Roman"/>
@@ -8814,7 +8943,7 @@
         </w:rPr>
         <w:t xml:space="preserve">, Llama3.2_3B</w:t>
       </w:r>
-      <w:hyperlink r:id="rId92">
+      <w:hyperlink r:id="rId94">
         <w:r>
           <w:rPr>
             <w:rFonts w:ascii="Times New Roman" w:cs="Times New Roman" w:eastAsia="Times New Roman" w:hAnsi="Times New Roman"/>
@@ -8840,7 +8969,7 @@
         </w:rPr>
         <w:t xml:space="preserve">, Llama3.0</w:t>
       </w:r>
-      <w:hyperlink r:id="rId93">
+      <w:hyperlink r:id="rId95">
         <w:r>
           <w:rPr>
             <w:rFonts w:ascii="Times New Roman" w:cs="Times New Roman" w:eastAsia="Times New Roman" w:hAnsi="Times New Roman"/>
@@ -8866,7 +8995,7 @@
         </w:rPr>
         <w:t xml:space="preserve">, Phi-4</w:t>
       </w:r>
-      <w:hyperlink r:id="rId94">
+      <w:hyperlink r:id="rId96">
         <w:r>
           <w:rPr>
             <w:rFonts w:ascii="Times New Roman" w:cs="Times New Roman" w:eastAsia="Times New Roman" w:hAnsi="Times New Roman"/>
@@ -8892,7 +9021,7 @@
         </w:rPr>
         <w:t xml:space="preserve"> nomic</w:t>
       </w:r>
-      <w:hyperlink r:id="rId95">
+      <w:hyperlink r:id="rId97">
         <w:r>
           <w:rPr>
             <w:rFonts w:ascii="Times New Roman" w:cs="Times New Roman" w:eastAsia="Times New Roman" w:hAnsi="Times New Roman"/>
@@ -8918,7 +9047,7 @@
         </w:rPr>
         <w:t xml:space="preserve">, and DeepSeek_8B</w:t>
       </w:r>
-      <w:hyperlink r:id="rId96">
+      <w:hyperlink r:id="rId98">
         <w:r>
           <w:rPr>
             <w:rFonts w:ascii="Times New Roman" w:cs="Times New Roman" w:eastAsia="Times New Roman" w:hAnsi="Times New Roman"/>
@@ -8944,7 +9073,7 @@
         </w:rPr>
         <w:t xml:space="preserve">. The proprietary models include OpenAI’s: text-embedding-ada-002 (ADA-002)</w:t>
       </w:r>
-      <w:hyperlink r:id="rId97">
+      <w:hyperlink r:id="rId99">
         <w:r>
           <w:rPr>
             <w:rFonts w:ascii="Times New Roman" w:cs="Times New Roman" w:eastAsia="Times New Roman" w:hAnsi="Times New Roman"/>
@@ -8970,7 +9099,7 @@
         </w:rPr>
         <w:t xml:space="preserve"> and text-embedding-3-large (LTE-3) </w:t>
       </w:r>
-      <w:hyperlink r:id="rId98">
+      <w:hyperlink r:id="rId100">
         <w:r>
           <w:rPr>
             <w:rFonts w:ascii="Times New Roman" w:cs="Times New Roman" w:eastAsia="Times New Roman" w:hAnsi="Times New Roman"/>
@@ -9006,7 +9135,7 @@
         </w:rPr>
         <w:t xml:space="preserve">and Cohere’s embed-english-v2.0</w:t>
       </w:r>
-      <w:hyperlink r:id="rId99">
+      <w:hyperlink r:id="rId101">
         <w:r>
           <w:rPr>
             <w:rFonts w:ascii="Times New Roman" w:cs="Times New Roman" w:eastAsia="Times New Roman" w:hAnsi="Times New Roman"/>
@@ -9410,7 +9539,7 @@
         </w:rPr>
         <w:t xml:space="preserve">In addition to AP clustering, CANTOS implemented K-means clustering on PCA transformed embeddings to standardize the tumor names in CTR. Unlike AP, K-means requires users to define the number of clusters, "K," as a hyperparameter</w:t>
       </w:r>
-      <w:hyperlink r:id="rId100">
+      <w:hyperlink r:id="rId102">
         <w:r>
           <w:rPr>
             <w:rFonts w:ascii="Times New Roman" w:cs="Times New Roman" w:eastAsia="Times New Roman" w:hAnsi="Times New Roman"/>
@@ -9436,7 +9565,7 @@
         </w:rPr>
         <w:t xml:space="preserve">. Without prior information on the types of tumors present in CTR, it is difficult to estimate "K" qualitatively and thus we used a computational method to decide on an optimal value for “K”.  To determine “K”, we implemented a commonly used cluster performance metric known as the silhouette coefficient</w:t>
       </w:r>
-      <w:hyperlink r:id="rId101">
+      <w:hyperlink r:id="rId103">
         <w:r>
           <w:rPr>
             <w:rFonts w:ascii="Times New Roman" w:cs="Times New Roman" w:eastAsia="Times New Roman" w:hAnsi="Times New Roman"/>
@@ -9462,7 +9591,7 @@
         </w:rPr>
         <w:t xml:space="preserve"> within CANTOS. For a given value of “K”, when K-means clustering is completed, the silhouette coefficient is computed for each data point. The silhouette coefficient has a range of [-1,1]. A silhouette coefficient of 1 signifies that the data point is well-matched to other elements in its own cluster and poorly matched to members of neighboring clusters</w:t>
       </w:r>
-      <w:hyperlink r:id="rId102">
+      <w:hyperlink r:id="rId104">
         <w:r>
           <w:rPr>
             <w:rFonts w:ascii="Times New Roman" w:cs="Times New Roman" w:eastAsia="Times New Roman" w:hAnsi="Times New Roman"/>
@@ -9488,7 +9617,7 @@
         </w:rPr>
         <w:t xml:space="preserve">. A silhouette coefficient of 0 indicates that the data point is at the decision boundary of neighboring clusters and a score of -1 indicates that the data point is poorly matched with other cluster members and likely assigned to an incorrect cluster</w:t>
       </w:r>
-      <w:hyperlink r:id="rId103">
+      <w:hyperlink r:id="rId105">
         <w:r>
           <w:rPr>
             <w:rFonts w:ascii="Times New Roman" w:cs="Times New Roman" w:eastAsia="Times New Roman" w:hAnsi="Times New Roman"/>
@@ -10418,7 +10547,7 @@
         </w:rPr>
         <w:t xml:space="preserve">Users can download the data used in this paper from the CTR website (</w:t>
       </w:r>
-      <w:hyperlink r:id="rId104">
+      <w:hyperlink r:id="rId106">
         <w:r>
           <w:rPr>
             <w:rFonts w:ascii="Times New Roman" w:cs="Times New Roman" w:eastAsia="Times New Roman" w:hAnsi="Times New Roman"/>
@@ -10442,7 +10571,7 @@
         </w:rPr>
         <w:t xml:space="preserve">)</w:t>
       </w:r>
-      <w:hyperlink r:id="rId105">
+      <w:hyperlink r:id="rId107">
         <w:r>
           <w:rPr>
             <w:rFonts w:ascii="Times New Roman" w:cs="Times New Roman" w:eastAsia="Times New Roman" w:hAnsi="Times New Roman"/>
@@ -10468,7 +10597,7 @@
         </w:rPr>
         <w:t xml:space="preserve">, Clinical Trials API or from the Aggregate Analysis of ClinicalTrials.gov-Clinical Trials Transformative Initiative (AACT-CTTI) website (</w:t>
       </w:r>
-      <w:hyperlink r:id="rId106">
+      <w:hyperlink r:id="rId108">
         <w:r>
           <w:rPr>
             <w:rFonts w:ascii="Times New Roman" w:cs="Times New Roman" w:eastAsia="Times New Roman" w:hAnsi="Times New Roman"/>
@@ -10513,7 +10642,7 @@
         </w:rPr>
         <w:t xml:space="preserve">. The code files for building and running CANTOS, along with the instructions for downloading the embeddings generated using Open AI are publicly available at our GitHub repository: </w:t>
       </w:r>
-      <w:hyperlink r:id="rId107">
+      <w:hyperlink r:id="rId109">
         <w:r>
           <w:rPr>
             <w:rFonts w:ascii="Times New Roman" w:cs="Times New Roman" w:eastAsia="Times New Roman" w:hAnsi="Times New Roman"/>
@@ -10764,7 +10893,7 @@
         </w:rPr>
         <w:t xml:space="preserve">. The code for implementation of the CANTOS pipeline is available in our public GitHub repository:</w:t>
       </w:r>
-      <w:hyperlink r:id="rId108">
+      <w:hyperlink r:id="rId110">
         <w:r>
           <w:rPr>
             <w:rFonts w:ascii="Times New Roman" w:cs="Times New Roman" w:eastAsia="Times New Roman" w:hAnsi="Times New Roman"/>
@@ -10777,7 +10906,7 @@
           <w:t xml:space="preserve"> </w:t>
         </w:r>
       </w:hyperlink>
-      <w:hyperlink r:id="rId109">
+      <w:hyperlink r:id="rId111">
         <w:r>
           <w:rPr>
             <w:rFonts w:ascii="Times New Roman" w:cs="Times New Roman" w:eastAsia="Times New Roman" w:hAnsi="Times New Roman"/>
@@ -11166,7 +11295,7 @@
         <w:t xml:space="preserve">1.</w:t>
         <w:tab/>
       </w:r>
-      <w:hyperlink r:id="rId110">
+      <w:hyperlink r:id="rId112">
         <w:r>
           <w:rPr>
             <w:rFonts w:ascii="Times New Roman" w:cs="Times New Roman" w:eastAsia="Times New Roman" w:hAnsi="Times New Roman"/>
@@ -11181,7 +11310,7 @@
           <w:t xml:space="preserve">Bray, F., Laversanne, M., Sung, H., Ferlay, J., Siegel, R.L., Soerjomataram, I., and Jemal, A. (2024). Global cancer statistics 2022: GLOBOCAN estimates of incidence and mortality worldwide for 36 cancers in 185 countries. CA Cancer J. Clin. </w:t>
         </w:r>
       </w:hyperlink>
-      <w:hyperlink r:id="rId111">
+      <w:hyperlink r:id="rId113">
         <w:r>
           <w:rPr>
             <w:rFonts w:ascii="Times New Roman" w:cs="Times New Roman" w:eastAsia="Times New Roman" w:hAnsi="Times New Roman"/>
@@ -11196,7 +11325,7 @@
           <w:t xml:space="preserve">74</w:t>
         </w:r>
       </w:hyperlink>
-      <w:hyperlink r:id="rId112">
+      <w:hyperlink r:id="rId114">
         <w:r>
           <w:rPr>
             <w:rFonts w:ascii="Times New Roman" w:cs="Times New Roman" w:eastAsia="Times New Roman" w:hAnsi="Times New Roman"/>
@@ -11256,7 +11385,7 @@
         <w:t xml:space="preserve">2.</w:t>
         <w:tab/>
       </w:r>
-      <w:hyperlink r:id="rId113">
+      <w:hyperlink r:id="rId115">
         <w:r>
           <w:rPr>
             <w:rFonts w:ascii="Times New Roman" w:cs="Times New Roman" w:eastAsia="Times New Roman" w:hAnsi="Times New Roman"/>
@@ -11271,7 +11400,7 @@
           <w:t xml:space="preserve">Siegel, R.L., Giaquinto, A.N., and Jemal, A. (2024). Cancer statistics, 2024. CA Cancer J. Clin. </w:t>
         </w:r>
       </w:hyperlink>
-      <w:hyperlink r:id="rId114">
+      <w:hyperlink r:id="rId116">
         <w:r>
           <w:rPr>
             <w:rFonts w:ascii="Times New Roman" w:cs="Times New Roman" w:eastAsia="Times New Roman" w:hAnsi="Times New Roman"/>
@@ -11286,7 +11415,7 @@
           <w:t xml:space="preserve">74</w:t>
         </w:r>
       </w:hyperlink>
-      <w:hyperlink r:id="rId115">
+      <w:hyperlink r:id="rId117">
         <w:r>
           <w:rPr>
             <w:rFonts w:ascii="Times New Roman" w:cs="Times New Roman" w:eastAsia="Times New Roman" w:hAnsi="Times New Roman"/>
@@ -11346,7 +11475,7 @@
         <w:t xml:space="preserve">3.</w:t>
         <w:tab/>
       </w:r>
-      <w:hyperlink r:id="rId116">
+      <w:hyperlink r:id="rId118">
         <w:r>
           <w:rPr>
             <w:rFonts w:ascii="Times New Roman" w:cs="Times New Roman" w:eastAsia="Times New Roman" w:hAnsi="Times New Roman"/>
@@ -11361,7 +11490,7 @@
           <w:t xml:space="preserve">Matt, G.Y., Sioson, E., Shelton, K., Wang, J., Lu, C., Zaldivar Peraza, A., Gangwani, K., Paul, R., Reilly, C., Acić, A., et al. (2024). St. Jude Survivorship Portal: Sharing and Analyzing Large Clinical and Genomic Datasets from Pediatric Cancer Survivors. Cancer Discov. </w:t>
         </w:r>
       </w:hyperlink>
-      <w:hyperlink r:id="rId117">
+      <w:hyperlink r:id="rId119">
         <w:r>
           <w:rPr>
             <w:rFonts w:ascii="Times New Roman" w:cs="Times New Roman" w:eastAsia="Times New Roman" w:hAnsi="Times New Roman"/>
@@ -11376,7 +11505,7 @@
           <w:t xml:space="preserve">14</w:t>
         </w:r>
       </w:hyperlink>
-      <w:hyperlink r:id="rId118">
+      <w:hyperlink r:id="rId120">
         <w:r>
           <w:rPr>
             <w:rFonts w:ascii="Times New Roman" w:cs="Times New Roman" w:eastAsia="Times New Roman" w:hAnsi="Times New Roman"/>
@@ -11436,7 +11565,7 @@
         <w:t xml:space="preserve">4.</w:t>
         <w:tab/>
       </w:r>
-      <w:hyperlink r:id="rId119">
+      <w:hyperlink r:id="rId121">
         <w:r>
           <w:rPr>
             <w:rFonts w:ascii="Times New Roman" w:cs="Times New Roman" w:eastAsia="Times New Roman" w:hAnsi="Times New Roman"/>
@@ -11451,7 +11580,7 @@
           <w:t xml:space="preserve">Aristizabal, P., Winestone, L.E., Umaretiya, P., and Bona, K. (2021). Disparities in Pediatric Oncology: The 21st Century Opportunity to Improve Outcomes for Children and Adolescents With Cancer. Am Soc Clin Oncol Educ Book </w:t>
         </w:r>
       </w:hyperlink>
-      <w:hyperlink r:id="rId120">
+      <w:hyperlink r:id="rId122">
         <w:r>
           <w:rPr>
             <w:rFonts w:ascii="Times New Roman" w:cs="Times New Roman" w:eastAsia="Times New Roman" w:hAnsi="Times New Roman"/>
@@ -11466,7 +11595,7 @@
           <w:t xml:space="preserve">41</w:t>
         </w:r>
       </w:hyperlink>
-      <w:hyperlink r:id="rId121">
+      <w:hyperlink r:id="rId123">
         <w:r>
           <w:rPr>
             <w:rFonts w:ascii="Times New Roman" w:cs="Times New Roman" w:eastAsia="Times New Roman" w:hAnsi="Times New Roman"/>
@@ -11526,7 +11655,7 @@
         <w:t xml:space="preserve">5.</w:t>
         <w:tab/>
       </w:r>
-      <w:hyperlink r:id="rId122">
+      <w:hyperlink r:id="rId124">
         <w:r>
           <w:rPr>
             <w:rFonts w:ascii="Times New Roman" w:cs="Times New Roman" w:eastAsia="Times New Roman" w:hAnsi="Times New Roman"/>
@@ -11541,7 +11670,7 @@
           <w:t xml:space="preserve">Hunger Stephen P., and Mullighan Charles G. Acute Lymphoblastic Leukemia in Children. N. Engl. J. Med. </w:t>
         </w:r>
       </w:hyperlink>
-      <w:hyperlink r:id="rId123">
+      <w:hyperlink r:id="rId125">
         <w:r>
           <w:rPr>
             <w:rFonts w:ascii="Times New Roman" w:cs="Times New Roman" w:eastAsia="Times New Roman" w:hAnsi="Times New Roman"/>
@@ -11556,7 +11685,7 @@
           <w:t xml:space="preserve">373</w:t>
         </w:r>
       </w:hyperlink>
-      <w:hyperlink r:id="rId124">
+      <w:hyperlink r:id="rId126">
         <w:r>
           <w:rPr>
             <w:rFonts w:ascii="Times New Roman" w:cs="Times New Roman" w:eastAsia="Times New Roman" w:hAnsi="Times New Roman"/>
@@ -11616,7 +11745,7 @@
         <w:t xml:space="preserve">6.</w:t>
         <w:tab/>
       </w:r>
-      <w:hyperlink r:id="rId125">
+      <w:hyperlink r:id="rId127">
         <w:r>
           <w:rPr>
             <w:rFonts w:ascii="Times New Roman" w:cs="Times New Roman" w:eastAsia="Times New Roman" w:hAnsi="Times New Roman"/>
@@ -11631,7 +11760,7 @@
           <w:t xml:space="preserve">Laetsch, T.W., DuBois, S.G., Bender, J.G., Macy, M.E., and Moreno, L. (2021). Opportunities and Challenges in Drug Development for Pediatric Cancers. Cancer Discov. </w:t>
         </w:r>
       </w:hyperlink>
-      <w:hyperlink r:id="rId126">
+      <w:hyperlink r:id="rId128">
         <w:r>
           <w:rPr>
             <w:rFonts w:ascii="Times New Roman" w:cs="Times New Roman" w:eastAsia="Times New Roman" w:hAnsi="Times New Roman"/>
@@ -11646,7 +11775,7 @@
           <w:t xml:space="preserve">11</w:t>
         </w:r>
       </w:hyperlink>
-      <w:hyperlink r:id="rId127">
+      <w:hyperlink r:id="rId129">
         <w:r>
           <w:rPr>
             <w:rFonts w:ascii="Times New Roman" w:cs="Times New Roman" w:eastAsia="Times New Roman" w:hAnsi="Times New Roman"/>
@@ -11706,7 +11835,7 @@
         <w:t xml:space="preserve">7.</w:t>
         <w:tab/>
       </w:r>
-      <w:hyperlink r:id="rId128">
+      <w:hyperlink r:id="rId130">
         <w:r>
           <w:rPr>
             <w:rFonts w:ascii="Times New Roman" w:cs="Times New Roman" w:eastAsia="Times New Roman" w:hAnsi="Times New Roman"/>
@@ -11721,7 +11850,7 @@
           <w:t xml:space="preserve">Renfro, L.A., Ji, L., Piao, J., Onar-Thomas, A., Kairalla, J.A., and Alonzo, T.A. (2019). Trial Design Challenges and Approaches for Precision Oncology in Rare Tumors: Experiences of the Children’s Oncology Group. JCO Precis Oncol </w:t>
         </w:r>
       </w:hyperlink>
-      <w:hyperlink r:id="rId129">
+      <w:hyperlink r:id="rId131">
         <w:r>
           <w:rPr>
             <w:rFonts w:ascii="Times New Roman" w:cs="Times New Roman" w:eastAsia="Times New Roman" w:hAnsi="Times New Roman"/>
@@ -11736,7 +11865,7 @@
           <w:t xml:space="preserve">3</w:t>
         </w:r>
       </w:hyperlink>
-      <w:hyperlink r:id="rId130">
+      <w:hyperlink r:id="rId132">
         <w:r>
           <w:rPr>
             <w:rFonts w:ascii="Times New Roman" w:cs="Times New Roman" w:eastAsia="Times New Roman" w:hAnsi="Times New Roman"/>
@@ -11751,7 +11880,7 @@
           <w:t xml:space="preserve">. https://doi.org/</w:t>
         </w:r>
       </w:hyperlink>
-      <w:hyperlink r:id="rId131">
+      <w:hyperlink r:id="rId133">
         <w:r>
           <w:rPr>
             <w:rFonts w:ascii="Times New Roman" w:cs="Times New Roman" w:eastAsia="Times New Roman" w:hAnsi="Times New Roman"/>
@@ -11766,7 +11895,7 @@
           <w:t xml:space="preserve">10.1200/PO.19.00060</w:t>
         </w:r>
       </w:hyperlink>
-      <w:hyperlink r:id="rId132">
+      <w:hyperlink r:id="rId134">
         <w:r>
           <w:rPr>
             <w:rFonts w:ascii="Times New Roman" w:cs="Times New Roman" w:eastAsia="Times New Roman" w:hAnsi="Times New Roman"/>
@@ -11826,7 +11955,7 @@
         <w:t xml:space="preserve">8.</w:t>
         <w:tab/>
       </w:r>
-      <w:hyperlink r:id="rId133">
+      <w:hyperlink r:id="rId135">
         <w:r>
           <w:rPr>
             <w:rFonts w:ascii="Times New Roman" w:cs="Times New Roman" w:eastAsia="Times New Roman" w:hAnsi="Times New Roman"/>
@@ -11841,7 +11970,7 @@
           <w:t xml:space="preserve">Rivers, Z., Hyde, B., Ronski, K., Stearns, D., Toll, S., Ritt, K., Cooney, M., Nimeiri, H., Federman, N., and Kaneva, K. (2023). Exploring Barriers to Pediatric Cancer Clinical Trials: The Role of a Networked, Just-in-Time Study Program. Clin. Ther. </w:t>
         </w:r>
       </w:hyperlink>
-      <w:hyperlink r:id="rId134">
+      <w:hyperlink r:id="rId136">
         <w:r>
           <w:rPr>
             <w:rFonts w:ascii="Times New Roman" w:cs="Times New Roman" w:eastAsia="Times New Roman" w:hAnsi="Times New Roman"/>
@@ -11856,7 +11985,7 @@
           <w:t xml:space="preserve">45</w:t>
         </w:r>
       </w:hyperlink>
-      <w:hyperlink r:id="rId135">
+      <w:hyperlink r:id="rId137">
         <w:r>
           <w:rPr>
             <w:rFonts w:ascii="Times New Roman" w:cs="Times New Roman" w:eastAsia="Times New Roman" w:hAnsi="Times New Roman"/>
@@ -11916,7 +12045,7 @@
         <w:t xml:space="preserve">9.</w:t>
         <w:tab/>
       </w:r>
-      <w:hyperlink r:id="rId136">
+      <w:hyperlink r:id="rId138">
         <w:r>
           <w:rPr>
             <w:rFonts w:ascii="Times New Roman" w:cs="Times New Roman" w:eastAsia="Times New Roman" w:hAnsi="Times New Roman"/>
@@ -11931,7 +12060,7 @@
           <w:t xml:space="preserve">National Institutes of Health Clinical Trials Registry ClinicalTrials.gov. </w:t>
         </w:r>
       </w:hyperlink>
-      <w:hyperlink r:id="rId137">
+      <w:hyperlink r:id="rId139">
         <w:r>
           <w:rPr>
             <w:rFonts w:ascii="Times New Roman" w:cs="Times New Roman" w:eastAsia="Times New Roman" w:hAnsi="Times New Roman"/>
@@ -11946,7 +12075,7 @@
           <w:t xml:space="preserve">https://clinicaltrials.gov/</w:t>
         </w:r>
       </w:hyperlink>
-      <w:hyperlink r:id="rId138">
+      <w:hyperlink r:id="rId140">
         <w:r>
           <w:rPr>
             <w:rFonts w:ascii="Times New Roman" w:cs="Times New Roman" w:eastAsia="Times New Roman" w:hAnsi="Times New Roman"/>
@@ -12006,7 +12135,7 @@
         <w:t xml:space="preserve">10.</w:t>
         <w:tab/>
       </w:r>
-      <w:hyperlink r:id="rId139">
+      <w:hyperlink r:id="rId141">
         <w:r>
           <w:rPr>
             <w:rFonts w:ascii="Times New Roman" w:cs="Times New Roman" w:eastAsia="Times New Roman" w:hAnsi="Times New Roman"/>
@@ -12021,7 +12150,7 @@
           <w:t xml:space="preserve">Zarin, D.A., Tse, T., Williams, R.J., Califf, R.M., and Ide, N.C. (2011). The ClinicalTrials.gov Results Database — Update and Key Issues. N. Engl. J. Med. </w:t>
         </w:r>
       </w:hyperlink>
-      <w:hyperlink r:id="rId140">
+      <w:hyperlink r:id="rId142">
         <w:r>
           <w:rPr>
             <w:rFonts w:ascii="Times New Roman" w:cs="Times New Roman" w:eastAsia="Times New Roman" w:hAnsi="Times New Roman"/>
@@ -12036,7 +12165,7 @@
           <w:t xml:space="preserve">364</w:t>
         </w:r>
       </w:hyperlink>
-      <w:hyperlink r:id="rId141">
+      <w:hyperlink r:id="rId143">
         <w:r>
           <w:rPr>
             <w:rFonts w:ascii="Times New Roman" w:cs="Times New Roman" w:eastAsia="Times New Roman" w:hAnsi="Times New Roman"/>
@@ -12096,7 +12225,7 @@
         <w:t xml:space="preserve">11.</w:t>
         <w:tab/>
       </w:r>
-      <w:hyperlink r:id="rId142">
+      <w:hyperlink r:id="rId144">
         <w:r>
           <w:rPr>
             <w:rFonts w:ascii="Times New Roman" w:cs="Times New Roman" w:eastAsia="Times New Roman" w:hAnsi="Times New Roman"/>
@@ -12156,7 +12285,7 @@
         <w:t xml:space="preserve">12.</w:t>
         <w:tab/>
       </w:r>
-      <w:hyperlink r:id="rId143">
+      <w:hyperlink r:id="rId145">
         <w:r>
           <w:rPr>
             <w:rFonts w:ascii="Times New Roman" w:cs="Times New Roman" w:eastAsia="Times New Roman" w:hAnsi="Times New Roman"/>
@@ -12216,7 +12345,7 @@
         <w:t xml:space="preserve">13.</w:t>
         <w:tab/>
       </w:r>
-      <w:hyperlink r:id="rId144">
+      <w:hyperlink r:id="rId146">
         <w:r>
           <w:rPr>
             <w:rFonts w:ascii="Times New Roman" w:cs="Times New Roman" w:eastAsia="Times New Roman" w:hAnsi="Times New Roman"/>
@@ -12276,7 +12405,7 @@
         <w:t xml:space="preserve">14.</w:t>
         <w:tab/>
       </w:r>
-      <w:hyperlink r:id="rId145">
+      <w:hyperlink r:id="rId147">
         <w:r>
           <w:rPr>
             <w:rFonts w:ascii="Times New Roman" w:cs="Times New Roman" w:eastAsia="Times New Roman" w:hAnsi="Times New Roman"/>
@@ -12336,7 +12465,7 @@
         <w:t xml:space="preserve">15.</w:t>
         <w:tab/>
       </w:r>
-      <w:hyperlink r:id="rId146">
+      <w:hyperlink r:id="rId148">
         <w:r>
           <w:rPr>
             <w:rFonts w:ascii="Times New Roman" w:cs="Times New Roman" w:eastAsia="Times New Roman" w:hAnsi="Times New Roman"/>
@@ -12396,7 +12525,7 @@
         <w:t xml:space="preserve">16.</w:t>
         <w:tab/>
       </w:r>
-      <w:hyperlink r:id="rId147">
+      <w:hyperlink r:id="rId149">
         <w:r>
           <w:rPr>
             <w:rFonts w:ascii="Times New Roman" w:cs="Times New Roman" w:eastAsia="Times New Roman" w:hAnsi="Times New Roman"/>
@@ -12456,7 +12585,7 @@
         <w:t xml:space="preserve">17.</w:t>
         <w:tab/>
       </w:r>
-      <w:hyperlink r:id="rId148">
+      <w:hyperlink r:id="rId150">
         <w:r>
           <w:rPr>
             <w:rFonts w:ascii="Times New Roman" w:cs="Times New Roman" w:eastAsia="Times New Roman" w:hAnsi="Times New Roman"/>
@@ -12516,7 +12645,7 @@
         <w:t xml:space="preserve">18.</w:t>
         <w:tab/>
       </w:r>
-      <w:hyperlink r:id="rId149">
+      <w:hyperlink r:id="rId151">
         <w:r>
           <w:rPr>
             <w:rFonts w:ascii="Times New Roman" w:cs="Times New Roman" w:eastAsia="Times New Roman" w:hAnsi="Times New Roman"/>
@@ -12576,7 +12705,7 @@
         <w:t xml:space="preserve">19.</w:t>
         <w:tab/>
       </w:r>
-      <w:hyperlink r:id="rId150">
+      <w:hyperlink r:id="rId152">
         <w:r>
           <w:rPr>
             <w:rFonts w:ascii="Times New Roman" w:cs="Times New Roman" w:eastAsia="Times New Roman" w:hAnsi="Times New Roman"/>
@@ -12636,7 +12765,7 @@
         <w:t xml:space="preserve">20.</w:t>
         <w:tab/>
       </w:r>
-      <w:hyperlink r:id="rId151">
+      <w:hyperlink r:id="rId153">
         <w:r>
           <w:rPr>
             <w:rFonts w:ascii="Times New Roman" w:cs="Times New Roman" w:eastAsia="Times New Roman" w:hAnsi="Times New Roman"/>
@@ -12696,7 +12825,7 @@
         <w:t xml:space="preserve">21.</w:t>
         <w:tab/>
       </w:r>
-      <w:hyperlink r:id="rId152">
+      <w:hyperlink r:id="rId154">
         <w:r>
           <w:rPr>
             <w:rFonts w:ascii="Times New Roman" w:cs="Times New Roman" w:eastAsia="Times New Roman" w:hAnsi="Times New Roman"/>
@@ -12756,7 +12885,7 @@
         <w:t xml:space="preserve">22.</w:t>
         <w:tab/>
       </w:r>
-      <w:hyperlink r:id="rId153">
+      <w:hyperlink r:id="rId155">
         <w:r>
           <w:rPr>
             <w:rFonts w:ascii="Times New Roman" w:cs="Times New Roman" w:eastAsia="Times New Roman" w:hAnsi="Times New Roman"/>
@@ -12816,7 +12945,7 @@
         <w:t xml:space="preserve">23.</w:t>
         <w:tab/>
       </w:r>
-      <w:hyperlink r:id="rId154">
+      <w:hyperlink r:id="rId156">
         <w:r>
           <w:rPr>
             <w:rFonts w:ascii="Times New Roman" w:cs="Times New Roman" w:eastAsia="Times New Roman" w:hAnsi="Times New Roman"/>
@@ -12876,7 +13005,7 @@
         <w:t xml:space="preserve">24.</w:t>
         <w:tab/>
       </w:r>
-      <w:hyperlink r:id="rId155">
+      <w:hyperlink r:id="rId157">
         <w:r>
           <w:rPr>
             <w:rFonts w:ascii="Times New Roman" w:cs="Times New Roman" w:eastAsia="Times New Roman" w:hAnsi="Times New Roman"/>
@@ -12936,7 +13065,7 @@
         <w:t xml:space="preserve">25.</w:t>
         <w:tab/>
       </w:r>
-      <w:hyperlink r:id="rId156">
+      <w:hyperlink r:id="rId158">
         <w:r>
           <w:rPr>
             <w:rFonts w:ascii="Times New Roman" w:cs="Times New Roman" w:eastAsia="Times New Roman" w:hAnsi="Times New Roman"/>
@@ -12996,7 +13125,7 @@
         <w:t xml:space="preserve">26.</w:t>
         <w:tab/>
       </w:r>
-      <w:hyperlink r:id="rId157">
+      <w:hyperlink r:id="rId159">
         <w:r>
           <w:rPr>
             <w:rFonts w:ascii="Times New Roman" w:cs="Times New Roman" w:eastAsia="Times New Roman" w:hAnsi="Times New Roman"/>
@@ -13056,7 +13185,7 @@
         <w:t xml:space="preserve">27.</w:t>
         <w:tab/>
       </w:r>
-      <w:hyperlink r:id="rId158">
+      <w:hyperlink r:id="rId160">
         <w:r>
           <w:rPr>
             <w:rFonts w:ascii="Times New Roman" w:cs="Times New Roman" w:eastAsia="Times New Roman" w:hAnsi="Times New Roman"/>
@@ -13116,7 +13245,7 @@
         <w:t xml:space="preserve">28.</w:t>
         <w:tab/>
       </w:r>
-      <w:hyperlink r:id="rId159">
+      <w:hyperlink r:id="rId161">
         <w:r>
           <w:rPr>
             <w:rFonts w:ascii="Times New Roman" w:cs="Times New Roman" w:eastAsia="Times New Roman" w:hAnsi="Times New Roman"/>
@@ -13176,7 +13305,7 @@
         <w:t xml:space="preserve">29.</w:t>
         <w:tab/>
       </w:r>
-      <w:hyperlink r:id="rId160">
+      <w:hyperlink r:id="rId162">
         <w:r>
           <w:rPr>
             <w:rFonts w:ascii="Times New Roman" w:cs="Times New Roman" w:eastAsia="Times New Roman" w:hAnsi="Times New Roman"/>
@@ -13236,7 +13365,7 @@
         <w:t xml:space="preserve">30.</w:t>
         <w:tab/>
       </w:r>
-      <w:hyperlink r:id="rId161">
+      <w:hyperlink r:id="rId163">
         <w:r>
           <w:rPr>
             <w:rFonts w:ascii="Times New Roman" w:cs="Times New Roman" w:eastAsia="Times New Roman" w:hAnsi="Times New Roman"/>
@@ -13296,7 +13425,7 @@
         <w:t xml:space="preserve">31.</w:t>
         <w:tab/>
       </w:r>
-      <w:hyperlink r:id="rId162">
+      <w:hyperlink r:id="rId164">
         <w:r>
           <w:rPr>
             <w:rFonts w:ascii="Times New Roman" w:cs="Times New Roman" w:eastAsia="Times New Roman" w:hAnsi="Times New Roman"/>
@@ -13356,7 +13485,7 @@
         <w:t xml:space="preserve">32.</w:t>
         <w:tab/>
       </w:r>
-      <w:hyperlink r:id="rId163">
+      <w:hyperlink r:id="rId165">
         <w:r>
           <w:rPr>
             <w:rFonts w:ascii="Times New Roman" w:cs="Times New Roman" w:eastAsia="Times New Roman" w:hAnsi="Times New Roman"/>
@@ -13416,7 +13545,7 @@
         <w:t xml:space="preserve">33.</w:t>
         <w:tab/>
       </w:r>
-      <w:hyperlink r:id="rId164">
+      <w:hyperlink r:id="rId166">
         <w:r>
           <w:rPr>
             <w:rFonts w:ascii="Times New Roman" w:cs="Times New Roman" w:eastAsia="Times New Roman" w:hAnsi="Times New Roman"/>
@@ -13476,7 +13605,7 @@
         <w:t xml:space="preserve">34.</w:t>
         <w:tab/>
       </w:r>
-      <w:hyperlink r:id="rId165">
+      <w:hyperlink r:id="rId167">
         <w:r>
           <w:rPr>
             <w:rFonts w:ascii="Times New Roman" w:cs="Times New Roman" w:eastAsia="Times New Roman" w:hAnsi="Times New Roman"/>
@@ -13536,7 +13665,7 @@
         <w:t xml:space="preserve">35.</w:t>
         <w:tab/>
       </w:r>
-      <w:hyperlink r:id="rId166">
+      <w:hyperlink r:id="rId168">
         <w:r>
           <w:rPr>
             <w:rFonts w:ascii="Times New Roman" w:cs="Times New Roman" w:eastAsia="Times New Roman" w:hAnsi="Times New Roman"/>
@@ -13596,7 +13725,7 @@
         <w:t xml:space="preserve">36.</w:t>
         <w:tab/>
       </w:r>
-      <w:hyperlink r:id="rId167">
+      <w:hyperlink r:id="rId169">
         <w:r>
           <w:rPr>
             <w:rFonts w:ascii="Times New Roman" w:cs="Times New Roman" w:eastAsia="Times New Roman" w:hAnsi="Times New Roman"/>
@@ -13656,7 +13785,7 @@
         <w:t xml:space="preserve">37.</w:t>
         <w:tab/>
       </w:r>
-      <w:hyperlink r:id="rId168">
+      <w:hyperlink r:id="rId170">
         <w:r>
           <w:rPr>
             <w:rFonts w:ascii="Times New Roman" w:cs="Times New Roman" w:eastAsia="Times New Roman" w:hAnsi="Times New Roman"/>
@@ -13716,7 +13845,7 @@
         <w:t xml:space="preserve">38.</w:t>
         <w:tab/>
       </w:r>
-      <w:hyperlink r:id="rId169">
+      <w:hyperlink r:id="rId171">
         <w:r>
           <w:rPr>
             <w:rFonts w:ascii="Times New Roman" w:cs="Times New Roman" w:eastAsia="Times New Roman" w:hAnsi="Times New Roman"/>
@@ -13776,7 +13905,7 @@
         <w:t xml:space="preserve">39.</w:t>
         <w:tab/>
       </w:r>
-      <w:hyperlink r:id="rId170">
+      <w:hyperlink r:id="rId172">
         <w:r>
           <w:rPr>
             <w:rFonts w:ascii="Times New Roman" w:cs="Times New Roman" w:eastAsia="Times New Roman" w:hAnsi="Times New Roman"/>
@@ -13836,7 +13965,7 @@
         <w:t xml:space="preserve">40.</w:t>
         <w:tab/>
       </w:r>
-      <w:hyperlink r:id="rId171">
+      <w:hyperlink r:id="rId173">
         <w:r>
           <w:rPr>
             <w:rFonts w:ascii="Times New Roman" w:cs="Times New Roman" w:eastAsia="Times New Roman" w:hAnsi="Times New Roman"/>
@@ -13896,7 +14025,7 @@
         <w:t xml:space="preserve">41.</w:t>
         <w:tab/>
       </w:r>
-      <w:hyperlink r:id="rId172">
+      <w:hyperlink r:id="rId174">
         <w:r>
           <w:rPr>
             <w:rFonts w:ascii="Times New Roman" w:cs="Times New Roman" w:eastAsia="Times New Roman" w:hAnsi="Times New Roman"/>
@@ -13956,7 +14085,7 @@
         <w:t xml:space="preserve">42.</w:t>
         <w:tab/>
       </w:r>
-      <w:hyperlink r:id="rId173">
+      <w:hyperlink r:id="rId175">
         <w:r>
           <w:rPr>
             <w:rFonts w:ascii="Times New Roman" w:cs="Times New Roman" w:eastAsia="Times New Roman" w:hAnsi="Times New Roman"/>
@@ -14016,7 +14145,7 @@
         <w:t xml:space="preserve">43.</w:t>
         <w:tab/>
       </w:r>
-      <w:hyperlink r:id="rId174">
+      <w:hyperlink r:id="rId176">
         <w:r>
           <w:rPr>
             <w:rFonts w:ascii="Times New Roman" w:cs="Times New Roman" w:eastAsia="Times New Roman" w:hAnsi="Times New Roman"/>
@@ -14076,7 +14205,7 @@
         <w:t xml:space="preserve">44.</w:t>
         <w:tab/>
       </w:r>
-      <w:hyperlink r:id="rId175">
+      <w:hyperlink r:id="rId177">
         <w:r>
           <w:rPr>
             <w:rFonts w:ascii="Times New Roman" w:cs="Times New Roman" w:eastAsia="Times New Roman" w:hAnsi="Times New Roman"/>
@@ -14136,7 +14265,7 @@
         <w:t xml:space="preserve">45.</w:t>
         <w:tab/>
       </w:r>
-      <w:hyperlink r:id="rId176">
+      <w:hyperlink r:id="rId178">
         <w:r>
           <w:rPr>
             <w:rFonts w:ascii="Times New Roman" w:cs="Times New Roman" w:eastAsia="Times New Roman" w:hAnsi="Times New Roman"/>
@@ -14151,7 +14280,7 @@
           <w:t xml:space="preserve">Gu, Y., Tinn, R., Cheng, H., Lucas, M., Usuyama, N., Liu, X., Naumann, T., Gao, J., and Poon, H. (2022). Domain-specific language model pretraining for biomedical natural language processing. ACM Trans. Comput. Healthc. </w:t>
         </w:r>
       </w:hyperlink>
-      <w:hyperlink r:id="rId177">
+      <w:hyperlink r:id="rId179">
         <w:r>
           <w:rPr>
             <w:rFonts w:ascii="Times New Roman" w:cs="Times New Roman" w:eastAsia="Times New Roman" w:hAnsi="Times New Roman"/>
@@ -14166,7 +14295,7 @@
           <w:t xml:space="preserve">3</w:t>
         </w:r>
       </w:hyperlink>
-      <w:hyperlink r:id="rId178">
+      <w:hyperlink r:id="rId180">
         <w:r>
           <w:rPr>
             <w:rFonts w:ascii="Times New Roman" w:cs="Times New Roman" w:eastAsia="Times New Roman" w:hAnsi="Times New Roman"/>
@@ -14226,7 +14355,7 @@
         <w:t xml:space="preserve">46.</w:t>
         <w:tab/>
       </w:r>
-      <w:hyperlink r:id="rId179">
+      <w:hyperlink r:id="rId181">
         <w:r>
           <w:rPr>
             <w:rFonts w:ascii="Times New Roman" w:cs="Times New Roman" w:eastAsia="Times New Roman" w:hAnsi="Times New Roman"/>
@@ -14241,7 +14370,7 @@
           <w:t xml:space="preserve">Yu Gu , Robert Tinn , Hao Cheng , Michael Lucas , Naoto Usuyama , Xiaodong Liu , Tristan Naumann and Jianfeng Gao , Hoifung Poon (2020). BiomedNLP-BiomedBERT-base-uncased-abstract. Hugging Face. </w:t>
         </w:r>
       </w:hyperlink>
-      <w:hyperlink r:id="rId180">
+      <w:hyperlink r:id="rId182">
         <w:r>
           <w:rPr>
             <w:rFonts w:ascii="Times New Roman" w:cs="Times New Roman" w:eastAsia="Times New Roman" w:hAnsi="Times New Roman"/>
@@ -14256,7 +14385,7 @@
           <w:t xml:space="preserve">https://huggingface.co/microsoft/BiomedNLP-BiomedBERT-base-uncased-abstract</w:t>
         </w:r>
       </w:hyperlink>
-      <w:hyperlink r:id="rId181">
+      <w:hyperlink r:id="rId183">
         <w:r>
           <w:rPr>
             <w:rFonts w:ascii="Times New Roman" w:cs="Times New Roman" w:eastAsia="Times New Roman" w:hAnsi="Times New Roman"/>
@@ -14316,7 +14445,7 @@
         <w:t xml:space="preserve">47.</w:t>
         <w:tab/>
       </w:r>
-      <w:hyperlink r:id="rId182">
+      <w:hyperlink r:id="rId184">
         <w:r>
           <w:rPr>
             <w:rFonts w:ascii="Times New Roman" w:cs="Times New Roman" w:eastAsia="Times New Roman" w:hAnsi="Times New Roman"/>
@@ -14331,7 +14460,7 @@
           <w:t xml:space="preserve">Lee, J., Yoon, W., Kim, S., Kim, D., Kim, S., So, C.H., and Kang, J. (2020). BioBERT: a pre-trained biomedical language representation model for biomedical text mining. Bioinformatics </w:t>
         </w:r>
       </w:hyperlink>
-      <w:hyperlink r:id="rId183">
+      <w:hyperlink r:id="rId185">
         <w:r>
           <w:rPr>
             <w:rFonts w:ascii="Times New Roman" w:cs="Times New Roman" w:eastAsia="Times New Roman" w:hAnsi="Times New Roman"/>
@@ -14346,7 +14475,7 @@
           <w:t xml:space="preserve">36</w:t>
         </w:r>
       </w:hyperlink>
-      <w:hyperlink r:id="rId184">
+      <w:hyperlink r:id="rId186">
         <w:r>
           <w:rPr>
             <w:rFonts w:ascii="Times New Roman" w:cs="Times New Roman" w:eastAsia="Times New Roman" w:hAnsi="Times New Roman"/>
@@ -14406,7 +14535,7 @@
         <w:t xml:space="preserve">48.</w:t>
         <w:tab/>
       </w:r>
-      <w:hyperlink r:id="rId185">
+      <w:hyperlink r:id="rId187">
         <w:r>
           <w:rPr>
             <w:rFonts w:ascii="Times New Roman" w:cs="Times New Roman" w:eastAsia="Times New Roman" w:hAnsi="Times New Roman"/>
@@ -14466,7 +14595,7 @@
         <w:t xml:space="preserve">49.</w:t>
         <w:tab/>
       </w:r>
-      <w:hyperlink r:id="rId186">
+      <w:hyperlink r:id="rId188">
         <w:r>
           <w:rPr>
             <w:rFonts w:ascii="Times New Roman" w:cs="Times New Roman" w:eastAsia="Times New Roman" w:hAnsi="Times New Roman"/>
@@ -14481,7 +14610,7 @@
           <w:t xml:space="preserve">Cohan, I.B.K.L. (2019). scibert_scivocab_uncased. Hugging Face. </w:t>
         </w:r>
       </w:hyperlink>
-      <w:hyperlink r:id="rId187">
+      <w:hyperlink r:id="rId189">
         <w:r>
           <w:rPr>
             <w:rFonts w:ascii="Times New Roman" w:cs="Times New Roman" w:eastAsia="Times New Roman" w:hAnsi="Times New Roman"/>
@@ -14496,7 +14625,7 @@
           <w:t xml:space="preserve">https://huggingface.co/allenai/scibert_scivocab_uncased</w:t>
         </w:r>
       </w:hyperlink>
-      <w:hyperlink r:id="rId188">
+      <w:hyperlink r:id="rId190">
         <w:r>
           <w:rPr>
             <w:rFonts w:ascii="Times New Roman" w:cs="Times New Roman" w:eastAsia="Times New Roman" w:hAnsi="Times New Roman"/>
@@ -14556,7 +14685,7 @@
         <w:t xml:space="preserve">50.</w:t>
         <w:tab/>
       </w:r>
-      <w:hyperlink r:id="rId189">
+      <w:hyperlink r:id="rId191">
         <w:r>
           <w:rPr>
             <w:rFonts w:ascii="Times New Roman" w:cs="Times New Roman" w:eastAsia="Times New Roman" w:hAnsi="Times New Roman"/>
@@ -14571,7 +14700,7 @@
           <w:t xml:space="preserve">Warner, B., Chaffin, A., Clavié, B., Weller, O., Hallström, O., Taghadouini, S., Gallagher, A., Biswas, R., Ladhak, F., Aarsen, T., et al. (2024). Smarter, better, faster, longer: A modern bidirectional encoder for fast, memory efficient, and long context finetuning and inference. arXiv [cs.CL]. https://doi.org/</w:t>
         </w:r>
       </w:hyperlink>
-      <w:hyperlink r:id="rId190">
+      <w:hyperlink r:id="rId192">
         <w:r>
           <w:rPr>
             <w:rFonts w:ascii="Times New Roman" w:cs="Times New Roman" w:eastAsia="Times New Roman" w:hAnsi="Times New Roman"/>
@@ -14586,7 +14715,7 @@
           <w:t xml:space="preserve">10.48550/ARXIV.2412.13663</w:t>
         </w:r>
       </w:hyperlink>
-      <w:hyperlink r:id="rId191">
+      <w:hyperlink r:id="rId193">
         <w:r>
           <w:rPr>
             <w:rFonts w:ascii="Times New Roman" w:cs="Times New Roman" w:eastAsia="Times New Roman" w:hAnsi="Times New Roman"/>
@@ -14646,7 +14775,7 @@
         <w:t xml:space="preserve">51.</w:t>
         <w:tab/>
       </w:r>
-      <w:hyperlink r:id="rId192">
+      <w:hyperlink r:id="rId194">
         <w:r>
           <w:rPr>
             <w:rFonts w:ascii="Times New Roman" w:cs="Times New Roman" w:eastAsia="Times New Roman" w:hAnsi="Times New Roman"/>
@@ -14661,7 +14790,7 @@
           <w:t xml:space="preserve">Benjamin Warner and Antoine Chaffin and Benjamin Clavié and Orion Weller and Oskar Hallström and Said Taghadouini and Alexis Gallagher and Raja Biswas and Faisal Ladhak and Tom Aarsen and Nathan Cooper and Griffin Adams and Jeremy Howard and Iacopo Poli (2024). ModernBERT-large. Hugging Face. </w:t>
         </w:r>
       </w:hyperlink>
-      <w:hyperlink r:id="rId193">
+      <w:hyperlink r:id="rId195">
         <w:r>
           <w:rPr>
             <w:rFonts w:ascii="Times New Roman" w:cs="Times New Roman" w:eastAsia="Times New Roman" w:hAnsi="Times New Roman"/>
@@ -14676,7 +14805,7 @@
           <w:t xml:space="preserve">https://huggingface.co/answerdotai/ModernBERT-large</w:t>
         </w:r>
       </w:hyperlink>
-      <w:hyperlink r:id="rId194">
+      <w:hyperlink r:id="rId196">
         <w:r>
           <w:rPr>
             <w:rFonts w:ascii="Times New Roman" w:cs="Times New Roman" w:eastAsia="Times New Roman" w:hAnsi="Times New Roman"/>
@@ -14736,7 +14865,7 @@
         <w:t xml:space="preserve">52.</w:t>
         <w:tab/>
       </w:r>
-      <w:hyperlink r:id="rId195">
+      <w:hyperlink r:id="rId197">
         <w:r>
           <w:rPr>
             <w:rFonts w:ascii="Times New Roman" w:cs="Times New Roman" w:eastAsia="Times New Roman" w:hAnsi="Times New Roman"/>
@@ -14751,7 +14880,7 @@
           <w:t xml:space="preserve">Raval, S. MedLlama2: Fine-tuned Llama 2 model to answer medical questions based on an open source medical dataset. </w:t>
         </w:r>
       </w:hyperlink>
-      <w:hyperlink r:id="rId196">
+      <w:hyperlink r:id="rId198">
         <w:r>
           <w:rPr>
             <w:rFonts w:ascii="Times New Roman" w:cs="Times New Roman" w:eastAsia="Times New Roman" w:hAnsi="Times New Roman"/>
@@ -14766,7 +14895,7 @@
           <w:t xml:space="preserve">https://huggingface.co/llSourcell/medllama2_7b</w:t>
         </w:r>
       </w:hyperlink>
-      <w:hyperlink r:id="rId197">
+      <w:hyperlink r:id="rId199">
         <w:r>
           <w:rPr>
             <w:rFonts w:ascii="Times New Roman" w:cs="Times New Roman" w:eastAsia="Times New Roman" w:hAnsi="Times New Roman"/>
@@ -14826,7 +14955,7 @@
         <w:t xml:space="preserve">53.</w:t>
         <w:tab/>
       </w:r>
-      <w:hyperlink r:id="rId198">
+      <w:hyperlink r:id="rId200">
         <w:r>
           <w:rPr>
             <w:rFonts w:ascii="Times New Roman" w:cs="Times New Roman" w:eastAsia="Times New Roman" w:hAnsi="Times New Roman"/>
@@ -14841,7 +14970,7 @@
           <w:t xml:space="preserve">MedLlama 2: Fine-tuned Llama 2 model to answer medical questions based on an open source medical dataset Ollama. </w:t>
         </w:r>
       </w:hyperlink>
-      <w:hyperlink r:id="rId199">
+      <w:hyperlink r:id="rId201">
         <w:r>
           <w:rPr>
             <w:rFonts w:ascii="Times New Roman" w:cs="Times New Roman" w:eastAsia="Times New Roman" w:hAnsi="Times New Roman"/>
@@ -14856,7 +14985,7 @@
           <w:t xml:space="preserve">https://ollama.com/library/medllama2</w:t>
         </w:r>
       </w:hyperlink>
-      <w:hyperlink r:id="rId200">
+      <w:hyperlink r:id="rId202">
         <w:r>
           <w:rPr>
             <w:rFonts w:ascii="Times New Roman" w:cs="Times New Roman" w:eastAsia="Times New Roman" w:hAnsi="Times New Roman"/>
@@ -14916,7 +15045,7 @@
         <w:t xml:space="preserve">54.</w:t>
         <w:tab/>
       </w:r>
-      <w:hyperlink r:id="rId201">
+      <w:hyperlink r:id="rId203">
         <w:r>
           <w:rPr>
             <w:rFonts w:ascii="Times New Roman" w:cs="Times New Roman" w:eastAsia="Times New Roman" w:hAnsi="Times New Roman"/>
@@ -14931,7 +15060,7 @@
           <w:t xml:space="preserve">Wu, C. (2023). MedLLaMA13B. </w:t>
         </w:r>
       </w:hyperlink>
-      <w:hyperlink r:id="rId202">
+      <w:hyperlink r:id="rId204">
         <w:r>
           <w:rPr>
             <w:rFonts w:ascii="Times New Roman" w:cs="Times New Roman" w:eastAsia="Times New Roman" w:hAnsi="Times New Roman"/>
@@ -14946,7 +15075,7 @@
           <w:t xml:space="preserve">https://huggingface.co/chaoyi-wu/MedLLaMA_13B</w:t>
         </w:r>
       </w:hyperlink>
-      <w:hyperlink r:id="rId203">
+      <w:hyperlink r:id="rId205">
         <w:r>
           <w:rPr>
             <w:rFonts w:ascii="Times New Roman" w:cs="Times New Roman" w:eastAsia="Times New Roman" w:hAnsi="Times New Roman"/>
@@ -15006,7 +15135,7 @@
         <w:t xml:space="preserve">55.</w:t>
         <w:tab/>
       </w:r>
-      <w:hyperlink r:id="rId204">
+      <w:hyperlink r:id="rId206">
         <w:r>
           <w:rPr>
             <w:rFonts w:ascii="Times New Roman" w:cs="Times New Roman" w:eastAsia="Times New Roman" w:hAnsi="Times New Roman"/>
@@ -15021,7 +15150,7 @@
           <w:t xml:space="preserve">Meta, A.I. (2024). Llama 3.3 70B: A multilingual instruction-tuned large language model. </w:t>
         </w:r>
       </w:hyperlink>
-      <w:hyperlink r:id="rId205">
+      <w:hyperlink r:id="rId207">
         <w:r>
           <w:rPr>
             <w:rFonts w:ascii="Times New Roman" w:cs="Times New Roman" w:eastAsia="Times New Roman" w:hAnsi="Times New Roman"/>
@@ -15036,7 +15165,7 @@
           <w:t xml:space="preserve">https://ollama.com/library/llama3.3</w:t>
         </w:r>
       </w:hyperlink>
-      <w:hyperlink r:id="rId206">
+      <w:hyperlink r:id="rId208">
         <w:r>
           <w:rPr>
             <w:rFonts w:ascii="Times New Roman" w:cs="Times New Roman" w:eastAsia="Times New Roman" w:hAnsi="Times New Roman"/>
@@ -15096,7 +15225,7 @@
         <w:t xml:space="preserve">56.</w:t>
         <w:tab/>
       </w:r>
-      <w:hyperlink r:id="rId207">
+      <w:hyperlink r:id="rId209">
         <w:r>
           <w:rPr>
             <w:rFonts w:ascii="Times New Roman" w:cs="Times New Roman" w:eastAsia="Times New Roman" w:hAnsi="Times New Roman"/>
@@ -15111,7 +15240,7 @@
           <w:t xml:space="preserve">Touvron, H., Lavril, T., Izacard, G., Martinet, X., Lachaux, M.-A., Lacroix, T., Rozière, B., Goyal, N., Hambro, E., Azhar, F., et al. (2023). LLaMA: Open and efficient foundation language models. arXiv [cs.CL]. https://doi.org/</w:t>
         </w:r>
       </w:hyperlink>
-      <w:hyperlink r:id="rId208">
+      <w:hyperlink r:id="rId210">
         <w:r>
           <w:rPr>
             <w:rFonts w:ascii="Times New Roman" w:cs="Times New Roman" w:eastAsia="Times New Roman" w:hAnsi="Times New Roman"/>
@@ -15126,7 +15255,7 @@
           <w:t xml:space="preserve">10.48550/ARXIV.2302.13971</w:t>
         </w:r>
       </w:hyperlink>
-      <w:hyperlink r:id="rId209">
+      <w:hyperlink r:id="rId211">
         <w:r>
           <w:rPr>
             <w:rFonts w:ascii="Times New Roman" w:cs="Times New Roman" w:eastAsia="Times New Roman" w:hAnsi="Times New Roman"/>
@@ -15186,7 +15315,7 @@
         <w:t xml:space="preserve">57.</w:t>
         <w:tab/>
       </w:r>
-      <w:hyperlink r:id="rId210">
+      <w:hyperlink r:id="rId212">
         <w:r>
           <w:rPr>
             <w:rFonts w:ascii="Times New Roman" w:cs="Times New Roman" w:eastAsia="Times New Roman" w:hAnsi="Times New Roman"/>
@@ -15201,7 +15330,7 @@
           <w:t xml:space="preserve">Meta, A.I. (2024). Llama 3.2: Revolutionizing edge AI and vision with open models. </w:t>
         </w:r>
       </w:hyperlink>
-      <w:hyperlink r:id="rId211">
+      <w:hyperlink r:id="rId213">
         <w:r>
           <w:rPr>
             <w:rFonts w:ascii="Times New Roman" w:cs="Times New Roman" w:eastAsia="Times New Roman" w:hAnsi="Times New Roman"/>
@@ -15216,7 +15345,7 @@
           <w:t xml:space="preserve">https://ollama.com/library/llama3.2</w:t>
         </w:r>
       </w:hyperlink>
-      <w:hyperlink r:id="rId212">
+      <w:hyperlink r:id="rId214">
         <w:r>
           <w:rPr>
             <w:rFonts w:ascii="Times New Roman" w:cs="Times New Roman" w:eastAsia="Times New Roman" w:hAnsi="Times New Roman"/>
@@ -15276,7 +15405,7 @@
         <w:t xml:space="preserve">58.</w:t>
         <w:tab/>
       </w:r>
-      <w:hyperlink r:id="rId213">
+      <w:hyperlink r:id="rId215">
         <w:r>
           <w:rPr>
             <w:rFonts w:ascii="Times New Roman" w:cs="Times New Roman" w:eastAsia="Times New Roman" w:hAnsi="Times New Roman"/>
@@ -15291,7 +15420,7 @@
           <w:t xml:space="preserve">Meta Llama 3: The most capable openly available LLM to date </w:t>
         </w:r>
       </w:hyperlink>
-      <w:hyperlink r:id="rId214">
+      <w:hyperlink r:id="rId216">
         <w:r>
           <w:rPr>
             <w:rFonts w:ascii="Times New Roman" w:cs="Times New Roman" w:eastAsia="Times New Roman" w:hAnsi="Times New Roman"/>
@@ -15306,7 +15435,7 @@
           <w:t xml:space="preserve">https://ollama.com/library/llama3</w:t>
         </w:r>
       </w:hyperlink>
-      <w:hyperlink r:id="rId215">
+      <w:hyperlink r:id="rId217">
         <w:r>
           <w:rPr>
             <w:rFonts w:ascii="Times New Roman" w:cs="Times New Roman" w:eastAsia="Times New Roman" w:hAnsi="Times New Roman"/>
@@ -15366,7 +15495,7 @@
         <w:t xml:space="preserve">59.</w:t>
         <w:tab/>
       </w:r>
-      <w:hyperlink r:id="rId216">
+      <w:hyperlink r:id="rId218">
         <w:r>
           <w:rPr>
             <w:rFonts w:ascii="Times New Roman" w:cs="Times New Roman" w:eastAsia="Times New Roman" w:hAnsi="Times New Roman"/>
@@ -15426,7 +15555,7 @@
         <w:t xml:space="preserve">60.</w:t>
         <w:tab/>
       </w:r>
-      <w:hyperlink r:id="rId217">
+      <w:hyperlink r:id="rId219">
         <w:r>
           <w:rPr>
             <w:rFonts w:ascii="Times New Roman" w:cs="Times New Roman" w:eastAsia="Times New Roman" w:hAnsi="Times New Roman"/>
@@ -15441,7 +15570,7 @@
           <w:t xml:space="preserve">Phi-4 is a 14B parameter, state-of-the-art open model from Microsoft Ollama. </w:t>
         </w:r>
       </w:hyperlink>
-      <w:hyperlink r:id="rId218">
+      <w:hyperlink r:id="rId220">
         <w:r>
           <w:rPr>
             <w:rFonts w:ascii="Times New Roman" w:cs="Times New Roman" w:eastAsia="Times New Roman" w:hAnsi="Times New Roman"/>
@@ -15456,7 +15585,7 @@
           <w:t xml:space="preserve">https://ollama.com/library/phi4</w:t>
         </w:r>
       </w:hyperlink>
-      <w:hyperlink r:id="rId219">
+      <w:hyperlink r:id="rId221">
         <w:r>
           <w:rPr>
             <w:rFonts w:ascii="Times New Roman" w:cs="Times New Roman" w:eastAsia="Times New Roman" w:hAnsi="Times New Roman"/>
@@ -15516,7 +15645,7 @@
         <w:t xml:space="preserve">61.</w:t>
         <w:tab/>
       </w:r>
-      <w:hyperlink r:id="rId220">
+      <w:hyperlink r:id="rId222">
         <w:r>
           <w:rPr>
             <w:rFonts w:ascii="Times New Roman" w:cs="Times New Roman" w:eastAsia="Times New Roman" w:hAnsi="Times New Roman"/>
@@ -15531,7 +15660,7 @@
           <w:t xml:space="preserve">Deepseek (2025). Depseek-r1:8b. Ollama. </w:t>
         </w:r>
       </w:hyperlink>
-      <w:hyperlink r:id="rId221">
+      <w:hyperlink r:id="rId223">
         <w:r>
           <w:rPr>
             <w:rFonts w:ascii="Times New Roman" w:cs="Times New Roman" w:eastAsia="Times New Roman" w:hAnsi="Times New Roman"/>
@@ -15546,7 +15675,7 @@
           <w:t xml:space="preserve">https://ollama.com/library/deepseek-r1:8b</w:t>
         </w:r>
       </w:hyperlink>
-      <w:hyperlink r:id="rId222">
+      <w:hyperlink r:id="rId224">
         <w:r>
           <w:rPr>
             <w:rFonts w:ascii="Times New Roman" w:cs="Times New Roman" w:eastAsia="Times New Roman" w:hAnsi="Times New Roman"/>
@@ -15606,7 +15735,7 @@
         <w:t xml:space="preserve">62.</w:t>
         <w:tab/>
       </w:r>
-      <w:hyperlink r:id="rId223">
+      <w:hyperlink r:id="rId225">
         <w:r>
           <w:rPr>
             <w:rFonts w:ascii="Times New Roman" w:cs="Times New Roman" w:eastAsia="Times New Roman" w:hAnsi="Times New Roman"/>
@@ -15621,7 +15750,7 @@
           <w:t xml:space="preserve">DeepSeek-AI, Guo, D., Yang, D., Zhang, H., Song, J., Zhang, R., Xu, R., Zhu, Q., Ma, S., Wang, P., et al. (2025). DeepSeek-R1: Incentivizing Reasoning Capability in LLMs via Reinforcement Learning. arXiv [cs.CL]. https://doi.org/</w:t>
         </w:r>
       </w:hyperlink>
-      <w:hyperlink r:id="rId224">
+      <w:hyperlink r:id="rId226">
         <w:r>
           <w:rPr>
             <w:rFonts w:ascii="Times New Roman" w:cs="Times New Roman" w:eastAsia="Times New Roman" w:hAnsi="Times New Roman"/>
@@ -15636,7 +15765,7 @@
           <w:t xml:space="preserve">10.48550/ARXIV.2501.12948</w:t>
         </w:r>
       </w:hyperlink>
-      <w:hyperlink r:id="rId225">
+      <w:hyperlink r:id="rId227">
         <w:r>
           <w:rPr>
             <w:rFonts w:ascii="Times New Roman" w:cs="Times New Roman" w:eastAsia="Times New Roman" w:hAnsi="Times New Roman"/>
@@ -15696,7 +15825,7 @@
         <w:t xml:space="preserve">63.</w:t>
         <w:tab/>
       </w:r>
-      <w:hyperlink r:id="rId226">
+      <w:hyperlink r:id="rId228">
         <w:r>
           <w:rPr>
             <w:rFonts w:ascii="Times New Roman" w:cs="Times New Roman" w:eastAsia="Times New Roman" w:hAnsi="Times New Roman"/>
@@ -15756,7 +15885,7 @@
         <w:t xml:space="preserve">64.</w:t>
         <w:tab/>
       </w:r>
-      <w:hyperlink r:id="rId227">
+      <w:hyperlink r:id="rId229">
         <w:r>
           <w:rPr>
             <w:rFonts w:ascii="Times New Roman" w:cs="Times New Roman" w:eastAsia="Times New Roman" w:hAnsi="Times New Roman"/>
@@ -15771,7 +15900,7 @@
           <w:t xml:space="preserve">Liang Wang, Nan Yang, Xiaolong Huang, Binxing Jiao, Linjun Yang, Daxin Jiang, Rangan Majumder, Furu Wei (2022). E5-Large. Hugging Face. </w:t>
         </w:r>
       </w:hyperlink>
-      <w:hyperlink r:id="rId228">
+      <w:hyperlink r:id="rId230">
         <w:r>
           <w:rPr>
             <w:rFonts w:ascii="Times New Roman" w:cs="Times New Roman" w:eastAsia="Times New Roman" w:hAnsi="Times New Roman"/>
@@ -15786,7 +15915,7 @@
           <w:t xml:space="preserve">https://huggingface.co/intfloat/e5-large</w:t>
         </w:r>
       </w:hyperlink>
-      <w:hyperlink r:id="rId229">
+      <w:hyperlink r:id="rId231">
         <w:r>
           <w:rPr>
             <w:rFonts w:ascii="Times New Roman" w:cs="Times New Roman" w:eastAsia="Times New Roman" w:hAnsi="Times New Roman"/>
@@ -15846,7 +15975,7 @@
         <w:t xml:space="preserve">65.</w:t>
         <w:tab/>
       </w:r>
-      <w:hyperlink r:id="rId230">
+      <w:hyperlink r:id="rId232">
         <w:r>
           <w:rPr>
             <w:rFonts w:ascii="Times New Roman" w:cs="Times New Roman" w:eastAsia="Times New Roman" w:hAnsi="Times New Roman"/>
@@ -15861,7 +15990,7 @@
           <w:t xml:space="preserve">New embedding models and API updates </w:t>
         </w:r>
       </w:hyperlink>
-      <w:hyperlink r:id="rId231">
+      <w:hyperlink r:id="rId233">
         <w:r>
           <w:rPr>
             <w:rFonts w:ascii="Times New Roman" w:cs="Times New Roman" w:eastAsia="Times New Roman" w:hAnsi="Times New Roman"/>
@@ -15876,7 +16005,7 @@
           <w:t xml:space="preserve">https://openai.com/index/new-embedding-models-and-api-updates/</w:t>
         </w:r>
       </w:hyperlink>
-      <w:hyperlink r:id="rId232">
+      <w:hyperlink r:id="rId234">
         <w:r>
           <w:rPr>
             <w:rFonts w:ascii="Times New Roman" w:cs="Times New Roman" w:eastAsia="Times New Roman" w:hAnsi="Times New Roman"/>
@@ -15936,7 +16065,7 @@
         <w:t xml:space="preserve">66.</w:t>
         <w:tab/>
       </w:r>
-      <w:hyperlink r:id="rId233">
+      <w:hyperlink r:id="rId235">
         <w:r>
           <w:rPr>
             <w:rFonts w:ascii="Times New Roman" w:cs="Times New Roman" w:eastAsia="Times New Roman" w:hAnsi="Times New Roman"/>
@@ -15951,7 +16080,7 @@
           <w:t xml:space="preserve">text-embedding-ada-002 (2023). OpenAI. </w:t>
         </w:r>
       </w:hyperlink>
-      <w:hyperlink r:id="rId234">
+      <w:hyperlink r:id="rId236">
         <w:r>
           <w:rPr>
             <w:rFonts w:ascii="Times New Roman" w:cs="Times New Roman" w:eastAsia="Times New Roman" w:hAnsi="Times New Roman"/>
@@ -15966,7 +16095,7 @@
           <w:t xml:space="preserve">https://openai.com/index/new-and-improved-embedding-model/</w:t>
         </w:r>
       </w:hyperlink>
-      <w:hyperlink r:id="rId235">
+      <w:hyperlink r:id="rId237">
         <w:r>
           <w:rPr>
             <w:rFonts w:ascii="Times New Roman" w:cs="Times New Roman" w:eastAsia="Times New Roman" w:hAnsi="Times New Roman"/>
@@ -16026,7 +16155,7 @@
         <w:t xml:space="preserve">67.</w:t>
         <w:tab/>
       </w:r>
-      <w:hyperlink r:id="rId236">
+      <w:hyperlink r:id="rId238">
         <w:r>
           <w:rPr>
             <w:rFonts w:ascii="Times New Roman" w:cs="Times New Roman" w:eastAsia="Times New Roman" w:hAnsi="Times New Roman"/>
@@ -16041,7 +16170,7 @@
           <w:t xml:space="preserve">all-mpnet-base-v2 Hugging Face. </w:t>
         </w:r>
       </w:hyperlink>
-      <w:hyperlink r:id="rId237">
+      <w:hyperlink r:id="rId239">
         <w:r>
           <w:rPr>
             <w:rFonts w:ascii="Times New Roman" w:cs="Times New Roman" w:eastAsia="Times New Roman" w:hAnsi="Times New Roman"/>
@@ -16056,7 +16185,7 @@
           <w:t xml:space="preserve">https://huggingface.co/sentence-transformers/all-mpnet-base-v2</w:t>
         </w:r>
       </w:hyperlink>
-      <w:hyperlink r:id="rId238">
+      <w:hyperlink r:id="rId240">
         <w:r>
           <w:rPr>
             <w:rFonts w:ascii="Times New Roman" w:cs="Times New Roman" w:eastAsia="Times New Roman" w:hAnsi="Times New Roman"/>
@@ -16116,7 +16245,7 @@
         <w:t xml:space="preserve">68.</w:t>
         <w:tab/>
       </w:r>
-      <w:hyperlink r:id="rId239">
+      <w:hyperlink r:id="rId241">
         <w:r>
           <w:rPr>
             <w:rFonts w:ascii="Times New Roman" w:cs="Times New Roman" w:eastAsia="Times New Roman" w:hAnsi="Times New Roman"/>
@@ -16131,7 +16260,7 @@
           <w:t xml:space="preserve">all-MiniLM-L12-v2 Hugging Face. </w:t>
         </w:r>
       </w:hyperlink>
-      <w:hyperlink r:id="rId240">
+      <w:hyperlink r:id="rId242">
         <w:r>
           <w:rPr>
             <w:rFonts w:ascii="Times New Roman" w:cs="Times New Roman" w:eastAsia="Times New Roman" w:hAnsi="Times New Roman"/>
@@ -16146,7 +16275,7 @@
           <w:t xml:space="preserve">https://huggingface.co/sentence-transformers/all-MiniLM-L12-v2</w:t>
         </w:r>
       </w:hyperlink>
-      <w:hyperlink r:id="rId241">
+      <w:hyperlink r:id="rId243">
         <w:r>
           <w:rPr>
             <w:rFonts w:ascii="Times New Roman" w:cs="Times New Roman" w:eastAsia="Times New Roman" w:hAnsi="Times New Roman"/>
@@ -16206,7 +16335,7 @@
         <w:t xml:space="preserve">69.</w:t>
         <w:tab/>
       </w:r>
-      <w:hyperlink r:id="rId242">
+      <w:hyperlink r:id="rId244">
         <w:r>
           <w:rPr>
             <w:rFonts w:ascii="Times New Roman" w:cs="Times New Roman" w:eastAsia="Times New Roman" w:hAnsi="Times New Roman"/>
@@ -16221,7 +16350,7 @@
           <w:t xml:space="preserve">all-MiniLM-L6-v2 Hugging Face. </w:t>
         </w:r>
       </w:hyperlink>
-      <w:hyperlink r:id="rId243">
+      <w:hyperlink r:id="rId245">
         <w:r>
           <w:rPr>
             <w:rFonts w:ascii="Times New Roman" w:cs="Times New Roman" w:eastAsia="Times New Roman" w:hAnsi="Times New Roman"/>
@@ -16236,7 +16365,7 @@
           <w:t xml:space="preserve">https://huggingface.co/sentence-transformers/all-MiniLM-L6-v2</w:t>
         </w:r>
       </w:hyperlink>
-      <w:hyperlink r:id="rId244">
+      <w:hyperlink r:id="rId246">
         <w:r>
           <w:rPr>
             <w:rFonts w:ascii="Times New Roman" w:cs="Times New Roman" w:eastAsia="Times New Roman" w:hAnsi="Times New Roman"/>
@@ -16296,7 +16425,7 @@
         <w:t xml:space="preserve">70.</w:t>
         <w:tab/>
       </w:r>
-      <w:hyperlink r:id="rId245">
+      <w:hyperlink r:id="rId247">
         <w:r>
           <w:rPr>
             <w:rFonts w:ascii="Times New Roman" w:cs="Times New Roman" w:eastAsia="Times New Roman" w:hAnsi="Times New Roman"/>
@@ -16311,7 +16440,7 @@
           <w:t xml:space="preserve">Nussbaum, Z., Morris, J.X., Duderstadt, B., and Mulyar, A. (2024). Nomic embed: Training a reproducible long context text embedder. arXiv [cs.CL]. https://doi.org/</w:t>
         </w:r>
       </w:hyperlink>
-      <w:hyperlink r:id="rId246">
+      <w:hyperlink r:id="rId248">
         <w:r>
           <w:rPr>
             <w:rFonts w:ascii="Times New Roman" w:cs="Times New Roman" w:eastAsia="Times New Roman" w:hAnsi="Times New Roman"/>
@@ -16326,7 +16455,7 @@
           <w:t xml:space="preserve">10.48550/ARXIV.2402.01613</w:t>
         </w:r>
       </w:hyperlink>
-      <w:hyperlink r:id="rId247">
+      <w:hyperlink r:id="rId249">
         <w:r>
           <w:rPr>
             <w:rFonts w:ascii="Times New Roman" w:cs="Times New Roman" w:eastAsia="Times New Roman" w:hAnsi="Times New Roman"/>
@@ -16386,7 +16515,7 @@
         <w:t xml:space="preserve">71.</w:t>
         <w:tab/>
       </w:r>
-      <w:hyperlink r:id="rId248">
+      <w:hyperlink r:id="rId250">
         <w:r>
           <w:rPr>
             <w:rFonts w:ascii="Times New Roman" w:cs="Times New Roman" w:eastAsia="Times New Roman" w:hAnsi="Times New Roman"/>
@@ -16401,7 +16530,7 @@
           <w:t xml:space="preserve">Liang Wang, Nan Yang, Xiaolong Huang, Binxing Jiao, Linjun Yang, Daxin Jiang, Rangan Majumder, Furu Wei (2023). E5-large-v2. Hugging Face. </w:t>
         </w:r>
       </w:hyperlink>
-      <w:hyperlink r:id="rId249">
+      <w:hyperlink r:id="rId251">
         <w:r>
           <w:rPr>
             <w:rFonts w:ascii="Times New Roman" w:cs="Times New Roman" w:eastAsia="Times New Roman" w:hAnsi="Times New Roman"/>
@@ -16416,7 +16545,7 @@
           <w:t xml:space="preserve">https://huggingface.co/intfloat/e5-large-v2</w:t>
         </w:r>
       </w:hyperlink>
-      <w:hyperlink r:id="rId250">
+      <w:hyperlink r:id="rId252">
         <w:r>
           <w:rPr>
             <w:rFonts w:ascii="Times New Roman" w:cs="Times New Roman" w:eastAsia="Times New Roman" w:hAnsi="Times New Roman"/>
@@ -16476,7 +16605,7 @@
         <w:t xml:space="preserve">72.</w:t>
         <w:tab/>
       </w:r>
-      <w:hyperlink r:id="rId251">
+      <w:hyperlink r:id="rId253">
         <w:r>
           <w:rPr>
             <w:rFonts w:ascii="Times New Roman" w:cs="Times New Roman" w:eastAsia="Times New Roman" w:hAnsi="Times New Roman"/>
@@ -16491,7 +16620,7 @@
           <w:t xml:space="preserve">Vasilevsky, N.A., Matentzoglu, N.A., Toro, S., Flack, J.E., IV, Hegde, H., Unni, D.R., Alyea, G.F., Amberger, J.S., Babb, L., Balhoff, J.P., et al. (2022). Mondo: Unifying diseases for the world, by the world. https://doi.org/</w:t>
         </w:r>
       </w:hyperlink>
-      <w:hyperlink r:id="rId252">
+      <w:hyperlink r:id="rId254">
         <w:r>
           <w:rPr>
             <w:rFonts w:ascii="Times New Roman" w:cs="Times New Roman" w:eastAsia="Times New Roman" w:hAnsi="Times New Roman"/>
@@ -16506,7 +16635,7 @@
           <w:t xml:space="preserve">10.1101/2022.04.13.22273750</w:t>
         </w:r>
       </w:hyperlink>
-      <w:hyperlink r:id="rId253">
+      <w:hyperlink r:id="rId255">
         <w:r>
           <w:rPr>
             <w:rFonts w:ascii="Times New Roman" w:cs="Times New Roman" w:eastAsia="Times New Roman" w:hAnsi="Times New Roman"/>
@@ -16566,7 +16695,7 @@
         <w:t xml:space="preserve">73.</w:t>
         <w:tab/>
       </w:r>
-      <w:hyperlink r:id="rId254">
+      <w:hyperlink r:id="rId256">
         <w:r>
           <w:rPr>
             <w:rFonts w:ascii="Times New Roman" w:cs="Times New Roman" w:eastAsia="Times New Roman" w:hAnsi="Times New Roman"/>
@@ -16581,7 +16710,7 @@
           <w:t xml:space="preserve">Baron, J.A., Johnson, C.S.-B., Schor, M.A., Olley, D., Nickel, L., Felix, V., Munro, J.B., Bello, S.M., Bearer, C., Lichenstein, R., et al. (2024). The DO-KB Knowledgebase: a 20-year journey developing the disease open science ecosystem. Nucleic Acids Res. </w:t>
         </w:r>
       </w:hyperlink>
-      <w:hyperlink r:id="rId255">
+      <w:hyperlink r:id="rId257">
         <w:r>
           <w:rPr>
             <w:rFonts w:ascii="Times New Roman" w:cs="Times New Roman" w:eastAsia="Times New Roman" w:hAnsi="Times New Roman"/>
@@ -16596,7 +16725,7 @@
           <w:t xml:space="preserve">52</w:t>
         </w:r>
       </w:hyperlink>
-      <w:hyperlink r:id="rId256">
+      <w:hyperlink r:id="rId258">
         <w:r>
           <w:rPr>
             <w:rFonts w:ascii="Times New Roman" w:cs="Times New Roman" w:eastAsia="Times New Roman" w:hAnsi="Times New Roman"/>
@@ -16656,7 +16785,7 @@
         <w:t xml:space="preserve">74.</w:t>
         <w:tab/>
       </w:r>
-      <w:hyperlink r:id="rId257">
+      <w:hyperlink r:id="rId259">
         <w:r>
           <w:rPr>
             <w:rFonts w:ascii="Times New Roman" w:cs="Times New Roman" w:eastAsia="Times New Roman" w:hAnsi="Times New Roman"/>
@@ -16671,7 +16800,7 @@
           <w:t xml:space="preserve">Schriml, L.M., Lichenstein, R., Bisordi, K., Bearer, C., Baron, J.A., and Greene, C. (2023). Modeling the enigma of complex disease etiology. J. Transl. Med. </w:t>
         </w:r>
       </w:hyperlink>
-      <w:hyperlink r:id="rId258">
+      <w:hyperlink r:id="rId260">
         <w:r>
           <w:rPr>
             <w:rFonts w:ascii="Times New Roman" w:cs="Times New Roman" w:eastAsia="Times New Roman" w:hAnsi="Times New Roman"/>
@@ -16686,7 +16815,7 @@
           <w:t xml:space="preserve">21</w:t>
         </w:r>
       </w:hyperlink>
-      <w:hyperlink r:id="rId259">
+      <w:hyperlink r:id="rId261">
         <w:r>
           <w:rPr>
             <w:rFonts w:ascii="Times New Roman" w:cs="Times New Roman" w:eastAsia="Times New Roman" w:hAnsi="Times New Roman"/>
@@ -16746,7 +16875,7 @@
         <w:t xml:space="preserve">75.</w:t>
         <w:tab/>
       </w:r>
-      <w:hyperlink r:id="rId260">
+      <w:hyperlink r:id="rId262">
         <w:r>
           <w:rPr>
             <w:rFonts w:ascii="Times New Roman" w:cs="Times New Roman" w:eastAsia="Times New Roman" w:hAnsi="Times New Roman"/>
@@ -16761,7 +16890,7 @@
           <w:t xml:space="preserve">Baron, J.A., and Schriml, L.M. (2023). Assessing resource use: a case study with the Human Disease Ontology. Database (Oxford) </w:t>
         </w:r>
       </w:hyperlink>
-      <w:hyperlink r:id="rId261">
+      <w:hyperlink r:id="rId263">
         <w:r>
           <w:rPr>
             <w:rFonts w:ascii="Times New Roman" w:cs="Times New Roman" w:eastAsia="Times New Roman" w:hAnsi="Times New Roman"/>
@@ -16776,7 +16905,7 @@
           <w:t xml:space="preserve">2023</w:t>
         </w:r>
       </w:hyperlink>
-      <w:hyperlink r:id="rId262">
+      <w:hyperlink r:id="rId264">
         <w:r>
           <w:rPr>
             <w:rFonts w:ascii="Times New Roman" w:cs="Times New Roman" w:eastAsia="Times New Roman" w:hAnsi="Times New Roman"/>
@@ -16791,7 +16920,7 @@
           <w:t xml:space="preserve">. https://doi.org/</w:t>
         </w:r>
       </w:hyperlink>
-      <w:hyperlink r:id="rId263">
+      <w:hyperlink r:id="rId265">
         <w:r>
           <w:rPr>
             <w:rFonts w:ascii="Times New Roman" w:cs="Times New Roman" w:eastAsia="Times New Roman" w:hAnsi="Times New Roman"/>
@@ -16806,7 +16935,7 @@
           <w:t xml:space="preserve">10.1093/database/baad007</w:t>
         </w:r>
       </w:hyperlink>
-      <w:hyperlink r:id="rId264">
+      <w:hyperlink r:id="rId266">
         <w:r>
           <w:rPr>
             <w:rFonts w:ascii="Times New Roman" w:cs="Times New Roman" w:eastAsia="Times New Roman" w:hAnsi="Times New Roman"/>
@@ -16866,7 +16995,7 @@
         <w:t xml:space="preserve">76.</w:t>
         <w:tab/>
       </w:r>
-      <w:hyperlink r:id="rId265">
+      <w:hyperlink r:id="rId267">
         <w:r>
           <w:rPr>
             <w:rFonts w:ascii="Times New Roman" w:cs="Times New Roman" w:eastAsia="Times New Roman" w:hAnsi="Times New Roman"/>
@@ -16881,7 +17010,7 @@
           <w:t xml:space="preserve">Schriml, L.M., Munro, J.B., Schor, M., Olley, D., McCracken, C., Felix, V., Baron, J.A., Jackson, R., Bello, S.M., Bearer, C., et al. (2022). The Human Disease Ontology 2022 update. Nucleic Acids Res. </w:t>
         </w:r>
       </w:hyperlink>
-      <w:hyperlink r:id="rId266">
+      <w:hyperlink r:id="rId268">
         <w:r>
           <w:rPr>
             <w:rFonts w:ascii="Times New Roman" w:cs="Times New Roman" w:eastAsia="Times New Roman" w:hAnsi="Times New Roman"/>
@@ -16896,7 +17025,7 @@
           <w:t xml:space="preserve">50</w:t>
         </w:r>
       </w:hyperlink>
-      <w:hyperlink r:id="rId267">
+      <w:hyperlink r:id="rId269">
         <w:r>
           <w:rPr>
             <w:rFonts w:ascii="Times New Roman" w:cs="Times New Roman" w:eastAsia="Times New Roman" w:hAnsi="Times New Roman"/>
@@ -16956,7 +17085,7 @@
         <w:t xml:space="preserve">77.</w:t>
         <w:tab/>
       </w:r>
-      <w:hyperlink r:id="rId268">
+      <w:hyperlink r:id="rId270">
         <w:r>
           <w:rPr>
             <w:rFonts w:ascii="Times New Roman" w:cs="Times New Roman" w:eastAsia="Times New Roman" w:hAnsi="Times New Roman"/>
@@ -16971,7 +17100,7 @@
           <w:t xml:space="preserve">Schriml, L.M., Mitraka, E., Munro, J., Tauber, B., Schor, M., Nickle, L., Felix, V., Jeng, L., Bearer, C., Lichenstein, R., et al. (2019). Human Disease Ontology 2018 update: classification, content and workflow expansion. Nucleic Acids Res. </w:t>
         </w:r>
       </w:hyperlink>
-      <w:hyperlink r:id="rId269">
+      <w:hyperlink r:id="rId271">
         <w:r>
           <w:rPr>
             <w:rFonts w:ascii="Times New Roman" w:cs="Times New Roman" w:eastAsia="Times New Roman" w:hAnsi="Times New Roman"/>
@@ -16986,7 +17115,7 @@
           <w:t xml:space="preserve">47</w:t>
         </w:r>
       </w:hyperlink>
-      <w:hyperlink r:id="rId270">
+      <w:hyperlink r:id="rId272">
         <w:r>
           <w:rPr>
             <w:rFonts w:ascii="Times New Roman" w:cs="Times New Roman" w:eastAsia="Times New Roman" w:hAnsi="Times New Roman"/>
@@ -17046,7 +17175,7 @@
         <w:t xml:space="preserve">78.</w:t>
         <w:tab/>
       </w:r>
-      <w:hyperlink r:id="rId271">
+      <w:hyperlink r:id="rId273">
         <w:r>
           <w:rPr>
             <w:rFonts w:ascii="Times New Roman" w:cs="Times New Roman" w:eastAsia="Times New Roman" w:hAnsi="Times New Roman"/>
@@ -17061,7 +17190,7 @@
           <w:t xml:space="preserve">Bello, S.M., Shimoyama, M., Mitraka, E., Laulederkind, S.J.F., Smith, C.L., Eppig, J.T., and Schriml, L.M. (2018). Disease Ontology: improving and unifying disease annotations across species. Dis. Model. Mech. </w:t>
         </w:r>
       </w:hyperlink>
-      <w:hyperlink r:id="rId272">
+      <w:hyperlink r:id="rId274">
         <w:r>
           <w:rPr>
             <w:rFonts w:ascii="Times New Roman" w:cs="Times New Roman" w:eastAsia="Times New Roman" w:hAnsi="Times New Roman"/>
@@ -17076,7 +17205,7 @@
           <w:t xml:space="preserve">11</w:t>
         </w:r>
       </w:hyperlink>
-      <w:hyperlink r:id="rId273">
+      <w:hyperlink r:id="rId275">
         <w:r>
           <w:rPr>
             <w:rFonts w:ascii="Times New Roman" w:cs="Times New Roman" w:eastAsia="Times New Roman" w:hAnsi="Times New Roman"/>
@@ -17091,7 +17220,7 @@
           <w:t xml:space="preserve">. https://doi.org/</w:t>
         </w:r>
       </w:hyperlink>
-      <w:hyperlink r:id="rId274">
+      <w:hyperlink r:id="rId276">
         <w:r>
           <w:rPr>
             <w:rFonts w:ascii="Times New Roman" w:cs="Times New Roman" w:eastAsia="Times New Roman" w:hAnsi="Times New Roman"/>
@@ -17106,7 +17235,7 @@
           <w:t xml:space="preserve">10.1242/dmm.032839</w:t>
         </w:r>
       </w:hyperlink>
-      <w:hyperlink r:id="rId275">
+      <w:hyperlink r:id="rId277">
         <w:r>
           <w:rPr>
             <w:rFonts w:ascii="Times New Roman" w:cs="Times New Roman" w:eastAsia="Times New Roman" w:hAnsi="Times New Roman"/>
@@ -17166,7 +17295,7 @@
         <w:t xml:space="preserve">79.</w:t>
         <w:tab/>
       </w:r>
-      <w:hyperlink r:id="rId276">
+      <w:hyperlink r:id="rId278">
         <w:r>
           <w:rPr>
             <w:rFonts w:ascii="Times New Roman" w:cs="Times New Roman" w:eastAsia="Times New Roman" w:hAnsi="Times New Roman"/>
@@ -17181,7 +17310,7 @@
           <w:t xml:space="preserve">Schriml, L.M., and Mitraka, E. (2015). The Disease Ontology: fostering interoperability between biological and clinical human disease-related data. Mamm. Genome </w:t>
         </w:r>
       </w:hyperlink>
-      <w:hyperlink r:id="rId277">
+      <w:hyperlink r:id="rId279">
         <w:r>
           <w:rPr>
             <w:rFonts w:ascii="Times New Roman" w:cs="Times New Roman" w:eastAsia="Times New Roman" w:hAnsi="Times New Roman"/>
@@ -17196,7 +17325,7 @@
           <w:t xml:space="preserve">26</w:t>
         </w:r>
       </w:hyperlink>
-      <w:hyperlink r:id="rId278">
+      <w:hyperlink r:id="rId280">
         <w:r>
           <w:rPr>
             <w:rFonts w:ascii="Times New Roman" w:cs="Times New Roman" w:eastAsia="Times New Roman" w:hAnsi="Times New Roman"/>
@@ -17256,7 +17385,7 @@
         <w:t xml:space="preserve">80.</w:t>
         <w:tab/>
       </w:r>
-      <w:hyperlink r:id="rId279">
+      <w:hyperlink r:id="rId281">
         <w:r>
           <w:rPr>
             <w:rFonts w:ascii="Times New Roman" w:cs="Times New Roman" w:eastAsia="Times New Roman" w:hAnsi="Times New Roman"/>
@@ -17271,7 +17400,7 @@
           <w:t xml:space="preserve">Wu, T.-J., Schriml, L.M., Chen, Q.-R., Colbert, M., Crichton, D.J., Finney, R., Hu, Y., Kibbe, W.A., Kincaid, H., Meerzaman, D., et al. (2015). Generating a focused view of disease ontology cancer terms for pan-cancer data integration and analysis. Database (Oxford) </w:t>
         </w:r>
       </w:hyperlink>
-      <w:hyperlink r:id="rId280">
+      <w:hyperlink r:id="rId282">
         <w:r>
           <w:rPr>
             <w:rFonts w:ascii="Times New Roman" w:cs="Times New Roman" w:eastAsia="Times New Roman" w:hAnsi="Times New Roman"/>
@@ -17286,7 +17415,7 @@
           <w:t xml:space="preserve">2015</w:t>
         </w:r>
       </w:hyperlink>
-      <w:hyperlink r:id="rId281">
+      <w:hyperlink r:id="rId283">
         <w:r>
           <w:rPr>
             <w:rFonts w:ascii="Times New Roman" w:cs="Times New Roman" w:eastAsia="Times New Roman" w:hAnsi="Times New Roman"/>
@@ -17346,7 +17475,7 @@
         <w:t xml:space="preserve">81.</w:t>
         <w:tab/>
       </w:r>
-      <w:hyperlink r:id="rId282">
+      <w:hyperlink r:id="rId284">
         <w:r>
           <w:rPr>
             <w:rFonts w:ascii="Times New Roman" w:cs="Times New Roman" w:eastAsia="Times New Roman" w:hAnsi="Times New Roman"/>
@@ -17361,7 +17490,7 @@
           <w:t xml:space="preserve">Kibbe, W.A., Arze, C., Felix, V., Mitraka, E., Bolton, E., Fu, G., Mungall, C.J., Binder, J.X., Malone, J., Vasant, D., et al. (2015). Disease Ontology 2015 update: an expanded and updated database of human diseases for linking biomedical knowledge through disease data. Nucleic Acids Res. </w:t>
         </w:r>
       </w:hyperlink>
-      <w:hyperlink r:id="rId283">
+      <w:hyperlink r:id="rId285">
         <w:r>
           <w:rPr>
             <w:rFonts w:ascii="Times New Roman" w:cs="Times New Roman" w:eastAsia="Times New Roman" w:hAnsi="Times New Roman"/>
@@ -17376,7 +17505,7 @@
           <w:t xml:space="preserve">43</w:t>
         </w:r>
       </w:hyperlink>
-      <w:hyperlink r:id="rId284">
+      <w:hyperlink r:id="rId286">
         <w:r>
           <w:rPr>
             <w:rFonts w:ascii="Times New Roman" w:cs="Times New Roman" w:eastAsia="Times New Roman" w:hAnsi="Times New Roman"/>
@@ -17436,7 +17565,7 @@
         <w:t xml:space="preserve">82.</w:t>
         <w:tab/>
       </w:r>
-      <w:hyperlink r:id="rId285">
+      <w:hyperlink r:id="rId287">
         <w:r>
           <w:rPr>
             <w:rFonts w:ascii="Times New Roman" w:cs="Times New Roman" w:eastAsia="Times New Roman" w:hAnsi="Times New Roman"/>
@@ -17451,7 +17580,7 @@
           <w:t xml:space="preserve">Schriml, L.M., Arze, C., Nadendla, S., Chang, Y.-W.W., Mazaitis, M., Felix, V., Feng, G., and Kibbe, W.A. (2012). Disease Ontology: a backbone for disease semantic integration. Nucleic Acids Res. </w:t>
         </w:r>
       </w:hyperlink>
-      <w:hyperlink r:id="rId286">
+      <w:hyperlink r:id="rId288">
         <w:r>
           <w:rPr>
             <w:rFonts w:ascii="Times New Roman" w:cs="Times New Roman" w:eastAsia="Times New Roman" w:hAnsi="Times New Roman"/>
@@ -17466,7 +17595,7 @@
           <w:t xml:space="preserve">40</w:t>
         </w:r>
       </w:hyperlink>
-      <w:hyperlink r:id="rId287">
+      <w:hyperlink r:id="rId289">
         <w:r>
           <w:rPr>
             <w:rFonts w:ascii="Times New Roman" w:cs="Times New Roman" w:eastAsia="Times New Roman" w:hAnsi="Times New Roman"/>
@@ -17526,7 +17655,7 @@
         <w:t xml:space="preserve">83.</w:t>
         <w:tab/>
       </w:r>
-      <w:hyperlink r:id="rId288">
+      <w:hyperlink r:id="rId290">
         <w:r>
           <w:rPr>
             <w:rFonts w:ascii="Times New Roman" w:cs="Times New Roman" w:eastAsia="Times New Roman" w:hAnsi="Times New Roman"/>
@@ -17541,7 +17670,7 @@
           <w:t xml:space="preserve">Osborne, J.D., Flatow, J., Holko, M., Lin, S.M., Kibbe, W.A., Zhu, L.J., Danila, M.I., Feng, G., and Chisholm, R.L. (2009). Annotating the human genome with Disease Ontology. BMC Genomics </w:t>
         </w:r>
       </w:hyperlink>
-      <w:hyperlink r:id="rId289">
+      <w:hyperlink r:id="rId291">
         <w:r>
           <w:rPr>
             <w:rFonts w:ascii="Times New Roman" w:cs="Times New Roman" w:eastAsia="Times New Roman" w:hAnsi="Times New Roman"/>
@@ -17556,7 +17685,7 @@
           <w:t xml:space="preserve">10 Suppl 1</w:t>
         </w:r>
       </w:hyperlink>
-      <w:hyperlink r:id="rId290">
+      <w:hyperlink r:id="rId292">
         <w:r>
           <w:rPr>
             <w:rFonts w:ascii="Times New Roman" w:cs="Times New Roman" w:eastAsia="Times New Roman" w:hAnsi="Times New Roman"/>
@@ -17616,7 +17745,7 @@
         <w:t xml:space="preserve">84.</w:t>
         <w:tab/>
       </w:r>
-      <w:hyperlink r:id="rId291">
+      <w:hyperlink r:id="rId293">
         <w:r>
           <w:rPr>
             <w:rFonts w:ascii="Times New Roman" w:cs="Times New Roman" w:eastAsia="Times New Roman" w:hAnsi="Times New Roman"/>
@@ -17631,7 +17760,7 @@
           <w:t xml:space="preserve">Köhler, S., Gargano, M., Matentzoglu, N., Carmody, L.C., Lewis-Smith, D., Vasilevsky, N.A., Danis, D., Balagura, G., Baynam, G., Brower, A.M., et al. (2021). The Human Phenotype Ontology in 2021. Nucleic Acids Res. </w:t>
         </w:r>
       </w:hyperlink>
-      <w:hyperlink r:id="rId292">
+      <w:hyperlink r:id="rId294">
         <w:r>
           <w:rPr>
             <w:rFonts w:ascii="Times New Roman" w:cs="Times New Roman" w:eastAsia="Times New Roman" w:hAnsi="Times New Roman"/>
@@ -17646,7 +17775,7 @@
           <w:t xml:space="preserve">49</w:t>
         </w:r>
       </w:hyperlink>
-      <w:hyperlink r:id="rId293">
+      <w:hyperlink r:id="rId295">
         <w:r>
           <w:rPr>
             <w:rFonts w:ascii="Times New Roman" w:cs="Times New Roman" w:eastAsia="Times New Roman" w:hAnsi="Times New Roman"/>
@@ -17706,7 +17835,7 @@
         <w:t xml:space="preserve">85.</w:t>
         <w:tab/>
       </w:r>
-      <w:hyperlink r:id="rId294">
+      <w:hyperlink r:id="rId296">
         <w:r>
           <w:rPr>
             <w:rFonts w:ascii="Times New Roman" w:cs="Times New Roman" w:eastAsia="Times New Roman" w:hAnsi="Times New Roman"/>
@@ -17721,7 +17850,7 @@
           <w:t xml:space="preserve">World Health Organization (2016). International Statistical Classification of Diseases and Related Health Problems. 10th Revision (ICD-10). 5th ed. </w:t>
         </w:r>
       </w:hyperlink>
-      <w:hyperlink r:id="rId295">
+      <w:hyperlink r:id="rId297">
         <w:r>
           <w:rPr>
             <w:rFonts w:ascii="Times New Roman" w:cs="Times New Roman" w:eastAsia="Times New Roman" w:hAnsi="Times New Roman"/>
@@ -17736,7 +17865,7 @@
           <w:t xml:space="preserve">https://icd.who.int/browse10/</w:t>
         </w:r>
       </w:hyperlink>
-      <w:hyperlink r:id="rId296">
+      <w:hyperlink r:id="rId298">
         <w:r>
           <w:rPr>
             <w:rFonts w:ascii="Times New Roman" w:cs="Times New Roman" w:eastAsia="Times New Roman" w:hAnsi="Times New Roman"/>
@@ -17796,7 +17925,7 @@
         <w:t xml:space="preserve">86.</w:t>
         <w:tab/>
       </w:r>
-      <w:hyperlink r:id="rId297">
+      <w:hyperlink r:id="rId299">
         <w:r>
           <w:rPr>
             <w:rFonts w:ascii="Times New Roman" w:cs="Times New Roman" w:eastAsia="Times New Roman" w:hAnsi="Times New Roman"/>
@@ -17811,7 +17940,7 @@
           <w:t xml:space="preserve">SNOMED CT: Systematized Nomenclature of Medicine Clinical Terms SNOMED International. SNOMED International. </w:t>
         </w:r>
       </w:hyperlink>
-      <w:hyperlink r:id="rId298">
+      <w:hyperlink r:id="rId300">
         <w:r>
           <w:rPr>
             <w:rFonts w:ascii="Times New Roman" w:cs="Times New Roman" w:eastAsia="Times New Roman" w:hAnsi="Times New Roman"/>
@@ -17871,7 +18000,7 @@
         <w:t xml:space="preserve">87.</w:t>
         <w:tab/>
       </w:r>
-      <w:hyperlink r:id="rId299">
+      <w:hyperlink r:id="rId301">
         <w:r>
           <w:rPr>
             <w:rFonts w:ascii="Times New Roman" w:cs="Times New Roman" w:eastAsia="Times New Roman" w:hAnsi="Times New Roman"/>
@@ -17886,7 +18015,7 @@
           <w:t xml:space="preserve">Stanford CRFM </w:t>
         </w:r>
       </w:hyperlink>
-      <w:hyperlink r:id="rId300">
+      <w:hyperlink r:id="rId302">
         <w:r>
           <w:rPr>
             <w:rFonts w:ascii="Times New Roman" w:cs="Times New Roman" w:eastAsia="Times New Roman" w:hAnsi="Times New Roman"/>
@@ -17901,7 +18030,7 @@
           <w:t xml:space="preserve">https://crfm.stanford.edu/2022/12/15/biomedlm.html</w:t>
         </w:r>
       </w:hyperlink>
-      <w:hyperlink r:id="rId301">
+      <w:hyperlink r:id="rId303">
         <w:r>
           <w:rPr>
             <w:rFonts w:ascii="Times New Roman" w:cs="Times New Roman" w:eastAsia="Times New Roman" w:hAnsi="Times New Roman"/>
@@ -17961,7 +18090,7 @@
         <w:t xml:space="preserve">88.</w:t>
         <w:tab/>
       </w:r>
-      <w:hyperlink r:id="rId302">
+      <w:hyperlink r:id="rId304">
         <w:r>
           <w:rPr>
             <w:rFonts w:ascii="Times New Roman" w:cs="Times New Roman" w:eastAsia="Times New Roman" w:hAnsi="Times New Roman"/>
@@ -17976,7 +18105,7 @@
           <w:t xml:space="preserve">Canonica, G.W., Baena-Cagnani, C.E., Bousquet, J., Bousquet, P.J., Lockey, R.F., Malling, H.-J., Passalacqua, G., Potter, P., and Valovirta, E. (2007). Recommendations for standardization of clinical trials with Allergen Specific Immunotherapy for respiratory allergy. A statement of a World Allergy Organization (WAO) taskforce. Allergy </w:t>
         </w:r>
       </w:hyperlink>
-      <w:hyperlink r:id="rId303">
+      <w:hyperlink r:id="rId305">
         <w:r>
           <w:rPr>
             <w:rFonts w:ascii="Times New Roman" w:cs="Times New Roman" w:eastAsia="Times New Roman" w:hAnsi="Times New Roman"/>
@@ -17991,7 +18120,7 @@
           <w:t xml:space="preserve">62</w:t>
         </w:r>
       </w:hyperlink>
-      <w:hyperlink r:id="rId304">
+      <w:hyperlink r:id="rId306">
         <w:r>
           <w:rPr>
             <w:rFonts w:ascii="Times New Roman" w:cs="Times New Roman" w:eastAsia="Times New Roman" w:hAnsi="Times New Roman"/>
@@ -18051,7 +18180,7 @@
         <w:t xml:space="preserve">89.</w:t>
         <w:tab/>
       </w:r>
-      <w:hyperlink r:id="rId305">
+      <w:hyperlink r:id="rId307">
         <w:r>
           <w:rPr>
             <w:rFonts w:ascii="Times New Roman" w:cs="Times New Roman" w:eastAsia="Times New Roman" w:hAnsi="Times New Roman"/>
@@ -18066,7 +18195,7 @@
           <w:t xml:space="preserve">Katz, M.H.G., Marsh, R., Herman, J.M., Shi, Q., Collison, E., Venook, A.P., Kindler, H.L., Alberts, S.R., Philip, P., Lowy, A.M., et al. (2013). Borderline resectable pancreatic cancer: need for standardization and methods for optimal clinical trial design. Ann. Surg. Oncol. </w:t>
         </w:r>
       </w:hyperlink>
-      <w:hyperlink r:id="rId306">
+      <w:hyperlink r:id="rId308">
         <w:r>
           <w:rPr>
             <w:rFonts w:ascii="Times New Roman" w:cs="Times New Roman" w:eastAsia="Times New Roman" w:hAnsi="Times New Roman"/>
@@ -18081,7 +18210,7 @@
           <w:t xml:space="preserve">20</w:t>
         </w:r>
       </w:hyperlink>
-      <w:hyperlink r:id="rId307">
+      <w:hyperlink r:id="rId309">
         <w:r>
           <w:rPr>
             <w:rFonts w:ascii="Times New Roman" w:cs="Times New Roman" w:eastAsia="Times New Roman" w:hAnsi="Times New Roman"/>
@@ -18141,7 +18270,7 @@
         <w:t xml:space="preserve">90.</w:t>
         <w:tab/>
       </w:r>
-      <w:hyperlink r:id="rId308">
+      <w:hyperlink r:id="rId310">
         <w:r>
           <w:rPr>
             <w:rFonts w:ascii="Times New Roman" w:cs="Times New Roman" w:eastAsia="Times New Roman" w:hAnsi="Times New Roman"/>
@@ -18156,7 +18285,7 @@
           <w:t xml:space="preserve">Dickersin, K., and Mayo-Wilson, E. (2018). Standards for design and measurement would make clinical research reproducible and usable. Proc. Natl. Acad. Sci. U. S. A. </w:t>
         </w:r>
       </w:hyperlink>
-      <w:hyperlink r:id="rId309">
+      <w:hyperlink r:id="rId311">
         <w:r>
           <w:rPr>
             <w:rFonts w:ascii="Times New Roman" w:cs="Times New Roman" w:eastAsia="Times New Roman" w:hAnsi="Times New Roman"/>
@@ -18171,7 +18300,7 @@
           <w:t xml:space="preserve">115</w:t>
         </w:r>
       </w:hyperlink>
-      <w:hyperlink r:id="rId310">
+      <w:hyperlink r:id="rId312">
         <w:r>
           <w:rPr>
             <w:rFonts w:ascii="Times New Roman" w:cs="Times New Roman" w:eastAsia="Times New Roman" w:hAnsi="Times New Roman"/>
@@ -18231,7 +18360,7 @@
         <w:t xml:space="preserve">91.</w:t>
         <w:tab/>
       </w:r>
-      <w:hyperlink r:id="rId311">
+      <w:hyperlink r:id="rId313">
         <w:r>
           <w:rPr>
             <w:rFonts w:ascii="Times New Roman" w:cs="Times New Roman" w:eastAsia="Times New Roman" w:hAnsi="Times New Roman"/>
@@ -18291,7 +18420,7 @@
         <w:t xml:space="preserve">92.</w:t>
         <w:tab/>
       </w:r>
-      <w:hyperlink r:id="rId312">
+      <w:hyperlink r:id="rId314">
         <w:r>
           <w:rPr>
             <w:rFonts w:ascii="Times New Roman" w:cs="Times New Roman" w:eastAsia="Times New Roman" w:hAnsi="Times New Roman"/>
@@ -18304,36 +18433,6 @@
             <w:rtl w:val="0"/>
           </w:rPr>
           <w:t xml:space="preserve">van der Loo, M. (2013). Stringdist: Approximate string matching, fuzzy text search, and string distance functions. (The R Foundation). </w:t>
-        </w:r>
-      </w:hyperlink>
-      <w:hyperlink r:id="rId313">
-        <w:r>
-          <w:rPr>
-            <w:rFonts w:ascii="Times New Roman" w:cs="Times New Roman" w:eastAsia="Times New Roman" w:hAnsi="Times New Roman"/>
-            <w:b w:val="0"/>
-            <w:i w:val="0"/>
-            <w:color w:val="000000"/>
-            <w:sz w:val="24"/>
-            <w:szCs w:val="24"/>
-            <w:u w:val="none"/>
-            <w:rtl w:val="0"/>
-          </w:rPr>
-          <w:t xml:space="preserve">https://cran.r-project.org/package=stringdist</w:t>
-        </w:r>
-      </w:hyperlink>
-      <w:hyperlink r:id="rId314">
-        <w:r>
-          <w:rPr>
-            <w:rFonts w:ascii="Times New Roman" w:cs="Times New Roman" w:eastAsia="Times New Roman" w:hAnsi="Times New Roman"/>
-            <w:b w:val="0"/>
-            <w:i w:val="0"/>
-            <w:color w:val="000000"/>
-            <w:sz w:val="24"/>
-            <w:szCs w:val="24"/>
-            <w:u w:val="none"/>
-            <w:rtl w:val="0"/>
-          </w:rPr>
-          <w:t xml:space="preserve"> </w:t>
         </w:r>
       </w:hyperlink>
       <w:hyperlink r:id="rId315">
@@ -18363,6 +18462,36 @@
             <w:u w:val="none"/>
             <w:rtl w:val="0"/>
           </w:rPr>
+          <w:t xml:space="preserve"> </w:t>
+        </w:r>
+      </w:hyperlink>
+      <w:hyperlink r:id="rId317">
+        <w:r>
+          <w:rPr>
+            <w:rFonts w:ascii="Times New Roman" w:cs="Times New Roman" w:eastAsia="Times New Roman" w:hAnsi="Times New Roman"/>
+            <w:b w:val="0"/>
+            <w:i w:val="0"/>
+            <w:color w:val="000000"/>
+            <w:sz w:val="24"/>
+            <w:szCs w:val="24"/>
+            <w:u w:val="none"/>
+            <w:rtl w:val="0"/>
+          </w:rPr>
+          <w:t xml:space="preserve">https://cran.r-project.org/package=stringdist</w:t>
+        </w:r>
+      </w:hyperlink>
+      <w:hyperlink r:id="rId318">
+        <w:r>
+          <w:rPr>
+            <w:rFonts w:ascii="Times New Roman" w:cs="Times New Roman" w:eastAsia="Times New Roman" w:hAnsi="Times New Roman"/>
+            <w:b w:val="0"/>
+            <w:i w:val="0"/>
+            <w:color w:val="000000"/>
+            <w:sz w:val="24"/>
+            <w:szCs w:val="24"/>
+            <w:u w:val="none"/>
+            <w:rtl w:val="0"/>
+          </w:rPr>
           <w:t xml:space="preserve">.</w:t>
         </w:r>
       </w:hyperlink>
@@ -18411,7 +18540,7 @@
         <w:t xml:space="preserve">93.</w:t>
         <w:tab/>
       </w:r>
-      <w:hyperlink r:id="rId317">
+      <w:hyperlink r:id="rId319">
         <w:r>
           <w:rPr>
             <w:rFonts w:ascii="Times New Roman" w:cs="Times New Roman" w:eastAsia="Times New Roman" w:hAnsi="Times New Roman"/>
@@ -18426,7 +18555,7 @@
           <w:t xml:space="preserve">R Core Team (2024) </w:t>
         </w:r>
       </w:hyperlink>
-      <w:hyperlink r:id="rId318">
+      <w:hyperlink r:id="rId320">
         <w:r>
           <w:rPr>
             <w:rFonts w:ascii="Times New Roman" w:cs="Times New Roman" w:eastAsia="Times New Roman" w:hAnsi="Times New Roman"/>
@@ -18441,7 +18570,7 @@
           <w:t xml:space="preserve">R: A Language and Environment for Statistical Computing</w:t>
         </w:r>
       </w:hyperlink>
-      <w:hyperlink r:id="rId319">
+      <w:hyperlink r:id="rId321">
         <w:r>
           <w:rPr>
             <w:rFonts w:ascii="Times New Roman" w:cs="Times New Roman" w:eastAsia="Times New Roman" w:hAnsi="Times New Roman"/>
@@ -18456,7 +18585,7 @@
           <w:t xml:space="preserve">. </w:t>
         </w:r>
       </w:hyperlink>
-      <w:hyperlink r:id="rId320">
+      <w:hyperlink r:id="rId322">
         <w:r>
           <w:rPr>
             <w:rFonts w:ascii="Times New Roman" w:cs="Times New Roman" w:eastAsia="Times New Roman" w:hAnsi="Times New Roman"/>
@@ -18471,7 +18600,7 @@
           <w:t xml:space="preserve">R Foundation for Statistical Computing, </w:t>
         </w:r>
       </w:hyperlink>
-      <w:hyperlink r:id="rId321">
+      <w:hyperlink r:id="rId323">
         <w:r>
           <w:rPr>
             <w:rFonts w:ascii="Times New Roman" w:cs="Times New Roman" w:eastAsia="Times New Roman" w:hAnsi="Times New Roman"/>
@@ -18486,7 +18615,7 @@
           <w:t xml:space="preserve">Vienna, Austria. </w:t>
         </w:r>
       </w:hyperlink>
-      <w:hyperlink r:id="rId322">
+      <w:hyperlink r:id="rId324">
         <w:r>
           <w:rPr>
             <w:rFonts w:ascii="Times New Roman" w:cs="Times New Roman" w:eastAsia="Times New Roman" w:hAnsi="Times New Roman"/>
@@ -18501,7 +18630,7 @@
           <w:t xml:space="preserve">https://www.R-project.org/</w:t>
         </w:r>
       </w:hyperlink>
-      <w:hyperlink r:id="rId323">
+      <w:hyperlink r:id="rId325">
         <w:r>
           <w:rPr>
             <w:rFonts w:ascii="Times New Roman" w:cs="Times New Roman" w:eastAsia="Times New Roman" w:hAnsi="Times New Roman"/>
@@ -18561,7 +18690,7 @@
         <w:t xml:space="preserve">94.</w:t>
         <w:tab/>
       </w:r>
-      <w:hyperlink r:id="rId324">
+      <w:hyperlink r:id="rId326">
         <w:r>
           <w:rPr>
             <w:rFonts w:ascii="Times New Roman" w:cs="Times New Roman" w:eastAsia="Times New Roman" w:hAnsi="Times New Roman"/>
@@ -18576,7 +18705,7 @@
           <w:t xml:space="preserve">Frey, B.J., and Dueck, D. (2007). Clustering by passing messages between data points. Science </w:t>
         </w:r>
       </w:hyperlink>
-      <w:hyperlink r:id="rId325">
+      <w:hyperlink r:id="rId327">
         <w:r>
           <w:rPr>
             <w:rFonts w:ascii="Times New Roman" w:cs="Times New Roman" w:eastAsia="Times New Roman" w:hAnsi="Times New Roman"/>
@@ -18591,7 +18720,7 @@
           <w:t xml:space="preserve">315</w:t>
         </w:r>
       </w:hyperlink>
-      <w:hyperlink r:id="rId326">
+      <w:hyperlink r:id="rId328">
         <w:r>
           <w:rPr>
             <w:rFonts w:ascii="Times New Roman" w:cs="Times New Roman" w:eastAsia="Times New Roman" w:hAnsi="Times New Roman"/>
@@ -18651,7 +18780,7 @@
         <w:t xml:space="preserve">95.</w:t>
         <w:tab/>
       </w:r>
-      <w:hyperlink r:id="rId327">
+      <w:hyperlink r:id="rId329">
         <w:r>
           <w:rPr>
             <w:rFonts w:ascii="Times New Roman" w:cs="Times New Roman" w:eastAsia="Times New Roman" w:hAnsi="Times New Roman"/>
@@ -18711,7 +18840,7 @@
         <w:t xml:space="preserve">96.</w:t>
         <w:tab/>
       </w:r>
-      <w:hyperlink r:id="rId328">
+      <w:hyperlink r:id="rId330">
         <w:r>
           <w:rPr>
             <w:rFonts w:ascii="Times New Roman" w:cs="Times New Roman" w:eastAsia="Times New Roman" w:hAnsi="Times New Roman"/>
@@ -18726,7 +18855,7 @@
           <w:t xml:space="preserve">Shi, X.H., Guan, R.C., Wang, L.P., Pei, Z.L., and Liang, Y.C. (2009). An incremental affinity propagation algorithm and its applications for text clustering. In 2009 International Joint Conference on Neural Networks (IEEE). https://doi.org/</w:t>
         </w:r>
       </w:hyperlink>
-      <w:hyperlink r:id="rId329">
+      <w:hyperlink r:id="rId331">
         <w:r>
           <w:rPr>
             <w:rFonts w:ascii="Times New Roman" w:cs="Times New Roman" w:eastAsia="Times New Roman" w:hAnsi="Times New Roman"/>
@@ -18741,7 +18870,7 @@
           <w:t xml:space="preserve">10.1109/ijcnn.2009.5178973</w:t>
         </w:r>
       </w:hyperlink>
-      <w:hyperlink r:id="rId330">
+      <w:hyperlink r:id="rId332">
         <w:r>
           <w:rPr>
             <w:rFonts w:ascii="Times New Roman" w:cs="Times New Roman" w:eastAsia="Times New Roman" w:hAnsi="Times New Roman"/>
@@ -18801,7 +18930,7 @@
         <w:t xml:space="preserve">97.</w:t>
         <w:tab/>
       </w:r>
-      <w:hyperlink r:id="rId331">
+      <w:hyperlink r:id="rId333">
         <w:r>
           <w:rPr>
             <w:rFonts w:ascii="Times New Roman" w:cs="Times New Roman" w:eastAsia="Times New Roman" w:hAnsi="Times New Roman"/>
@@ -18816,7 +18945,7 @@
           <w:t xml:space="preserve">Shailendra Kumar Shrivastava, J.L.Rana, R.C.Jain (2013). Text document clustering based on phrase similarity using affinity propagation. International Journal of Computer Applications </w:t>
         </w:r>
       </w:hyperlink>
-      <w:hyperlink r:id="rId332">
+      <w:hyperlink r:id="rId334">
         <w:r>
           <w:rPr>
             <w:rFonts w:ascii="Times New Roman" w:cs="Times New Roman" w:eastAsia="Times New Roman" w:hAnsi="Times New Roman"/>
@@ -18831,7 +18960,7 @@
           <w:t xml:space="preserve">61</w:t>
         </w:r>
       </w:hyperlink>
-      <w:hyperlink r:id="rId333">
+      <w:hyperlink r:id="rId335">
         <w:r>
           <w:rPr>
             <w:rFonts w:ascii="Times New Roman" w:cs="Times New Roman" w:eastAsia="Times New Roman" w:hAnsi="Times New Roman"/>
@@ -18846,7 +18975,7 @@
           <w:t xml:space="preserve">. https://doi.org/</w:t>
         </w:r>
       </w:hyperlink>
-      <w:hyperlink r:id="rId334">
+      <w:hyperlink r:id="rId336">
         <w:r>
           <w:rPr>
             <w:rFonts w:ascii="Times New Roman" w:cs="Times New Roman" w:eastAsia="Times New Roman" w:hAnsi="Times New Roman"/>
@@ -18861,7 +18990,7 @@
           <w:t xml:space="preserve">10.5120/10032-5077</w:t>
         </w:r>
       </w:hyperlink>
-      <w:hyperlink r:id="rId335">
+      <w:hyperlink r:id="rId337">
         <w:r>
           <w:rPr>
             <w:rFonts w:ascii="Times New Roman" w:cs="Times New Roman" w:eastAsia="Times New Roman" w:hAnsi="Times New Roman"/>
@@ -18921,7 +19050,7 @@
         <w:t xml:space="preserve">98.</w:t>
         <w:tab/>
       </w:r>
-      <w:hyperlink r:id="rId336">
+      <w:hyperlink r:id="rId338">
         <w:r>
           <w:rPr>
             <w:rFonts w:ascii="Times New Roman" w:cs="Times New Roman" w:eastAsia="Times New Roman" w:hAnsi="Times New Roman"/>
@@ -18934,36 +19063,6 @@
             <w:rtl w:val="0"/>
           </w:rPr>
           <w:t xml:space="preserve">Cortes, D. (2019). isotree: Isolation-Based Outlier Detection. (The R Foundation). https://doi.org/</w:t>
-        </w:r>
-      </w:hyperlink>
-      <w:hyperlink r:id="rId337">
-        <w:r>
-          <w:rPr>
-            <w:rFonts w:ascii="Times New Roman" w:cs="Times New Roman" w:eastAsia="Times New Roman" w:hAnsi="Times New Roman"/>
-            <w:b w:val="0"/>
-            <w:i w:val="0"/>
-            <w:color w:val="000000"/>
-            <w:sz w:val="24"/>
-            <w:szCs w:val="24"/>
-            <w:u w:val="none"/>
-            <w:rtl w:val="0"/>
-          </w:rPr>
-          <w:t xml:space="preserve">10.32614/cran.package.isotree</w:t>
-        </w:r>
-      </w:hyperlink>
-      <w:hyperlink r:id="rId338">
-        <w:r>
-          <w:rPr>
-            <w:rFonts w:ascii="Times New Roman" w:cs="Times New Roman" w:eastAsia="Times New Roman" w:hAnsi="Times New Roman"/>
-            <w:b w:val="0"/>
-            <w:i w:val="0"/>
-            <w:color w:val="000000"/>
-            <w:sz w:val="24"/>
-            <w:szCs w:val="24"/>
-            <w:u w:val="none"/>
-            <w:rtl w:val="0"/>
-          </w:rPr>
-          <w:t xml:space="preserve"> https://doi.org/</w:t>
         </w:r>
       </w:hyperlink>
       <w:hyperlink r:id="rId339">
@@ -18993,6 +19092,36 @@
             <w:u w:val="none"/>
             <w:rtl w:val="0"/>
           </w:rPr>
+          <w:t xml:space="preserve"> https://doi.org/</w:t>
+        </w:r>
+      </w:hyperlink>
+      <w:hyperlink r:id="rId341">
+        <w:r>
+          <w:rPr>
+            <w:rFonts w:ascii="Times New Roman" w:cs="Times New Roman" w:eastAsia="Times New Roman" w:hAnsi="Times New Roman"/>
+            <w:b w:val="0"/>
+            <w:i w:val="0"/>
+            <w:color w:val="000000"/>
+            <w:sz w:val="24"/>
+            <w:szCs w:val="24"/>
+            <w:u w:val="none"/>
+            <w:rtl w:val="0"/>
+          </w:rPr>
+          <w:t xml:space="preserve">10.32614/cran.package.isotree</w:t>
+        </w:r>
+      </w:hyperlink>
+      <w:hyperlink r:id="rId342">
+        <w:r>
+          <w:rPr>
+            <w:rFonts w:ascii="Times New Roman" w:cs="Times New Roman" w:eastAsia="Times New Roman" w:hAnsi="Times New Roman"/>
+            <w:b w:val="0"/>
+            <w:i w:val="0"/>
+            <w:color w:val="000000"/>
+            <w:sz w:val="24"/>
+            <w:szCs w:val="24"/>
+            <w:u w:val="none"/>
+            <w:rtl w:val="0"/>
+          </w:rPr>
           <w:t xml:space="preserve">.</w:t>
         </w:r>
       </w:hyperlink>
@@ -19041,7 +19170,7 @@
         <w:t xml:space="preserve">99.</w:t>
         <w:tab/>
       </w:r>
-      <w:hyperlink r:id="rId341">
+      <w:hyperlink r:id="rId343">
         <w:r>
           <w:rPr>
             <w:rFonts w:ascii="Times New Roman" w:cs="Times New Roman" w:eastAsia="Times New Roman" w:hAnsi="Times New Roman"/>
@@ -19101,7 +19230,7 @@
         <w:t xml:space="preserve">100.</w:t>
         <w:tab/>
       </w:r>
-      <w:hyperlink r:id="rId342">
+      <w:hyperlink r:id="rId344">
         <w:r>
           <w:rPr>
             <w:rFonts w:ascii="Times New Roman" w:cs="Times New Roman" w:eastAsia="Times New Roman" w:hAnsi="Times New Roman"/>
@@ -19114,36 +19243,6 @@
             <w:rtl w:val="0"/>
           </w:rPr>
           <w:t xml:space="preserve">Hahsler, M., and Piekenbrock, M. (2015). Dbscan: Density-based spatial clustering of applications with noise (DBSCAN) and related algorithms. (The R Foundation). https://doi.org/</w:t>
-        </w:r>
-      </w:hyperlink>
-      <w:hyperlink r:id="rId343">
-        <w:r>
-          <w:rPr>
-            <w:rFonts w:ascii="Times New Roman" w:cs="Times New Roman" w:eastAsia="Times New Roman" w:hAnsi="Times New Roman"/>
-            <w:b w:val="0"/>
-            <w:i w:val="0"/>
-            <w:color w:val="000000"/>
-            <w:sz w:val="24"/>
-            <w:szCs w:val="24"/>
-            <w:u w:val="none"/>
-            <w:rtl w:val="0"/>
-          </w:rPr>
-          <w:t xml:space="preserve">10.32614/cran.package.dbscan</w:t>
-        </w:r>
-      </w:hyperlink>
-      <w:hyperlink r:id="rId344">
-        <w:r>
-          <w:rPr>
-            <w:rFonts w:ascii="Times New Roman" w:cs="Times New Roman" w:eastAsia="Times New Roman" w:hAnsi="Times New Roman"/>
-            <w:b w:val="0"/>
-            <w:i w:val="0"/>
-            <w:color w:val="000000"/>
-            <w:sz w:val="24"/>
-            <w:szCs w:val="24"/>
-            <w:u w:val="none"/>
-            <w:rtl w:val="0"/>
-          </w:rPr>
-          <w:t xml:space="preserve"> https://doi.org/</w:t>
         </w:r>
       </w:hyperlink>
       <w:hyperlink r:id="rId345">
@@ -19173,6 +19272,36 @@
             <w:u w:val="none"/>
             <w:rtl w:val="0"/>
           </w:rPr>
+          <w:t xml:space="preserve"> https://doi.org/</w:t>
+        </w:r>
+      </w:hyperlink>
+      <w:hyperlink r:id="rId347">
+        <w:r>
+          <w:rPr>
+            <w:rFonts w:ascii="Times New Roman" w:cs="Times New Roman" w:eastAsia="Times New Roman" w:hAnsi="Times New Roman"/>
+            <w:b w:val="0"/>
+            <w:i w:val="0"/>
+            <w:color w:val="000000"/>
+            <w:sz w:val="24"/>
+            <w:szCs w:val="24"/>
+            <w:u w:val="none"/>
+            <w:rtl w:val="0"/>
+          </w:rPr>
+          <w:t xml:space="preserve">10.32614/cran.package.dbscan</w:t>
+        </w:r>
+      </w:hyperlink>
+      <w:hyperlink r:id="rId348">
+        <w:r>
+          <w:rPr>
+            <w:rFonts w:ascii="Times New Roman" w:cs="Times New Roman" w:eastAsia="Times New Roman" w:hAnsi="Times New Roman"/>
+            <w:b w:val="0"/>
+            <w:i w:val="0"/>
+            <w:color w:val="000000"/>
+            <w:sz w:val="24"/>
+            <w:szCs w:val="24"/>
+            <w:u w:val="none"/>
+            <w:rtl w:val="0"/>
+          </w:rPr>
           <w:t xml:space="preserve">.</w:t>
         </w:r>
       </w:hyperlink>
@@ -19221,7 +19350,7 @@
         <w:t xml:space="preserve">101.</w:t>
         <w:tab/>
       </w:r>
-      <w:hyperlink r:id="rId347">
+      <w:hyperlink r:id="rId349">
         <w:r>
           <w:rPr>
             <w:rFonts w:ascii="Times New Roman" w:cs="Times New Roman" w:eastAsia="Times New Roman" w:hAnsi="Times New Roman"/>
@@ -19236,7 +19365,7 @@
           <w:t xml:space="preserve">Alghushairy, O., Alsini, R., Soule, T., and Ma, X. (2020). A review of Local Outlier Factor algorithms for outlier detection in big data streams. Big Data Cogn. Comput. </w:t>
         </w:r>
       </w:hyperlink>
-      <w:hyperlink r:id="rId348">
+      <w:hyperlink r:id="rId350">
         <w:r>
           <w:rPr>
             <w:rFonts w:ascii="Times New Roman" w:cs="Times New Roman" w:eastAsia="Times New Roman" w:hAnsi="Times New Roman"/>
@@ -19251,7 +19380,7 @@
           <w:t xml:space="preserve">5</w:t>
         </w:r>
       </w:hyperlink>
-      <w:hyperlink r:id="rId349">
+      <w:hyperlink r:id="rId351">
         <w:r>
           <w:rPr>
             <w:rFonts w:ascii="Times New Roman" w:cs="Times New Roman" w:eastAsia="Times New Roman" w:hAnsi="Times New Roman"/>
@@ -19311,7 +19440,7 @@
         <w:t xml:space="preserve">102.</w:t>
         <w:tab/>
       </w:r>
-      <w:hyperlink r:id="rId350">
+      <w:hyperlink r:id="rId352">
         <w:r>
           <w:rPr>
             <w:rFonts w:ascii="Times New Roman" w:cs="Times New Roman" w:eastAsia="Times New Roman" w:hAnsi="Times New Roman"/>
@@ -19326,7 +19455,7 @@
           <w:t xml:space="preserve">Ding, H., Ding, K., Zhang, J., Wang, Y., Gao, L., Li, Y., Chen, F., Shao, Z., and Lai, W. (2018). Local outlier factor-based fault detection and evaluation of photovoltaic system. Solar Energy </w:t>
         </w:r>
       </w:hyperlink>
-      <w:hyperlink r:id="rId351">
+      <w:hyperlink r:id="rId353">
         <w:r>
           <w:rPr>
             <w:rFonts w:ascii="Times New Roman" w:cs="Times New Roman" w:eastAsia="Times New Roman" w:hAnsi="Times New Roman"/>
@@ -19341,7 +19470,7 @@
           <w:t xml:space="preserve">164</w:t>
         </w:r>
       </w:hyperlink>
-      <w:hyperlink r:id="rId352">
+      <w:hyperlink r:id="rId354">
         <w:r>
           <w:rPr>
             <w:rFonts w:ascii="Times New Roman" w:cs="Times New Roman" w:eastAsia="Times New Roman" w:hAnsi="Times New Roman"/>
@@ -19401,7 +19530,7 @@
         <w:t xml:space="preserve">103.</w:t>
         <w:tab/>
       </w:r>
-      <w:hyperlink r:id="rId353">
+      <w:hyperlink r:id="rId355">
         <w:r>
           <w:rPr>
             <w:rFonts w:ascii="Times New Roman" w:cs="Times New Roman" w:eastAsia="Times New Roman" w:hAnsi="Times New Roman"/>
@@ -19416,7 +19545,7 @@
           <w:t xml:space="preserve">Xu, H., Zhang, L., Li, P., and Zhu, F. (2022). Outlier detection algorithm based on k-nearest neighbors-local outlier factor. J. Algorithm. Comput. Technol. </w:t>
         </w:r>
       </w:hyperlink>
-      <w:hyperlink r:id="rId354">
+      <w:hyperlink r:id="rId356">
         <w:r>
           <w:rPr>
             <w:rFonts w:ascii="Times New Roman" w:cs="Times New Roman" w:eastAsia="Times New Roman" w:hAnsi="Times New Roman"/>
@@ -19431,7 +19560,7 @@
           <w:t xml:space="preserve">16</w:t>
         </w:r>
       </w:hyperlink>
-      <w:hyperlink r:id="rId355">
+      <w:hyperlink r:id="rId357">
         <w:r>
           <w:rPr>
             <w:rFonts w:ascii="Times New Roman" w:cs="Times New Roman" w:eastAsia="Times New Roman" w:hAnsi="Times New Roman"/>
@@ -19446,7 +19575,7 @@
           <w:t xml:space="preserve">. https://doi.org/</w:t>
         </w:r>
       </w:hyperlink>
-      <w:hyperlink r:id="rId356">
+      <w:hyperlink r:id="rId358">
         <w:r>
           <w:rPr>
             <w:rFonts w:ascii="Times New Roman" w:cs="Times New Roman" w:eastAsia="Times New Roman" w:hAnsi="Times New Roman"/>
@@ -19461,7 +19590,7 @@
           <w:t xml:space="preserve">10.1177/17483026221078111</w:t>
         </w:r>
       </w:hyperlink>
-      <w:hyperlink r:id="rId357">
+      <w:hyperlink r:id="rId359">
         <w:r>
           <w:rPr>
             <w:rFonts w:ascii="Times New Roman" w:cs="Times New Roman" w:eastAsia="Times New Roman" w:hAnsi="Times New Roman"/>
@@ -19521,7 +19650,7 @@
         <w:t xml:space="preserve">104.</w:t>
         <w:tab/>
       </w:r>
-      <w:hyperlink r:id="rId358">
+      <w:hyperlink r:id="rId360">
         <w:r>
           <w:rPr>
             <w:rFonts w:ascii="Times New Roman" w:cs="Times New Roman" w:eastAsia="Times New Roman" w:hAnsi="Times New Roman"/>
@@ -19536,7 +19665,7 @@
           <w:t xml:space="preserve">Morris, J., Kuleshov, V., Shmatikov, V., and Rush, A. (2023). Text embeddings reveal (almost) as much as text. In Proceedings of the 2023 Conference on Empirical Methods in Natural Language Processing (Association for Computational Linguistics). https://doi.org/</w:t>
         </w:r>
       </w:hyperlink>
-      <w:hyperlink r:id="rId359">
+      <w:hyperlink r:id="rId361">
         <w:r>
           <w:rPr>
             <w:rFonts w:ascii="Times New Roman" w:cs="Times New Roman" w:eastAsia="Times New Roman" w:hAnsi="Times New Roman"/>
@@ -19551,7 +19680,7 @@
           <w:t xml:space="preserve">10.18653/v1/2023.emnlp-main.765</w:t>
         </w:r>
       </w:hyperlink>
-      <w:hyperlink r:id="rId360">
+      <w:hyperlink r:id="rId362">
         <w:r>
           <w:rPr>
             <w:rFonts w:ascii="Times New Roman" w:cs="Times New Roman" w:eastAsia="Times New Roman" w:hAnsi="Times New Roman"/>
@@ -19611,7 +19740,7 @@
         <w:t xml:space="preserve">105.</w:t>
         <w:tab/>
       </w:r>
-      <w:hyperlink r:id="rId361">
+      <w:hyperlink r:id="rId363">
         <w:r>
           <w:rPr>
             <w:rFonts w:ascii="Times New Roman" w:cs="Times New Roman" w:eastAsia="Times New Roman" w:hAnsi="Times New Roman"/>
@@ -19671,7 +19800,7 @@
         <w:t xml:space="preserve">106.</w:t>
         <w:tab/>
       </w:r>
-      <w:hyperlink r:id="rId362">
+      <w:hyperlink r:id="rId364">
         <w:r>
           <w:rPr>
             <w:rFonts w:ascii="Times New Roman" w:cs="Times New Roman" w:eastAsia="Times New Roman" w:hAnsi="Times New Roman"/>
@@ -19686,7 +19815,7 @@
           <w:t xml:space="preserve">Incitti, F., Urli, F., and Snidaro, L. (2023). Beyond word embeddings: A survey. Inf. Fusion </w:t>
         </w:r>
       </w:hyperlink>
-      <w:hyperlink r:id="rId363">
+      <w:hyperlink r:id="rId365">
         <w:r>
           <w:rPr>
             <w:rFonts w:ascii="Times New Roman" w:cs="Times New Roman" w:eastAsia="Times New Roman" w:hAnsi="Times New Roman"/>
@@ -19701,7 +19830,7 @@
           <w:t xml:space="preserve">89</w:t>
         </w:r>
       </w:hyperlink>
-      <w:hyperlink r:id="rId364">
+      <w:hyperlink r:id="rId366">
         <w:r>
           <w:rPr>
             <w:rFonts w:ascii="Times New Roman" w:cs="Times New Roman" w:eastAsia="Times New Roman" w:hAnsi="Times New Roman"/>
@@ -19761,7 +19890,7 @@
         <w:t xml:space="preserve">107.</w:t>
         <w:tab/>
       </w:r>
-      <w:hyperlink r:id="rId365">
+      <w:hyperlink r:id="rId367">
         <w:r>
           <w:rPr>
             <w:rFonts w:ascii="Times New Roman" w:cs="Times New Roman" w:eastAsia="Times New Roman" w:hAnsi="Times New Roman"/>
@@ -19776,7 +19905,7 @@
           <w:t xml:space="preserve">Khattak, F.K., Jeblee, S., Pou-Prom, C., Abdalla, M., Meaney, C., and Rudzicz, F. (2019). A survey of word embeddings for clinical text. J. Biomed. Inform. </w:t>
         </w:r>
       </w:hyperlink>
-      <w:hyperlink r:id="rId366">
+      <w:hyperlink r:id="rId368">
         <w:r>
           <w:rPr>
             <w:rFonts w:ascii="Times New Roman" w:cs="Times New Roman" w:eastAsia="Times New Roman" w:hAnsi="Times New Roman"/>
@@ -19791,7 +19920,7 @@
           <w:t xml:space="preserve">100S</w:t>
         </w:r>
       </w:hyperlink>
-      <w:hyperlink r:id="rId367">
+      <w:hyperlink r:id="rId369">
         <w:r>
           <w:rPr>
             <w:rFonts w:ascii="Times New Roman" w:cs="Times New Roman" w:eastAsia="Times New Roman" w:hAnsi="Times New Roman"/>
@@ -19851,7 +19980,7 @@
         <w:t xml:space="preserve">108.</w:t>
         <w:tab/>
       </w:r>
-      <w:hyperlink r:id="rId368">
+      <w:hyperlink r:id="rId370">
         <w:r>
           <w:rPr>
             <w:rFonts w:ascii="Times New Roman" w:cs="Times New Roman" w:eastAsia="Times New Roman" w:hAnsi="Times New Roman"/>
@@ -19866,7 +19995,7 @@
           <w:t xml:space="preserve">Gökçe, O., Prada, J., Nikolov, N.I., Gu, N., and Hahnloser, R.H.R. (2020). Embedding-based scientific literature discovery in a text editor application. In Proceedings of the 58th Annual Meeting of the Association for Computational Linguistics: System Demonstrations (Association for Computational Linguistics). https://doi.org/</w:t>
         </w:r>
       </w:hyperlink>
-      <w:hyperlink r:id="rId369">
+      <w:hyperlink r:id="rId371">
         <w:r>
           <w:rPr>
             <w:rFonts w:ascii="Times New Roman" w:cs="Times New Roman" w:eastAsia="Times New Roman" w:hAnsi="Times New Roman"/>
@@ -19881,7 +20010,7 @@
           <w:t xml:space="preserve">10.18653/v1/2020.acl-demos.36</w:t>
         </w:r>
       </w:hyperlink>
-      <w:hyperlink r:id="rId370">
+      <w:hyperlink r:id="rId372">
         <w:r>
           <w:rPr>
             <w:rFonts w:ascii="Times New Roman" w:cs="Times New Roman" w:eastAsia="Times New Roman" w:hAnsi="Times New Roman"/>
@@ -19941,7 +20070,7 @@
         <w:t xml:space="preserve">109.</w:t>
         <w:tab/>
       </w:r>
-      <w:hyperlink r:id="rId371">
+      <w:hyperlink r:id="rId373">
         <w:r>
           <w:rPr>
             <w:rFonts w:ascii="Times New Roman" w:cs="Times New Roman" w:eastAsia="Times New Roman" w:hAnsi="Times New Roman"/>
@@ -20001,7 +20130,7 @@
         <w:t xml:space="preserve">110.</w:t>
         <w:tab/>
       </w:r>
-      <w:hyperlink r:id="rId372">
+      <w:hyperlink r:id="rId374">
         <w:r>
           <w:rPr>
             <w:rFonts w:ascii="Times New Roman" w:cs="Times New Roman" w:eastAsia="Times New Roman" w:hAnsi="Times New Roman"/>
@@ -20016,7 +20145,7 @@
           <w:t xml:space="preserve">Mehta, V., Bawa, S., and Singh, J. (2021). WEClustering: word embeddings based text clustering technique for large datasets. Complex Intell Systems </w:t>
         </w:r>
       </w:hyperlink>
-      <w:hyperlink r:id="rId373">
+      <w:hyperlink r:id="rId375">
         <w:r>
           <w:rPr>
             <w:rFonts w:ascii="Times New Roman" w:cs="Times New Roman" w:eastAsia="Times New Roman" w:hAnsi="Times New Roman"/>
@@ -20031,7 +20160,7 @@
           <w:t xml:space="preserve">7</w:t>
         </w:r>
       </w:hyperlink>
-      <w:hyperlink r:id="rId374">
+      <w:hyperlink r:id="rId376">
         <w:r>
           <w:rPr>
             <w:rFonts w:ascii="Times New Roman" w:cs="Times New Roman" w:eastAsia="Times New Roman" w:hAnsi="Times New Roman"/>
@@ -20091,7 +20220,7 @@
         <w:t xml:space="preserve">111.</w:t>
         <w:tab/>
       </w:r>
-      <w:hyperlink r:id="rId375">
+      <w:hyperlink r:id="rId377">
         <w:r>
           <w:rPr>
             <w:rFonts w:ascii="Times New Roman" w:cs="Times New Roman" w:eastAsia="Times New Roman" w:hAnsi="Times New Roman"/>
@@ -20106,7 +20235,7 @@
           <w:t xml:space="preserve">Stein, R.A., Jaques, P.A., and Valiati, J.F. (2019). An analysis of hierarchical text classification using word embeddings. Inf. Sci. </w:t>
         </w:r>
       </w:hyperlink>
-      <w:hyperlink r:id="rId376">
+      <w:hyperlink r:id="rId378">
         <w:r>
           <w:rPr>
             <w:rFonts w:ascii="Times New Roman" w:cs="Times New Roman" w:eastAsia="Times New Roman" w:hAnsi="Times New Roman"/>
@@ -20121,7 +20250,7 @@
           <w:t xml:space="preserve">471</w:t>
         </w:r>
       </w:hyperlink>
-      <w:hyperlink r:id="rId377">
+      <w:hyperlink r:id="rId379">
         <w:r>
           <w:rPr>
             <w:rFonts w:ascii="Times New Roman" w:cs="Times New Roman" w:eastAsia="Times New Roman" w:hAnsi="Times New Roman"/>
@@ -20181,7 +20310,7 @@
         <w:t xml:space="preserve">112.</w:t>
         <w:tab/>
       </w:r>
-      <w:hyperlink r:id="rId378">
+      <w:hyperlink r:id="rId380">
         <w:r>
           <w:rPr>
             <w:rFonts w:ascii="Times New Roman" w:cs="Times New Roman" w:eastAsia="Times New Roman" w:hAnsi="Times New Roman"/>
@@ -20241,7 +20370,7 @@
         <w:t xml:space="preserve">113.</w:t>
         <w:tab/>
       </w:r>
-      <w:hyperlink r:id="rId379">
+      <w:hyperlink r:id="rId381">
         <w:r>
           <w:rPr>
             <w:rFonts w:ascii="Times New Roman" w:cs="Times New Roman" w:eastAsia="Times New Roman" w:hAnsi="Times New Roman"/>
@@ -20301,7 +20430,7 @@
         <w:t xml:space="preserve">114.</w:t>
         <w:tab/>
       </w:r>
-      <w:hyperlink r:id="rId380">
+      <w:hyperlink r:id="rId382">
         <w:r>
           <w:rPr>
             <w:rFonts w:ascii="Times New Roman" w:cs="Times New Roman" w:eastAsia="Times New Roman" w:hAnsi="Times New Roman"/>
@@ -20361,7 +20490,7 @@
         <w:t xml:space="preserve">115.</w:t>
         <w:tab/>
       </w:r>
-      <w:hyperlink r:id="rId381">
+      <w:hyperlink r:id="rId383">
         <w:r>
           <w:rPr>
             <w:rFonts w:ascii="Times New Roman" w:cs="Times New Roman" w:eastAsia="Times New Roman" w:hAnsi="Times New Roman"/>
@@ -20421,7 +20550,7 @@
         <w:t xml:space="preserve">116.</w:t>
         <w:tab/>
       </w:r>
-      <w:hyperlink r:id="rId382">
+      <w:hyperlink r:id="rId384">
         <w:r>
           <w:rPr>
             <w:rFonts w:ascii="Times New Roman" w:cs="Times New Roman" w:eastAsia="Times New Roman" w:hAnsi="Times New Roman"/>
@@ -20481,7 +20610,7 @@
         <w:t xml:space="preserve">117.</w:t>
         <w:tab/>
       </w:r>
-      <w:hyperlink r:id="rId383">
+      <w:hyperlink r:id="rId385">
         <w:r>
           <w:rPr>
             <w:rFonts w:ascii="Times New Roman" w:cs="Times New Roman" w:eastAsia="Times New Roman" w:hAnsi="Times New Roman"/>
@@ -20541,7 +20670,7 @@
         <w:t xml:space="preserve">118.</w:t>
         <w:tab/>
       </w:r>
-      <w:hyperlink r:id="rId384">
+      <w:hyperlink r:id="rId386">
         <w:r>
           <w:rPr>
             <w:rFonts w:ascii="Times New Roman" w:cs="Times New Roman" w:eastAsia="Times New Roman" w:hAnsi="Times New Roman"/>
@@ -20556,7 +20685,7 @@
           <w:t xml:space="preserve">Devlin, J., Chang, M.-W., Lee, K., and Toutanova, K. (2018). BERT: Pre-training of deep bidirectional Transformers for language understanding. arXiv [cs.CL]. https://doi.org/</w:t>
         </w:r>
       </w:hyperlink>
-      <w:hyperlink r:id="rId385">
+      <w:hyperlink r:id="rId387">
         <w:r>
           <w:rPr>
             <w:rFonts w:ascii="Times New Roman" w:cs="Times New Roman" w:eastAsia="Times New Roman" w:hAnsi="Times New Roman"/>
@@ -20571,7 +20700,7 @@
           <w:t xml:space="preserve">10.48550/ARXIV.1810.04805</w:t>
         </w:r>
       </w:hyperlink>
-      <w:hyperlink r:id="rId386">
+      <w:hyperlink r:id="rId388">
         <w:r>
           <w:rPr>
             <w:rFonts w:ascii="Times New Roman" w:cs="Times New Roman" w:eastAsia="Times New Roman" w:hAnsi="Times New Roman"/>
@@ -20631,7 +20760,7 @@
         <w:t xml:space="preserve">119.</w:t>
         <w:tab/>
       </w:r>
-      <w:hyperlink r:id="rId387">
+      <w:hyperlink r:id="rId389">
         <w:r>
           <w:rPr>
             <w:rFonts w:ascii="Times New Roman" w:cs="Times New Roman" w:eastAsia="Times New Roman" w:hAnsi="Times New Roman"/>
@@ -20646,7 +20775,7 @@
           <w:t xml:space="preserve">OpenAI, Achiam, J., Adler, S., Agarwal, S., Ahmad, L., Akkaya, I., Aleman, F.L., Almeida, D., Altenschmidt, J., Altman, S., et al. (2023). GPT-4 Technical Report. arXiv [cs.CL]. https://doi.org/</w:t>
         </w:r>
       </w:hyperlink>
-      <w:hyperlink r:id="rId388">
+      <w:hyperlink r:id="rId390">
         <w:r>
           <w:rPr>
             <w:rFonts w:ascii="Times New Roman" w:cs="Times New Roman" w:eastAsia="Times New Roman" w:hAnsi="Times New Roman"/>
@@ -20661,7 +20790,7 @@
           <w:t xml:space="preserve">10.48550/ARXIV.2303.08774</w:t>
         </w:r>
       </w:hyperlink>
-      <w:hyperlink r:id="rId389">
+      <w:hyperlink r:id="rId391">
         <w:r>
           <w:rPr>
             <w:rFonts w:ascii="Times New Roman" w:cs="Times New Roman" w:eastAsia="Times New Roman" w:hAnsi="Times New Roman"/>
@@ -20721,7 +20850,7 @@
         <w:t xml:space="preserve">120.</w:t>
         <w:tab/>
       </w:r>
-      <w:hyperlink r:id="rId390">
+      <w:hyperlink r:id="rId392">
         <w:r>
           <w:rPr>
             <w:rFonts w:ascii="Times New Roman" w:cs="Times New Roman" w:eastAsia="Times New Roman" w:hAnsi="Times New Roman"/>
@@ -20736,7 +20865,7 @@
           <w:t xml:space="preserve">Brown, T.B., Mann, B., Ryder, N., Subbiah, M., Kaplan, J., Dhariwal, P., Neelakantan, A., Shyam, P., Sastry, G., Askell, A., et al. (2020). Language Models are Few-Shot Learners. arXiv [cs.CL]. https://doi.org/</w:t>
         </w:r>
       </w:hyperlink>
-      <w:hyperlink r:id="rId391">
+      <w:hyperlink r:id="rId393">
         <w:r>
           <w:rPr>
             <w:rFonts w:ascii="Times New Roman" w:cs="Times New Roman" w:eastAsia="Times New Roman" w:hAnsi="Times New Roman"/>
@@ -20751,7 +20880,7 @@
           <w:t xml:space="preserve">10.48550/ARXIV.2005.14165</w:t>
         </w:r>
       </w:hyperlink>
-      <w:hyperlink r:id="rId392">
+      <w:hyperlink r:id="rId394">
         <w:r>
           <w:rPr>
             <w:rFonts w:ascii="Times New Roman" w:cs="Times New Roman" w:eastAsia="Times New Roman" w:hAnsi="Times New Roman"/>
@@ -20811,7 +20940,7 @@
         <w:t xml:space="preserve">121.</w:t>
         <w:tab/>
       </w:r>
-      <w:hyperlink r:id="rId393">
+      <w:hyperlink r:id="rId395">
         <w:r>
           <w:rPr>
             <w:rFonts w:ascii="Times New Roman" w:cs="Times New Roman" w:eastAsia="Times New Roman" w:hAnsi="Times New Roman"/>
@@ -20871,7 +21000,7 @@
         <w:t xml:space="preserve">122.</w:t>
         <w:tab/>
       </w:r>
-      <w:hyperlink r:id="rId394">
+      <w:hyperlink r:id="rId396">
         <w:r>
           <w:rPr>
             <w:rFonts w:ascii="Times New Roman" w:cs="Times New Roman" w:eastAsia="Times New Roman" w:hAnsi="Times New Roman"/>
@@ -20931,7 +21060,7 @@
         <w:t xml:space="preserve">123.</w:t>
         <w:tab/>
       </w:r>
-      <w:hyperlink r:id="rId395">
+      <w:hyperlink r:id="rId397">
         <w:r>
           <w:rPr>
             <w:rFonts w:ascii="Times New Roman" w:cs="Times New Roman" w:eastAsia="Times New Roman" w:hAnsi="Times New Roman"/>
@@ -20991,7 +21120,7 @@
         <w:t xml:space="preserve">124.</w:t>
         <w:tab/>
       </w:r>
-      <w:hyperlink r:id="rId396">
+      <w:hyperlink r:id="rId398">
         <w:r>
           <w:rPr>
             <w:rFonts w:ascii="Times New Roman" w:cs="Times New Roman" w:eastAsia="Times New Roman" w:hAnsi="Times New Roman"/>
@@ -21051,7 +21180,7 @@
         <w:t xml:space="preserve">125.</w:t>
         <w:tab/>
       </w:r>
-      <w:hyperlink r:id="rId397">
+      <w:hyperlink r:id="rId399">
         <w:r>
           <w:rPr>
             <w:rFonts w:ascii="Times New Roman" w:cs="Times New Roman" w:eastAsia="Times New Roman" w:hAnsi="Times New Roman"/>
@@ -21111,7 +21240,7 @@
         <w:t xml:space="preserve">126.</w:t>
         <w:tab/>
       </w:r>
-      <w:hyperlink r:id="rId398">
+      <w:hyperlink r:id="rId400">
         <w:r>
           <w:rPr>
             <w:rFonts w:ascii="Times New Roman" w:cs="Times New Roman" w:eastAsia="Times New Roman" w:hAnsi="Times New Roman"/>
@@ -21126,7 +21255,7 @@
           <w:t xml:space="preserve">Jianmo Ni, Chen Qu, Jing Lu, Zhuyun Dai, Gustavo Hernández Ábrego, Ji Ma, Vincent Y. Zhao, Yi Luan, Keith B. Hall, Ming-Wei Chang, Yinfei Yang (2021). gtr-t5-large. Hugging Face. </w:t>
         </w:r>
       </w:hyperlink>
-      <w:hyperlink r:id="rId399">
+      <w:hyperlink r:id="rId401">
         <w:r>
           <w:rPr>
             <w:rFonts w:ascii="Times New Roman" w:cs="Times New Roman" w:eastAsia="Times New Roman" w:hAnsi="Times New Roman"/>
@@ -21141,7 +21270,7 @@
           <w:t xml:space="preserve">https://huggingface.co/sentence-transformers/gtr-t5-large</w:t>
         </w:r>
       </w:hyperlink>
-      <w:hyperlink r:id="rId400">
+      <w:hyperlink r:id="rId402">
         <w:r>
           <w:rPr>
             <w:rFonts w:ascii="Times New Roman" w:cs="Times New Roman" w:eastAsia="Times New Roman" w:hAnsi="Times New Roman"/>
@@ -21201,7 +21330,7 @@
         <w:t xml:space="preserve">127.</w:t>
         <w:tab/>
       </w:r>
-      <w:hyperlink r:id="rId401">
+      <w:hyperlink r:id="rId403">
         <w:r>
           <w:rPr>
             <w:rFonts w:ascii="Times New Roman" w:cs="Times New Roman" w:eastAsia="Times New Roman" w:hAnsi="Times New Roman"/>
@@ -21216,7 +21345,7 @@
           <w:t xml:space="preserve">all-roberta-large-v1 Hugging Face. </w:t>
         </w:r>
       </w:hyperlink>
-      <w:hyperlink r:id="rId402">
+      <w:hyperlink r:id="rId404">
         <w:r>
           <w:rPr>
             <w:rFonts w:ascii="Times New Roman" w:cs="Times New Roman" w:eastAsia="Times New Roman" w:hAnsi="Times New Roman"/>
@@ -21231,7 +21360,7 @@
           <w:t xml:space="preserve">https://huggingface.co/sentence-transformers/all-roberta-large-v1</w:t>
         </w:r>
       </w:hyperlink>
-      <w:hyperlink r:id="rId403">
+      <w:hyperlink r:id="rId405">
         <w:r>
           <w:rPr>
             <w:rFonts w:ascii="Times New Roman" w:cs="Times New Roman" w:eastAsia="Times New Roman" w:hAnsi="Times New Roman"/>
@@ -21291,7 +21420,7 @@
         <w:t xml:space="preserve">128.</w:t>
         <w:tab/>
       </w:r>
-      <w:hyperlink r:id="rId404">
+      <w:hyperlink r:id="rId406">
         <w:r>
           <w:rPr>
             <w:rFonts w:ascii="Times New Roman" w:cs="Times New Roman" w:eastAsia="Times New Roman" w:hAnsi="Times New Roman"/>
@@ -21306,7 +21435,7 @@
           <w:t xml:space="preserve">Fangyu Liu, Ehsan Shareghi, Zaiqiao Meng, Marco Basaldella, Nigel Collier (2021). SapBERT. Hugging Face. </w:t>
         </w:r>
       </w:hyperlink>
-      <w:hyperlink r:id="rId405">
+      <w:hyperlink r:id="rId407">
         <w:r>
           <w:rPr>
             <w:rFonts w:ascii="Times New Roman" w:cs="Times New Roman" w:eastAsia="Times New Roman" w:hAnsi="Times New Roman"/>
@@ -21321,7 +21450,7 @@
           <w:t xml:space="preserve">https://huggingface.co/cambridgeltl/SapBERT-from-PubMedBERT-fulltext</w:t>
         </w:r>
       </w:hyperlink>
-      <w:hyperlink r:id="rId406">
+      <w:hyperlink r:id="rId408">
         <w:r>
           <w:rPr>
             <w:rFonts w:ascii="Times New Roman" w:cs="Times New Roman" w:eastAsia="Times New Roman" w:hAnsi="Times New Roman"/>
@@ -21381,7 +21510,7 @@
         <w:t xml:space="preserve">129.</w:t>
         <w:tab/>
       </w:r>
-      <w:hyperlink r:id="rId407">
+      <w:hyperlink r:id="rId409">
         <w:r>
           <w:rPr>
             <w:rFonts w:ascii="Times New Roman" w:cs="Times New Roman" w:eastAsia="Times New Roman" w:hAnsi="Times New Roman"/>
@@ -21441,7 +21570,7 @@
         <w:t xml:space="preserve">130.</w:t>
         <w:tab/>
       </w:r>
-      <w:hyperlink r:id="rId408">
+      <w:hyperlink r:id="rId410">
         <w:r>
           <w:rPr>
             <w:rFonts w:ascii="Times New Roman" w:cs="Times New Roman" w:eastAsia="Times New Roman" w:hAnsi="Times New Roman"/>
@@ -21456,7 +21585,7 @@
           <w:t xml:space="preserve">Wang, G., Liu, X., Ying, Z., Yang, G., Chen, Z., Liu, Z., Zhang, M., Yan, H., Lu, Y., Gao, Y., et al. (2023). Optimized glycemic control of type 2 diabetes with reinforcement learning: a proof-of-concept trial. Nat. Med. </w:t>
         </w:r>
       </w:hyperlink>
-      <w:hyperlink r:id="rId409">
+      <w:hyperlink r:id="rId411">
         <w:r>
           <w:rPr>
             <w:rFonts w:ascii="Times New Roman" w:cs="Times New Roman" w:eastAsia="Times New Roman" w:hAnsi="Times New Roman"/>
@@ -21471,7 +21600,7 @@
           <w:t xml:space="preserve">29</w:t>
         </w:r>
       </w:hyperlink>
-      <w:hyperlink r:id="rId410">
+      <w:hyperlink r:id="rId412">
         <w:r>
           <w:rPr>
             <w:rFonts w:ascii="Times New Roman" w:cs="Times New Roman" w:eastAsia="Times New Roman" w:hAnsi="Times New Roman"/>
@@ -21531,7 +21660,7 @@
         <w:t xml:space="preserve">131.</w:t>
         <w:tab/>
       </w:r>
-      <w:hyperlink r:id="rId411">
+      <w:hyperlink r:id="rId413">
         <w:r>
           <w:rPr>
             <w:rFonts w:ascii="Times New Roman" w:cs="Times New Roman" w:eastAsia="Times New Roman" w:hAnsi="Times New Roman"/>
@@ -21546,7 +21675,7 @@
           <w:t xml:space="preserve">Guangyu Wang, Xiaohong Liu, Zhen Ying, Guoxing Yang, Zhiwei Chen, Zhiwen Liu, Min Zhang, Hongmei Yan, Yuxing Lu, Yuanxu Gao, Kanmin Xue, Xiaoying Li,Ying Chen (2023). ClinicalBERT. Hugging Face. </w:t>
         </w:r>
       </w:hyperlink>
-      <w:hyperlink r:id="rId412">
+      <w:hyperlink r:id="rId414">
         <w:r>
           <w:rPr>
             <w:rFonts w:ascii="Times New Roman" w:cs="Times New Roman" w:eastAsia="Times New Roman" w:hAnsi="Times New Roman"/>
@@ -21561,7 +21690,7 @@
           <w:t xml:space="preserve">https://huggingface.co/medicalai/ClinicalBERT</w:t>
         </w:r>
       </w:hyperlink>
-      <w:hyperlink r:id="rId413">
+      <w:hyperlink r:id="rId415">
         <w:r>
           <w:rPr>
             <w:rFonts w:ascii="Times New Roman" w:cs="Times New Roman" w:eastAsia="Times New Roman" w:hAnsi="Times New Roman"/>
@@ -21621,7 +21750,7 @@
         <w:t xml:space="preserve">132.</w:t>
         <w:tab/>
       </w:r>
-      <w:hyperlink r:id="rId414">
+      <w:hyperlink r:id="rId416">
         <w:r>
           <w:rPr>
             <w:rFonts w:ascii="Times New Roman" w:cs="Times New Roman" w:eastAsia="Times New Roman" w:hAnsi="Times New Roman"/>
@@ -21636,7 +21765,7 @@
           <w:t xml:space="preserve">Luo, R., Sun, L., Xia, Y., Qin, T., Zhang, S., Poon, H., and Liu, T.-Y. (2022). BioGPT: generative pre-trained transformer for biomedical text generation and mining. Brief. Bioinform. </w:t>
         </w:r>
       </w:hyperlink>
-      <w:hyperlink r:id="rId415">
+      <w:hyperlink r:id="rId417">
         <w:r>
           <w:rPr>
             <w:rFonts w:ascii="Times New Roman" w:cs="Times New Roman" w:eastAsia="Times New Roman" w:hAnsi="Times New Roman"/>
@@ -21651,7 +21780,7 @@
           <w:t xml:space="preserve">23</w:t>
         </w:r>
       </w:hyperlink>
-      <w:hyperlink r:id="rId416">
+      <w:hyperlink r:id="rId418">
         <w:r>
           <w:rPr>
             <w:rFonts w:ascii="Times New Roman" w:cs="Times New Roman" w:eastAsia="Times New Roman" w:hAnsi="Times New Roman"/>
@@ -21711,7 +21840,7 @@
         <w:t xml:space="preserve">133.</w:t>
         <w:tab/>
       </w:r>
-      <w:hyperlink r:id="rId417">
+      <w:hyperlink r:id="rId419">
         <w:r>
           <w:rPr>
             <w:rFonts w:ascii="Times New Roman" w:cs="Times New Roman" w:eastAsia="Times New Roman" w:hAnsi="Times New Roman"/>
@@ -21726,7 +21855,7 @@
           <w:t xml:space="preserve">Renqian Luo, Liai Sun, Yingce Xia, Tao Qin, Sheng Zhang, Hoifung Poon, Tie-Yan Liu (2022). BioGPT. Hugging Face. </w:t>
         </w:r>
       </w:hyperlink>
-      <w:hyperlink r:id="rId418">
+      <w:hyperlink r:id="rId420">
         <w:r>
           <w:rPr>
             <w:rFonts w:ascii="Times New Roman" w:cs="Times New Roman" w:eastAsia="Times New Roman" w:hAnsi="Times New Roman"/>
@@ -21741,7 +21870,7 @@
           <w:t xml:space="preserve">https://huggingface.co/microsoft/biogpt</w:t>
         </w:r>
       </w:hyperlink>
-      <w:hyperlink r:id="rId419">
+      <w:hyperlink r:id="rId421">
         <w:r>
           <w:rPr>
             <w:rFonts w:ascii="Times New Roman" w:cs="Times New Roman" w:eastAsia="Times New Roman" w:hAnsi="Times New Roman"/>
@@ -21801,7 +21930,7 @@
         <w:t xml:space="preserve">134.</w:t>
         <w:tab/>
       </w:r>
-      <w:hyperlink r:id="rId420">
+      <w:hyperlink r:id="rId422">
         <w:r>
           <w:rPr>
             <w:rFonts w:ascii="Times New Roman" w:cs="Times New Roman" w:eastAsia="Times New Roman" w:hAnsi="Times New Roman"/>
@@ -21861,7 +21990,7 @@
         <w:t xml:space="preserve">135.</w:t>
         <w:tab/>
       </w:r>
-      <w:hyperlink r:id="rId421">
+      <w:hyperlink r:id="rId423">
         <w:r>
           <w:rPr>
             <w:rFonts w:ascii="Times New Roman" w:cs="Times New Roman" w:eastAsia="Times New Roman" w:hAnsi="Times New Roman"/>
@@ -21876,7 +22005,7 @@
           <w:t xml:space="preserve">Fangxiaoyu Feng, Yinfei Yang, Daniel Cer, Naveen Arivazhagan, Wei Wang (2020). LaBSE. Hugging Face. </w:t>
         </w:r>
       </w:hyperlink>
-      <w:hyperlink r:id="rId422">
+      <w:hyperlink r:id="rId424">
         <w:r>
           <w:rPr>
             <w:rFonts w:ascii="Times New Roman" w:cs="Times New Roman" w:eastAsia="Times New Roman" w:hAnsi="Times New Roman"/>
@@ -21891,7 +22020,7 @@
           <w:t xml:space="preserve">https://huggingface.co/sentence-transformers/LaBSE</w:t>
         </w:r>
       </w:hyperlink>
-      <w:hyperlink r:id="rId423">
+      <w:hyperlink r:id="rId425">
         <w:r>
           <w:rPr>
             <w:rFonts w:ascii="Times New Roman" w:cs="Times New Roman" w:eastAsia="Times New Roman" w:hAnsi="Times New Roman"/>
@@ -21951,7 +22080,7 @@
         <w:t xml:space="preserve">136.</w:t>
         <w:tab/>
       </w:r>
-      <w:hyperlink r:id="rId424">
+      <w:hyperlink r:id="rId426">
         <w:r>
           <w:rPr>
             <w:rFonts w:ascii="Times New Roman" w:cs="Times New Roman" w:eastAsia="Times New Roman" w:hAnsi="Times New Roman"/>
@@ -21966,7 +22095,7 @@
           <w:t xml:space="preserve">Cohere embed-english-v2.0 (2023). Cohere. </w:t>
         </w:r>
       </w:hyperlink>
-      <w:hyperlink r:id="rId425">
+      <w:hyperlink r:id="rId427">
         <w:r>
           <w:rPr>
             <w:rFonts w:ascii="Times New Roman" w:cs="Times New Roman" w:eastAsia="Times New Roman" w:hAnsi="Times New Roman"/>
@@ -21981,7 +22110,7 @@
           <w:t xml:space="preserve">https://docs.cohere.com/v2/docs/cohere-embed</w:t>
         </w:r>
       </w:hyperlink>
-      <w:hyperlink r:id="rId426">
+      <w:hyperlink r:id="rId428">
         <w:r>
           <w:rPr>
             <w:rFonts w:ascii="Times New Roman" w:cs="Times New Roman" w:eastAsia="Times New Roman" w:hAnsi="Times New Roman"/>
@@ -22041,7 +22170,7 @@
         <w:t xml:space="preserve">137.</w:t>
         <w:tab/>
       </w:r>
-      <w:hyperlink r:id="rId427">
+      <w:hyperlink r:id="rId429">
         <w:r>
           <w:rPr>
             <w:rFonts w:ascii="Times New Roman" w:cs="Times New Roman" w:eastAsia="Times New Roman" w:hAnsi="Times New Roman"/>
@@ -22101,7 +22230,7 @@
         <w:t xml:space="preserve">138.</w:t>
         <w:tab/>
       </w:r>
-      <w:hyperlink r:id="rId428">
+      <w:hyperlink r:id="rId430">
         <w:r>
           <w:rPr>
             <w:rFonts w:ascii="Times New Roman" w:cs="Times New Roman" w:eastAsia="Times New Roman" w:hAnsi="Times New Roman"/>
@@ -22148,7 +22277,7 @@
           <w:szCs w:val="24"/>
         </w:rPr>
         <w:sectPr>
-          <w:headerReference r:id="rId429" w:type="default"/>
+          <w:headerReference r:id="rId431" w:type="default"/>
           <w:pgSz w:h="15840" w:w="12240" w:orient="portrait"/>
           <w:pgMar w:bottom="1440" w:top="1440" w:left="1267.2" w:right="1440" w:header="720" w:footer="720"/>
           <w:pgNumType w:start="1"/>
@@ -22167,7 +22296,7 @@
         <w:t xml:space="preserve">139.</w:t>
         <w:tab/>
       </w:r>
-      <w:hyperlink r:id="rId430">
+      <w:hyperlink r:id="rId432">
         <w:r>
           <w:rPr>
             <w:rFonts w:ascii="Times New Roman" w:cs="Times New Roman" w:eastAsia="Times New Roman" w:hAnsi="Times New Roman"/>
@@ -22182,7 +22311,7 @@
           <w:t xml:space="preserve">Shutaywi, M., and Kachouie, N.N. (2021). Silhouette Analysis for Performance Evaluation in Machine Learning with Applications to Clustering. Entropy </w:t>
         </w:r>
       </w:hyperlink>
-      <w:hyperlink r:id="rId431">
+      <w:hyperlink r:id="rId433">
         <w:r>
           <w:rPr>
             <w:rFonts w:ascii="Times New Roman" w:cs="Times New Roman" w:eastAsia="Times New Roman" w:hAnsi="Times New Roman"/>
@@ -22197,7 +22326,7 @@
           <w:t xml:space="preserve">23</w:t>
         </w:r>
       </w:hyperlink>
-      <w:hyperlink r:id="rId432">
+      <w:hyperlink r:id="rId434">
         <w:r>
           <w:rPr>
             <w:rFonts w:ascii="Times New Roman" w:cs="Times New Roman" w:eastAsia="Times New Roman" w:hAnsi="Times New Roman"/>
@@ -22212,7 +22341,7 @@
           <w:t xml:space="preserve">. https://doi.org/</w:t>
         </w:r>
       </w:hyperlink>
-      <w:hyperlink r:id="rId433">
+      <w:hyperlink r:id="rId435">
         <w:r>
           <w:rPr>
             <w:rFonts w:ascii="Times New Roman" w:cs="Times New Roman" w:eastAsia="Times New Roman" w:hAnsi="Times New Roman"/>
@@ -22227,7 +22356,7 @@
           <w:t xml:space="preserve">10.3390/e23060759</w:t>
         </w:r>
       </w:hyperlink>
-      <w:hyperlink r:id="rId434">
+      <w:hyperlink r:id="rId436">
         <w:r>
           <w:rPr>
             <w:rFonts w:ascii="Times New Roman" w:cs="Times New Roman" w:eastAsia="Times New Roman" w:hAnsi="Times New Roman"/>
@@ -47946,7 +48075,7 @@
                     <pic:cNvPicPr preferRelativeResize="0"/>
                   </pic:nvPicPr>
                   <pic:blipFill>
-                    <a:blip r:embed="rId435"/>
+                    <a:blip r:embed="rId437"/>
                     <a:srcRect b="0" l="0" r="0" t="0"/>
                     <a:stretch>
                       <a:fillRect/>
@@ -48113,16 +48242,16 @@
           <wp:inline distB="114300" distT="114300" distL="114300" distR="114300">
             <wp:extent cx="7170039" cy="3133725"/>
             <wp:effectExtent b="0" l="0" r="0" t="0"/>
-            <wp:docPr id="1" name="image5.png"/>
+            <wp:docPr id="1" name="image3.png"/>
             <a:graphic>
               <a:graphicData uri="http://schemas.openxmlformats.org/drawingml/2006/picture">
                 <pic:pic>
                   <pic:nvPicPr>
-                    <pic:cNvPr id="0" name="image5.png"/>
+                    <pic:cNvPr id="0" name="image3.png"/>
                     <pic:cNvPicPr preferRelativeResize="0"/>
                   </pic:nvPicPr>
                   <pic:blipFill>
-                    <a:blip r:embed="rId436"/>
+                    <a:blip r:embed="rId438"/>
                     <a:srcRect b="0" l="0" r="0" t="0"/>
                     <a:stretch>
                       <a:fillRect/>
@@ -48283,16 +48412,16 @@
           <wp:inline distB="114300" distT="114300" distL="114300" distR="114300">
             <wp:extent cx="7217045" cy="4254901"/>
             <wp:effectExtent b="0" l="0" r="0" t="0"/>
-            <wp:docPr id="5" name="image4.png"/>
+            <wp:docPr id="5" name="image7.png"/>
             <a:graphic>
               <a:graphicData uri="http://schemas.openxmlformats.org/drawingml/2006/picture">
                 <pic:pic>
                   <pic:nvPicPr>
-                    <pic:cNvPr id="0" name="image4.png"/>
+                    <pic:cNvPr id="0" name="image7.png"/>
                     <pic:cNvPicPr preferRelativeResize="0"/>
                   </pic:nvPicPr>
                   <pic:blipFill>
-                    <a:blip r:embed="rId437"/>
+                    <a:blip r:embed="rId439"/>
                     <a:srcRect b="0" l="0" r="0" t="0"/>
                     <a:stretch>
                       <a:fillRect/>
@@ -48425,7 +48554,7 @@
                     <pic:cNvPicPr preferRelativeResize="0"/>
                   </pic:nvPicPr>
                   <pic:blipFill>
-                    <a:blip r:embed="rId438"/>
+                    <a:blip r:embed="rId440"/>
                     <a:srcRect b="0" l="0" r="0" t="0"/>
                     <a:stretch>
                       <a:fillRect/>
@@ -48579,7 +48708,7 @@
                     <pic:cNvPicPr preferRelativeResize="0"/>
                   </pic:nvPicPr>
                   <pic:blipFill>
-                    <a:blip r:embed="rId439"/>
+                    <a:blip r:embed="rId441"/>
                     <a:srcRect b="0" l="0" r="0" t="0"/>
                     <a:stretch>
                       <a:fillRect/>
@@ -48790,16 +48919,16 @@
           <wp:inline distB="114300" distT="114300" distL="114300" distR="114300">
             <wp:extent cx="6565011" cy="4943480"/>
             <wp:effectExtent b="0" l="0" r="0" t="0"/>
-            <wp:docPr id="2" name="image3.png"/>
+            <wp:docPr id="2" name="image5.png"/>
             <a:graphic>
               <a:graphicData uri="http://schemas.openxmlformats.org/drawingml/2006/picture">
                 <pic:pic>
                   <pic:nvPicPr>
-                    <pic:cNvPr id="0" name="image3.png"/>
+                    <pic:cNvPr id="0" name="image5.png"/>
                     <pic:cNvPicPr preferRelativeResize="0"/>
                   </pic:nvPicPr>
                   <pic:blipFill>
-                    <a:blip r:embed="rId440"/>
+                    <a:blip r:embed="rId442"/>
                     <a:srcRect b="0" l="0" r="0" t="0"/>
                     <a:stretch>
                       <a:fillRect/>
@@ -48932,16 +49061,16 @@
           <wp:inline distB="114300" distT="114300" distL="114300" distR="114300">
             <wp:extent cx="5893689" cy="4442331"/>
             <wp:effectExtent b="0" l="0" r="0" t="0"/>
-            <wp:docPr id="6" name="image7.png"/>
+            <wp:docPr id="6" name="image4.png"/>
             <a:graphic>
               <a:graphicData uri="http://schemas.openxmlformats.org/drawingml/2006/picture">
                 <pic:pic>
                   <pic:nvPicPr>
-                    <pic:cNvPr id="0" name="image7.png"/>
+                    <pic:cNvPr id="0" name="image4.png"/>
                     <pic:cNvPicPr preferRelativeResize="0"/>
                   </pic:nvPicPr>
                   <pic:blipFill>
-                    <a:blip r:embed="rId441"/>
+                    <a:blip r:embed="rId443"/>
                     <a:srcRect b="0" l="0" r="0" t="0"/>
                     <a:stretch>
                       <a:fillRect/>
@@ -49791,6 +49920,162 @@
           <w:rtl w:val="0"/>
         </w:rPr>
         <w:t xml:space="preserve">This file contains the standardized pediatric tumor names from the WHO Tumor Classification System 5th edition only.  </w:t>
+      </w:r>
+    </w:p>
+    <w:p>
+      <w:pPr>
+        <w:ind w:left="-540" w:firstLine="0"/>
+        <w:jc w:val="both"/>
+        <w:rPr>
+          <w:rFonts w:ascii="Times New Roman" w:cs="Times New Roman" w:eastAsia="Times New Roman" w:hAnsi="Times New Roman"/>
+          <w:sz w:val="24"/>
+          <w:szCs w:val="24"/>
+        </w:rPr>
+      </w:pPr>
+      <w:r>
+        <w:rPr>
+          <w:rtl w:val="0"/>
+        </w:rPr>
+      </w:r>
+    </w:p>
+    <w:p>
+      <w:pPr>
+        <w:ind w:left="-540" w:firstLine="0"/>
+        <w:jc w:val="both"/>
+        <w:rPr>
+          <w:rFonts w:ascii="Times New Roman" w:cs="Times New Roman" w:eastAsia="Times New Roman" w:hAnsi="Times New Roman"/>
+          <w:sz w:val="24"/>
+          <w:szCs w:val="24"/>
+          <w:highlight w:val="yellow"/>
+        </w:rPr>
+      </w:pPr>
+      <w:r>
+        <w:rPr>
+          <w:rFonts w:ascii="Times New Roman" w:cs="Times New Roman" w:eastAsia="Times New Roman" w:hAnsi="Times New Roman"/>
+          <w:b w:val="1"/>
+          <w:sz w:val="24"/>
+          <w:szCs w:val="24"/>
+          <w:highlight w:val="yellow"/>
+          <w:rtl w:val="0"/>
+        </w:rPr>
+        <w:t xml:space="preserve">Supplementary Table ST12: </w:t>
+      </w:r>
+      <w:r>
+        <w:rPr>
+          <w:rFonts w:ascii="Times New Roman" w:cs="Times New Roman" w:eastAsia="Times New Roman" w:hAnsi="Times New Roman"/>
+          <w:sz w:val="24"/>
+          <w:szCs w:val="24"/>
+          <w:highlight w:val="yellow"/>
+          <w:rtl w:val="0"/>
+        </w:rPr>
+        <w:t xml:space="preserve">ST12_MI_5th_results.csv.</w:t>
+      </w:r>
+      <w:r>
+        <w:rPr>
+          <w:rFonts w:ascii="Times New Roman" w:cs="Times New Roman" w:eastAsia="Times New Roman" w:hAnsi="Times New Roman"/>
+          <w:b w:val="1"/>
+          <w:sz w:val="24"/>
+          <w:szCs w:val="24"/>
+          <w:highlight w:val="yellow"/>
+          <w:rtl w:val="0"/>
+        </w:rPr>
+        <w:t xml:space="preserve"> </w:t>
+      </w:r>
+      <w:r>
+        <w:rPr>
+          <w:rFonts w:ascii="Times New Roman" w:cs="Times New Roman" w:eastAsia="Times New Roman" w:hAnsi="Times New Roman"/>
+          <w:sz w:val="24"/>
+          <w:szCs w:val="24"/>
+          <w:highlight w:val="yellow"/>
+          <w:rtl w:val="0"/>
+        </w:rPr>
+        <w:t xml:space="preserve">This file contains the pairwise mutual information between the eleven high-accuracy methods evaluated against the WHO Tumor Classification System 5th edition.  </w:t>
+      </w:r>
+    </w:p>
+    <w:p>
+      <w:pPr>
+        <w:ind w:left="-540" w:firstLine="0"/>
+        <w:jc w:val="both"/>
+        <w:rPr>
+          <w:rFonts w:ascii="Times New Roman" w:cs="Times New Roman" w:eastAsia="Times New Roman" w:hAnsi="Times New Roman"/>
+          <w:sz w:val="24"/>
+          <w:szCs w:val="24"/>
+        </w:rPr>
+      </w:pPr>
+      <w:r>
+        <w:rPr>
+          <w:rtl w:val="0"/>
+        </w:rPr>
+      </w:r>
+    </w:p>
+    <w:p>
+      <w:pPr>
+        <w:ind w:left="-540" w:firstLine="0"/>
+        <w:jc w:val="both"/>
+        <w:rPr>
+          <w:rFonts w:ascii="Times New Roman" w:cs="Times New Roman" w:eastAsia="Times New Roman" w:hAnsi="Times New Roman"/>
+          <w:sz w:val="24"/>
+          <w:szCs w:val="24"/>
+          <w:highlight w:val="yellow"/>
+        </w:rPr>
+      </w:pPr>
+      <w:r>
+        <w:rPr>
+          <w:rFonts w:ascii="Times New Roman" w:cs="Times New Roman" w:eastAsia="Times New Roman" w:hAnsi="Times New Roman"/>
+          <w:b w:val="1"/>
+          <w:sz w:val="24"/>
+          <w:szCs w:val="24"/>
+          <w:highlight w:val="yellow"/>
+          <w:rtl w:val="0"/>
+        </w:rPr>
+        <w:t xml:space="preserve">Supplementary Table ST13: </w:t>
+      </w:r>
+      <w:r>
+        <w:rPr>
+          <w:rFonts w:ascii="Times New Roman" w:cs="Times New Roman" w:eastAsia="Times New Roman" w:hAnsi="Times New Roman"/>
+          <w:sz w:val="24"/>
+          <w:szCs w:val="24"/>
+          <w:highlight w:val="yellow"/>
+          <w:rtl w:val="0"/>
+        </w:rPr>
+        <w:t xml:space="preserve">ST13_MI_all_results.csv.</w:t>
+      </w:r>
+      <w:r>
+        <w:rPr>
+          <w:rFonts w:ascii="Times New Roman" w:cs="Times New Roman" w:eastAsia="Times New Roman" w:hAnsi="Times New Roman"/>
+          <w:b w:val="1"/>
+          <w:sz w:val="24"/>
+          <w:szCs w:val="24"/>
+          <w:highlight w:val="yellow"/>
+          <w:rtl w:val="0"/>
+        </w:rPr>
+        <w:t xml:space="preserve"> </w:t>
+      </w:r>
+      <w:r>
+        <w:rPr>
+          <w:rFonts w:ascii="Times New Roman" w:cs="Times New Roman" w:eastAsia="Times New Roman" w:hAnsi="Times New Roman"/>
+          <w:sz w:val="24"/>
+          <w:szCs w:val="24"/>
+          <w:highlight w:val="yellow"/>
+          <w:rtl w:val="0"/>
+        </w:rPr>
+        <w:t xml:space="preserve">This file contains the pairwise mutual information between the eleven high-accuracy methods evaluated against the WHO Tumor Classification System all editions.  </w:t>
+      </w:r>
+    </w:p>
+    <w:p>
+      <w:pPr>
+        <w:ind w:left="-540" w:firstLine="0"/>
+        <w:jc w:val="both"/>
+        <w:rPr>
+          <w:rFonts w:ascii="Times New Roman" w:cs="Times New Roman" w:eastAsia="Times New Roman" w:hAnsi="Times New Roman"/>
+          <w:sz w:val="24"/>
+          <w:szCs w:val="24"/>
+        </w:rPr>
+      </w:pPr>
+      <w:r>
+        <w:rPr>
+          <w:rtl w:val="0"/>
+        </w:rPr>
       </w:r>
     </w:p>
     <w:p>

</xml_diff>